<commit_message>
Simplify Q1 Word answer and use original lecture diagrams
</commit_message>
<xml_diff>
--- a/downloads/PIA5704/PIA5704_Q1_Bilingual.docx
+++ b/downloads/PIA5704/PIA5704_Q1_Bilingual.docx
@@ -7,19 +7,7 @@
         <w:pStyle w:val="Title"/>
       </w:pPr>
       <w:r>
-        <w:t>Q1 升降机系统</w:t>
-        <w:br/>
-        <w:t>Lift Systems</w:t>
-      </w:r>
-    </w:p>
-    <w:p>
-      <w:pPr>
-        <w:pStyle w:val="Subtitle"/>
-      </w:pPr>
-      <w:r>
-        <w:t>中英双语答案与课件定位</w:t>
-        <w:br/>
-        <w:t>Bilingual answer with lecture references</w:t>
+        <w:t>Q1 升降机系统 / Lift Systems</w:t>
       </w:r>
     </w:p>
     <w:p>
@@ -27,29 +15,71 @@
         <w:pStyle w:val="Heading1"/>
       </w:pPr>
       <w:r>
-        <w:t>题目 / Question</w:t>
+        <w:t>1 电力曳引式升降机 / Electric traction lift</w:t>
       </w:r>
     </w:p>
     <w:p>
       <w:r>
-        <w:t>描述典型电力曳引式升降机及直顶式液压升降机的主要部件，附示意图，并简要解释各部件的运作功能。</w:t>
+        <w:t>电力曳引式升降机由电动机驱动曳引轮，通过曳引轮与悬吊钢丝绳之间的摩擦传递动力，使轿厢和对重沿导轨反向移动。对重平衡部分重量，减少电动机需要克服的不平衡负载。</w:t>
       </w:r>
     </w:p>
     <w:p>
       <w:r>
-        <w:t>Describe the major components of a typical electric traction lift and a direct-driven cylinder hydraulic lift with schematic diagrams, and briefly explain the operational functions of the components.</w:t>
+        <w:t>An electric traction lift uses a motor to rotate a traction sheave. Friction between the sheave and suspension ropes moves the car and counterweight in opposite directions along their guide rails. The counterweight balances part of the load, reducing the unbalanced load that the motor must overcome.</w:t>
       </w:r>
     </w:p>
     <w:p>
       <w:pPr>
-        <w:spacing w:after="160"/>
+        <w:spacing w:after="60"/>
+        <w:jc w:val="center"/>
       </w:pPr>
       <w:r>
-        <w:rPr>
-          <w:color w:val="526875"/>
-          <w:sz w:val="18"/>
-        </w:rPr>
-        <w:t>出处 / Source: 0 PIA5704 Course Outline 2026_27.pdf, PDF p. 2, Question 1.</w:t>
+        <w:drawing>
+          <wp:inline xmlns:a="http://schemas.openxmlformats.org/drawingml/2006/main" xmlns:pic="http://schemas.openxmlformats.org/drawingml/2006/picture">
+            <wp:extent cx="3660542" cy="5940000"/>
+            <wp:docPr id="1" name="Picture 1"/>
+            <wp:cNvGraphicFramePr>
+              <a:graphicFrameLocks noChangeAspect="1"/>
+            </wp:cNvGraphicFramePr>
+            <a:graphic>
+              <a:graphicData uri="http://schemas.openxmlformats.org/drawingml/2006/picture">
+                <pic:pic>
+                  <pic:nvPicPr>
+                    <pic:cNvPr id="0" name="traction_ppt.png"/>
+                    <pic:cNvPicPr/>
+                  </pic:nvPicPr>
+                  <pic:blipFill>
+                    <a:blip r:embed="rId11"/>
+                    <a:stretch>
+                      <a:fillRect/>
+                    </a:stretch>
+                  </pic:blipFill>
+                  <pic:spPr>
+                    <a:xfrm>
+                      <a:off x="0" y="0"/>
+                      <a:ext cx="3660542" cy="5940000"/>
+                    </a:xfrm>
+                    <a:prstGeom prst="rect"/>
+                  </pic:spPr>
+                </pic:pic>
+              </a:graphicData>
+            </a:graphic>
+          </wp:inline>
+        </w:drawing>
+      </w:r>
+    </w:p>
+    <w:p>
+      <w:pPr>
+        <w:pStyle w:val="Caption"/>
+        <w:jc w:val="center"/>
+      </w:pPr>
+      <w:r>
+        <w:t>图 1 电力曳引式升降机 / Figure 1 Electric traction lift</w:t>
+      </w:r>
+    </w:p>
+    <w:p>
+      <w:r>
+        <w:br w:type="page"/>
       </w:r>
     </w:p>
     <w:p>
@@ -57,45 +87,7 @@
         <w:pStyle w:val="Heading1"/>
       </w:pPr>
       <w:r>
-        <w:t>资料与页码说明 / Source and page conventions</w:t>
-      </w:r>
-    </w:p>
-    <w:p>
-      <w:r>
-        <w:t>主要依据：Lecture1+Vertical+Transportation+System+I_2026.pdf，以下简称 L1。页码均为 PDF 阅读器页码，封面计第 1 页。</w:t>
-      </w:r>
-    </w:p>
-    <w:p>
-      <w:r>
-        <w:t>Main source: Lecture1+Vertical+Transportation+System+I_2026.pdf, abbreviated as L1. All references use PDF page numbers, counting the cover as page 1.</w:t>
-      </w:r>
-    </w:p>
-    <w:p>
-      <w:r>
-        <w:t>“图示释义”表示课件只在结构图中标出该部件，其功能说明是依据图示关系整理，并非课件逐字原文。液压阀组的停止及下降逻辑属于此类解释，课件没有给出详细液压回路。</w:t>
-      </w:r>
-    </w:p>
-    <w:p>
-      <w:r>
-        <w:t>“Diagram-based explanation” means that the component is labelled in a lecture diagram and its function is explained from that arrangement, rather than quoted from the slide. Hydraulic holding and descent are explained on this basis; the lecture does not provide a detailed valve circuit.</w:t>
-      </w:r>
-    </w:p>
-    <w:p>
-      <w:r>
-        <w:t>本题的直顶式液压升降机对应 L1 第 31–33 页的 direct-ram driven type。第 34 页的 roped type 是另一种结构。</w:t>
-      </w:r>
-    </w:p>
-    <w:p>
-      <w:r>
-        <w:t>The direct-driven cylinder lift in this question corresponds to the direct-ram driven type on L1 pp. 31–33. The roped type on p. 34 is a different arrangement.</w:t>
-      </w:r>
-    </w:p>
-    <w:p>
-      <w:pPr>
-        <w:pStyle w:val="Heading2"/>
-      </w:pPr>
-      <w:r>
-        <w:t>最有用的课件位置 / Key slide locations</w:t>
+        <w:t>1.1 主要部件及功能 / Major components (1/2)</w:t>
       </w:r>
     </w:p>
     <w:tbl>
@@ -106,10 +98,9 @@
         <w:tblLook w:firstColumn="1" w:firstRow="1" w:lastColumn="0" w:lastRow="0" w:noHBand="0" w:noVBand="1" w:val="04A0"/>
       </w:tblPr>
       <w:tblGrid>
-        <w:gridCol w:w="2537"/>
-        <w:gridCol w:w="2537"/>
-        <w:gridCol w:w="2537"/>
-        <w:gridCol w:w="2537"/>
+        <w:gridCol w:w="2098"/>
+        <w:gridCol w:w="3288"/>
+        <w:gridCol w:w="4706"/>
       </w:tblGrid>
       <w:tr>
         <w:trPr>
@@ -117,7 +108,7 @@
         </w:trPr>
         <w:tc>
           <w:tcPr>
-            <w:tcW w:type="dxa" w:w="1701"/>
+            <w:tcW w:type="dxa" w:w="2098"/>
             <w:shd w:fill="17364D"/>
           </w:tcPr>
           <w:p>
@@ -132,7 +123,7 @@
         </w:tc>
         <w:tc>
           <w:tcPr>
-            <w:tcW w:type="dxa" w:w="2608"/>
+            <w:tcW w:type="dxa" w:w="3288"/>
             <w:shd w:fill="17364D"/>
           </w:tcPr>
           <w:p>
@@ -141,13 +132,13 @@
                 <w:b/>
                 <w:color w:val="FFFFFF"/>
               </w:rPr>
-              <w:t>中文功能</w:t>
+              <w:t>功能</w:t>
             </w:r>
           </w:p>
         </w:tc>
         <w:tc>
           <w:tcPr>
-            <w:tcW w:type="dxa" w:w="3628"/>
+            <w:tcW w:type="dxa" w:w="4706"/>
             <w:shd w:fill="17364D"/>
           </w:tcPr>
           <w:p>
@@ -160,18 +151,59 @@
             </w:r>
           </w:p>
         </w:tc>
+      </w:tr>
+      <w:tr>
+        <w:trPr>
+          <w:cantSplit/>
+        </w:trPr>
         <w:tc>
           <w:tcPr>
-            <w:tcW w:type="dxa" w:w="2154"/>
-            <w:shd w:fill="17364D"/>
+            <w:tcW w:type="dxa" w:w="2098"/>
           </w:tcPr>
           <w:p>
+            <w:pPr>
+              <w:spacing w:before="60" w:after="80" w:line="259" w:lineRule="auto"/>
+            </w:pPr>
             <w:r>
               <w:rPr>
                 <w:b/>
-                <w:color w:val="FFFFFF"/>
+                <w:sz w:val="19"/>
               </w:rPr>
-              <w:t>PPT 出处 / Source</w:t>
+              <w:t>1 轿厢及轿架</w:t>
+              <w:br/>
+              <w:t>Car and car sling</w:t>
+            </w:r>
+          </w:p>
+        </w:tc>
+        <w:tc>
+          <w:tcPr>
+            <w:tcW w:type="dxa" w:w="3288"/>
+          </w:tcPr>
+          <w:p>
+            <w:pPr>
+              <w:spacing w:before="60" w:after="80" w:line="259" w:lineRule="auto"/>
+            </w:pPr>
+            <w:r>
+              <w:rPr>
+                <w:sz w:val="19"/>
+              </w:rPr>
+              <w:t>轿厢承载乘客或货物；轿架承托轿厢，并与悬吊及导向部件连接。</w:t>
+            </w:r>
+          </w:p>
+        </w:tc>
+        <w:tc>
+          <w:tcPr>
+            <w:tcW w:type="dxa" w:w="4706"/>
+          </w:tcPr>
+          <w:p>
+            <w:pPr>
+              <w:spacing w:before="60" w:after="80" w:line="259" w:lineRule="auto"/>
+            </w:pPr>
+            <w:r>
+              <w:rPr>
+                <w:sz w:val="19"/>
+              </w:rPr>
+              <w:t>The car carries passengers or goods. The car sling supports the car and connects it to the suspension and guiding components.</w:t>
             </w:r>
           </w:p>
         </w:tc>
@@ -182,66 +214,52 @@
         </w:trPr>
         <w:tc>
           <w:tcPr>
-            <w:tcW w:type="dxa" w:w="1701"/>
+            <w:tcW w:type="dxa" w:w="2098"/>
           </w:tcPr>
           <w:p>
             <w:pPr>
-              <w:spacing w:before="40" w:after="60" w:line="252" w:lineRule="auto"/>
+              <w:spacing w:before="60" w:after="80" w:line="259" w:lineRule="auto"/>
             </w:pPr>
             <w:r>
               <w:rPr>
                 <w:b/>
-                <w:sz w:val="18"/>
+                <w:sz w:val="19"/>
               </w:rPr>
-              <w:t>曳引式 / Traction</w:t>
+              <w:t>2 驱动电动机</w:t>
+              <w:br/>
+              <w:t>Drive motor</w:t>
             </w:r>
           </w:p>
         </w:tc>
         <w:tc>
           <w:tcPr>
-            <w:tcW w:type="dxa" w:w="2608"/>
+            <w:tcW w:type="dxa" w:w="3288"/>
           </w:tcPr>
           <w:p>
             <w:pPr>
-              <w:spacing w:before="40" w:after="60" w:line="252" w:lineRule="auto"/>
+              <w:spacing w:before="60" w:after="80" w:line="259" w:lineRule="auto"/>
             </w:pPr>
             <w:r>
               <w:rPr>
-                <w:sz w:val="18"/>
+                <w:sz w:val="19"/>
               </w:rPr>
-              <w:t>完整部件图；部件及安全装置；驱动系统。</w:t>
+              <w:t>提供升降动力。无齿轮式直接驱动曳引轮；有齿轮式通过减速装置驱动。</w:t>
             </w:r>
           </w:p>
         </w:tc>
         <w:tc>
           <w:tcPr>
-            <w:tcW w:type="dxa" w:w="3628"/>
+            <w:tcW w:type="dxa" w:w="4706"/>
           </w:tcPr>
           <w:p>
             <w:pPr>
-              <w:spacing w:before="40" w:after="60" w:line="252" w:lineRule="auto"/>
+              <w:spacing w:before="60" w:after="80" w:line="259" w:lineRule="auto"/>
             </w:pPr>
             <w:r>
               <w:rPr>
-                <w:sz w:val="18"/>
+                <w:sz w:val="19"/>
               </w:rPr>
-              <w:t>Complete component diagrams; component and safety definitions; drive arrangements.</w:t>
-            </w:r>
-          </w:p>
-        </w:tc>
-        <w:tc>
-          <w:tcPr>
-            <w:tcW w:type="dxa" w:w="2154"/>
-          </w:tcPr>
-          <w:p>
-            <w:pPr>
-              <w:spacing w:before="40" w:after="60" w:line="252" w:lineRule="auto"/>
-            </w:pPr>
-            <w:r>
-              <w:rPr>
-                <w:sz w:val="18"/>
-              </w:rPr>
-              <w:t>L1 pp. 10, 15–30, 35 左图</w:t>
+              <w:t>The motor supplies driving power. It drives the sheave directly in a gearless lift or through reduction gearing in a geared lift.</w:t>
             </w:r>
           </w:p>
         </w:tc>
@@ -252,66 +270,276 @@
         </w:trPr>
         <w:tc>
           <w:tcPr>
-            <w:tcW w:type="dxa" w:w="1701"/>
+            <w:tcW w:type="dxa" w:w="2098"/>
           </w:tcPr>
           <w:p>
             <w:pPr>
-              <w:spacing w:before="40" w:after="60" w:line="252" w:lineRule="auto"/>
+              <w:spacing w:before="60" w:after="80" w:line="259" w:lineRule="auto"/>
             </w:pPr>
             <w:r>
               <w:rPr>
                 <w:b/>
-                <w:sz w:val="18"/>
+                <w:sz w:val="19"/>
               </w:rPr>
-              <w:t>液压式 / Hydraulic</w:t>
+              <w:t>3 曳引轮及减速装置</w:t>
+              <w:br/>
+              <w:t>Traction sheave and reduction gearing</w:t>
             </w:r>
           </w:p>
         </w:tc>
         <w:tc>
           <w:tcPr>
-            <w:tcW w:type="dxa" w:w="2608"/>
+            <w:tcW w:type="dxa" w:w="3288"/>
           </w:tcPr>
           <w:p>
             <w:pPr>
-              <w:spacing w:before="40" w:after="60" w:line="252" w:lineRule="auto"/>
+              <w:spacing w:before="60" w:after="80" w:line="259" w:lineRule="auto"/>
             </w:pPr>
             <w:r>
               <w:rPr>
-                <w:sz w:val="18"/>
+                <w:sz w:val="19"/>
               </w:rPr>
-              <w:t>液压类型、直顶原理、完整部件图。</w:t>
+              <w:t>曳引轮通过与钢丝绳的摩擦传递牵引力。有齿轮式的减速装置降低电动机输出转速。</w:t>
             </w:r>
           </w:p>
         </w:tc>
         <w:tc>
           <w:tcPr>
-            <w:tcW w:type="dxa" w:w="3628"/>
+            <w:tcW w:type="dxa" w:w="4706"/>
           </w:tcPr>
           <w:p>
             <w:pPr>
-              <w:spacing w:before="40" w:after="60" w:line="252" w:lineRule="auto"/>
+              <w:spacing w:before="60" w:after="80" w:line="259" w:lineRule="auto"/>
             </w:pPr>
             <w:r>
               <w:rPr>
-                <w:sz w:val="18"/>
+                <w:sz w:val="19"/>
               </w:rPr>
-              <w:t>Hydraulic types, direct-ram principle and complete component diagrams.</w:t>
+              <w:t>The sheave transmits driving force to the ropes through friction. In a geared lift, the reduction unit reduces motor speed before driving the sheave.</w:t>
+            </w:r>
+          </w:p>
+        </w:tc>
+      </w:tr>
+      <w:tr>
+        <w:trPr>
+          <w:cantSplit/>
+        </w:trPr>
+        <w:tc>
+          <w:tcPr>
+            <w:tcW w:type="dxa" w:w="2098"/>
+          </w:tcPr>
+          <w:p>
+            <w:pPr>
+              <w:spacing w:before="60" w:after="80" w:line="259" w:lineRule="auto"/>
+            </w:pPr>
+            <w:r>
+              <w:rPr>
+                <w:b/>
+                <w:sz w:val="19"/>
+              </w:rPr>
+              <w:t>4 悬吊钢丝绳</w:t>
+              <w:br/>
+              <w:t>Suspension / hoisting ropes</w:t>
             </w:r>
           </w:p>
         </w:tc>
         <w:tc>
           <w:tcPr>
-            <w:tcW w:type="dxa" w:w="2154"/>
+            <w:tcW w:type="dxa" w:w="3288"/>
           </w:tcPr>
           <w:p>
             <w:pPr>
-              <w:spacing w:before="40" w:after="60" w:line="252" w:lineRule="auto"/>
+              <w:spacing w:before="60" w:after="80" w:line="259" w:lineRule="auto"/>
             </w:pPr>
             <w:r>
               <w:rPr>
-                <w:sz w:val="18"/>
+                <w:sz w:val="19"/>
               </w:rPr>
-              <w:t>L1 pp. 6, 31–33, 35 右图</w:t>
+              <w:t>悬吊轿厢和对重，并传递曳引轮的驱动力。</w:t>
+            </w:r>
+          </w:p>
+        </w:tc>
+        <w:tc>
+          <w:tcPr>
+            <w:tcW w:type="dxa" w:w="4706"/>
+          </w:tcPr>
+          <w:p>
+            <w:pPr>
+              <w:spacing w:before="60" w:after="80" w:line="259" w:lineRule="auto"/>
+            </w:pPr>
+            <w:r>
+              <w:rPr>
+                <w:sz w:val="19"/>
+              </w:rPr>
+              <w:t>The ropes suspend the car and counterweight and transmit the driving force from the traction sheave.</w:t>
+            </w:r>
+          </w:p>
+        </w:tc>
+      </w:tr>
+      <w:tr>
+        <w:trPr>
+          <w:cantSplit/>
+        </w:trPr>
+        <w:tc>
+          <w:tcPr>
+            <w:tcW w:type="dxa" w:w="2098"/>
+          </w:tcPr>
+          <w:p>
+            <w:pPr>
+              <w:spacing w:before="60" w:after="80" w:line="259" w:lineRule="auto"/>
+            </w:pPr>
+            <w:r>
+              <w:rPr>
+                <w:b/>
+                <w:sz w:val="19"/>
+              </w:rPr>
+              <w:t>5 对重</w:t>
+              <w:br/>
+              <w:t>Counterweight</w:t>
+            </w:r>
+          </w:p>
+        </w:tc>
+        <w:tc>
+          <w:tcPr>
+            <w:tcW w:type="dxa" w:w="3288"/>
+          </w:tcPr>
+          <w:p>
+            <w:pPr>
+              <w:spacing w:before="60" w:after="80" w:line="259" w:lineRule="auto"/>
+            </w:pPr>
+            <w:r>
+              <w:rPr>
+                <w:sz w:val="19"/>
+              </w:rPr>
+              <w:t>平衡轿厢及部分载荷重量，减少驱动功率，使电动机主要克服不平衡负载和摩擦。</w:t>
+            </w:r>
+          </w:p>
+        </w:tc>
+        <w:tc>
+          <w:tcPr>
+            <w:tcW w:type="dxa" w:w="4706"/>
+          </w:tcPr>
+          <w:p>
+            <w:pPr>
+              <w:spacing w:before="60" w:after="80" w:line="259" w:lineRule="auto"/>
+            </w:pPr>
+            <w:r>
+              <w:rPr>
+                <w:sz w:val="19"/>
+              </w:rPr>
+              <w:t>The counterweight balances the car and part of its load, reducing the power needed to overcome the unbalanced load and friction.</w:t>
+            </w:r>
+          </w:p>
+        </w:tc>
+      </w:tr>
+      <w:tr>
+        <w:trPr>
+          <w:cantSplit/>
+        </w:trPr>
+        <w:tc>
+          <w:tcPr>
+            <w:tcW w:type="dxa" w:w="2098"/>
+          </w:tcPr>
+          <w:p>
+            <w:pPr>
+              <w:spacing w:before="60" w:after="80" w:line="259" w:lineRule="auto"/>
+            </w:pPr>
+            <w:r>
+              <w:rPr>
+                <w:b/>
+                <w:sz w:val="19"/>
+              </w:rPr>
+              <w:t>6 导轨及导靴／滚轮</w:t>
+              <w:br/>
+              <w:t>Guide rails and shoes / rollers</w:t>
+            </w:r>
+          </w:p>
+        </w:tc>
+        <w:tc>
+          <w:tcPr>
+            <w:tcW w:type="dxa" w:w="3288"/>
+          </w:tcPr>
+          <w:p>
+            <w:pPr>
+              <w:spacing w:before="60" w:after="80" w:line="259" w:lineRule="auto"/>
+            </w:pPr>
+            <w:r>
+              <w:rPr>
+                <w:sz w:val="19"/>
+              </w:rPr>
+              <w:t>引导轿厢和对重沿规定垂直路径运行，并限制横向移动。</w:t>
+            </w:r>
+          </w:p>
+        </w:tc>
+        <w:tc>
+          <w:tcPr>
+            <w:tcW w:type="dxa" w:w="4706"/>
+          </w:tcPr>
+          <w:p>
+            <w:pPr>
+              <w:spacing w:before="60" w:after="80" w:line="259" w:lineRule="auto"/>
+            </w:pPr>
+            <w:r>
+              <w:rPr>
+                <w:sz w:val="19"/>
+              </w:rPr>
+              <w:t>They guide the car and counterweight along their vertical paths and restrain lateral movement.</w:t>
+            </w:r>
+          </w:p>
+        </w:tc>
+      </w:tr>
+      <w:tr>
+        <w:trPr>
+          <w:cantSplit/>
+        </w:trPr>
+        <w:tc>
+          <w:tcPr>
+            <w:tcW w:type="dxa" w:w="2098"/>
+          </w:tcPr>
+          <w:p>
+            <w:pPr>
+              <w:spacing w:before="60" w:after="80" w:line="259" w:lineRule="auto"/>
+            </w:pPr>
+            <w:r>
+              <w:rPr>
+                <w:b/>
+                <w:sz w:val="19"/>
+              </w:rPr>
+              <w:t>7 制动器</w:t>
+              <w:br/>
+              <w:t>Brake</w:t>
+            </w:r>
+          </w:p>
+        </w:tc>
+        <w:tc>
+          <w:tcPr>
+            <w:tcW w:type="dxa" w:w="3288"/>
+          </w:tcPr>
+          <w:p>
+            <w:pPr>
+              <w:spacing w:before="60" w:after="80" w:line="259" w:lineRule="auto"/>
+            </w:pPr>
+            <w:r>
+              <w:rPr>
+                <w:sz w:val="19"/>
+              </w:rPr>
+              <w:t>使驱动系统停止并保持静止。制动器采用弹簧施闸、电力释放；有齿轮式通常装在电动机与减速装置之间。</w:t>
+            </w:r>
+          </w:p>
+        </w:tc>
+        <w:tc>
+          <w:tcPr>
+            <w:tcW w:type="dxa" w:w="4706"/>
+          </w:tcPr>
+          <w:p>
+            <w:pPr>
+              <w:spacing w:before="60" w:after="80" w:line="259" w:lineRule="auto"/>
+            </w:pPr>
+            <w:r>
+              <w:rPr>
+                <w:sz w:val="19"/>
+              </w:rPr>
+              <w:t>The brake stops and holds the drive system. It is spring-applied and electrically released. In a geared lift, it normally sits between the motor and reduction unit.</w:t>
             </w:r>
           </w:p>
         </w:tc>
@@ -327,99 +555,7 @@
         <w:pStyle w:val="Heading1"/>
       </w:pPr>
       <w:r>
-        <w:t>1 电力曳引式升降机 / Electric traction lift</w:t>
-      </w:r>
-    </w:p>
-    <w:p>
-      <w:pPr>
-        <w:pStyle w:val="Heading2"/>
-      </w:pPr>
-      <w:r>
-        <w:t>1.1 基本原理 / Operating principle</w:t>
-      </w:r>
-    </w:p>
-    <w:p>
-      <w:r>
-        <w:t>电动机驱动曳引轮，通过曳引轮与悬吊钢丝绳之间的摩擦传递动力，使轿厢与对重沿导轨反向移动。对重平衡部分重量，因此电动机主要克服不平衡负载及摩擦。</w:t>
-      </w:r>
-    </w:p>
-    <w:p>
-      <w:r>
-        <w:t>A motor rotates the traction sheave. Friction between the sheave and suspension ropes moves the car and counterweight in opposite directions along their guide rails. The counterweight balances part of the load, so the motor mainly overcomes the unbalanced load and friction.</w:t>
-      </w:r>
-    </w:p>
-    <w:p>
-      <w:pPr>
-        <w:spacing w:after="160"/>
-      </w:pPr>
-      <w:r>
-        <w:rPr>
-          <w:color w:val="526875"/>
-          <w:sz w:val="18"/>
-        </w:rPr>
-        <w:t>出处 / Source: L1 p. 10 “Electric Elevators”; p. 25 “Counterweight system”; pp. 26–30 “Traction System”; p. 35 left diagram.</w:t>
-      </w:r>
-    </w:p>
-    <w:p>
-      <w:pPr>
-        <w:jc w:val="center"/>
-      </w:pPr>
-      <w:r>
-        <w:drawing>
-          <wp:inline xmlns:a="http://schemas.openxmlformats.org/drawingml/2006/main" xmlns:pic="http://schemas.openxmlformats.org/drawingml/2006/picture">
-            <wp:extent cx="6336000" cy="4267317"/>
-            <wp:docPr id="1" name="Picture 1"/>
-            <wp:cNvGraphicFramePr>
-              <a:graphicFrameLocks noChangeAspect="1"/>
-            </wp:cNvGraphicFramePr>
-            <a:graphic>
-              <a:graphicData uri="http://schemas.openxmlformats.org/drawingml/2006/picture">
-                <pic:pic>
-                  <pic:nvPicPr>
-                    <pic:cNvPr id="0" name="traction.png"/>
-                    <pic:cNvPicPr/>
-                  </pic:nvPicPr>
-                  <pic:blipFill>
-                    <a:blip r:embed="rId11"/>
-                    <a:stretch>
-                      <a:fillRect/>
-                    </a:stretch>
-                  </pic:blipFill>
-                  <pic:spPr>
-                    <a:xfrm>
-                      <a:off x="0" y="0"/>
-                      <a:ext cx="6336000" cy="4267317"/>
-                    </a:xfrm>
-                    <a:prstGeom prst="rect"/>
-                  </pic:spPr>
-                </pic:pic>
-              </a:graphicData>
-            </a:graphic>
-          </wp:inline>
-        </w:drawing>
-      </w:r>
-    </w:p>
-    <w:p>
-      <w:pPr>
-        <w:pStyle w:val="Caption"/>
-      </w:pPr>
-      <w:r>
-        <w:t>图 1 / Figure 1. 依据 L1 第 10、16–26、35 页重绘的简化结构图；非按比例。</w:t>
-        <w:br/>
-        <w:t>Simplified schematic redrawn from L1 pp. 10, 16–26 and 35; not to scale.</w:t>
-      </w:r>
-    </w:p>
-    <w:p>
-      <w:r>
-        <w:br w:type="page"/>
-      </w:r>
-    </w:p>
-    <w:p>
-      <w:pPr>
-        <w:pStyle w:val="Heading1"/>
-      </w:pPr>
-      <w:r>
-        <w:t>1.2 主要部件及功能 / Major components (1/2)</w:t>
+        <w:t>1.1 主要部件及功能 / Major components (2/2)</w:t>
       </w:r>
     </w:p>
     <w:tbl>
@@ -430,10 +566,9 @@
         <w:tblLook w:firstColumn="1" w:firstRow="1" w:lastColumn="0" w:lastRow="0" w:noHBand="0" w:noVBand="1" w:val="04A0"/>
       </w:tblPr>
       <w:tblGrid>
-        <w:gridCol w:w="2537"/>
-        <w:gridCol w:w="2537"/>
-        <w:gridCol w:w="2537"/>
-        <w:gridCol w:w="2537"/>
+        <w:gridCol w:w="2098"/>
+        <w:gridCol w:w="3288"/>
+        <w:gridCol w:w="4706"/>
       </w:tblGrid>
       <w:tr>
         <w:trPr>
@@ -441,7 +576,7 @@
         </w:trPr>
         <w:tc>
           <w:tcPr>
-            <w:tcW w:type="dxa" w:w="1701"/>
+            <w:tcW w:type="dxa" w:w="2098"/>
             <w:shd w:fill="17364D"/>
           </w:tcPr>
           <w:p>
@@ -456,7 +591,7 @@
         </w:tc>
         <w:tc>
           <w:tcPr>
-            <w:tcW w:type="dxa" w:w="2608"/>
+            <w:tcW w:type="dxa" w:w="3288"/>
             <w:shd w:fill="17364D"/>
           </w:tcPr>
           <w:p>
@@ -465,13 +600,13 @@
                 <w:b/>
                 <w:color w:val="FFFFFF"/>
               </w:rPr>
-              <w:t>中文功能</w:t>
+              <w:t>功能</w:t>
             </w:r>
           </w:p>
         </w:tc>
         <w:tc>
           <w:tcPr>
-            <w:tcW w:type="dxa" w:w="3628"/>
+            <w:tcW w:type="dxa" w:w="4706"/>
             <w:shd w:fill="17364D"/>
           </w:tcPr>
           <w:p>
@@ -484,18 +619,59 @@
             </w:r>
           </w:p>
         </w:tc>
+      </w:tr>
+      <w:tr>
+        <w:trPr>
+          <w:cantSplit/>
+        </w:trPr>
         <w:tc>
           <w:tcPr>
-            <w:tcW w:type="dxa" w:w="2154"/>
-            <w:shd w:fill="17364D"/>
+            <w:tcW w:type="dxa" w:w="2098"/>
           </w:tcPr>
           <w:p>
+            <w:pPr>
+              <w:spacing w:before="60" w:after="80" w:line="259" w:lineRule="auto"/>
+            </w:pPr>
             <w:r>
               <w:rPr>
                 <w:b/>
-                <w:color w:val="FFFFFF"/>
+                <w:sz w:val="19"/>
               </w:rPr>
-              <w:t>PPT 出处 / Source</w:t>
+              <w:t>8 控制器及传感器</w:t>
+              <w:br/>
+              <w:t>Controller and transducers</w:t>
+            </w:r>
+          </w:p>
+        </w:tc>
+        <w:tc>
+          <w:tcPr>
+            <w:tcW w:type="dxa" w:w="3288"/>
+          </w:tcPr>
+          <w:p>
+            <w:pPr>
+              <w:spacing w:before="60" w:after="80" w:line="259" w:lineRule="auto"/>
+            </w:pPr>
+            <w:r>
+              <w:rPr>
+                <w:sz w:val="19"/>
+              </w:rPr>
+              <w:t>协调运行方向、速度、停车和门的操作；位置及速度传感器提供反馈。</w:t>
+            </w:r>
+          </w:p>
+        </w:tc>
+        <w:tc>
+          <w:tcPr>
+            <w:tcW w:type="dxa" w:w="4706"/>
+          </w:tcPr>
+          <w:p>
+            <w:pPr>
+              <w:spacing w:before="60" w:after="80" w:line="259" w:lineRule="auto"/>
+            </w:pPr>
+            <w:r>
+              <w:rPr>
+                <w:sz w:val="19"/>
+              </w:rPr>
+              <w:t>The controller coordinates direction, speed, stopping and door operation. Position and speed transducers provide feedback.</w:t>
             </w:r>
           </w:p>
         </w:tc>
@@ -506,70 +682,52 @@
         </w:trPr>
         <w:tc>
           <w:tcPr>
-            <w:tcW w:type="dxa" w:w="1701"/>
+            <w:tcW w:type="dxa" w:w="2098"/>
           </w:tcPr>
           <w:p>
             <w:pPr>
-              <w:spacing w:before="40" w:after="60" w:line="252" w:lineRule="auto"/>
+              <w:spacing w:before="60" w:after="80" w:line="259" w:lineRule="auto"/>
             </w:pPr>
             <w:r>
               <w:rPr>
                 <w:b/>
-                <w:sz w:val="18"/>
+                <w:sz w:val="19"/>
               </w:rPr>
-              <w:t>1 轿厢及轿架</w:t>
+              <w:t>9 门及门安全装置</w:t>
               <w:br/>
-              <w:t>Car and car sling</w:t>
+              <w:t>Doors and door safety devices</w:t>
             </w:r>
           </w:p>
         </w:tc>
         <w:tc>
           <w:tcPr>
-            <w:tcW w:type="dxa" w:w="2608"/>
+            <w:tcW w:type="dxa" w:w="3288"/>
           </w:tcPr>
           <w:p>
             <w:pPr>
-              <w:spacing w:before="40" w:after="60" w:line="252" w:lineRule="auto"/>
+              <w:spacing w:before="60" w:after="80" w:line="259" w:lineRule="auto"/>
             </w:pPr>
             <w:r>
               <w:rPr>
-                <w:sz w:val="18"/>
+                <w:sz w:val="19"/>
               </w:rPr>
-              <w:t>轿厢承载乘客或货物；轿架承托轿厢，并与悬吊及导向部件连接。</w:t>
+              <w:t>门机负责开关门。层门联锁确保门未正确关闭并锁紧时不能运行；关门期间若有人进入，接近传感器使门重开。</w:t>
             </w:r>
           </w:p>
         </w:tc>
         <w:tc>
           <w:tcPr>
-            <w:tcW w:type="dxa" w:w="3628"/>
+            <w:tcW w:type="dxa" w:w="4706"/>
           </w:tcPr>
           <w:p>
             <w:pPr>
-              <w:spacing w:before="40" w:after="60" w:line="252" w:lineRule="auto"/>
+              <w:spacing w:before="60" w:after="80" w:line="259" w:lineRule="auto"/>
             </w:pPr>
             <w:r>
               <w:rPr>
-                <w:sz w:val="18"/>
+                <w:sz w:val="19"/>
               </w:rPr>
-              <w:t>The car carries passengers or goods. The car sling supports the car and connects it to the suspension and guiding components.</w:t>
-            </w:r>
-          </w:p>
-        </w:tc>
-        <w:tc>
-          <w:tcPr>
-            <w:tcW w:type="dxa" w:w="2154"/>
-          </w:tcPr>
-          <w:p>
-            <w:pPr>
-              <w:spacing w:before="40" w:after="60" w:line="252" w:lineRule="auto"/>
-            </w:pPr>
-            <w:r>
-              <w:rPr>
-                <w:sz w:val="18"/>
-              </w:rPr>
-              <w:t>L1 pp. 10, 35</w:t>
-              <w:br/>
-              <w:t>结构图／图示释义</w:t>
+              <w:t>The operator opens and closes the doors. Interlocks prevent travel unless landing doors are closed and locked. A proximity sensor reopens closing doors when someone enters.</w:t>
             </w:r>
           </w:p>
         </w:tc>
@@ -580,70 +738,52 @@
         </w:trPr>
         <w:tc>
           <w:tcPr>
-            <w:tcW w:type="dxa" w:w="1701"/>
+            <w:tcW w:type="dxa" w:w="2098"/>
           </w:tcPr>
           <w:p>
             <w:pPr>
-              <w:spacing w:before="40" w:after="60" w:line="252" w:lineRule="auto"/>
+              <w:spacing w:before="60" w:after="80" w:line="259" w:lineRule="auto"/>
             </w:pPr>
             <w:r>
               <w:rPr>
                 <w:b/>
-                <w:sz w:val="18"/>
+                <w:sz w:val="19"/>
               </w:rPr>
-              <w:t>2 驱动电动机</w:t>
+              <w:t>10 限速器、绳及张紧轮</w:t>
               <w:br/>
-              <w:t>Drive motor</w:t>
+              <w:t>Governor, rope and tension sheave</w:t>
             </w:r>
           </w:p>
         </w:tc>
         <w:tc>
           <w:tcPr>
-            <w:tcW w:type="dxa" w:w="2608"/>
+            <w:tcW w:type="dxa" w:w="3288"/>
           </w:tcPr>
           <w:p>
             <w:pPr>
-              <w:spacing w:before="40" w:after="60" w:line="252" w:lineRule="auto"/>
+              <w:spacing w:before="60" w:after="80" w:line="259" w:lineRule="auto"/>
             </w:pPr>
             <w:r>
               <w:rPr>
-                <w:sz w:val="18"/>
+                <w:sz w:val="19"/>
               </w:rPr>
-              <w:t>提供升降动力。无齿轮式直接驱动曳引轮；有齿轮式通过减速装置驱动。</w:t>
+              <w:t>限速器在达到预定超速值时触发停止，并在需要时使安全钳或辅助制动器动作。绳及张紧轮构成相关机械布置。</w:t>
             </w:r>
           </w:p>
         </w:tc>
         <w:tc>
           <w:tcPr>
-            <w:tcW w:type="dxa" w:w="3628"/>
+            <w:tcW w:type="dxa" w:w="4706"/>
           </w:tcPr>
           <w:p>
             <w:pPr>
-              <w:spacing w:before="40" w:after="60" w:line="252" w:lineRule="auto"/>
+              <w:spacing w:before="60" w:after="80" w:line="259" w:lineRule="auto"/>
             </w:pPr>
             <w:r>
               <w:rPr>
-                <w:sz w:val="18"/>
+                <w:sz w:val="19"/>
               </w:rPr>
-              <w:t>The motor supplies driving power. It drives the sheave directly in a gearless lift or through reduction gearing in a geared lift.</w:t>
-            </w:r>
-          </w:p>
-        </w:tc>
-        <w:tc>
-          <w:tcPr>
-            <w:tcW w:type="dxa" w:w="2154"/>
-          </w:tcPr>
-          <w:p>
-            <w:pPr>
-              <w:spacing w:before="40" w:after="60" w:line="252" w:lineRule="auto"/>
-            </w:pPr>
-            <w:r>
-              <w:rPr>
-                <w:sz w:val="18"/>
-              </w:rPr>
-              <w:t>L1 p. 10 “Drive”;</w:t>
-              <w:br/>
-              <w:t>pp. 26, 29</w:t>
+              <w:t>At a predetermined overspeed, the governor initiates stopping and applies the safety gear or auxiliary brake when necessary. Its rope and tension sheave form the associated arrangement.</w:t>
             </w:r>
           </w:p>
         </w:tc>
@@ -654,70 +794,52 @@
         </w:trPr>
         <w:tc>
           <w:tcPr>
-            <w:tcW w:type="dxa" w:w="1701"/>
+            <w:tcW w:type="dxa" w:w="2098"/>
           </w:tcPr>
           <w:p>
             <w:pPr>
-              <w:spacing w:before="40" w:after="60" w:line="252" w:lineRule="auto"/>
+              <w:spacing w:before="60" w:after="80" w:line="259" w:lineRule="auto"/>
             </w:pPr>
             <w:r>
               <w:rPr>
                 <w:b/>
-                <w:sz w:val="18"/>
+                <w:sz w:val="19"/>
               </w:rPr>
-              <w:t>3 曳引轮及减速装置</w:t>
+              <w:t>11 安全钳</w:t>
               <w:br/>
-              <w:t>Traction sheave and reduction gearing</w:t>
+              <w:t>Safety gear</w:t>
             </w:r>
           </w:p>
         </w:tc>
         <w:tc>
           <w:tcPr>
-            <w:tcW w:type="dxa" w:w="2608"/>
+            <w:tcW w:type="dxa" w:w="3288"/>
           </w:tcPr>
           <w:p>
             <w:pPr>
-              <w:spacing w:before="40" w:after="60" w:line="252" w:lineRule="auto"/>
+              <w:spacing w:before="60" w:after="80" w:line="259" w:lineRule="auto"/>
             </w:pPr>
             <w:r>
               <w:rPr>
-                <w:sz w:val="18"/>
+                <w:sz w:val="19"/>
               </w:rPr>
-              <w:t>曳引轮通过与钢丝绳的摩擦传递牵引力。有齿轮式的减速装置降低电动机输出转速。</w:t>
+              <w:t>在向下超速或悬吊失效等情况下，作用于导轨，使轿厢停止并保持静止。</w:t>
             </w:r>
           </w:p>
         </w:tc>
         <w:tc>
           <w:tcPr>
-            <w:tcW w:type="dxa" w:w="3628"/>
+            <w:tcW w:type="dxa" w:w="4706"/>
           </w:tcPr>
           <w:p>
             <w:pPr>
-              <w:spacing w:before="40" w:after="60" w:line="252" w:lineRule="auto"/>
+              <w:spacing w:before="60" w:after="80" w:line="259" w:lineRule="auto"/>
             </w:pPr>
             <w:r>
               <w:rPr>
-                <w:sz w:val="18"/>
+                <w:sz w:val="19"/>
               </w:rPr>
-              <w:t>The sheave transmits driving force to the ropes through friction. In a geared lift, the reduction unit reduces motor speed before driving the sheave.</w:t>
-            </w:r>
-          </w:p>
-        </w:tc>
-        <w:tc>
-          <w:tcPr>
-            <w:tcW w:type="dxa" w:w="2154"/>
-          </w:tcPr>
-          <w:p>
-            <w:pPr>
-              <w:spacing w:before="40" w:after="60" w:line="252" w:lineRule="auto"/>
-            </w:pPr>
-            <w:r>
-              <w:rPr>
-                <w:sz w:val="18"/>
-              </w:rPr>
-              <w:t>L1 pp. 26, 29–30</w:t>
-              <w:br/>
-              <w:t>传力过程结合图示</w:t>
+              <w:t>The safety gear acts on the guide rails to stop and hold the car during downward overspeed or suspension failure.</w:t>
             </w:r>
           </w:p>
         </w:tc>
@@ -728,68 +850,52 @@
         </w:trPr>
         <w:tc>
           <w:tcPr>
-            <w:tcW w:type="dxa" w:w="1701"/>
+            <w:tcW w:type="dxa" w:w="2098"/>
           </w:tcPr>
           <w:p>
             <w:pPr>
-              <w:spacing w:before="40" w:after="60" w:line="252" w:lineRule="auto"/>
+              <w:spacing w:before="60" w:after="80" w:line="259" w:lineRule="auto"/>
             </w:pPr>
             <w:r>
               <w:rPr>
                 <w:b/>
-                <w:sz w:val="18"/>
+                <w:sz w:val="19"/>
               </w:rPr>
-              <w:t>4 悬吊钢丝绳</w:t>
+              <w:t>12 平层及限位装置</w:t>
               <w:br/>
-              <w:t>Suspension / hoisting ropes</w:t>
+              <w:t>Levelling and limit devices</w:t>
             </w:r>
           </w:p>
         </w:tc>
         <w:tc>
           <w:tcPr>
-            <w:tcW w:type="dxa" w:w="2608"/>
+            <w:tcW w:type="dxa" w:w="3288"/>
           </w:tcPr>
           <w:p>
             <w:pPr>
-              <w:spacing w:before="40" w:after="60" w:line="252" w:lineRule="auto"/>
+              <w:spacing w:before="60" w:after="80" w:line="259" w:lineRule="auto"/>
             </w:pPr>
             <w:r>
               <w:rPr>
-                <w:sz w:val="18"/>
+                <w:sz w:val="19"/>
               </w:rPr>
-              <w:t>悬吊轿厢和对重，并传递曳引轮的驱动力。</w:t>
+              <w:t>平层装置提高停靠楼层的准确度；限位或终端停止开关防止轿厢越过允许行程。</w:t>
             </w:r>
           </w:p>
         </w:tc>
         <w:tc>
           <w:tcPr>
-            <w:tcW w:type="dxa" w:w="3628"/>
+            <w:tcW w:type="dxa" w:w="4706"/>
           </w:tcPr>
           <w:p>
             <w:pPr>
-              <w:spacing w:before="40" w:after="60" w:line="252" w:lineRule="auto"/>
+              <w:spacing w:before="60" w:after="80" w:line="259" w:lineRule="auto"/>
             </w:pPr>
             <w:r>
               <w:rPr>
-                <w:sz w:val="18"/>
+                <w:sz w:val="19"/>
               </w:rPr>
-              <w:t>The ropes suspend the car and counterweight and transmit the driving force from the traction sheave.</w:t>
-            </w:r>
-          </w:p>
-        </w:tc>
-        <w:tc>
-          <w:tcPr>
-            <w:tcW w:type="dxa" w:w="2154"/>
-          </w:tcPr>
-          <w:p>
-            <w:pPr>
-              <w:spacing w:before="40" w:after="60" w:line="252" w:lineRule="auto"/>
-            </w:pPr>
-            <w:r>
-              <w:rPr>
-                <w:sz w:val="18"/>
-              </w:rPr>
-              <w:t>L1 p. 15 “Suspension Ropes”; pp. 10, 35 图示</w:t>
+              <w:t>Levelling improves stopping accuracy at landings. Limit or terminal stopping switches prevent travel beyond the permitted limits.</w:t>
             </w:r>
           </w:p>
         </w:tc>
@@ -800,700 +906,16 @@
         </w:trPr>
         <w:tc>
           <w:tcPr>
-            <w:tcW w:type="dxa" w:w="1701"/>
+            <w:tcW w:type="dxa" w:w="2098"/>
           </w:tcPr>
           <w:p>
             <w:pPr>
-              <w:spacing w:before="40" w:after="60" w:line="252" w:lineRule="auto"/>
+              <w:spacing w:before="60" w:after="80" w:line="259" w:lineRule="auto"/>
             </w:pPr>
             <w:r>
               <w:rPr>
                 <w:b/>
-                <w:sz w:val="18"/>
-              </w:rPr>
-              <w:t>5 对重</w:t>
-              <w:br/>
-              <w:t>Counterweight</w:t>
-            </w:r>
-          </w:p>
-        </w:tc>
-        <w:tc>
-          <w:tcPr>
-            <w:tcW w:type="dxa" w:w="2608"/>
-          </w:tcPr>
-          <w:p>
-            <w:pPr>
-              <w:spacing w:before="40" w:after="60" w:line="252" w:lineRule="auto"/>
-            </w:pPr>
-            <w:r>
-              <w:rPr>
-                <w:sz w:val="18"/>
-              </w:rPr>
-              <w:t>平衡轿厢及部分载荷重量，减少驱动功率，使电动机主要克服不平衡负载和摩擦。</w:t>
-            </w:r>
-          </w:p>
-        </w:tc>
-        <w:tc>
-          <w:tcPr>
-            <w:tcW w:type="dxa" w:w="3628"/>
-          </w:tcPr>
-          <w:p>
-            <w:pPr>
-              <w:spacing w:before="40" w:after="60" w:line="252" w:lineRule="auto"/>
-            </w:pPr>
-            <w:r>
-              <w:rPr>
-                <w:sz w:val="18"/>
-              </w:rPr>
-              <w:t>The counterweight balances the car and part of its load, reducing the power needed to overcome the unbalanced load and friction.</w:t>
-            </w:r>
-          </w:p>
-        </w:tc>
-        <w:tc>
-          <w:tcPr>
-            <w:tcW w:type="dxa" w:w="2154"/>
-          </w:tcPr>
-          <w:p>
-            <w:pPr>
-              <w:spacing w:before="40" w:after="60" w:line="252" w:lineRule="auto"/>
-            </w:pPr>
-            <w:r>
-              <w:rPr>
-                <w:sz w:val="18"/>
-              </w:rPr>
-              <w:t>L1 p. 16 “Counterweight”; p. 25 “Counterweight system”</w:t>
-            </w:r>
-          </w:p>
-        </w:tc>
-      </w:tr>
-      <w:tr>
-        <w:trPr>
-          <w:cantSplit/>
-        </w:trPr>
-        <w:tc>
-          <w:tcPr>
-            <w:tcW w:type="dxa" w:w="1701"/>
-          </w:tcPr>
-          <w:p>
-            <w:pPr>
-              <w:spacing w:before="40" w:after="60" w:line="252" w:lineRule="auto"/>
-            </w:pPr>
-            <w:r>
-              <w:rPr>
-                <w:b/>
-                <w:sz w:val="18"/>
-              </w:rPr>
-              <w:t>6 导轨及导靴／滚轮</w:t>
-              <w:br/>
-              <w:t>Guide rails and shoes / rollers</w:t>
-            </w:r>
-          </w:p>
-        </w:tc>
-        <w:tc>
-          <w:tcPr>
-            <w:tcW w:type="dxa" w:w="2608"/>
-          </w:tcPr>
-          <w:p>
-            <w:pPr>
-              <w:spacing w:before="40" w:after="60" w:line="252" w:lineRule="auto"/>
-            </w:pPr>
-            <w:r>
-              <w:rPr>
-                <w:sz w:val="18"/>
-              </w:rPr>
-              <w:t>引导轿厢和对重沿规定垂直路径运行，并限制横向移动。</w:t>
-            </w:r>
-          </w:p>
-        </w:tc>
-        <w:tc>
-          <w:tcPr>
-            <w:tcW w:type="dxa" w:w="3628"/>
-          </w:tcPr>
-          <w:p>
-            <w:pPr>
-              <w:spacing w:before="40" w:after="60" w:line="252" w:lineRule="auto"/>
-            </w:pPr>
-            <w:r>
-              <w:rPr>
-                <w:sz w:val="18"/>
-              </w:rPr>
-              <w:t>They guide the car and counterweight along their vertical paths and restrain lateral movement.</w:t>
-            </w:r>
-          </w:p>
-        </w:tc>
-        <w:tc>
-          <w:tcPr>
-            <w:tcW w:type="dxa" w:w="2154"/>
-          </w:tcPr>
-          <w:p>
-            <w:pPr>
-              <w:spacing w:before="40" w:after="60" w:line="252" w:lineRule="auto"/>
-            </w:pPr>
-            <w:r>
-              <w:rPr>
-                <w:sz w:val="18"/>
-              </w:rPr>
-              <w:t>L1 p. 16 “Guides”;</w:t>
-              <w:br/>
-              <w:t>pp. 10–11, 35 图示</w:t>
-            </w:r>
-          </w:p>
-        </w:tc>
-      </w:tr>
-      <w:tr>
-        <w:trPr>
-          <w:cantSplit/>
-        </w:trPr>
-        <w:tc>
-          <w:tcPr>
-            <w:tcW w:type="dxa" w:w="1701"/>
-          </w:tcPr>
-          <w:p>
-            <w:pPr>
-              <w:spacing w:before="40" w:after="60" w:line="252" w:lineRule="auto"/>
-            </w:pPr>
-            <w:r>
-              <w:rPr>
-                <w:b/>
-                <w:sz w:val="18"/>
-              </w:rPr>
-              <w:t>7 制动器</w:t>
-              <w:br/>
-              <w:t>Brake</w:t>
-            </w:r>
-          </w:p>
-        </w:tc>
-        <w:tc>
-          <w:tcPr>
-            <w:tcW w:type="dxa" w:w="2608"/>
-          </w:tcPr>
-          <w:p>
-            <w:pPr>
-              <w:spacing w:before="40" w:after="60" w:line="252" w:lineRule="auto"/>
-            </w:pPr>
-            <w:r>
-              <w:rPr>
-                <w:sz w:val="18"/>
-              </w:rPr>
-              <w:t>使驱动系统停止并保持静止。课件介绍弹簧施闸、电力释放的结构；有齿轮式通常装在电动机与减速装置之间。</w:t>
-            </w:r>
-          </w:p>
-        </w:tc>
-        <w:tc>
-          <w:tcPr>
-            <w:tcW w:type="dxa" w:w="3628"/>
-          </w:tcPr>
-          <w:p>
-            <w:pPr>
-              <w:spacing w:before="40" w:after="60" w:line="252" w:lineRule="auto"/>
-            </w:pPr>
-            <w:r>
-              <w:rPr>
-                <w:sz w:val="18"/>
-              </w:rPr>
-              <w:t>The brake stops and holds the drive system. It is spring-applied and electrically released. In a geared lift, it normally sits between the motor and reduction unit.</w:t>
-            </w:r>
-          </w:p>
-        </w:tc>
-        <w:tc>
-          <w:tcPr>
-            <w:tcW w:type="dxa" w:w="2154"/>
-          </w:tcPr>
-          <w:p>
-            <w:pPr>
-              <w:spacing w:before="40" w:after="60" w:line="252" w:lineRule="auto"/>
-            </w:pPr>
-            <w:r>
-              <w:rPr>
-                <w:sz w:val="18"/>
-              </w:rPr>
-              <w:t>L1 pp. 26, 28–29</w:t>
-            </w:r>
-          </w:p>
-        </w:tc>
-      </w:tr>
-    </w:tbl>
-    <w:p>
-      <w:pPr>
-        <w:spacing w:after="160"/>
-      </w:pPr>
-      <w:r>
-        <w:rPr>
-          <w:color w:val="526875"/>
-          <w:sz w:val="18"/>
-        </w:rPr>
-        <w:t>出处 / Source: L1: “Electric Elevators”, “Suspension Ropes”, “Components”, “Counterweight system” and “Traction System”.</w:t>
-      </w:r>
-    </w:p>
-    <w:p>
-      <w:r>
-        <w:br w:type="page"/>
-      </w:r>
-    </w:p>
-    <w:p>
-      <w:pPr>
-        <w:pStyle w:val="Heading1"/>
-      </w:pPr>
-      <w:r>
-        <w:t>1.2 主要部件及功能 / Major components (2/2)</w:t>
-      </w:r>
-    </w:p>
-    <w:tbl>
-      <w:tblPr>
-        <w:tblStyle w:val="TableGrid"/>
-        <w:tblW w:type="auto" w:w="0"/>
-        <w:tblLayout w:type="fixed"/>
-        <w:tblLook w:firstColumn="1" w:firstRow="1" w:lastColumn="0" w:lastRow="0" w:noHBand="0" w:noVBand="1" w:val="04A0"/>
-      </w:tblPr>
-      <w:tblGrid>
-        <w:gridCol w:w="2537"/>
-        <w:gridCol w:w="2537"/>
-        <w:gridCol w:w="2537"/>
-        <w:gridCol w:w="2537"/>
-      </w:tblGrid>
-      <w:tr>
-        <w:trPr>
-          <w:tblHeader/>
-        </w:trPr>
-        <w:tc>
-          <w:tcPr>
-            <w:tcW w:type="dxa" w:w="1701"/>
-            <w:shd w:fill="17364D"/>
-          </w:tcPr>
-          <w:p>
-            <w:r>
-              <w:rPr>
-                <w:b/>
-                <w:color w:val="FFFFFF"/>
-              </w:rPr>
-              <w:t>部件 / Component</w:t>
-            </w:r>
-          </w:p>
-        </w:tc>
-        <w:tc>
-          <w:tcPr>
-            <w:tcW w:type="dxa" w:w="2608"/>
-            <w:shd w:fill="17364D"/>
-          </w:tcPr>
-          <w:p>
-            <w:r>
-              <w:rPr>
-                <w:b/>
-                <w:color w:val="FFFFFF"/>
-              </w:rPr>
-              <w:t>中文功能</w:t>
-            </w:r>
-          </w:p>
-        </w:tc>
-        <w:tc>
-          <w:tcPr>
-            <w:tcW w:type="dxa" w:w="3628"/>
-            <w:shd w:fill="17364D"/>
-          </w:tcPr>
-          <w:p>
-            <w:r>
-              <w:rPr>
-                <w:b/>
-                <w:color w:val="FFFFFF"/>
-              </w:rPr>
-              <w:t>Operational function</w:t>
-            </w:r>
-          </w:p>
-        </w:tc>
-        <w:tc>
-          <w:tcPr>
-            <w:tcW w:type="dxa" w:w="2154"/>
-            <w:shd w:fill="17364D"/>
-          </w:tcPr>
-          <w:p>
-            <w:r>
-              <w:rPr>
-                <w:b/>
-                <w:color w:val="FFFFFF"/>
-              </w:rPr>
-              <w:t>PPT 出处 / Source</w:t>
-            </w:r>
-          </w:p>
-        </w:tc>
-      </w:tr>
-      <w:tr>
-        <w:trPr>
-          <w:cantSplit/>
-        </w:trPr>
-        <w:tc>
-          <w:tcPr>
-            <w:tcW w:type="dxa" w:w="1701"/>
-          </w:tcPr>
-          <w:p>
-            <w:pPr>
-              <w:spacing w:before="40" w:after="60" w:line="252" w:lineRule="auto"/>
-            </w:pPr>
-            <w:r>
-              <w:rPr>
-                <w:b/>
-                <w:sz w:val="18"/>
-              </w:rPr>
-              <w:t>8 控制器及传感器</w:t>
-              <w:br/>
-              <w:t>Controller and transducers</w:t>
-            </w:r>
-          </w:p>
-        </w:tc>
-        <w:tc>
-          <w:tcPr>
-            <w:tcW w:type="dxa" w:w="2608"/>
-          </w:tcPr>
-          <w:p>
-            <w:pPr>
-              <w:spacing w:before="40" w:after="60" w:line="252" w:lineRule="auto"/>
-            </w:pPr>
-            <w:r>
-              <w:rPr>
-                <w:sz w:val="18"/>
-              </w:rPr>
-              <w:t>协调运行方向、速度、停车和门的操作；位置及速度传感器提供反馈。</w:t>
-            </w:r>
-          </w:p>
-        </w:tc>
-        <w:tc>
-          <w:tcPr>
-            <w:tcW w:type="dxa" w:w="3628"/>
-          </w:tcPr>
-          <w:p>
-            <w:pPr>
-              <w:spacing w:before="40" w:after="60" w:line="252" w:lineRule="auto"/>
-            </w:pPr>
-            <w:r>
-              <w:rPr>
-                <w:sz w:val="18"/>
-              </w:rPr>
-              <w:t>The controller coordinates direction, speed, stopping and door operation. Position and speed transducers provide feedback.</w:t>
-            </w:r>
-          </w:p>
-        </w:tc>
-        <w:tc>
-          <w:tcPr>
-            <w:tcW w:type="dxa" w:w="2154"/>
-          </w:tcPr>
-          <w:p>
-            <w:pPr>
-              <w:spacing w:before="40" w:after="60" w:line="252" w:lineRule="auto"/>
-            </w:pPr>
-            <w:r>
-              <w:rPr>
-                <w:sz w:val="18"/>
-              </w:rPr>
-              <w:t>L1 pp. 10, 35</w:t>
-              <w:br/>
-              <w:t>结构图／图示释义</w:t>
-            </w:r>
-          </w:p>
-        </w:tc>
-      </w:tr>
-      <w:tr>
-        <w:trPr>
-          <w:cantSplit/>
-        </w:trPr>
-        <w:tc>
-          <w:tcPr>
-            <w:tcW w:type="dxa" w:w="1701"/>
-          </w:tcPr>
-          <w:p>
-            <w:pPr>
-              <w:spacing w:before="40" w:after="60" w:line="252" w:lineRule="auto"/>
-            </w:pPr>
-            <w:r>
-              <w:rPr>
-                <w:b/>
-                <w:sz w:val="18"/>
-              </w:rPr>
-              <w:t>9 门及门安全装置</w:t>
-              <w:br/>
-              <w:t>Doors and door safety devices</w:t>
-            </w:r>
-          </w:p>
-        </w:tc>
-        <w:tc>
-          <w:tcPr>
-            <w:tcW w:type="dxa" w:w="2608"/>
-          </w:tcPr>
-          <w:p>
-            <w:pPr>
-              <w:spacing w:before="40" w:after="60" w:line="252" w:lineRule="auto"/>
-            </w:pPr>
-            <w:r>
-              <w:rPr>
-                <w:sz w:val="18"/>
-              </w:rPr>
-              <w:t>门机负责开关门。层门联锁确保门未正确关闭并锁紧时不能运行；关门期间若有人进入，接近传感器使门重开。</w:t>
-            </w:r>
-          </w:p>
-        </w:tc>
-        <w:tc>
-          <w:tcPr>
-            <w:tcW w:type="dxa" w:w="3628"/>
-          </w:tcPr>
-          <w:p>
-            <w:pPr>
-              <w:spacing w:before="40" w:after="60" w:line="252" w:lineRule="auto"/>
-            </w:pPr>
-            <w:r>
-              <w:rPr>
-                <w:sz w:val="18"/>
-              </w:rPr>
-              <w:t>The operator opens and closes the doors. Interlocks prevent travel unless landing doors are closed and locked. A proximity sensor reopens closing doors when someone enters.</w:t>
-            </w:r>
-          </w:p>
-        </w:tc>
-        <w:tc>
-          <w:tcPr>
-            <w:tcW w:type="dxa" w:w="2154"/>
-          </w:tcPr>
-          <w:p>
-            <w:pPr>
-              <w:spacing w:before="40" w:after="60" w:line="252" w:lineRule="auto"/>
-            </w:pPr>
-            <w:r>
-              <w:rPr>
-                <w:sz w:val="18"/>
-              </w:rPr>
-              <w:t>L1 pp. 17–18 “Landing door interlock”; p. 19; p. 35 图示</w:t>
-            </w:r>
-          </w:p>
-        </w:tc>
-      </w:tr>
-      <w:tr>
-        <w:trPr>
-          <w:cantSplit/>
-        </w:trPr>
-        <w:tc>
-          <w:tcPr>
-            <w:tcW w:type="dxa" w:w="1701"/>
-          </w:tcPr>
-          <w:p>
-            <w:pPr>
-              <w:spacing w:before="40" w:after="60" w:line="252" w:lineRule="auto"/>
-            </w:pPr>
-            <w:r>
-              <w:rPr>
-                <w:b/>
-                <w:sz w:val="18"/>
-              </w:rPr>
-              <w:t>10 限速器、绳及张紧轮</w:t>
-              <w:br/>
-              <w:t>Governor, rope and tension sheave</w:t>
-            </w:r>
-          </w:p>
-        </w:tc>
-        <w:tc>
-          <w:tcPr>
-            <w:tcW w:type="dxa" w:w="2608"/>
-          </w:tcPr>
-          <w:p>
-            <w:pPr>
-              <w:spacing w:before="40" w:after="60" w:line="252" w:lineRule="auto"/>
-            </w:pPr>
-            <w:r>
-              <w:rPr>
-                <w:sz w:val="18"/>
-              </w:rPr>
-              <w:t>限速器在达到预定超速值时触发停止，并在需要时使安全钳或辅助制动器动作。绳及张紧轮构成相关机械布置。</w:t>
-            </w:r>
-          </w:p>
-        </w:tc>
-        <w:tc>
-          <w:tcPr>
-            <w:tcW w:type="dxa" w:w="3628"/>
-          </w:tcPr>
-          <w:p>
-            <w:pPr>
-              <w:spacing w:before="40" w:after="60" w:line="252" w:lineRule="auto"/>
-            </w:pPr>
-            <w:r>
-              <w:rPr>
-                <w:sz w:val="18"/>
-              </w:rPr>
-              <w:t>At a predetermined overspeed, the governor initiates stopping and applies the safety gear or auxiliary brake when necessary. Its rope and tension sheave form the associated arrangement.</w:t>
-            </w:r>
-          </w:p>
-        </w:tc>
-        <w:tc>
-          <w:tcPr>
-            <w:tcW w:type="dxa" w:w="2154"/>
-          </w:tcPr>
-          <w:p>
-            <w:pPr>
-              <w:spacing w:before="40" w:after="60" w:line="252" w:lineRule="auto"/>
-            </w:pPr>
-            <w:r>
-              <w:rPr>
-                <w:sz w:val="18"/>
-              </w:rPr>
-              <w:t>L1 p. 20 “Overspeed Governor”; p. 35 图示</w:t>
-            </w:r>
-          </w:p>
-        </w:tc>
-      </w:tr>
-      <w:tr>
-        <w:trPr>
-          <w:cantSplit/>
-        </w:trPr>
-        <w:tc>
-          <w:tcPr>
-            <w:tcW w:type="dxa" w:w="1701"/>
-          </w:tcPr>
-          <w:p>
-            <w:pPr>
-              <w:spacing w:before="40" w:after="60" w:line="252" w:lineRule="auto"/>
-            </w:pPr>
-            <w:r>
-              <w:rPr>
-                <w:b/>
-                <w:sz w:val="18"/>
-              </w:rPr>
-              <w:t>11 安全钳</w:t>
-              <w:br/>
-              <w:t>Safety gear</w:t>
-            </w:r>
-          </w:p>
-        </w:tc>
-        <w:tc>
-          <w:tcPr>
-            <w:tcW w:type="dxa" w:w="2608"/>
-          </w:tcPr>
-          <w:p>
-            <w:pPr>
-              <w:spacing w:before="40" w:after="60" w:line="252" w:lineRule="auto"/>
-            </w:pPr>
-            <w:r>
-              <w:rPr>
-                <w:sz w:val="18"/>
-              </w:rPr>
-              <w:t>在向下超速或悬吊失效等情况下，作用于导轨，使轿厢停止并保持静止。</w:t>
-            </w:r>
-          </w:p>
-        </w:tc>
-        <w:tc>
-          <w:tcPr>
-            <w:tcW w:type="dxa" w:w="3628"/>
-          </w:tcPr>
-          <w:p>
-            <w:pPr>
-              <w:spacing w:before="40" w:after="60" w:line="252" w:lineRule="auto"/>
-            </w:pPr>
-            <w:r>
-              <w:rPr>
-                <w:sz w:val="18"/>
-              </w:rPr>
-              <w:t>The safety gear acts on the guide rails to stop and hold the car during downward overspeed or suspension failure.</w:t>
-            </w:r>
-          </w:p>
-        </w:tc>
-        <w:tc>
-          <w:tcPr>
-            <w:tcW w:type="dxa" w:w="2154"/>
-          </w:tcPr>
-          <w:p>
-            <w:pPr>
-              <w:spacing w:before="40" w:after="60" w:line="252" w:lineRule="auto"/>
-            </w:pPr>
-            <w:r>
-              <w:rPr>
-                <w:sz w:val="18"/>
-              </w:rPr>
-              <w:t>L1 p. 21 “Safety Gear”; p. 24 “Safety Devices”</w:t>
-            </w:r>
-          </w:p>
-        </w:tc>
-      </w:tr>
-      <w:tr>
-        <w:trPr>
-          <w:cantSplit/>
-        </w:trPr>
-        <w:tc>
-          <w:tcPr>
-            <w:tcW w:type="dxa" w:w="1701"/>
-          </w:tcPr>
-          <w:p>
-            <w:pPr>
-              <w:spacing w:before="40" w:after="60" w:line="252" w:lineRule="auto"/>
-            </w:pPr>
-            <w:r>
-              <w:rPr>
-                <w:b/>
-                <w:sz w:val="18"/>
-              </w:rPr>
-              <w:t>12 平层及限位装置</w:t>
-              <w:br/>
-              <w:t>Levelling and limit devices</w:t>
-            </w:r>
-          </w:p>
-        </w:tc>
-        <w:tc>
-          <w:tcPr>
-            <w:tcW w:type="dxa" w:w="2608"/>
-          </w:tcPr>
-          <w:p>
-            <w:pPr>
-              <w:spacing w:before="40" w:after="60" w:line="252" w:lineRule="auto"/>
-            </w:pPr>
-            <w:r>
-              <w:rPr>
-                <w:sz w:val="18"/>
-              </w:rPr>
-              <w:t>平层装置提高停靠楼层的准确度；限位或终端停止开关防止轿厢越过允许行程。</w:t>
-            </w:r>
-          </w:p>
-        </w:tc>
-        <w:tc>
-          <w:tcPr>
-            <w:tcW w:type="dxa" w:w="3628"/>
-          </w:tcPr>
-          <w:p>
-            <w:pPr>
-              <w:spacing w:before="40" w:after="60" w:line="252" w:lineRule="auto"/>
-            </w:pPr>
-            <w:r>
-              <w:rPr>
-                <w:sz w:val="18"/>
-              </w:rPr>
-              <w:t>Levelling improves stopping accuracy at landings. Limit or terminal stopping switches prevent travel beyond the permitted limits.</w:t>
-            </w:r>
-          </w:p>
-        </w:tc>
-        <w:tc>
-          <w:tcPr>
-            <w:tcW w:type="dxa" w:w="2154"/>
-          </w:tcPr>
-          <w:p>
-            <w:pPr>
-              <w:spacing w:before="40" w:after="60" w:line="252" w:lineRule="auto"/>
-            </w:pPr>
-            <w:r>
-              <w:rPr>
-                <w:sz w:val="18"/>
-              </w:rPr>
-              <w:t>L1 p. 19 “Leveling”; pp. 24, 35</w:t>
-            </w:r>
-          </w:p>
-        </w:tc>
-      </w:tr>
-      <w:tr>
-        <w:trPr>
-          <w:cantSplit/>
-        </w:trPr>
-        <w:tc>
-          <w:tcPr>
-            <w:tcW w:type="dxa" w:w="1701"/>
-          </w:tcPr>
-          <w:p>
-            <w:pPr>
-              <w:spacing w:before="40" w:after="60" w:line="252" w:lineRule="auto"/>
-            </w:pPr>
-            <w:r>
-              <w:rPr>
-                <w:b/>
-                <w:sz w:val="18"/>
+                <w:sz w:val="19"/>
               </w:rPr>
               <w:t>13 缓冲器</w:t>
               <w:br/>
@@ -1503,15 +925,15 @@
         </w:tc>
         <w:tc>
           <w:tcPr>
-            <w:tcW w:type="dxa" w:w="2608"/>
+            <w:tcW w:type="dxa" w:w="3288"/>
           </w:tcPr>
           <w:p>
             <w:pPr>
-              <w:spacing w:before="40" w:after="60" w:line="252" w:lineRule="auto"/>
+              <w:spacing w:before="60" w:after="80" w:line="259" w:lineRule="auto"/>
             </w:pPr>
             <w:r>
               <w:rPr>
-                <w:sz w:val="18"/>
+                <w:sz w:val="19"/>
               </w:rPr>
               <w:t>在行程底部发生越程冲击时吸收能量。油压缓冲器通过流体阻尼产生制动作用。</w:t>
             </w:r>
@@ -1519,33 +941,17 @@
         </w:tc>
         <w:tc>
           <w:tcPr>
-            <w:tcW w:type="dxa" w:w="3628"/>
+            <w:tcW w:type="dxa" w:w="4706"/>
           </w:tcPr>
           <w:p>
             <w:pPr>
-              <w:spacing w:before="40" w:after="60" w:line="252" w:lineRule="auto"/>
+              <w:spacing w:before="60" w:after="80" w:line="259" w:lineRule="auto"/>
             </w:pPr>
             <w:r>
               <w:rPr>
-                <w:sz w:val="18"/>
+                <w:sz w:val="19"/>
               </w:rPr>
               <w:t>Buffers absorb impact energy at the lower end of travel. Oil buffers provide braking through fluid resistance.</w:t>
-            </w:r>
-          </w:p>
-        </w:tc>
-        <w:tc>
-          <w:tcPr>
-            <w:tcW w:type="dxa" w:w="2154"/>
-          </w:tcPr>
-          <w:p>
-            <w:pPr>
-              <w:spacing w:before="40" w:after="60" w:line="252" w:lineRule="auto"/>
-            </w:pPr>
-            <w:r>
-              <w:rPr>
-                <w:sz w:val="18"/>
-              </w:rPr>
-              <w:t>L1 p. 20 “Oil Buffer”; pp. 24, 35</w:t>
             </w:r>
           </w:p>
         </w:tc>
@@ -1561,59 +967,12 @@
     </w:p>
     <w:p>
       <w:r>
-        <w:t>随行电缆连接固定设备与移动轿厢，传送电源及控制信号。补偿绳及补偿轮用于补偿轿厢位置改变时的悬吊绳重量不平衡，并非所有简化配置均需画出。</w:t>
+        <w:t>随行电缆连接固定设备与移动轿厢，传送电源和控制信号。补偿绳及补偿轮用于补偿轿厢位置改变时的悬吊绳重量不平衡。</w:t>
       </w:r>
     </w:p>
     <w:p>
       <w:r>
-        <w:t>Travelling cables carry power and control signals between fixed equipment and the moving car. Compensation ropes and sheaves compensate for changes in suspension-rope weight balance as the car changes position; they need not appear in every simplified arrangement.</w:t>
-      </w:r>
-    </w:p>
-    <w:p>
-      <w:pPr>
-        <w:spacing w:after="160"/>
-      </w:pPr>
-      <w:r>
-        <w:rPr>
-          <w:color w:val="526875"/>
-          <w:sz w:val="18"/>
-        </w:rPr>
-        <w:t>出处 / Source: L1 pp. 10–11, 35: travelling cables; pp. 10–11: compensation ropes and sheave. Diagram-based explanations / 图示释义。</w:t>
-      </w:r>
-    </w:p>
-    <w:p>
-      <w:r>
-        <w:br w:type="page"/>
-      </w:r>
-    </w:p>
-    <w:p>
-      <w:pPr>
-        <w:pStyle w:val="Heading1"/>
-      </w:pPr>
-      <w:r>
-        <w:t>1.3 运行过程 / Traction operating sequence</w:t>
-      </w:r>
-    </w:p>
-    <w:p>
-      <w:r>
-        <w:t>收到指令后，控制系统在门已关闭、联锁条件满足时释放制动器，并控制电动机驱动曳引轮。钢丝绳带动轿厢与对重反向移动。接近目标楼层时，系统减速和平层；停车后由制动器保持静止，再开门。</w:t>
-      </w:r>
-    </w:p>
-    <w:p>
-      <w:r>
-        <w:t>After a travel command, the controller releases the brake and operates the motor once the doors are closed and interlock conditions are satisfied. The sheave moves the ropes, causing opposite travel of the car and counterweight. Near the destination, the system slows and levels the car. The brake holds the stopped car before the doors open.</w:t>
-      </w:r>
-    </w:p>
-    <w:p>
-      <w:pPr>
-        <w:spacing w:after="160"/>
-      </w:pPr>
-      <w:r>
-        <w:rPr>
-          <w:color w:val="526875"/>
-          <w:sz w:val="18"/>
-        </w:rPr>
-        <w:t>出处 / Source: Synthesis of L1 pp. 17–19, 25–29 and 35 / 综合课件部件功能整理。</w:t>
+        <w:t>Travelling cables carry power and control signals between fixed equipment and the moving car. Compensation ropes and sheaves compensate for changes in suspension-rope weight balance as the car changes position.</w:t>
       </w:r>
     </w:p>
     <w:p>
@@ -1621,59 +980,17 @@
         <w:pStyle w:val="Heading2"/>
       </w:pPr>
       <w:r>
-        <w:t>制动器与安全钳的区别 / Brake versus safety gear</w:t>
+        <w:t>1.2 运作过程 / Operation</w:t>
       </w:r>
     </w:p>
     <w:p>
       <w:r>
-        <w:t>制动器作用于驱动系统，用于停止及保持。安全钳则是在向下超速或悬吊失效等异常情况下，作用于导轨的机械安全装置。两者应分开解释。</w:t>
+        <w:t>门关闭且联锁条件满足后，控制器释放制动器并启动驱动系统，带动轿厢和对重反向移动。接近目标楼层时减速和平层，停车后由制动器保持静止，再开门。限速器与安全钳提供异常超速时的保护。</w:t>
       </w:r>
     </w:p>
     <w:p>
       <w:r>
-        <w:t>The brake acts on the drive system to stop and hold it. The safety gear is a mechanical device that acts on the guide rails during conditions such as downward overspeed or suspension failure. Their functions should be explained separately.</w:t>
-      </w:r>
-    </w:p>
-    <w:p>
-      <w:pPr>
-        <w:spacing w:after="160"/>
-      </w:pPr>
-      <w:r>
-        <w:rPr>
-          <w:color w:val="526875"/>
-          <w:sz w:val="18"/>
-        </w:rPr>
-        <w:t>出处 / Source: L1 pp. 21, 24, 26 and 29.</w:t>
-      </w:r>
-    </w:p>
-    <w:p>
-      <w:pPr>
-        <w:pStyle w:val="Heading2"/>
-      </w:pPr>
-      <w:r>
-        <w:t>有齿轮与无齿轮 / Geared and gearless drives</w:t>
-      </w:r>
-    </w:p>
-    <w:p>
-      <w:r>
-        <w:t>有齿轮式由高速电动机通过蜗杆及齿轮减速装置驱动曳引轮；无齿轮式由低速电动机直接连接曳引轮。减速箱应注明为有齿轮式所需的部件。</w:t>
-      </w:r>
-    </w:p>
-    <w:p>
-      <w:r>
-        <w:t>A geared lift uses a high-speed motor with a worm-and-gear reduction unit to drive the sheave. In a gearless lift, a low-speed motor is directly connected to the sheave. A gearbox should therefore be identified as a component of the geared arrangement.</w:t>
-      </w:r>
-    </w:p>
-    <w:p>
-      <w:pPr>
-        <w:spacing w:after="160"/>
-      </w:pPr>
-      <w:r>
-        <w:rPr>
-          <w:color w:val="526875"/>
-          <w:sz w:val="18"/>
-        </w:rPr>
-        <w:t>出处 / Source: L1 pp. 26–29; drive illustrations on pp. 14 and 30.</w:t>
+        <w:t>Once the doors are closed and interlock conditions are satisfied, the controller releases the brake and operates the drive, moving the car and counterweight in opposite directions. The car slows and levels at the destination, the brake holds it stationary, and the doors open. The governor and safety gear provide protection during abnormal overspeed.</w:t>
       </w:r>
     </w:p>
     <w:p>
@@ -1690,43 +1007,24 @@
       </w:r>
     </w:p>
     <w:p>
-      <w:pPr>
-        <w:pStyle w:val="Heading2"/>
-      </w:pPr>
       <w:r>
-        <w:t>2.1 基本原理 / Operating principle</w:t>
+        <w:t>直顶式液压升降机利用油泵把液压油送入油缸，油压推动柱塞伸出，直接顶升轿厢。典型埋地式结构的油缸向地下延伸，以容纳所需的柱塞行程。</w:t>
       </w:r>
     </w:p>
     <w:p>
       <w:r>
-        <w:t>油泵将液压油送入油缸，油压使柱塞伸出，直接顶升轿厢。课件所示的典型埋地式油缸向地下延伸，以容纳柱塞所需的行程。</w:t>
-      </w:r>
-    </w:p>
-    <w:p>
-      <w:r>
-        <w:t>The pump delivers oil into a cylinder. Oil pressure extends the plunger, which directly raises the car. In the conventional in-ground arrangement illustrated, the cylinder extends below ground to accommodate the required plunger travel.</w:t>
+        <w:t>A direct-ram hydraulic lift pumps oil into a cylinder. Oil pressure extends the plunger, which directly raises the car. In a conventional in-ground arrangement, the cylinder extends below ground to accommodate the required plunger travel.</w:t>
       </w:r>
     </w:p>
     <w:p>
       <w:pPr>
-        <w:spacing w:after="160"/>
-      </w:pPr>
-      <w:r>
-        <w:rPr>
-          <w:color w:val="526875"/>
-          <w:sz w:val="18"/>
-        </w:rPr>
-        <w:t>出处 / Source: L1 p. 32 “Hydraulic Elevators — Direct-ram driven type”; pp. 33 and 35 right diagram.</w:t>
-      </w:r>
-    </w:p>
-    <w:p>
-      <w:pPr>
+        <w:spacing w:after="60"/>
         <w:jc w:val="center"/>
       </w:pPr>
       <w:r>
         <w:drawing>
           <wp:inline xmlns:a="http://schemas.openxmlformats.org/drawingml/2006/main" xmlns:pic="http://schemas.openxmlformats.org/drawingml/2006/picture">
-            <wp:extent cx="6336000" cy="4267317"/>
+            <wp:extent cx="3561342" cy="5940000"/>
             <wp:docPr id="2" name="Picture 2"/>
             <wp:cNvGraphicFramePr>
               <a:graphicFrameLocks noChangeAspect="1"/>
@@ -1735,7 +1033,7 @@
               <a:graphicData uri="http://schemas.openxmlformats.org/drawingml/2006/picture">
                 <pic:pic>
                   <pic:nvPicPr>
-                    <pic:cNvPr id="0" name="hydraulic.png"/>
+                    <pic:cNvPr id="0" name="hydraulic_ppt.png"/>
                     <pic:cNvPicPr/>
                   </pic:nvPicPr>
                   <pic:blipFill>
@@ -1747,7 +1045,7 @@
                   <pic:spPr>
                     <a:xfrm>
                       <a:off x="0" y="0"/>
-                      <a:ext cx="6336000" cy="4267317"/>
+                      <a:ext cx="3561342" cy="5940000"/>
                     </a:xfrm>
                     <a:prstGeom prst="rect"/>
                   </pic:spPr>
@@ -1761,11 +1059,10 @@
     <w:p>
       <w:pPr>
         <w:pStyle w:val="Caption"/>
+        <w:jc w:val="center"/>
       </w:pPr>
       <w:r>
-        <w:t>图 2 / Figure 2. 依据 L1 第 6、32–33、35 页重绘。油路按功能简化；非详细阀组回路，非按比例。</w:t>
-        <w:br/>
-        <w:t>Redrawn from L1 pp. 6, 32–33 and 35. Functional oil-flow schematic, not a detailed valve circuit; not to scale.</w:t>
+        <w:t>图 2 直顶式液压升降机 / Figure 2 Direct-ram hydraulic lift</w:t>
       </w:r>
     </w:p>
     <w:p>
@@ -1778,7 +1075,7 @@
         <w:pStyle w:val="Heading1"/>
       </w:pPr>
       <w:r>
-        <w:t>2.2 主要部件及功能 / Major components (1/2)</w:t>
+        <w:t>2.1 主要部件及功能 / Major components (1/2)</w:t>
       </w:r>
     </w:p>
     <w:tbl>
@@ -1789,10 +1086,9 @@
         <w:tblLook w:firstColumn="1" w:firstRow="1" w:lastColumn="0" w:lastRow="0" w:noHBand="0" w:noVBand="1" w:val="04A0"/>
       </w:tblPr>
       <w:tblGrid>
-        <w:gridCol w:w="2537"/>
-        <w:gridCol w:w="2537"/>
-        <w:gridCol w:w="2537"/>
-        <w:gridCol w:w="2537"/>
+        <w:gridCol w:w="2098"/>
+        <w:gridCol w:w="3288"/>
+        <w:gridCol w:w="4706"/>
       </w:tblGrid>
       <w:tr>
         <w:trPr>
@@ -1800,7 +1096,7 @@
         </w:trPr>
         <w:tc>
           <w:tcPr>
-            <w:tcW w:type="dxa" w:w="1701"/>
+            <w:tcW w:type="dxa" w:w="2098"/>
             <w:shd w:fill="17364D"/>
           </w:tcPr>
           <w:p>
@@ -1815,7 +1111,7 @@
         </w:tc>
         <w:tc>
           <w:tcPr>
-            <w:tcW w:type="dxa" w:w="2608"/>
+            <w:tcW w:type="dxa" w:w="3288"/>
             <w:shd w:fill="17364D"/>
           </w:tcPr>
           <w:p>
@@ -1824,13 +1120,13 @@
                 <w:b/>
                 <w:color w:val="FFFFFF"/>
               </w:rPr>
-              <w:t>中文功能</w:t>
+              <w:t>功能</w:t>
             </w:r>
           </w:p>
         </w:tc>
         <w:tc>
           <w:tcPr>
-            <w:tcW w:type="dxa" w:w="3628"/>
+            <w:tcW w:type="dxa" w:w="4706"/>
             <w:shd w:fill="17364D"/>
           </w:tcPr>
           <w:p>
@@ -1843,18 +1139,59 @@
             </w:r>
           </w:p>
         </w:tc>
+      </w:tr>
+      <w:tr>
+        <w:trPr>
+          <w:cantSplit/>
+        </w:trPr>
         <w:tc>
           <w:tcPr>
-            <w:tcW w:type="dxa" w:w="2154"/>
-            <w:shd w:fill="17364D"/>
+            <w:tcW w:type="dxa" w:w="2098"/>
           </w:tcPr>
           <w:p>
+            <w:pPr>
+              <w:spacing w:before="60" w:after="80" w:line="259" w:lineRule="auto"/>
+            </w:pPr>
             <w:r>
               <w:rPr>
                 <w:b/>
-                <w:color w:val="FFFFFF"/>
+                <w:sz w:val="19"/>
               </w:rPr>
-              <w:t>PPT 出处 / Source</w:t>
+              <w:t>1 轿厢及承托结构</w:t>
+              <w:br/>
+              <w:t>Car and support</w:t>
+            </w:r>
+          </w:p>
+        </w:tc>
+        <w:tc>
+          <w:tcPr>
+            <w:tcW w:type="dxa" w:w="3288"/>
+          </w:tcPr>
+          <w:p>
+            <w:pPr>
+              <w:spacing w:before="60" w:after="80" w:line="259" w:lineRule="auto"/>
+            </w:pPr>
+            <w:r>
+              <w:rPr>
+                <w:sz w:val="19"/>
+              </w:rPr>
+              <w:t>承载乘客或货物，底部由柱塞直接承托。</w:t>
+            </w:r>
+          </w:p>
+        </w:tc>
+        <w:tc>
+          <w:tcPr>
+            <w:tcW w:type="dxa" w:w="4706"/>
+          </w:tcPr>
+          <w:p>
+            <w:pPr>
+              <w:spacing w:before="60" w:after="80" w:line="259" w:lineRule="auto"/>
+            </w:pPr>
+            <w:r>
+              <w:rPr>
+                <w:sz w:val="19"/>
+              </w:rPr>
+              <w:t>The car carries passengers or goods and is supported directly by the plunger beneath it.</w:t>
             </w:r>
           </w:p>
         </w:tc>
@@ -1865,70 +1202,52 @@
         </w:trPr>
         <w:tc>
           <w:tcPr>
-            <w:tcW w:type="dxa" w:w="1701"/>
+            <w:tcW w:type="dxa" w:w="2098"/>
           </w:tcPr>
           <w:p>
             <w:pPr>
-              <w:spacing w:before="40" w:after="60" w:line="252" w:lineRule="auto"/>
+              <w:spacing w:before="60" w:after="80" w:line="259" w:lineRule="auto"/>
             </w:pPr>
             <w:r>
               <w:rPr>
                 <w:b/>
-                <w:sz w:val="18"/>
+                <w:sz w:val="19"/>
               </w:rPr>
-              <w:t>1 轿厢及承托结构</w:t>
+              <w:t>2 柱塞／顶杆</w:t>
               <w:br/>
-              <w:t>Car and support</w:t>
+              <w:t>Plunger / ram</w:t>
             </w:r>
           </w:p>
         </w:tc>
         <w:tc>
           <w:tcPr>
-            <w:tcW w:type="dxa" w:w="2608"/>
+            <w:tcW w:type="dxa" w:w="3288"/>
           </w:tcPr>
           <w:p>
             <w:pPr>
-              <w:spacing w:before="40" w:after="60" w:line="252" w:lineRule="auto"/>
+              <w:spacing w:before="60" w:after="80" w:line="259" w:lineRule="auto"/>
             </w:pPr>
             <w:r>
               <w:rPr>
-                <w:sz w:val="18"/>
+                <w:sz w:val="19"/>
               </w:rPr>
-              <w:t>承载乘客或货物，底部由柱塞直接承托。</w:t>
+              <w:t>把液压作用转化为垂直机械运动；伸出时顶升轿厢，缩回时轿厢下降。</w:t>
             </w:r>
           </w:p>
         </w:tc>
         <w:tc>
           <w:tcPr>
-            <w:tcW w:type="dxa" w:w="3628"/>
+            <w:tcW w:type="dxa" w:w="4706"/>
           </w:tcPr>
           <w:p>
             <w:pPr>
-              <w:spacing w:before="40" w:after="60" w:line="252" w:lineRule="auto"/>
+              <w:spacing w:before="60" w:after="80" w:line="259" w:lineRule="auto"/>
             </w:pPr>
             <w:r>
               <w:rPr>
-                <w:sz w:val="18"/>
+                <w:sz w:val="19"/>
               </w:rPr>
-              <w:t>The car carries passengers or goods and is supported directly by the plunger beneath it.</w:t>
-            </w:r>
-          </w:p>
-        </w:tc>
-        <w:tc>
-          <w:tcPr>
-            <w:tcW w:type="dxa" w:w="2154"/>
-          </w:tcPr>
-          <w:p>
-            <w:pPr>
-              <w:spacing w:before="40" w:after="60" w:line="252" w:lineRule="auto"/>
-            </w:pPr>
-            <w:r>
-              <w:rPr>
-                <w:sz w:val="18"/>
-              </w:rPr>
-              <w:t>L1 pp. 32–33;</w:t>
-              <w:br/>
-              <w:t>p. 35 右图</w:t>
+              <w:t>The plunger converts hydraulic action into vertical movement. Its extension raises the car, and its retraction allows descent.</w:t>
             </w:r>
           </w:p>
         </w:tc>
@@ -1939,70 +1258,52 @@
         </w:trPr>
         <w:tc>
           <w:tcPr>
-            <w:tcW w:type="dxa" w:w="1701"/>
+            <w:tcW w:type="dxa" w:w="2098"/>
           </w:tcPr>
           <w:p>
             <w:pPr>
-              <w:spacing w:before="40" w:after="60" w:line="252" w:lineRule="auto"/>
+              <w:spacing w:before="60" w:after="80" w:line="259" w:lineRule="auto"/>
             </w:pPr>
             <w:r>
               <w:rPr>
                 <w:b/>
-                <w:sz w:val="18"/>
+                <w:sz w:val="19"/>
               </w:rPr>
-              <w:t>2 柱塞／顶杆</w:t>
+              <w:t>3 油缸</w:t>
               <w:br/>
-              <w:t>Plunger / ram</w:t>
+              <w:t>Hydraulic cylinder</w:t>
             </w:r>
           </w:p>
         </w:tc>
         <w:tc>
           <w:tcPr>
-            <w:tcW w:type="dxa" w:w="2608"/>
+            <w:tcW w:type="dxa" w:w="3288"/>
           </w:tcPr>
           <w:p>
             <w:pPr>
-              <w:spacing w:before="40" w:after="60" w:line="252" w:lineRule="auto"/>
+              <w:spacing w:before="60" w:after="80" w:line="259" w:lineRule="auto"/>
             </w:pPr>
             <w:r>
               <w:rPr>
-                <w:sz w:val="18"/>
+                <w:sz w:val="19"/>
               </w:rPr>
-              <w:t>把液压作用转化为垂直机械运动；伸出时顶升轿厢，缩回时轿厢下降。</w:t>
+              <w:t>容纳受压液压油，与柱塞构成顶升机构。典型埋地式油缸向地下延伸，以容纳所需行程。</w:t>
             </w:r>
           </w:p>
         </w:tc>
         <w:tc>
           <w:tcPr>
-            <w:tcW w:type="dxa" w:w="3628"/>
+            <w:tcW w:type="dxa" w:w="4706"/>
           </w:tcPr>
           <w:p>
             <w:pPr>
-              <w:spacing w:before="40" w:after="60" w:line="252" w:lineRule="auto"/>
+              <w:spacing w:before="60" w:after="80" w:line="259" w:lineRule="auto"/>
             </w:pPr>
             <w:r>
               <w:rPr>
-                <w:sz w:val="18"/>
+                <w:sz w:val="19"/>
               </w:rPr>
-              <w:t>The plunger converts hydraulic action into vertical movement. Its extension raises the car, and its retraction allows descent.</w:t>
-            </w:r>
-          </w:p>
-        </w:tc>
-        <w:tc>
-          <w:tcPr>
-            <w:tcW w:type="dxa" w:w="2154"/>
-          </w:tcPr>
-          <w:p>
-            <w:pPr>
-              <w:spacing w:before="40" w:after="60" w:line="252" w:lineRule="auto"/>
-            </w:pPr>
-            <w:r>
-              <w:rPr>
-                <w:sz w:val="18"/>
-              </w:rPr>
-              <w:t>L1 p. 32 正文;</w:t>
-              <w:br/>
-              <w:t>p. 33 “Plunger”</w:t>
+              <w:t>The cylinder contains pressurised oil and forms the actuator with the plunger. In the in-ground arrangement, it extends below ground to accommodate travel.</w:t>
             </w:r>
           </w:p>
         </w:tc>
@@ -2013,68 +1314,52 @@
         </w:trPr>
         <w:tc>
           <w:tcPr>
-            <w:tcW w:type="dxa" w:w="1701"/>
+            <w:tcW w:type="dxa" w:w="2098"/>
           </w:tcPr>
           <w:p>
             <w:pPr>
-              <w:spacing w:before="40" w:after="60" w:line="252" w:lineRule="auto"/>
+              <w:spacing w:before="60" w:after="80" w:line="259" w:lineRule="auto"/>
             </w:pPr>
             <w:r>
               <w:rPr>
                 <w:b/>
-                <w:sz w:val="18"/>
+                <w:sz w:val="19"/>
               </w:rPr>
-              <w:t>3 油缸</w:t>
+              <w:t>4 液压油</w:t>
               <w:br/>
-              <w:t>Hydraulic cylinder</w:t>
+              <w:t>Hydraulic oil</w:t>
             </w:r>
           </w:p>
         </w:tc>
         <w:tc>
           <w:tcPr>
-            <w:tcW w:type="dxa" w:w="2608"/>
+            <w:tcW w:type="dxa" w:w="3288"/>
           </w:tcPr>
           <w:p>
             <w:pPr>
-              <w:spacing w:before="40" w:after="60" w:line="252" w:lineRule="auto"/>
+              <w:spacing w:before="60" w:after="80" w:line="259" w:lineRule="auto"/>
             </w:pPr>
             <w:r>
               <w:rPr>
-                <w:sz w:val="18"/>
+                <w:sz w:val="19"/>
               </w:rPr>
-              <w:t>容纳受压液压油，与柱塞构成顶升机构。典型埋地式油缸向地下延伸，以容纳所需行程。</w:t>
+              <w:t>作为工作介质，把油泵提供的压力传递至柱塞。</w:t>
             </w:r>
           </w:p>
         </w:tc>
         <w:tc>
           <w:tcPr>
-            <w:tcW w:type="dxa" w:w="3628"/>
+            <w:tcW w:type="dxa" w:w="4706"/>
           </w:tcPr>
           <w:p>
             <w:pPr>
-              <w:spacing w:before="40" w:after="60" w:line="252" w:lineRule="auto"/>
+              <w:spacing w:before="60" w:after="80" w:line="259" w:lineRule="auto"/>
             </w:pPr>
             <w:r>
               <w:rPr>
-                <w:sz w:val="18"/>
+                <w:sz w:val="19"/>
               </w:rPr>
-              <w:t>The cylinder contains pressurised oil and forms the actuator with the plunger. In the in-ground arrangement, it extends below ground to accommodate travel.</w:t>
-            </w:r>
-          </w:p>
-        </w:tc>
-        <w:tc>
-          <w:tcPr>
-            <w:tcW w:type="dxa" w:w="2154"/>
-          </w:tcPr>
-          <w:p>
-            <w:pPr>
-              <w:spacing w:before="40" w:after="60" w:line="252" w:lineRule="auto"/>
-            </w:pPr>
-            <w:r>
-              <w:rPr>
-                <w:sz w:val="18"/>
-              </w:rPr>
-              <w:t>L1 p. 32; p. 33 “Cylinder”; p. 35 “Cylinder in borehole”</w:t>
+              <w:t>Hydraulic oil is the working fluid that transmits pump pressure to the plunger.</w:t>
             </w:r>
           </w:p>
         </w:tc>
@@ -2085,68 +1370,52 @@
         </w:trPr>
         <w:tc>
           <w:tcPr>
-            <w:tcW w:type="dxa" w:w="1701"/>
+            <w:tcW w:type="dxa" w:w="2098"/>
           </w:tcPr>
           <w:p>
             <w:pPr>
-              <w:spacing w:before="40" w:after="60" w:line="252" w:lineRule="auto"/>
+              <w:spacing w:before="60" w:after="80" w:line="259" w:lineRule="auto"/>
             </w:pPr>
             <w:r>
               <w:rPr>
                 <w:b/>
-                <w:sz w:val="18"/>
+                <w:sz w:val="19"/>
               </w:rPr>
-              <w:t>4 液压油</w:t>
+              <w:t>5 油箱及油位计</w:t>
               <w:br/>
-              <w:t>Hydraulic oil</w:t>
+              <w:t>Tank and level gauge</w:t>
             </w:r>
           </w:p>
         </w:tc>
         <w:tc>
           <w:tcPr>
-            <w:tcW w:type="dxa" w:w="2608"/>
+            <w:tcW w:type="dxa" w:w="3288"/>
           </w:tcPr>
           <w:p>
             <w:pPr>
-              <w:spacing w:before="40" w:after="60" w:line="252" w:lineRule="auto"/>
+              <w:spacing w:before="60" w:after="80" w:line="259" w:lineRule="auto"/>
             </w:pPr>
             <w:r>
               <w:rPr>
-                <w:sz w:val="18"/>
+                <w:sz w:val="19"/>
               </w:rPr>
-              <w:t>作为工作介质，把油泵提供的压力传递至柱塞。</w:t>
+              <w:t>油箱储油，向油泵供油并接收回油；油位计用于检查油量。</w:t>
             </w:r>
           </w:p>
         </w:tc>
         <w:tc>
           <w:tcPr>
-            <w:tcW w:type="dxa" w:w="3628"/>
+            <w:tcW w:type="dxa" w:w="4706"/>
           </w:tcPr>
           <w:p>
             <w:pPr>
-              <w:spacing w:before="40" w:after="60" w:line="252" w:lineRule="auto"/>
+              <w:spacing w:before="60" w:after="80" w:line="259" w:lineRule="auto"/>
             </w:pPr>
             <w:r>
               <w:rPr>
-                <w:sz w:val="18"/>
+                <w:sz w:val="19"/>
               </w:rPr>
-              <w:t>Hydraulic oil is the working fluid that transmits pump pressure to the plunger.</w:t>
-            </w:r>
-          </w:p>
-        </w:tc>
-        <w:tc>
-          <w:tcPr>
-            <w:tcW w:type="dxa" w:w="2154"/>
-          </w:tcPr>
-          <w:p>
-            <w:pPr>
-              <w:spacing w:before="40" w:after="60" w:line="252" w:lineRule="auto"/>
-            </w:pPr>
-            <w:r>
-              <w:rPr>
-                <w:sz w:val="18"/>
-              </w:rPr>
-              <w:t>L1 p. 32 正文</w:t>
+              <w:t>The tank stores oil, supplies the pump and receives returning oil. The gauge indicates the oil level.</w:t>
             </w:r>
           </w:p>
         </w:tc>
@@ -2157,90 +1426,16 @@
         </w:trPr>
         <w:tc>
           <w:tcPr>
-            <w:tcW w:type="dxa" w:w="1701"/>
+            <w:tcW w:type="dxa" w:w="2098"/>
           </w:tcPr>
           <w:p>
             <w:pPr>
-              <w:spacing w:before="40" w:after="60" w:line="252" w:lineRule="auto"/>
+              <w:spacing w:before="60" w:after="80" w:line="259" w:lineRule="auto"/>
             </w:pPr>
             <w:r>
               <w:rPr>
                 <w:b/>
-                <w:sz w:val="18"/>
-              </w:rPr>
-              <w:t>5 油箱及油位计</w:t>
-              <w:br/>
-              <w:t>Tank and level gauge</w:t>
-            </w:r>
-          </w:p>
-        </w:tc>
-        <w:tc>
-          <w:tcPr>
-            <w:tcW w:type="dxa" w:w="2608"/>
-          </w:tcPr>
-          <w:p>
-            <w:pPr>
-              <w:spacing w:before="40" w:after="60" w:line="252" w:lineRule="auto"/>
-            </w:pPr>
-            <w:r>
-              <w:rPr>
-                <w:sz w:val="18"/>
-              </w:rPr>
-              <w:t>油箱储油，向油泵供油并接收回油；油位计用于检查油量。</w:t>
-            </w:r>
-          </w:p>
-        </w:tc>
-        <w:tc>
-          <w:tcPr>
-            <w:tcW w:type="dxa" w:w="3628"/>
-          </w:tcPr>
-          <w:p>
-            <w:pPr>
-              <w:spacing w:before="40" w:after="60" w:line="252" w:lineRule="auto"/>
-            </w:pPr>
-            <w:r>
-              <w:rPr>
-                <w:sz w:val="18"/>
-              </w:rPr>
-              <w:t>The tank stores oil, supplies the pump and receives returning oil. The gauge indicates the oil level.</w:t>
-            </w:r>
-          </w:p>
-        </w:tc>
-        <w:tc>
-          <w:tcPr>
-            <w:tcW w:type="dxa" w:w="2154"/>
-          </w:tcPr>
-          <w:p>
-            <w:pPr>
-              <w:spacing w:before="40" w:after="60" w:line="252" w:lineRule="auto"/>
-            </w:pPr>
-            <w:r>
-              <w:rPr>
-                <w:sz w:val="18"/>
-              </w:rPr>
-              <w:t>L1 p. 33 “Tank”, “Oil level gauge”; p. 35</w:t>
-              <w:br/>
-              <w:t>图示释义</w:t>
-            </w:r>
-          </w:p>
-        </w:tc>
-      </w:tr>
-      <w:tr>
-        <w:trPr>
-          <w:cantSplit/>
-        </w:trPr>
-        <w:tc>
-          <w:tcPr>
-            <w:tcW w:type="dxa" w:w="1701"/>
-          </w:tcPr>
-          <w:p>
-            <w:pPr>
-              <w:spacing w:before="40" w:after="60" w:line="252" w:lineRule="auto"/>
-            </w:pPr>
-            <w:r>
-              <w:rPr>
-                <w:b/>
-                <w:sz w:val="18"/>
+                <w:sz w:val="19"/>
               </w:rPr>
               <w:t>6 电动机及油泵</w:t>
               <w:br/>
@@ -2250,15 +1445,15 @@
         </w:tc>
         <w:tc>
           <w:tcPr>
-            <w:tcW w:type="dxa" w:w="2608"/>
+            <w:tcW w:type="dxa" w:w="3288"/>
           </w:tcPr>
           <w:p>
             <w:pPr>
-              <w:spacing w:before="40" w:after="60" w:line="252" w:lineRule="auto"/>
+              <w:spacing w:before="60" w:after="80" w:line="259" w:lineRule="auto"/>
             </w:pPr>
             <w:r>
               <w:rPr>
-                <w:sz w:val="18"/>
+                <w:sz w:val="19"/>
               </w:rPr>
               <w:t>电动机驱动油泵，向系统输送液压油，提供顶升所需的压力及流量。</w:t>
             </w:r>
@@ -2266,52 +1461,22 @@
         </w:tc>
         <w:tc>
           <w:tcPr>
-            <w:tcW w:type="dxa" w:w="3628"/>
+            <w:tcW w:type="dxa" w:w="4706"/>
           </w:tcPr>
           <w:p>
             <w:pPr>
-              <w:spacing w:before="40" w:after="60" w:line="252" w:lineRule="auto"/>
+              <w:spacing w:before="60" w:after="80" w:line="259" w:lineRule="auto"/>
             </w:pPr>
             <w:r>
               <w:rPr>
-                <w:sz w:val="18"/>
+                <w:sz w:val="19"/>
               </w:rPr>
               <w:t>The motor drives the pump, which supplies the oil pressure and flow needed to raise the car.</w:t>
             </w:r>
           </w:p>
         </w:tc>
-        <w:tc>
-          <w:tcPr>
-            <w:tcW w:type="dxa" w:w="2154"/>
-          </w:tcPr>
-          <w:p>
-            <w:pPr>
-              <w:spacing w:before="40" w:after="60" w:line="252" w:lineRule="auto"/>
-            </w:pPr>
-            <w:r>
-              <w:rPr>
-                <w:sz w:val="18"/>
-              </w:rPr>
-              <w:t>L1 p. 32 正文;</w:t>
-              <w:br/>
-              <w:t>p. 33 “Motor”, “Pump”; p. 35</w:t>
-            </w:r>
-          </w:p>
-        </w:tc>
       </w:tr>
     </w:tbl>
-    <w:p>
-      <w:pPr>
-        <w:spacing w:after="160"/>
-      </w:pPr>
-      <w:r>
-        <w:rPr>
-          <w:color w:val="526875"/>
-          <w:sz w:val="18"/>
-        </w:rPr>
-        <w:t>出处 / Source: L1 pp. 6, 32–33 and 35. 图示中部件的功能解释参见首页说明 / See the opening note on diagram-based explanations.</w:t>
-      </w:r>
-    </w:p>
     <w:p>
       <w:r>
         <w:br w:type="page"/>
@@ -2322,7 +1487,7 @@
         <w:pStyle w:val="Heading1"/>
       </w:pPr>
       <w:r>
-        <w:t>2.2 主要部件及功能 / Major components (2/2)</w:t>
+        <w:t>2.1 主要部件及功能 / Major components (2/2)</w:t>
       </w:r>
     </w:p>
     <w:tbl>
@@ -2333,10 +1498,9 @@
         <w:tblLook w:firstColumn="1" w:firstRow="1" w:lastColumn="0" w:lastRow="0" w:noHBand="0" w:noVBand="1" w:val="04A0"/>
       </w:tblPr>
       <w:tblGrid>
-        <w:gridCol w:w="2537"/>
-        <w:gridCol w:w="2537"/>
-        <w:gridCol w:w="2537"/>
-        <w:gridCol w:w="2537"/>
+        <w:gridCol w:w="2098"/>
+        <w:gridCol w:w="3288"/>
+        <w:gridCol w:w="4706"/>
       </w:tblGrid>
       <w:tr>
         <w:trPr>
@@ -2344,7 +1508,7 @@
         </w:trPr>
         <w:tc>
           <w:tcPr>
-            <w:tcW w:type="dxa" w:w="1701"/>
+            <w:tcW w:type="dxa" w:w="2098"/>
             <w:shd w:fill="17364D"/>
           </w:tcPr>
           <w:p>
@@ -2359,7 +1523,7 @@
         </w:tc>
         <w:tc>
           <w:tcPr>
-            <w:tcW w:type="dxa" w:w="2608"/>
+            <w:tcW w:type="dxa" w:w="3288"/>
             <w:shd w:fill="17364D"/>
           </w:tcPr>
           <w:p>
@@ -2368,13 +1532,13 @@
                 <w:b/>
                 <w:color w:val="FFFFFF"/>
               </w:rPr>
-              <w:t>中文功能</w:t>
+              <w:t>功能</w:t>
             </w:r>
           </w:p>
         </w:tc>
         <w:tc>
           <w:tcPr>
-            <w:tcW w:type="dxa" w:w="3628"/>
+            <w:tcW w:type="dxa" w:w="4706"/>
             <w:shd w:fill="17364D"/>
           </w:tcPr>
           <w:p>
@@ -2387,18 +1551,59 @@
             </w:r>
           </w:p>
         </w:tc>
+      </w:tr>
+      <w:tr>
+        <w:trPr>
+          <w:cantSplit/>
+        </w:trPr>
         <w:tc>
           <w:tcPr>
-            <w:tcW w:type="dxa" w:w="2154"/>
-            <w:shd w:fill="17364D"/>
+            <w:tcW w:type="dxa" w:w="2098"/>
           </w:tcPr>
           <w:p>
+            <w:pPr>
+              <w:spacing w:before="60" w:after="80" w:line="259" w:lineRule="auto"/>
+            </w:pPr>
             <w:r>
               <w:rPr>
                 <w:b/>
-                <w:color w:val="FFFFFF"/>
+                <w:sz w:val="19"/>
               </w:rPr>
-              <w:t>PPT 出处 / Source</w:t>
+              <w:t>7 控制阀组及油管</w:t>
+              <w:br/>
+              <w:t>Valve block and pipework</w:t>
+            </w:r>
+          </w:p>
+        </w:tc>
+        <w:tc>
+          <w:tcPr>
+            <w:tcW w:type="dxa" w:w="3288"/>
+          </w:tcPr>
+          <w:p>
+            <w:pPr>
+              <w:spacing w:before="60" w:after="80" w:line="259" w:lineRule="auto"/>
+            </w:pPr>
+            <w:r>
+              <w:rPr>
+                <w:sz w:val="19"/>
+              </w:rPr>
+              <w:t>油管连接动力装置和油缸；阀组控制进油、保压及回油，从而控制上升、停止和下降。</w:t>
+            </w:r>
+          </w:p>
+        </w:tc>
+        <w:tc>
+          <w:tcPr>
+            <w:tcW w:type="dxa" w:w="4706"/>
+          </w:tcPr>
+          <w:p>
+            <w:pPr>
+              <w:spacing w:before="60" w:after="80" w:line="259" w:lineRule="auto"/>
+            </w:pPr>
+            <w:r>
+              <w:rPr>
+                <w:sz w:val="19"/>
+              </w:rPr>
+              <w:t>Pipework connects the power unit to the cylinder. The valves control oil admission, holding and return for ascent, stopping and descent.</w:t>
             </w:r>
           </w:p>
         </w:tc>
@@ -2409,70 +1614,52 @@
         </w:trPr>
         <w:tc>
           <w:tcPr>
-            <w:tcW w:type="dxa" w:w="1701"/>
+            <w:tcW w:type="dxa" w:w="2098"/>
           </w:tcPr>
           <w:p>
             <w:pPr>
-              <w:spacing w:before="40" w:after="60" w:line="252" w:lineRule="auto"/>
+              <w:spacing w:before="60" w:after="80" w:line="259" w:lineRule="auto"/>
             </w:pPr>
             <w:r>
               <w:rPr>
                 <w:b/>
-                <w:sz w:val="18"/>
+                <w:sz w:val="19"/>
               </w:rPr>
-              <w:t>7 控制阀组及油管</w:t>
+              <w:t>8 控制器</w:t>
               <w:br/>
-              <w:t>Valve block and pipework</w:t>
+              <w:t>Controller</w:t>
             </w:r>
           </w:p>
         </w:tc>
         <w:tc>
           <w:tcPr>
-            <w:tcW w:type="dxa" w:w="2608"/>
+            <w:tcW w:type="dxa" w:w="3288"/>
           </w:tcPr>
           <w:p>
             <w:pPr>
-              <w:spacing w:before="40" w:after="60" w:line="252" w:lineRule="auto"/>
+              <w:spacing w:before="60" w:after="80" w:line="259" w:lineRule="auto"/>
             </w:pPr>
             <w:r>
               <w:rPr>
-                <w:sz w:val="18"/>
+                <w:sz w:val="19"/>
               </w:rPr>
-              <w:t>油管连接动力装置和油缸；阀组控制进油、保压及回油，从而控制上升、停止和下降。</w:t>
+              <w:t>接收运行指令，协调油泵、阀组、停车及门的操作。</w:t>
             </w:r>
           </w:p>
         </w:tc>
         <w:tc>
           <w:tcPr>
-            <w:tcW w:type="dxa" w:w="3628"/>
+            <w:tcW w:type="dxa" w:w="4706"/>
           </w:tcPr>
           <w:p>
             <w:pPr>
-              <w:spacing w:before="40" w:after="60" w:line="252" w:lineRule="auto"/>
+              <w:spacing w:before="60" w:after="80" w:line="259" w:lineRule="auto"/>
             </w:pPr>
             <w:r>
               <w:rPr>
-                <w:sz w:val="18"/>
+                <w:sz w:val="19"/>
               </w:rPr>
-              <w:t>Pipework connects the power unit to the cylinder. The valves control oil admission, holding and return for ascent, stopping and descent.</w:t>
-            </w:r>
-          </w:p>
-        </w:tc>
-        <w:tc>
-          <w:tcPr>
-            <w:tcW w:type="dxa" w:w="2154"/>
-          </w:tcPr>
-          <w:p>
-            <w:pPr>
-              <w:spacing w:before="40" w:after="60" w:line="252" w:lineRule="auto"/>
-            </w:pPr>
-            <w:r>
-              <w:rPr>
-                <w:sz w:val="18"/>
-              </w:rPr>
-              <w:t>L1 p. 32 “Valve”; p. 35 “Valve block”及油管</w:t>
-              <w:br/>
-              <w:t>功能属图示释义</w:t>
+              <w:t>The controller receives travel commands and coordinates pump, valve, stopping and door operations.</w:t>
             </w:r>
           </w:p>
         </w:tc>
@@ -2483,70 +1670,52 @@
         </w:trPr>
         <w:tc>
           <w:tcPr>
-            <w:tcW w:type="dxa" w:w="1701"/>
+            <w:tcW w:type="dxa" w:w="2098"/>
           </w:tcPr>
           <w:p>
             <w:pPr>
-              <w:spacing w:before="40" w:after="60" w:line="252" w:lineRule="auto"/>
+              <w:spacing w:before="60" w:after="80" w:line="259" w:lineRule="auto"/>
             </w:pPr>
             <w:r>
               <w:rPr>
                 <w:b/>
-                <w:sz w:val="18"/>
+                <w:sz w:val="19"/>
               </w:rPr>
-              <w:t>8 控制器</w:t>
+              <w:t>9 导轨、导靴及支架</w:t>
               <w:br/>
-              <w:t>Controller</w:t>
+              <w:t>Rails, shoes and brackets</w:t>
             </w:r>
           </w:p>
         </w:tc>
         <w:tc>
           <w:tcPr>
-            <w:tcW w:type="dxa" w:w="2608"/>
+            <w:tcW w:type="dxa" w:w="3288"/>
           </w:tcPr>
           <w:p>
             <w:pPr>
-              <w:spacing w:before="40" w:after="60" w:line="252" w:lineRule="auto"/>
+              <w:spacing w:before="60" w:after="80" w:line="259" w:lineRule="auto"/>
             </w:pPr>
             <w:r>
               <w:rPr>
-                <w:sz w:val="18"/>
+                <w:sz w:val="19"/>
               </w:rPr>
-              <w:t>接收运行指令，协调油泵、阀组、停车及门的操作。</w:t>
+              <w:t>引导轿厢垂直移动并限制横向偏移；支架固定导轨。</w:t>
             </w:r>
           </w:p>
         </w:tc>
         <w:tc>
           <w:tcPr>
-            <w:tcW w:type="dxa" w:w="3628"/>
+            <w:tcW w:type="dxa" w:w="4706"/>
           </w:tcPr>
           <w:p>
             <w:pPr>
-              <w:spacing w:before="40" w:after="60" w:line="252" w:lineRule="auto"/>
+              <w:spacing w:before="60" w:after="80" w:line="259" w:lineRule="auto"/>
             </w:pPr>
             <w:r>
               <w:rPr>
-                <w:sz w:val="18"/>
+                <w:sz w:val="19"/>
               </w:rPr>
-              <w:t>The controller receives travel commands and coordinates pump, valve, stopping and door operations.</w:t>
-            </w:r>
-          </w:p>
-        </w:tc>
-        <w:tc>
-          <w:tcPr>
-            <w:tcW w:type="dxa" w:w="2154"/>
-          </w:tcPr>
-          <w:p>
-            <w:pPr>
-              <w:spacing w:before="40" w:after="60" w:line="252" w:lineRule="auto"/>
-            </w:pPr>
-            <w:r>
-              <w:rPr>
-                <w:sz w:val="18"/>
-              </w:rPr>
-              <w:t>L1 pp. 33, 35</w:t>
-              <w:br/>
-              <w:t>结构图／图示释义</w:t>
+              <w:t>Rails and shoes guide the car vertically and restrain lateral movement. Brackets secure the rails.</w:t>
             </w:r>
           </w:p>
         </w:tc>
@@ -2557,68 +1726,52 @@
         </w:trPr>
         <w:tc>
           <w:tcPr>
-            <w:tcW w:type="dxa" w:w="1701"/>
+            <w:tcW w:type="dxa" w:w="2098"/>
           </w:tcPr>
           <w:p>
             <w:pPr>
-              <w:spacing w:before="40" w:after="60" w:line="252" w:lineRule="auto"/>
+              <w:spacing w:before="60" w:after="80" w:line="259" w:lineRule="auto"/>
             </w:pPr>
             <w:r>
               <w:rPr>
                 <w:b/>
-                <w:sz w:val="18"/>
+                <w:sz w:val="19"/>
               </w:rPr>
-              <w:t>9 导轨、导靴及支架</w:t>
+              <w:t>10 门、门机及联锁</w:t>
               <w:br/>
-              <w:t>Rails, shoes and brackets</w:t>
+              <w:t>Doors, operator and interlocks</w:t>
             </w:r>
           </w:p>
         </w:tc>
         <w:tc>
           <w:tcPr>
-            <w:tcW w:type="dxa" w:w="2608"/>
+            <w:tcW w:type="dxa" w:w="3288"/>
           </w:tcPr>
           <w:p>
             <w:pPr>
-              <w:spacing w:before="40" w:after="60" w:line="252" w:lineRule="auto"/>
+              <w:spacing w:before="60" w:after="80" w:line="259" w:lineRule="auto"/>
             </w:pPr>
             <w:r>
               <w:rPr>
-                <w:sz w:val="18"/>
+                <w:sz w:val="19"/>
               </w:rPr>
-              <w:t>引导轿厢垂直移动并限制横向偏移；支架固定导轨。</w:t>
+              <w:t>控制乘客出入。门未正确关闭并锁紧时，联锁阻止正常运行。</w:t>
             </w:r>
           </w:p>
         </w:tc>
         <w:tc>
           <w:tcPr>
-            <w:tcW w:type="dxa" w:w="3628"/>
+            <w:tcW w:type="dxa" w:w="4706"/>
           </w:tcPr>
           <w:p>
             <w:pPr>
-              <w:spacing w:before="40" w:after="60" w:line="252" w:lineRule="auto"/>
+              <w:spacing w:before="60" w:after="80" w:line="259" w:lineRule="auto"/>
             </w:pPr>
             <w:r>
               <w:rPr>
-                <w:sz w:val="18"/>
+                <w:sz w:val="19"/>
               </w:rPr>
-              <w:t>Rails and shoes guide the car vertically and restrain lateral movement. Brackets secure the rails.</w:t>
-            </w:r>
-          </w:p>
-        </w:tc>
-        <w:tc>
-          <w:tcPr>
-            <w:tcW w:type="dxa" w:w="2154"/>
-          </w:tcPr>
-          <w:p>
-            <w:pPr>
-              <w:spacing w:before="40" w:after="60" w:line="252" w:lineRule="auto"/>
-            </w:pPr>
-            <w:r>
-              <w:rPr>
-                <w:sz w:val="18"/>
-              </w:rPr>
-              <w:t>L1 p. 33 “Rail”, “Guide shoe”, “Rail bracket”; p. 35</w:t>
+              <w:t>Doors control passenger access. Interlocks prevent normal travel unless the doors are properly closed and locked.</w:t>
             </w:r>
           </w:p>
         </w:tc>
@@ -2629,68 +1782,52 @@
         </w:trPr>
         <w:tc>
           <w:tcPr>
-            <w:tcW w:type="dxa" w:w="1701"/>
+            <w:tcW w:type="dxa" w:w="2098"/>
           </w:tcPr>
           <w:p>
             <w:pPr>
-              <w:spacing w:before="40" w:after="60" w:line="252" w:lineRule="auto"/>
+              <w:spacing w:before="60" w:after="80" w:line="259" w:lineRule="auto"/>
             </w:pPr>
             <w:r>
               <w:rPr>
                 <w:b/>
-                <w:sz w:val="18"/>
+                <w:sz w:val="19"/>
               </w:rPr>
-              <w:t>10 门、门机及联锁</w:t>
+              <w:t>11 平层及限位装置</w:t>
               <w:br/>
-              <w:t>Doors, operator and interlocks</w:t>
+              <w:t>Levelling and limit devices</w:t>
             </w:r>
           </w:p>
         </w:tc>
         <w:tc>
           <w:tcPr>
-            <w:tcW w:type="dxa" w:w="2608"/>
+            <w:tcW w:type="dxa" w:w="3288"/>
           </w:tcPr>
           <w:p>
             <w:pPr>
-              <w:spacing w:before="40" w:after="60" w:line="252" w:lineRule="auto"/>
+              <w:spacing w:before="60" w:after="80" w:line="259" w:lineRule="auto"/>
             </w:pPr>
             <w:r>
               <w:rPr>
-                <w:sz w:val="18"/>
+                <w:sz w:val="19"/>
               </w:rPr>
-              <w:t>控制乘客出入。门未正确关闭并锁紧时，联锁阻止正常运行。</w:t>
+              <w:t>平层装置使轿厢准确停靠楼层；限位装置防止超出规定行程。</w:t>
             </w:r>
           </w:p>
         </w:tc>
         <w:tc>
           <w:tcPr>
-            <w:tcW w:type="dxa" w:w="3628"/>
+            <w:tcW w:type="dxa" w:w="4706"/>
           </w:tcPr>
           <w:p>
             <w:pPr>
-              <w:spacing w:before="40" w:after="60" w:line="252" w:lineRule="auto"/>
+              <w:spacing w:before="60" w:after="80" w:line="259" w:lineRule="auto"/>
             </w:pPr>
             <w:r>
               <w:rPr>
-                <w:sz w:val="18"/>
+                <w:sz w:val="19"/>
               </w:rPr>
-              <w:t>Doors control passenger access. Interlocks prevent normal travel unless the doors are properly closed and locked.</w:t>
-            </w:r>
-          </w:p>
-        </w:tc>
-        <w:tc>
-          <w:tcPr>
-            <w:tcW w:type="dxa" w:w="2154"/>
-          </w:tcPr>
-          <w:p>
-            <w:pPr>
-              <w:spacing w:before="40" w:after="60" w:line="252" w:lineRule="auto"/>
-            </w:pPr>
-            <w:r>
-              <w:rPr>
-                <w:sz w:val="18"/>
-              </w:rPr>
-              <w:t>L1 p. 33 “Car gate”, “Car gate switch”; p. 35; 原理见 pp. 17–18</w:t>
+              <w:t>Levelling devices provide accurate landing alignment. Limit devices prevent travel beyond the permitted range.</w:t>
             </w:r>
           </w:p>
         </w:tc>
@@ -2701,88 +1838,16 @@
         </w:trPr>
         <w:tc>
           <w:tcPr>
-            <w:tcW w:type="dxa" w:w="1701"/>
+            <w:tcW w:type="dxa" w:w="2098"/>
           </w:tcPr>
           <w:p>
             <w:pPr>
-              <w:spacing w:before="40" w:after="60" w:line="252" w:lineRule="auto"/>
+              <w:spacing w:before="60" w:after="80" w:line="259" w:lineRule="auto"/>
             </w:pPr>
             <w:r>
               <w:rPr>
                 <w:b/>
-                <w:sz w:val="18"/>
-              </w:rPr>
-              <w:t>11 平层及限位装置</w:t>
-              <w:br/>
-              <w:t>Levelling and limit devices</w:t>
-            </w:r>
-          </w:p>
-        </w:tc>
-        <w:tc>
-          <w:tcPr>
-            <w:tcW w:type="dxa" w:w="2608"/>
-          </w:tcPr>
-          <w:p>
-            <w:pPr>
-              <w:spacing w:before="40" w:after="60" w:line="252" w:lineRule="auto"/>
-            </w:pPr>
-            <w:r>
-              <w:rPr>
-                <w:sz w:val="18"/>
-              </w:rPr>
-              <w:t>平层装置使轿厢准确停靠楼层；限位装置防止超出规定行程。</w:t>
-            </w:r>
-          </w:p>
-        </w:tc>
-        <w:tc>
-          <w:tcPr>
-            <w:tcW w:type="dxa" w:w="3628"/>
-          </w:tcPr>
-          <w:p>
-            <w:pPr>
-              <w:spacing w:before="40" w:after="60" w:line="252" w:lineRule="auto"/>
-            </w:pPr>
-            <w:r>
-              <w:rPr>
-                <w:sz w:val="18"/>
-              </w:rPr>
-              <w:t>Levelling devices provide accurate landing alignment. Limit devices prevent travel beyond the permitted range.</w:t>
-            </w:r>
-          </w:p>
-        </w:tc>
-        <w:tc>
-          <w:tcPr>
-            <w:tcW w:type="dxa" w:w="2154"/>
-          </w:tcPr>
-          <w:p>
-            <w:pPr>
-              <w:spacing w:before="40" w:after="60" w:line="252" w:lineRule="auto"/>
-            </w:pPr>
-            <w:r>
-              <w:rPr>
-                <w:sz w:val="18"/>
-              </w:rPr>
-              <w:t>L1 p. 33 开关及凸轮标注; 原理见 pp. 19, 24</w:t>
-            </w:r>
-          </w:p>
-        </w:tc>
-      </w:tr>
-      <w:tr>
-        <w:trPr>
-          <w:cantSplit/>
-        </w:trPr>
-        <w:tc>
-          <w:tcPr>
-            <w:tcW w:type="dxa" w:w="1701"/>
-          </w:tcPr>
-          <w:p>
-            <w:pPr>
-              <w:spacing w:before="40" w:after="60" w:line="252" w:lineRule="auto"/>
-            </w:pPr>
-            <w:r>
-              <w:rPr>
-                <w:b/>
-                <w:sz w:val="18"/>
+                <w:sz w:val="19"/>
               </w:rPr>
               <w:t>12 底坑缓冲器</w:t>
               <w:br/>
@@ -2792,15 +1857,15 @@
         </w:tc>
         <w:tc>
           <w:tcPr>
-            <w:tcW w:type="dxa" w:w="2608"/>
+            <w:tcW w:type="dxa" w:w="3288"/>
           </w:tcPr>
           <w:p>
             <w:pPr>
-              <w:spacing w:before="40" w:after="60" w:line="252" w:lineRule="auto"/>
+              <w:spacing w:before="60" w:after="80" w:line="259" w:lineRule="auto"/>
             </w:pPr>
             <w:r>
               <w:rPr>
-                <w:sz w:val="18"/>
+                <w:sz w:val="19"/>
               </w:rPr>
               <w:t>在轿厢底部发生越程冲击时吸收能量。</w:t>
             </w:r>
@@ -2808,770 +1873,17 @@
         </w:tc>
         <w:tc>
           <w:tcPr>
-            <w:tcW w:type="dxa" w:w="3628"/>
+            <w:tcW w:type="dxa" w:w="4706"/>
           </w:tcPr>
           <w:p>
             <w:pPr>
-              <w:spacing w:before="40" w:after="60" w:line="252" w:lineRule="auto"/>
+              <w:spacing w:before="60" w:after="80" w:line="259" w:lineRule="auto"/>
             </w:pPr>
             <w:r>
               <w:rPr>
-                <w:sz w:val="18"/>
+                <w:sz w:val="19"/>
               </w:rPr>
               <w:t>Pit buffers absorb impact energy if the car overruns at the bottom of travel.</w:t>
-            </w:r>
-          </w:p>
-        </w:tc>
-        <w:tc>
-          <w:tcPr>
-            <w:tcW w:type="dxa" w:w="2154"/>
-          </w:tcPr>
-          <w:p>
-            <w:pPr>
-              <w:spacing w:before="40" w:after="60" w:line="252" w:lineRule="auto"/>
-            </w:pPr>
-            <w:r>
-              <w:rPr>
-                <w:sz w:val="18"/>
-              </w:rPr>
-              <w:t>L1 p. 33 “Buffer spring”; p. 6 “Car buffer”; 功能见 pp. 20, 24</w:t>
-            </w:r>
-          </w:p>
-        </w:tc>
-      </w:tr>
-    </w:tbl>
-    <w:p>
-      <w:r>
-        <w:t>控制阀组在第 35 页只以 “Valve block” 标出。上表说明的是整体功能，不把课件未展开的具体阀件型号或详细动作时序当作原文。</w:t>
-      </w:r>
-    </w:p>
-    <w:p>
-      <w:r>
-        <w:t>The valve block is labelled on p. 35 without an internal circuit. The table explains its overall function; specific internal valve types and detailed sequences are not presented as slide text.</w:t>
-      </w:r>
-    </w:p>
-    <w:p>
-      <w:r>
-        <w:br w:type="page"/>
-      </w:r>
-    </w:p>
-    <w:p>
-      <w:pPr>
-        <w:pStyle w:val="Heading1"/>
-      </w:pPr>
-      <w:r>
-        <w:t>2.3 运行过程 / Hydraulic operating sequence</w:t>
-      </w:r>
-    </w:p>
-    <w:p>
-      <w:pPr>
-        <w:pStyle w:val="Heading2"/>
-      </w:pPr>
-      <w:r>
-        <w:t>上升 / Ascent</w:t>
-      </w:r>
-    </w:p>
-    <w:p>
-      <w:r>
-        <w:t>控制器启动电动机和油泵。油进入油缸，推动柱塞伸出并直接顶升轿厢。</w:t>
-      </w:r>
-    </w:p>
-    <w:p>
-      <w:r>
-        <w:t>The controller starts the motor and pump. Oil enters the cylinder, extending the plunger and directly raising the car.</w:t>
-      </w:r>
-    </w:p>
-    <w:p>
-      <w:pPr>
-        <w:pStyle w:val="Heading2"/>
-      </w:pPr>
-      <w:r>
-        <w:t>停止 / Holding</w:t>
-      </w:r>
-    </w:p>
-    <w:p>
-      <w:r>
-        <w:t>停止供油，并由阀组保持油缸内的油液，使柱塞和轿厢保持在所需位置。</w:t>
-      </w:r>
-    </w:p>
-    <w:p>
-      <w:r>
-        <w:t>Oil delivery stops, and the valve arrangement retains oil in the cylinder to hold the plunger and car at the required position.</w:t>
-      </w:r>
-    </w:p>
-    <w:p>
-      <w:pPr>
-        <w:pStyle w:val="Heading2"/>
-      </w:pPr>
-      <w:r>
-        <w:t>下降 / Descent</w:t>
-      </w:r>
-    </w:p>
-    <w:p>
-      <w:r>
-        <w:t>阀组允许油缸内的油受控流回油箱；轿厢重量使柱塞缩回，轿厢随之下降。</w:t>
-      </w:r>
-    </w:p>
-    <w:p>
-      <w:r>
-        <w:t>The valve arrangement permits controlled oil return to the tank. The weight of the car retracts the plunger, allowing the car to descend.</w:t>
-      </w:r>
-    </w:p>
-    <w:p>
-      <w:pPr>
-        <w:spacing w:after="160"/>
-      </w:pPr>
-      <w:r>
-        <w:rPr>
-          <w:color w:val="526875"/>
-          <w:sz w:val="18"/>
-        </w:rPr>
-        <w:t>出处 / Source: L1 p. 32 rising principle; pp. 33 and 35 component connections. Holding and descent are diagram-based functional explanations / 停止及下降为图示功能解释。</w:t>
-      </w:r>
-    </w:p>
-    <w:p>
-      <w:pPr>
-        <w:pStyle w:val="Heading2"/>
-      </w:pPr>
-      <w:r>
-        <w:t>直顶结构的关键 / Essential feature of direct drive</w:t>
-      </w:r>
-    </w:p>
-    <w:p>
-      <w:r>
-        <w:t>应画出柱塞直接承托轿厢。本题采用的典型结构由油缸和柱塞传递顶升力，不需要用曳引轮、悬吊绳和对重来传递该顶升动力。</w:t>
-      </w:r>
-    </w:p>
-    <w:p>
-      <w:r>
-        <w:t>The diagram should show the plunger supporting the car directly. In the typical arrangement selected here, lifting force is transmitted through the cylinder and plunger, without a traction sheave, suspension ropes or counterweight.</w:t>
-      </w:r>
-    </w:p>
-    <w:p>
-      <w:pPr>
-        <w:spacing w:after="160"/>
-      </w:pPr>
-      <w:r>
-        <w:rPr>
-          <w:color w:val="526875"/>
-          <w:sz w:val="18"/>
-        </w:rPr>
-        <w:t>出处 / Source: L1 pp. 31–33 and 35 right diagram; distinguish from the roped hydraulic arrangement on p. 34.</w:t>
-      </w:r>
-    </w:p>
-    <w:p>
-      <w:r>
-        <w:br w:type="page"/>
-      </w:r>
-    </w:p>
-    <w:p>
-      <w:pPr>
-        <w:pStyle w:val="Heading1"/>
-      </w:pPr>
-      <w:r>
-        <w:t>3 课件出处索引 / Lecture reference index</w:t>
-      </w:r>
-    </w:p>
-    <w:p>
-      <w:r>
-        <w:t>以下索引便于回到原课件核对术语、图示及功能。所有页码均指 PDF 页码。</w:t>
-      </w:r>
-    </w:p>
-    <w:p>
-      <w:r>
-        <w:t>This index locates the terminology, diagrams and functions in the uploaded lecture. All page numbers refer to PDF pages.</w:t>
-      </w:r>
-    </w:p>
-    <w:tbl>
-      <w:tblPr>
-        <w:tblStyle w:val="TableGrid"/>
-        <w:tblW w:type="auto" w:w="0"/>
-        <w:tblLook w:firstColumn="1" w:firstRow="1" w:lastColumn="0" w:lastRow="0" w:noHBand="0" w:noVBand="1" w:val="04A0"/>
-      </w:tblPr>
-      <w:tblGrid>
-        <w:gridCol w:w="3383"/>
-        <w:gridCol w:w="3383"/>
-        <w:gridCol w:w="3383"/>
-      </w:tblGrid>
-      <w:tr>
-        <w:trPr>
-          <w:cantSplit/>
-        </w:trPr>
-        <w:tc>
-          <w:tcPr>
-            <w:tcW w:type="dxa" w:w="3383"/>
-          </w:tcPr>
-          <w:p>
-            <w:pPr>
-              <w:spacing w:after="80"/>
-            </w:pPr>
-            <w:r>
-              <w:rPr>
-                <w:sz w:val="18"/>
-              </w:rPr>
-              <w:t>内容 / Topic</w:t>
-            </w:r>
-          </w:p>
-        </w:tc>
-        <w:tc>
-          <w:tcPr>
-            <w:tcW w:type="dxa" w:w="3383"/>
-          </w:tcPr>
-          <w:p>
-            <w:pPr>
-              <w:spacing w:after="80"/>
-            </w:pPr>
-            <w:r>
-              <w:rPr>
-                <w:sz w:val="18"/>
-              </w:rPr>
-              <w:t>文件或章节 / File or section</w:t>
-            </w:r>
-          </w:p>
-        </w:tc>
-        <w:tc>
-          <w:tcPr>
-            <w:tcW w:type="dxa" w:w="3383"/>
-          </w:tcPr>
-          <w:p>
-            <w:pPr>
-              <w:spacing w:after="80"/>
-            </w:pPr>
-            <w:r>
-              <w:rPr>
-                <w:sz w:val="18"/>
-              </w:rPr>
-              <w:t>位置 / Location</w:t>
-            </w:r>
-          </w:p>
-        </w:tc>
-      </w:tr>
-      <w:tr>
-        <w:trPr>
-          <w:cantSplit/>
-        </w:trPr>
-        <w:tc>
-          <w:tcPr>
-            <w:tcW w:type="dxa" w:w="3383"/>
-          </w:tcPr>
-          <w:p>
-            <w:pPr>
-              <w:spacing w:after="80"/>
-            </w:pPr>
-            <w:r>
-              <w:rPr>
-                <w:sz w:val="18"/>
-              </w:rPr>
-              <w:t>题目 / Assignment question</w:t>
-            </w:r>
-          </w:p>
-        </w:tc>
-        <w:tc>
-          <w:tcPr>
-            <w:tcW w:type="dxa" w:w="3383"/>
-          </w:tcPr>
-          <w:p>
-            <w:pPr>
-              <w:spacing w:after="80"/>
-            </w:pPr>
-            <w:r>
-              <w:rPr>
-                <w:sz w:val="18"/>
-              </w:rPr>
-              <w:t>0 PIA5704 Course Outline 2026_27.pdf</w:t>
-            </w:r>
-          </w:p>
-        </w:tc>
-        <w:tc>
-          <w:tcPr>
-            <w:tcW w:type="dxa" w:w="3383"/>
-          </w:tcPr>
-          <w:p>
-            <w:pPr>
-              <w:spacing w:after="80"/>
-            </w:pPr>
-            <w:r>
-              <w:rPr>
-                <w:sz w:val="18"/>
-              </w:rPr>
-              <w:t>p. 2, Question 1</w:t>
-            </w:r>
-          </w:p>
-        </w:tc>
-      </w:tr>
-      <w:tr>
-        <w:trPr>
-          <w:cantSplit/>
-        </w:trPr>
-        <w:tc>
-          <w:tcPr>
-            <w:tcW w:type="dxa" w:w="3383"/>
-          </w:tcPr>
-          <w:p>
-            <w:pPr>
-              <w:spacing w:after="80"/>
-            </w:pPr>
-            <w:r>
-              <w:rPr>
-                <w:sz w:val="18"/>
-              </w:rPr>
-              <w:t>核心课件 / Main lecture</w:t>
-            </w:r>
-          </w:p>
-        </w:tc>
-        <w:tc>
-          <w:tcPr>
-            <w:tcW w:type="dxa" w:w="3383"/>
-          </w:tcPr>
-          <w:p>
-            <w:pPr>
-              <w:spacing w:after="80"/>
-            </w:pPr>
-            <w:r>
-              <w:rPr>
-                <w:sz w:val="18"/>
-              </w:rPr>
-              <w:t>Lecture1+Vertical+Transportation+System+I_2026.pdf</w:t>
-            </w:r>
-          </w:p>
-        </w:tc>
-        <w:tc>
-          <w:tcPr>
-            <w:tcW w:type="dxa" w:w="3383"/>
-          </w:tcPr>
-          <w:p>
-            <w:pPr>
-              <w:spacing w:after="80"/>
-            </w:pPr>
-            <w:r>
-              <w:rPr>
-                <w:sz w:val="18"/>
-              </w:rPr>
-              <w:t>Abbreviation: L1</w:t>
-            </w:r>
-          </w:p>
-        </w:tc>
-      </w:tr>
-      <w:tr>
-        <w:trPr>
-          <w:cantSplit/>
-        </w:trPr>
-        <w:tc>
-          <w:tcPr>
-            <w:tcW w:type="dxa" w:w="3383"/>
-          </w:tcPr>
-          <w:p>
-            <w:pPr>
-              <w:spacing w:after="80"/>
-            </w:pPr>
-            <w:r>
-              <w:rPr>
-                <w:sz w:val="18"/>
-              </w:rPr>
-              <w:t>液压类型 / Hydraulic types</w:t>
-            </w:r>
-          </w:p>
-        </w:tc>
-        <w:tc>
-          <w:tcPr>
-            <w:tcW w:type="dxa" w:w="3383"/>
-          </w:tcPr>
-          <w:p>
-            <w:pPr>
-              <w:spacing w:after="80"/>
-            </w:pPr>
-            <w:r>
-              <w:rPr>
-                <w:sz w:val="18"/>
-              </w:rPr>
-              <w:t>Types of Hydraulic Lifts</w:t>
-            </w:r>
-          </w:p>
-        </w:tc>
-        <w:tc>
-          <w:tcPr>
-            <w:tcW w:type="dxa" w:w="3383"/>
-          </w:tcPr>
-          <w:p>
-            <w:pPr>
-              <w:spacing w:after="80"/>
-            </w:pPr>
-            <w:r>
-              <w:rPr>
-                <w:sz w:val="18"/>
-              </w:rPr>
-              <w:t>L1 p. 6</w:t>
-            </w:r>
-          </w:p>
-        </w:tc>
-      </w:tr>
-      <w:tr>
-        <w:trPr>
-          <w:cantSplit/>
-        </w:trPr>
-        <w:tc>
-          <w:tcPr>
-            <w:tcW w:type="dxa" w:w="3383"/>
-          </w:tcPr>
-          <w:p>
-            <w:pPr>
-              <w:spacing w:after="80"/>
-            </w:pPr>
-            <w:r>
-              <w:rPr>
-                <w:sz w:val="18"/>
-              </w:rPr>
-              <w:t>曳引完整部件图 / Traction component diagram</w:t>
-            </w:r>
-          </w:p>
-        </w:tc>
-        <w:tc>
-          <w:tcPr>
-            <w:tcW w:type="dxa" w:w="3383"/>
-          </w:tcPr>
-          <w:p>
-            <w:pPr>
-              <w:spacing w:after="80"/>
-            </w:pPr>
-            <w:r>
-              <w:rPr>
-                <w:sz w:val="18"/>
-              </w:rPr>
-              <w:t>Electric Elevators</w:t>
-            </w:r>
-          </w:p>
-        </w:tc>
-        <w:tc>
-          <w:tcPr>
-            <w:tcW w:type="dxa" w:w="3383"/>
-          </w:tcPr>
-          <w:p>
-            <w:pPr>
-              <w:spacing w:after="80"/>
-            </w:pPr>
-            <w:r>
-              <w:rPr>
-                <w:sz w:val="18"/>
-              </w:rPr>
-              <w:t>L1 p. 10</w:t>
-            </w:r>
-          </w:p>
-        </w:tc>
-      </w:tr>
-      <w:tr>
-        <w:trPr>
-          <w:cantSplit/>
-        </w:trPr>
-        <w:tc>
-          <w:tcPr>
-            <w:tcW w:type="dxa" w:w="3383"/>
-          </w:tcPr>
-          <w:p>
-            <w:pPr>
-              <w:spacing w:after="80"/>
-            </w:pPr>
-            <w:r>
-              <w:rPr>
-                <w:sz w:val="18"/>
-              </w:rPr>
-              <w:t>曳引绳及部件定义 / Ropes and component definitions</w:t>
-            </w:r>
-          </w:p>
-        </w:tc>
-        <w:tc>
-          <w:tcPr>
-            <w:tcW w:type="dxa" w:w="3383"/>
-          </w:tcPr>
-          <w:p>
-            <w:pPr>
-              <w:spacing w:after="80"/>
-            </w:pPr>
-            <w:r>
-              <w:rPr>
-                <w:sz w:val="18"/>
-              </w:rPr>
-              <w:t>Suspension Ropes; Components; Definitions</w:t>
-            </w:r>
-          </w:p>
-        </w:tc>
-        <w:tc>
-          <w:tcPr>
-            <w:tcW w:type="dxa" w:w="3383"/>
-          </w:tcPr>
-          <w:p>
-            <w:pPr>
-              <w:spacing w:after="80"/>
-            </w:pPr>
-            <w:r>
-              <w:rPr>
-                <w:sz w:val="18"/>
-              </w:rPr>
-              <w:t>L1 pp. 15–23</w:t>
-            </w:r>
-          </w:p>
-        </w:tc>
-      </w:tr>
-      <w:tr>
-        <w:trPr>
-          <w:cantSplit/>
-        </w:trPr>
-        <w:tc>
-          <w:tcPr>
-            <w:tcW w:type="dxa" w:w="3383"/>
-          </w:tcPr>
-          <w:p>
-            <w:pPr>
-              <w:spacing w:after="80"/>
-            </w:pPr>
-            <w:r>
-              <w:rPr>
-                <w:sz w:val="18"/>
-              </w:rPr>
-              <w:t>安全装置及对重 / Safety devices and counterweight</w:t>
-            </w:r>
-          </w:p>
-        </w:tc>
-        <w:tc>
-          <w:tcPr>
-            <w:tcW w:type="dxa" w:w="3383"/>
-          </w:tcPr>
-          <w:p>
-            <w:pPr>
-              <w:spacing w:after="80"/>
-            </w:pPr>
-            <w:r>
-              <w:rPr>
-                <w:sz w:val="18"/>
-              </w:rPr>
-              <w:t>Safety Devices; Counterweight system</w:t>
-            </w:r>
-          </w:p>
-        </w:tc>
-        <w:tc>
-          <w:tcPr>
-            <w:tcW w:type="dxa" w:w="3383"/>
-          </w:tcPr>
-          <w:p>
-            <w:pPr>
-              <w:spacing w:after="80"/>
-            </w:pPr>
-            <w:r>
-              <w:rPr>
-                <w:sz w:val="18"/>
-              </w:rPr>
-              <w:t>L1 pp. 24–25</w:t>
-            </w:r>
-          </w:p>
-        </w:tc>
-      </w:tr>
-      <w:tr>
-        <w:trPr>
-          <w:cantSplit/>
-        </w:trPr>
-        <w:tc>
-          <w:tcPr>
-            <w:tcW w:type="dxa" w:w="3383"/>
-          </w:tcPr>
-          <w:p>
-            <w:pPr>
-              <w:spacing w:after="80"/>
-            </w:pPr>
-            <w:r>
-              <w:rPr>
-                <w:sz w:val="18"/>
-              </w:rPr>
-              <w:t>驱动系统 / Drive systems</w:t>
-            </w:r>
-          </w:p>
-        </w:tc>
-        <w:tc>
-          <w:tcPr>
-            <w:tcW w:type="dxa" w:w="3383"/>
-          </w:tcPr>
-          <w:p>
-            <w:pPr>
-              <w:spacing w:after="80"/>
-            </w:pPr>
-            <w:r>
-              <w:rPr>
-                <w:sz w:val="18"/>
-              </w:rPr>
-              <w:t>Traction System: gearless and geared types</w:t>
-            </w:r>
-          </w:p>
-        </w:tc>
-        <w:tc>
-          <w:tcPr>
-            <w:tcW w:type="dxa" w:w="3383"/>
-          </w:tcPr>
-          <w:p>
-            <w:pPr>
-              <w:spacing w:after="80"/>
-            </w:pPr>
-            <w:r>
-              <w:rPr>
-                <w:sz w:val="18"/>
-              </w:rPr>
-              <w:t>L1 pp. 26–30</w:t>
-            </w:r>
-          </w:p>
-        </w:tc>
-      </w:tr>
-      <w:tr>
-        <w:trPr>
-          <w:cantSplit/>
-        </w:trPr>
-        <w:tc>
-          <w:tcPr>
-            <w:tcW w:type="dxa" w:w="3383"/>
-          </w:tcPr>
-          <w:p>
-            <w:pPr>
-              <w:spacing w:after="80"/>
-            </w:pPr>
-            <w:r>
-              <w:rPr>
-                <w:sz w:val="18"/>
-              </w:rPr>
-              <w:t>直顶液压原理与部件 / Direct-ram principle and components</w:t>
-            </w:r>
-          </w:p>
-        </w:tc>
-        <w:tc>
-          <w:tcPr>
-            <w:tcW w:type="dxa" w:w="3383"/>
-          </w:tcPr>
-          <w:p>
-            <w:pPr>
-              <w:spacing w:after="80"/>
-            </w:pPr>
-            <w:r>
-              <w:rPr>
-                <w:sz w:val="18"/>
-              </w:rPr>
-              <w:t>Hydraulic Elevators: Direct-ram driven type</w:t>
-            </w:r>
-          </w:p>
-        </w:tc>
-        <w:tc>
-          <w:tcPr>
-            <w:tcW w:type="dxa" w:w="3383"/>
-          </w:tcPr>
-          <w:p>
-            <w:pPr>
-              <w:spacing w:after="80"/>
-            </w:pPr>
-            <w:r>
-              <w:rPr>
-                <w:sz w:val="18"/>
-              </w:rPr>
-              <w:t>L1 pp. 31–33</w:t>
-            </w:r>
-          </w:p>
-        </w:tc>
-      </w:tr>
-      <w:tr>
-        <w:trPr>
-          <w:cantSplit/>
-        </w:trPr>
-        <w:tc>
-          <w:tcPr>
-            <w:tcW w:type="dxa" w:w="3383"/>
-          </w:tcPr>
-          <w:p>
-            <w:pPr>
-              <w:spacing w:after="80"/>
-            </w:pPr>
-            <w:r>
-              <w:rPr>
-                <w:sz w:val="18"/>
-              </w:rPr>
-              <w:t>绳索式液压对照 / Roped hydraulic arrangement</w:t>
-            </w:r>
-          </w:p>
-        </w:tc>
-        <w:tc>
-          <w:tcPr>
-            <w:tcW w:type="dxa" w:w="3383"/>
-          </w:tcPr>
-          <w:p>
-            <w:pPr>
-              <w:spacing w:after="80"/>
-            </w:pPr>
-            <w:r>
-              <w:rPr>
-                <w:sz w:val="18"/>
-              </w:rPr>
-              <w:t>Hydraulic Elevators: Roped type</w:t>
-            </w:r>
-          </w:p>
-        </w:tc>
-        <w:tc>
-          <w:tcPr>
-            <w:tcW w:type="dxa" w:w="3383"/>
-          </w:tcPr>
-          <w:p>
-            <w:pPr>
-              <w:spacing w:after="80"/>
-            </w:pPr>
-            <w:r>
-              <w:rPr>
-                <w:sz w:val="18"/>
-              </w:rPr>
-              <w:t>L1 p. 34</w:t>
-            </w:r>
-          </w:p>
-        </w:tc>
-      </w:tr>
-      <w:tr>
-        <w:trPr>
-          <w:cantSplit/>
-        </w:trPr>
-        <w:tc>
-          <w:tcPr>
-            <w:tcW w:type="dxa" w:w="3383"/>
-          </w:tcPr>
-          <w:p>
-            <w:pPr>
-              <w:spacing w:after="80"/>
-            </w:pPr>
-            <w:r>
-              <w:rPr>
-                <w:sz w:val="18"/>
-              </w:rPr>
-              <w:t>两类完整结构图 / Complete diagrams of both types</w:t>
-            </w:r>
-          </w:p>
-        </w:tc>
-        <w:tc>
-          <w:tcPr>
-            <w:tcW w:type="dxa" w:w="3383"/>
-          </w:tcPr>
-          <w:p>
-            <w:pPr>
-              <w:spacing w:after="80"/>
-            </w:pPr>
-            <w:r>
-              <w:rPr>
-                <w:sz w:val="18"/>
-              </w:rPr>
-              <w:t>Comparison of Traction vs Hydraulic Lift</w:t>
-            </w:r>
-          </w:p>
-        </w:tc>
-        <w:tc>
-          <w:tcPr>
-            <w:tcW w:type="dxa" w:w="3383"/>
-          </w:tcPr>
-          <w:p>
-            <w:pPr>
-              <w:spacing w:after="80"/>
-            </w:pPr>
-            <w:r>
-              <w:rPr>
-                <w:sz w:val="18"/>
-              </w:rPr>
-              <w:t>L1 p. 35</w:t>
             </w:r>
           </w:p>
         </w:tc>
@@ -3582,34 +1894,24 @@
         <w:pStyle w:val="Heading2"/>
       </w:pPr>
       <w:r>
-        <w:t>参考文献 / References</w:t>
+        <w:t>2.2 运作过程 / Operation</w:t>
       </w:r>
     </w:p>
     <w:p>
       <w:r>
-        <w:t>Leung, G. H. T. (2026). Vertical Transportation Systems (Part 1) [Lecture slides]. PIA5704, City University of Hong Kong. Uploaded file: Lecture1+Vertical+Transportation+System+I_2026.pdf.</w:t>
+        <w:t>上升时，电动机驱动油泵向油缸供油，使柱塞伸出并顶升轿厢。停止时，阀组保持油缸内的油液，使轿厢停留在所需位置。下降时，阀组允许油液受控流回油箱，轿厢重量使柱塞缩回，轿厢随之下降。</w:t>
       </w:r>
     </w:p>
     <w:p>
       <w:r>
-        <w:t>City University of Hong Kong. (2026–2027). PIA5704 Building Services Systems and Maintenance for Housing Managers: Course Outline. Uploaded file: 0 PIA5704 Course Outline 2026_27.pdf.</w:t>
-      </w:r>
-    </w:p>
-    <w:p>
-      <w:r>
-        <w:t>本答案依据用户上传课件整理；图 1、图 2 为根据课件重绘的简化示意图。</w:t>
-      </w:r>
-    </w:p>
-    <w:p>
-      <w:r>
-        <w:t>This answer is based on the uploaded course materials. Figures 1 and 2 are simplified schematics redrawn from the lecture.</w:t>
+        <w:t>During ascent, the motor drives the pump to supply oil to the cylinder, extending the plunger and raising the car. During holding, the valve arrangement retains oil in the cylinder to keep the car at the required position. During descent, the valves allow controlled oil return to the tank, and the weight of the car retracts the plunger.</w:t>
       </w:r>
     </w:p>
     <w:sectPr>
       <w:headerReference w:type="default" r:id="rId9"/>
       <w:footerReference w:type="default" r:id="rId10"/>
       <w:pgSz w:w="11906" w:h="16838"/>
-      <w:pgMar w:top="964" w:right="879" w:bottom="907" w:left="879" w:header="397" w:footer="397" w:gutter="0"/>
+      <w:pgMar w:top="879" w:right="907" w:bottom="850" w:left="907" w:header="369" w:footer="369" w:gutter="0"/>
       <w:cols w:space="720"/>
       <w:docGrid w:linePitch="360"/>
     </w:sectPr>
@@ -3624,9 +1926,6 @@
       <w:pStyle w:val="Footer"/>
       <w:jc w:val="right"/>
     </w:pPr>
-    <w:r>
-      <w:t xml:space="preserve">Q1 · 中英双语 / Bilingual   |   </w:t>
-    </w:r>
     <w:fldSimple w:instr="PAGE"/>
   </w:p>
 </w:ftr>
@@ -3639,7 +1938,7 @@
       <w:pStyle w:val="Caption"/>
     </w:pPr>
     <w:r>
-      <w:t>PIA5704  |  Building Services Systems and Maintenance for Housing Managers</w:t>
+      <w:t>PIA5704  |  Q1</w:t>
     </w:r>
   </w:p>
 </w:hdr>
@@ -4009,7 +2308,7 @@
     <w:qFormat/>
     <w:rsid w:val="00FC693F"/>
     <w:pPr>
-      <w:spacing w:after="100" w:line="269" w:lineRule="auto"/>
+      <w:spacing w:after="100" w:line="264" w:lineRule="auto"/>
     </w:pPr>
     <w:rPr>
       <w:rFonts w:ascii="Calibri" w:hAnsi="Calibri" w:eastAsia="Noto Sans CJK SC"/>
@@ -4071,7 +2370,7 @@
     <w:pPr>
       <w:keepNext/>
       <w:keepLines/>
-      <w:spacing w:before="480" w:after="180"/>
+      <w:spacing w:before="480" w:after="140"/>
       <w:outlineLvl w:val="0"/>
     </w:pPr>
     <w:rPr>
@@ -4079,7 +2378,7 @@
       <w:b/>
       <w:bCs/>
       <w:color w:val="17364D"/>
-      <w:sz w:val="34"/>
+      <w:sz w:val="32"/>
       <w:szCs w:val="28"/>
     </w:rPr>
   </w:style>
@@ -4095,7 +2394,7 @@
     <w:pPr>
       <w:keepNext/>
       <w:keepLines/>
-      <w:spacing w:before="200" w:after="180"/>
+      <w:spacing w:before="200" w:after="140"/>
       <w:outlineLvl w:val="1"/>
     </w:pPr>
     <w:rPr>
@@ -4360,7 +2659,7 @@
       <w:pBdr>
         <w:bottom w:val="single" w:sz="8" w:space="4" w:color="4F81BD" w:themeColor="accent1"/>
       </w:pBdr>
-      <w:spacing w:after="180" w:line="240" w:lineRule="auto"/>
+      <w:spacing w:after="140" w:line="240" w:lineRule="auto"/>
       <w:contextualSpacing/>
     </w:pPr>
     <w:rPr>
@@ -4368,7 +2667,7 @@
       <w:color w:val="17364D"/>
       <w:spacing w:val="5"/>
       <w:kern w:val="28"/>
-      <w:sz w:val="46"/>
+      <w:sz w:val="40"/>
       <w:szCs w:val="52"/>
     </w:rPr>
   </w:style>

</xml_diff>

<commit_message>
Add hand-drawable Q1 schematics and use consistent lecture component names
</commit_message>
<xml_diff>
--- a/downloads/PIA5704/PIA5704_Q1_Bilingual.docx
+++ b/downloads/PIA5704/PIA5704_Q1_Bilingual.docx
@@ -19,24 +19,13 @@
       </w:r>
     </w:p>
     <w:p>
-      <w:r>
-        <w:t>电力曳引式升降机由电动机驱动曳引轮，通过曳引轮与悬吊钢丝绳之间的摩擦传递动力，使轿厢和对重沿导轨反向移动。对重平衡部分重量，减少电动机需要克服的不平衡负载。</w:t>
-      </w:r>
-    </w:p>
-    <w:p>
-      <w:r>
-        <w:t>An electric traction lift uses a motor to rotate a traction sheave. Friction between the sheave and suspension ropes moves the car and counterweight in opposite directions along their guide rails. The counterweight balances part of the load, reducing the unbalanced load that the motor must overcome.</w:t>
-      </w:r>
-    </w:p>
-    <w:p>
       <w:pPr>
-        <w:spacing w:after="60"/>
         <w:jc w:val="center"/>
       </w:pPr>
       <w:r>
         <w:drawing>
           <wp:inline xmlns:a="http://schemas.openxmlformats.org/drawingml/2006/main" xmlns:pic="http://schemas.openxmlformats.org/drawingml/2006/picture">
-            <wp:extent cx="3660542" cy="5940000"/>
+            <wp:extent cx="5438045" cy="7596000"/>
             <wp:docPr id="1" name="Picture 1"/>
             <wp:cNvGraphicFramePr>
               <a:graphicFrameLocks noChangeAspect="1"/>
@@ -45,7 +34,7 @@
               <a:graphicData uri="http://schemas.openxmlformats.org/drawingml/2006/picture">
                 <pic:pic>
                   <pic:nvPicPr>
-                    <pic:cNvPr id="0" name="traction_ppt.png"/>
+                    <pic:cNvPr id="0" name="PIA5704_Q1_Traction_Handdraw.png"/>
                     <pic:cNvPicPr/>
                   </pic:nvPicPr>
                   <pic:blipFill>
@@ -57,7 +46,7 @@
                   <pic:spPr>
                     <a:xfrm>
                       <a:off x="0" y="0"/>
-                      <a:ext cx="3660542" cy="5940000"/>
+                      <a:ext cx="5438045" cy="7596000"/>
                     </a:xfrm>
                     <a:prstGeom prst="rect"/>
                   </pic:spPr>
@@ -66,15 +55,6 @@
             </a:graphic>
           </wp:inline>
         </w:drawing>
-      </w:r>
-    </w:p>
-    <w:p>
-      <w:pPr>
-        <w:pStyle w:val="Caption"/>
-        <w:jc w:val="center"/>
-      </w:pPr>
-      <w:r>
-        <w:t>图 1 电力曳引式升降机 / Figure 1 Electric traction lift</w:t>
       </w:r>
     </w:p>
     <w:p>
@@ -87,7 +67,7 @@
         <w:pStyle w:val="Heading1"/>
       </w:pPr>
       <w:r>
-        <w:t>1.1 主要部件及功能 / Major components (1/2)</w:t>
+        <w:t>1.1 部件及功能 / Components and functions (1/3)</w:t>
       </w:r>
     </w:p>
     <w:tbl>
@@ -98,9 +78,9 @@
         <w:tblLook w:firstColumn="1" w:firstRow="1" w:lastColumn="0" w:lastRow="0" w:noHBand="0" w:noVBand="1" w:val="04A0"/>
       </w:tblPr>
       <w:tblGrid>
-        <w:gridCol w:w="2098"/>
-        <w:gridCol w:w="3288"/>
-        <w:gridCol w:w="4706"/>
+        <w:gridCol w:w="3402"/>
+        <w:gridCol w:w="3402"/>
+        <w:gridCol w:w="3402"/>
       </w:tblGrid>
       <w:tr>
         <w:trPr>
@@ -108,45 +88,33 @@
         </w:trPr>
         <w:tc>
           <w:tcPr>
-            <w:tcW w:type="dxa" w:w="2098"/>
-            <w:shd w:fill="17364D"/>
+            <w:tcW w:type="dxa" w:w="3685"/>
+            <w:shd w:fill="E7EDF2"/>
           </w:tcPr>
           <w:p>
             <w:r>
-              <w:rPr>
-                <w:b/>
-                <w:color w:val="FFFFFF"/>
-              </w:rPr>
-              <w:t>部件 / Component</w:t>
+              <w:t>编号及部件 / Component</w:t>
             </w:r>
           </w:p>
         </w:tc>
         <w:tc>
           <w:tcPr>
-            <w:tcW w:type="dxa" w:w="3288"/>
-            <w:shd w:fill="17364D"/>
+            <w:tcW w:type="dxa" w:w="2551"/>
+            <w:shd w:fill="E7EDF2"/>
           </w:tcPr>
           <w:p>
             <w:r>
-              <w:rPr>
-                <w:b/>
-                <w:color w:val="FFFFFF"/>
-              </w:rPr>
               <w:t>功能</w:t>
             </w:r>
           </w:p>
         </w:tc>
         <w:tc>
           <w:tcPr>
-            <w:tcW w:type="dxa" w:w="4706"/>
-            <w:shd w:fill="17364D"/>
+            <w:tcW w:type="dxa" w:w="3969"/>
+            <w:shd w:fill="E7EDF2"/>
           </w:tcPr>
           <w:p>
             <w:r>
-              <w:rPr>
-                <w:b/>
-                <w:color w:val="FFFFFF"/>
-              </w:rPr>
               <w:t>Operational function</w:t>
             </w:r>
           </w:p>
@@ -158,52 +126,51 @@
         </w:trPr>
         <w:tc>
           <w:tcPr>
-            <w:tcW w:type="dxa" w:w="2098"/>
+            <w:tcW w:type="dxa" w:w="3685"/>
           </w:tcPr>
           <w:p>
             <w:pPr>
-              <w:spacing w:before="60" w:after="80" w:line="259" w:lineRule="auto"/>
+              <w:spacing w:before="40" w:after="60" w:line="252" w:lineRule="auto"/>
             </w:pPr>
             <w:r>
               <w:rPr>
-                <w:b/>
-                <w:sz w:val="19"/>
+                <w:sz w:val="18"/>
               </w:rPr>
-              <w:t>1 轿厢及轿架</w:t>
+              <w:t>T1 控制器</w:t>
               <w:br/>
-              <w:t>Car and car sling</w:t>
+              <w:t>Controller</w:t>
             </w:r>
           </w:p>
         </w:tc>
         <w:tc>
           <w:tcPr>
-            <w:tcW w:type="dxa" w:w="3288"/>
+            <w:tcW w:type="dxa" w:w="2551"/>
           </w:tcPr>
           <w:p>
             <w:pPr>
-              <w:spacing w:before="60" w:after="80" w:line="259" w:lineRule="auto"/>
+              <w:spacing w:before="40" w:after="60" w:line="252" w:lineRule="auto"/>
             </w:pPr>
             <w:r>
               <w:rPr>
-                <w:sz w:val="19"/>
+                <w:sz w:val="18"/>
               </w:rPr>
-              <w:t>轿厢承载乘客或货物；轿架承托轿厢，并与悬吊及导向部件连接。</w:t>
+              <w:t>协调驱动、停车及开关门。</w:t>
             </w:r>
           </w:p>
         </w:tc>
         <w:tc>
           <w:tcPr>
-            <w:tcW w:type="dxa" w:w="4706"/>
+            <w:tcW w:type="dxa" w:w="3969"/>
           </w:tcPr>
           <w:p>
             <w:pPr>
-              <w:spacing w:before="60" w:after="80" w:line="259" w:lineRule="auto"/>
+              <w:spacing w:before="40" w:after="60" w:line="252" w:lineRule="auto"/>
             </w:pPr>
             <w:r>
               <w:rPr>
-                <w:sz w:val="19"/>
+                <w:sz w:val="18"/>
               </w:rPr>
-              <w:t>The car carries passengers or goods. The car sling supports the car and connects it to the suspension and guiding components.</w:t>
+              <w:t>Coordinates drive, stopping and door operation.</w:t>
             </w:r>
           </w:p>
         </w:tc>
@@ -214,18 +181,17 @@
         </w:trPr>
         <w:tc>
           <w:tcPr>
-            <w:tcW w:type="dxa" w:w="2098"/>
+            <w:tcW w:type="dxa" w:w="3685"/>
           </w:tcPr>
           <w:p>
             <w:pPr>
-              <w:spacing w:before="60" w:after="80" w:line="259" w:lineRule="auto"/>
+              <w:spacing w:before="40" w:after="60" w:line="252" w:lineRule="auto"/>
             </w:pPr>
             <w:r>
               <w:rPr>
-                <w:b/>
-                <w:sz w:val="19"/>
+                <w:sz w:val="18"/>
               </w:rPr>
-              <w:t>2 驱动电动机</w:t>
+              <w:t>T2 驱动电动机</w:t>
               <w:br/>
               <w:t>Drive motor</w:t>
             </w:r>
@@ -233,33 +199,33 @@
         </w:tc>
         <w:tc>
           <w:tcPr>
-            <w:tcW w:type="dxa" w:w="3288"/>
+            <w:tcW w:type="dxa" w:w="2551"/>
           </w:tcPr>
           <w:p>
             <w:pPr>
-              <w:spacing w:before="60" w:after="80" w:line="259" w:lineRule="auto"/>
+              <w:spacing w:before="40" w:after="60" w:line="252" w:lineRule="auto"/>
             </w:pPr>
             <w:r>
               <w:rPr>
-                <w:sz w:val="19"/>
+                <w:sz w:val="18"/>
               </w:rPr>
-              <w:t>提供升降动力。无齿轮式直接驱动曳引轮；有齿轮式通过减速装置驱动。</w:t>
+              <w:t>提供驱动力。</w:t>
             </w:r>
           </w:p>
         </w:tc>
         <w:tc>
           <w:tcPr>
-            <w:tcW w:type="dxa" w:w="4706"/>
+            <w:tcW w:type="dxa" w:w="3969"/>
           </w:tcPr>
           <w:p>
             <w:pPr>
-              <w:spacing w:before="60" w:after="80" w:line="259" w:lineRule="auto"/>
+              <w:spacing w:before="40" w:after="60" w:line="252" w:lineRule="auto"/>
             </w:pPr>
             <w:r>
               <w:rPr>
-                <w:sz w:val="19"/>
+                <w:sz w:val="18"/>
               </w:rPr>
-              <w:t>The motor supplies driving power. It drives the sheave directly in a gearless lift or through reduction gearing in a geared lift.</w:t>
+              <w:t>Supplies driving power.</w:t>
             </w:r>
           </w:p>
         </w:tc>
@@ -270,52 +236,51 @@
         </w:trPr>
         <w:tc>
           <w:tcPr>
-            <w:tcW w:type="dxa" w:w="2098"/>
+            <w:tcW w:type="dxa" w:w="3685"/>
           </w:tcPr>
           <w:p>
             <w:pPr>
-              <w:spacing w:before="60" w:after="80" w:line="259" w:lineRule="auto"/>
+              <w:spacing w:before="40" w:after="60" w:line="252" w:lineRule="auto"/>
             </w:pPr>
             <w:r>
               <w:rPr>
-                <w:b/>
-                <w:sz w:val="19"/>
+                <w:sz w:val="18"/>
               </w:rPr>
-              <w:t>3 曳引轮及减速装置</w:t>
+              <w:t>T3 制动器</w:t>
               <w:br/>
-              <w:t>Traction sheave and reduction gearing</w:t>
+              <w:t>Brake</w:t>
             </w:r>
           </w:p>
         </w:tc>
         <w:tc>
           <w:tcPr>
-            <w:tcW w:type="dxa" w:w="3288"/>
+            <w:tcW w:type="dxa" w:w="2551"/>
           </w:tcPr>
           <w:p>
             <w:pPr>
-              <w:spacing w:before="60" w:after="80" w:line="259" w:lineRule="auto"/>
+              <w:spacing w:before="40" w:after="60" w:line="252" w:lineRule="auto"/>
             </w:pPr>
             <w:r>
               <w:rPr>
-                <w:sz w:val="19"/>
+                <w:sz w:val="18"/>
               </w:rPr>
-              <w:t>曳引轮通过与钢丝绳的摩擦传递牵引力。有齿轮式的减速装置降低电动机输出转速。</w:t>
+              <w:t>停止并保持驱动系统；弹簧施闸、电力释放。</w:t>
             </w:r>
           </w:p>
         </w:tc>
         <w:tc>
           <w:tcPr>
-            <w:tcW w:type="dxa" w:w="4706"/>
+            <w:tcW w:type="dxa" w:w="3969"/>
           </w:tcPr>
           <w:p>
             <w:pPr>
-              <w:spacing w:before="60" w:after="80" w:line="259" w:lineRule="auto"/>
+              <w:spacing w:before="40" w:after="60" w:line="252" w:lineRule="auto"/>
             </w:pPr>
             <w:r>
               <w:rPr>
-                <w:sz w:val="19"/>
+                <w:sz w:val="18"/>
               </w:rPr>
-              <w:t>The sheave transmits driving force to the ropes through friction. In a geared lift, the reduction unit reduces motor speed before driving the sheave.</w:t>
+              <w:t>Stops and holds the drive; spring-applied and electrically released.</w:t>
             </w:r>
           </w:p>
         </w:tc>
@@ -326,52 +291,51 @@
         </w:trPr>
         <w:tc>
           <w:tcPr>
-            <w:tcW w:type="dxa" w:w="2098"/>
+            <w:tcW w:type="dxa" w:w="3685"/>
           </w:tcPr>
           <w:p>
             <w:pPr>
-              <w:spacing w:before="60" w:after="80" w:line="259" w:lineRule="auto"/>
+              <w:spacing w:before="40" w:after="60" w:line="252" w:lineRule="auto"/>
             </w:pPr>
             <w:r>
               <w:rPr>
-                <w:b/>
-                <w:sz w:val="19"/>
+                <w:sz w:val="18"/>
               </w:rPr>
-              <w:t>4 悬吊钢丝绳</w:t>
+              <w:t>T4 齿轮箱</w:t>
               <w:br/>
-              <w:t>Suspension / hoisting ropes</w:t>
+              <w:t>Gear box</w:t>
             </w:r>
           </w:p>
         </w:tc>
         <w:tc>
           <w:tcPr>
-            <w:tcW w:type="dxa" w:w="3288"/>
+            <w:tcW w:type="dxa" w:w="2551"/>
           </w:tcPr>
           <w:p>
             <w:pPr>
-              <w:spacing w:before="60" w:after="80" w:line="259" w:lineRule="auto"/>
+              <w:spacing w:before="40" w:after="60" w:line="252" w:lineRule="auto"/>
             </w:pPr>
             <w:r>
               <w:rPr>
-                <w:sz w:val="19"/>
+                <w:sz w:val="18"/>
               </w:rPr>
-              <w:t>悬吊轿厢和对重，并传递曳引轮的驱动力。</w:t>
+              <w:t>降低转速并传递转矩至曳引轮。</w:t>
             </w:r>
           </w:p>
         </w:tc>
         <w:tc>
           <w:tcPr>
-            <w:tcW w:type="dxa" w:w="4706"/>
+            <w:tcW w:type="dxa" w:w="3969"/>
           </w:tcPr>
           <w:p>
             <w:pPr>
-              <w:spacing w:before="60" w:after="80" w:line="259" w:lineRule="auto"/>
+              <w:spacing w:before="40" w:after="60" w:line="252" w:lineRule="auto"/>
             </w:pPr>
             <w:r>
               <w:rPr>
-                <w:sz w:val="19"/>
+                <w:sz w:val="18"/>
               </w:rPr>
-              <w:t>The ropes suspend the car and counterweight and transmit the driving force from the traction sheave.</w:t>
+              <w:t>Reduces speed and transmits torque to the drive sheave.</w:t>
             </w:r>
           </w:p>
         </w:tc>
@@ -382,52 +346,51 @@
         </w:trPr>
         <w:tc>
           <w:tcPr>
-            <w:tcW w:type="dxa" w:w="2098"/>
+            <w:tcW w:type="dxa" w:w="3685"/>
           </w:tcPr>
           <w:p>
             <w:pPr>
-              <w:spacing w:before="60" w:after="80" w:line="259" w:lineRule="auto"/>
+              <w:spacing w:before="40" w:after="60" w:line="252" w:lineRule="auto"/>
             </w:pPr>
             <w:r>
               <w:rPr>
-                <w:b/>
-                <w:sz w:val="19"/>
+                <w:sz w:val="18"/>
               </w:rPr>
-              <w:t>5 对重</w:t>
+              <w:t>T5 曳引轮</w:t>
               <w:br/>
-              <w:t>Counterweight</w:t>
+              <w:t>Drive sheave</w:t>
             </w:r>
           </w:p>
         </w:tc>
         <w:tc>
           <w:tcPr>
-            <w:tcW w:type="dxa" w:w="3288"/>
+            <w:tcW w:type="dxa" w:w="2551"/>
           </w:tcPr>
           <w:p>
             <w:pPr>
-              <w:spacing w:before="60" w:after="80" w:line="259" w:lineRule="auto"/>
+              <w:spacing w:before="40" w:after="60" w:line="252" w:lineRule="auto"/>
             </w:pPr>
             <w:r>
               <w:rPr>
-                <w:sz w:val="19"/>
+                <w:sz w:val="18"/>
               </w:rPr>
-              <w:t>平衡轿厢及部分载荷重量，减少驱动功率，使电动机主要克服不平衡负载和摩擦。</w:t>
+              <w:t>通过与悬吊绳的摩擦传递驱动力。</w:t>
             </w:r>
           </w:p>
         </w:tc>
         <w:tc>
           <w:tcPr>
-            <w:tcW w:type="dxa" w:w="4706"/>
+            <w:tcW w:type="dxa" w:w="3969"/>
           </w:tcPr>
           <w:p>
             <w:pPr>
-              <w:spacing w:before="60" w:after="80" w:line="259" w:lineRule="auto"/>
+              <w:spacing w:before="40" w:after="60" w:line="252" w:lineRule="auto"/>
             </w:pPr>
             <w:r>
               <w:rPr>
-                <w:sz w:val="19"/>
+                <w:sz w:val="18"/>
               </w:rPr>
-              <w:t>The counterweight balances the car and part of its load, reducing the power needed to overcome the unbalanced load and friction.</w:t>
+              <w:t>Transmits driving force by friction with the suspension rope.</w:t>
             </w:r>
           </w:p>
         </w:tc>
@@ -438,52 +401,51 @@
         </w:trPr>
         <w:tc>
           <w:tcPr>
-            <w:tcW w:type="dxa" w:w="2098"/>
+            <w:tcW w:type="dxa" w:w="3685"/>
           </w:tcPr>
           <w:p>
             <w:pPr>
-              <w:spacing w:before="60" w:after="80" w:line="259" w:lineRule="auto"/>
+              <w:spacing w:before="40" w:after="60" w:line="252" w:lineRule="auto"/>
             </w:pPr>
             <w:r>
               <w:rPr>
-                <w:b/>
-                <w:sz w:val="19"/>
+                <w:sz w:val="18"/>
               </w:rPr>
-              <w:t>6 导轨及导靴／滚轮</w:t>
+              <w:t>T6 悬吊绳</w:t>
               <w:br/>
-              <w:t>Guide rails and shoes / rollers</w:t>
+              <w:t>Suspension rope</w:t>
             </w:r>
           </w:p>
         </w:tc>
         <w:tc>
           <w:tcPr>
-            <w:tcW w:type="dxa" w:w="3288"/>
+            <w:tcW w:type="dxa" w:w="2551"/>
           </w:tcPr>
           <w:p>
             <w:pPr>
-              <w:spacing w:before="60" w:after="80" w:line="259" w:lineRule="auto"/>
+              <w:spacing w:before="40" w:after="60" w:line="252" w:lineRule="auto"/>
             </w:pPr>
             <w:r>
               <w:rPr>
-                <w:sz w:val="19"/>
+                <w:sz w:val="18"/>
               </w:rPr>
-              <w:t>引导轿厢和对重沿规定垂直路径运行，并限制横向移动。</w:t>
+              <w:t>悬吊轿厢和对重。</w:t>
             </w:r>
           </w:p>
         </w:tc>
         <w:tc>
           <w:tcPr>
-            <w:tcW w:type="dxa" w:w="4706"/>
+            <w:tcW w:type="dxa" w:w="3969"/>
           </w:tcPr>
           <w:p>
             <w:pPr>
-              <w:spacing w:before="60" w:after="80" w:line="259" w:lineRule="auto"/>
+              <w:spacing w:before="40" w:after="60" w:line="252" w:lineRule="auto"/>
             </w:pPr>
             <w:r>
               <w:rPr>
-                <w:sz w:val="19"/>
+                <w:sz w:val="18"/>
               </w:rPr>
-              <w:t>They guide the car and counterweight along their vertical paths and restrain lateral movement.</w:t>
+              <w:t>Suspends the car and counterweight.</w:t>
             </w:r>
           </w:p>
         </w:tc>
@@ -494,52 +456,326 @@
         </w:trPr>
         <w:tc>
           <w:tcPr>
-            <w:tcW w:type="dxa" w:w="2098"/>
+            <w:tcW w:type="dxa" w:w="3685"/>
           </w:tcPr>
           <w:p>
             <w:pPr>
-              <w:spacing w:before="60" w:after="80" w:line="259" w:lineRule="auto"/>
+              <w:spacing w:before="40" w:after="60" w:line="252" w:lineRule="auto"/>
             </w:pPr>
             <w:r>
               <w:rPr>
-                <w:b/>
-                <w:sz w:val="19"/>
+                <w:sz w:val="18"/>
               </w:rPr>
-              <w:t>7 制动器</w:t>
+              <w:t>T7 轿厢</w:t>
               <w:br/>
-              <w:t>Brake</w:t>
+              <w:t>Car</w:t>
             </w:r>
           </w:p>
         </w:tc>
         <w:tc>
           <w:tcPr>
-            <w:tcW w:type="dxa" w:w="3288"/>
+            <w:tcW w:type="dxa" w:w="2551"/>
           </w:tcPr>
           <w:p>
             <w:pPr>
-              <w:spacing w:before="60" w:after="80" w:line="259" w:lineRule="auto"/>
+              <w:spacing w:before="40" w:after="60" w:line="252" w:lineRule="auto"/>
             </w:pPr>
             <w:r>
               <w:rPr>
-                <w:sz w:val="19"/>
+                <w:sz w:val="18"/>
               </w:rPr>
-              <w:t>使驱动系统停止并保持静止。制动器采用弹簧施闸、电力释放；有齿轮式通常装在电动机与减速装置之间。</w:t>
+              <w:t>承载乘客或货物。</w:t>
             </w:r>
           </w:p>
         </w:tc>
         <w:tc>
           <w:tcPr>
-            <w:tcW w:type="dxa" w:w="4706"/>
+            <w:tcW w:type="dxa" w:w="3969"/>
           </w:tcPr>
           <w:p>
             <w:pPr>
-              <w:spacing w:before="60" w:after="80" w:line="259" w:lineRule="auto"/>
+              <w:spacing w:before="40" w:after="60" w:line="252" w:lineRule="auto"/>
             </w:pPr>
             <w:r>
               <w:rPr>
-                <w:sz w:val="19"/>
+                <w:sz w:val="18"/>
               </w:rPr>
-              <w:t>The brake stops and holds the drive system. It is spring-applied and electrically released. In a geared lift, it normally sits between the motor and reduction unit.</w:t>
+              <w:t>Carries passengers or goods.</w:t>
+            </w:r>
+          </w:p>
+        </w:tc>
+      </w:tr>
+      <w:tr>
+        <w:trPr>
+          <w:cantSplit/>
+        </w:trPr>
+        <w:tc>
+          <w:tcPr>
+            <w:tcW w:type="dxa" w:w="3685"/>
+          </w:tcPr>
+          <w:p>
+            <w:pPr>
+              <w:spacing w:before="40" w:after="60" w:line="252" w:lineRule="auto"/>
+            </w:pPr>
+            <w:r>
+              <w:rPr>
+                <w:sz w:val="18"/>
+              </w:rPr>
+              <w:t>T8 对重</w:t>
+              <w:br/>
+              <w:t>Counterweight</w:t>
+            </w:r>
+          </w:p>
+        </w:tc>
+        <w:tc>
+          <w:tcPr>
+            <w:tcW w:type="dxa" w:w="2551"/>
+          </w:tcPr>
+          <w:p>
+            <w:pPr>
+              <w:spacing w:before="40" w:after="60" w:line="252" w:lineRule="auto"/>
+            </w:pPr>
+            <w:r>
+              <w:rPr>
+                <w:sz w:val="18"/>
+              </w:rPr>
+              <w:t>平衡部分重量，减少不平衡负载。</w:t>
+            </w:r>
+          </w:p>
+        </w:tc>
+        <w:tc>
+          <w:tcPr>
+            <w:tcW w:type="dxa" w:w="3969"/>
+          </w:tcPr>
+          <w:p>
+            <w:pPr>
+              <w:spacing w:before="40" w:after="60" w:line="252" w:lineRule="auto"/>
+            </w:pPr>
+            <w:r>
+              <w:rPr>
+                <w:sz w:val="18"/>
+              </w:rPr>
+              <w:t>Balances part of the load to reduce the unbalanced load.</w:t>
+            </w:r>
+          </w:p>
+        </w:tc>
+      </w:tr>
+      <w:tr>
+        <w:trPr>
+          <w:cantSplit/>
+        </w:trPr>
+        <w:tc>
+          <w:tcPr>
+            <w:tcW w:type="dxa" w:w="3685"/>
+          </w:tcPr>
+          <w:p>
+            <w:pPr>
+              <w:spacing w:before="40" w:after="60" w:line="252" w:lineRule="auto"/>
+            </w:pPr>
+            <w:r>
+              <w:rPr>
+                <w:sz w:val="18"/>
+              </w:rPr>
+              <w:t>T9 轿厢导轨</w:t>
+              <w:br/>
+              <w:t>Car guide rail</w:t>
+            </w:r>
+          </w:p>
+        </w:tc>
+        <w:tc>
+          <w:tcPr>
+            <w:tcW w:type="dxa" w:w="2551"/>
+          </w:tcPr>
+          <w:p>
+            <w:pPr>
+              <w:spacing w:before="40" w:after="60" w:line="252" w:lineRule="auto"/>
+            </w:pPr>
+            <w:r>
+              <w:rPr>
+                <w:sz w:val="18"/>
+              </w:rPr>
+              <w:t>引导轿厢垂直运行。</w:t>
+            </w:r>
+          </w:p>
+        </w:tc>
+        <w:tc>
+          <w:tcPr>
+            <w:tcW w:type="dxa" w:w="3969"/>
+          </w:tcPr>
+          <w:p>
+            <w:pPr>
+              <w:spacing w:before="40" w:after="60" w:line="252" w:lineRule="auto"/>
+            </w:pPr>
+            <w:r>
+              <w:rPr>
+                <w:sz w:val="18"/>
+              </w:rPr>
+              <w:t>Guides the car vertically.</w:t>
+            </w:r>
+          </w:p>
+        </w:tc>
+      </w:tr>
+      <w:tr>
+        <w:trPr>
+          <w:cantSplit/>
+        </w:trPr>
+        <w:tc>
+          <w:tcPr>
+            <w:tcW w:type="dxa" w:w="3685"/>
+          </w:tcPr>
+          <w:p>
+            <w:pPr>
+              <w:spacing w:before="40" w:after="60" w:line="252" w:lineRule="auto"/>
+            </w:pPr>
+            <w:r>
+              <w:rPr>
+                <w:sz w:val="18"/>
+              </w:rPr>
+              <w:t>T10 对重导轨</w:t>
+              <w:br/>
+              <w:t>Counterweight guide rail</w:t>
+            </w:r>
+          </w:p>
+        </w:tc>
+        <w:tc>
+          <w:tcPr>
+            <w:tcW w:type="dxa" w:w="2551"/>
+          </w:tcPr>
+          <w:p>
+            <w:pPr>
+              <w:spacing w:before="40" w:after="60" w:line="252" w:lineRule="auto"/>
+            </w:pPr>
+            <w:r>
+              <w:rPr>
+                <w:sz w:val="18"/>
+              </w:rPr>
+              <w:t>引导对重垂直运行。</w:t>
+            </w:r>
+          </w:p>
+        </w:tc>
+        <w:tc>
+          <w:tcPr>
+            <w:tcW w:type="dxa" w:w="3969"/>
+          </w:tcPr>
+          <w:p>
+            <w:pPr>
+              <w:spacing w:before="40" w:after="60" w:line="252" w:lineRule="auto"/>
+            </w:pPr>
+            <w:r>
+              <w:rPr>
+                <w:sz w:val="18"/>
+              </w:rPr>
+              <w:t>Guides the counterweight vertically.</w:t>
+            </w:r>
+          </w:p>
+        </w:tc>
+      </w:tr>
+      <w:tr>
+        <w:trPr>
+          <w:cantSplit/>
+        </w:trPr>
+        <w:tc>
+          <w:tcPr>
+            <w:tcW w:type="dxa" w:w="3685"/>
+          </w:tcPr>
+          <w:p>
+            <w:pPr>
+              <w:spacing w:before="40" w:after="60" w:line="252" w:lineRule="auto"/>
+            </w:pPr>
+            <w:r>
+              <w:rPr>
+                <w:sz w:val="18"/>
+              </w:rPr>
+              <w:t>T11 门机</w:t>
+              <w:br/>
+              <w:t>Door operator</w:t>
+            </w:r>
+          </w:p>
+        </w:tc>
+        <w:tc>
+          <w:tcPr>
+            <w:tcW w:type="dxa" w:w="2551"/>
+          </w:tcPr>
+          <w:p>
+            <w:pPr>
+              <w:spacing w:before="40" w:after="60" w:line="252" w:lineRule="auto"/>
+            </w:pPr>
+            <w:r>
+              <w:rPr>
+                <w:sz w:val="18"/>
+              </w:rPr>
+              <w:t>驱动轿门开关。</w:t>
+            </w:r>
+          </w:p>
+        </w:tc>
+        <w:tc>
+          <w:tcPr>
+            <w:tcW w:type="dxa" w:w="3969"/>
+          </w:tcPr>
+          <w:p>
+            <w:pPr>
+              <w:spacing w:before="40" w:after="60" w:line="252" w:lineRule="auto"/>
+            </w:pPr>
+            <w:r>
+              <w:rPr>
+                <w:sz w:val="18"/>
+              </w:rPr>
+              <w:t>Operates the car doors.</w:t>
+            </w:r>
+          </w:p>
+        </w:tc>
+      </w:tr>
+      <w:tr>
+        <w:trPr>
+          <w:cantSplit/>
+        </w:trPr>
+        <w:tc>
+          <w:tcPr>
+            <w:tcW w:type="dxa" w:w="3685"/>
+          </w:tcPr>
+          <w:p>
+            <w:pPr>
+              <w:spacing w:before="40" w:after="60" w:line="252" w:lineRule="auto"/>
+            </w:pPr>
+            <w:r>
+              <w:rPr>
+                <w:sz w:val="18"/>
+              </w:rPr>
+              <w:t>T12 轿门</w:t>
+              <w:br/>
+              <w:t>Car doors</w:t>
+            </w:r>
+          </w:p>
+        </w:tc>
+        <w:tc>
+          <w:tcPr>
+            <w:tcW w:type="dxa" w:w="2551"/>
+          </w:tcPr>
+          <w:p>
+            <w:pPr>
+              <w:spacing w:before="40" w:after="60" w:line="252" w:lineRule="auto"/>
+            </w:pPr>
+            <w:r>
+              <w:rPr>
+                <w:sz w:val="18"/>
+              </w:rPr>
+              <w:t>控制轿厢入口。</w:t>
+            </w:r>
+          </w:p>
+        </w:tc>
+        <w:tc>
+          <w:tcPr>
+            <w:tcW w:type="dxa" w:w="3969"/>
+          </w:tcPr>
+          <w:p>
+            <w:pPr>
+              <w:spacing w:before="40" w:after="60" w:line="252" w:lineRule="auto"/>
+            </w:pPr>
+            <w:r>
+              <w:rPr>
+                <w:sz w:val="18"/>
+              </w:rPr>
+              <w:t>Control access to the car.</w:t>
             </w:r>
           </w:p>
         </w:tc>
@@ -555,7 +791,7 @@
         <w:pStyle w:val="Heading1"/>
       </w:pPr>
       <w:r>
-        <w:t>1.1 主要部件及功能 / Major components (2/2)</w:t>
+        <w:t>1.1 部件及功能 / Components and functions (2/3)</w:t>
       </w:r>
     </w:p>
     <w:tbl>
@@ -566,9 +802,9 @@
         <w:tblLook w:firstColumn="1" w:firstRow="1" w:lastColumn="0" w:lastRow="0" w:noHBand="0" w:noVBand="1" w:val="04A0"/>
       </w:tblPr>
       <w:tblGrid>
-        <w:gridCol w:w="2098"/>
-        <w:gridCol w:w="3288"/>
-        <w:gridCol w:w="4706"/>
+        <w:gridCol w:w="3402"/>
+        <w:gridCol w:w="3402"/>
+        <w:gridCol w:w="3402"/>
       </w:tblGrid>
       <w:tr>
         <w:trPr>
@@ -576,45 +812,33 @@
         </w:trPr>
         <w:tc>
           <w:tcPr>
-            <w:tcW w:type="dxa" w:w="2098"/>
-            <w:shd w:fill="17364D"/>
+            <w:tcW w:type="dxa" w:w="3685"/>
+            <w:shd w:fill="E7EDF2"/>
           </w:tcPr>
           <w:p>
             <w:r>
-              <w:rPr>
-                <w:b/>
-                <w:color w:val="FFFFFF"/>
-              </w:rPr>
-              <w:t>部件 / Component</w:t>
+              <w:t>编号及部件 / Component</w:t>
             </w:r>
           </w:p>
         </w:tc>
         <w:tc>
           <w:tcPr>
-            <w:tcW w:type="dxa" w:w="3288"/>
-            <w:shd w:fill="17364D"/>
+            <w:tcW w:type="dxa" w:w="2551"/>
+            <w:shd w:fill="E7EDF2"/>
           </w:tcPr>
           <w:p>
             <w:r>
-              <w:rPr>
-                <w:b/>
-                <w:color w:val="FFFFFF"/>
-              </w:rPr>
               <w:t>功能</w:t>
             </w:r>
           </w:p>
         </w:tc>
         <w:tc>
           <w:tcPr>
-            <w:tcW w:type="dxa" w:w="4706"/>
-            <w:shd w:fill="17364D"/>
+            <w:tcW w:type="dxa" w:w="3969"/>
+            <w:shd w:fill="E7EDF2"/>
           </w:tcPr>
           <w:p>
             <w:r>
-              <w:rPr>
-                <w:b/>
-                <w:color w:val="FFFFFF"/>
-              </w:rPr>
               <w:t>Operational function</w:t>
             </w:r>
           </w:p>
@@ -626,52 +850,51 @@
         </w:trPr>
         <w:tc>
           <w:tcPr>
-            <w:tcW w:type="dxa" w:w="2098"/>
+            <w:tcW w:type="dxa" w:w="3685"/>
           </w:tcPr>
           <w:p>
             <w:pPr>
-              <w:spacing w:before="60" w:after="80" w:line="259" w:lineRule="auto"/>
+              <w:spacing w:before="40" w:after="60" w:line="252" w:lineRule="auto"/>
             </w:pPr>
             <w:r>
               <w:rPr>
-                <w:b/>
-                <w:sz w:val="19"/>
+                <w:sz w:val="18"/>
               </w:rPr>
-              <w:t>8 控制器及传感器</w:t>
+              <w:t>T13 层门</w:t>
               <w:br/>
-              <w:t>Controller and transducers</w:t>
+              <w:t>Landing doors</w:t>
             </w:r>
           </w:p>
         </w:tc>
         <w:tc>
           <w:tcPr>
-            <w:tcW w:type="dxa" w:w="3288"/>
+            <w:tcW w:type="dxa" w:w="2551"/>
           </w:tcPr>
           <w:p>
             <w:pPr>
-              <w:spacing w:before="60" w:after="80" w:line="259" w:lineRule="auto"/>
+              <w:spacing w:before="40" w:after="60" w:line="252" w:lineRule="auto"/>
             </w:pPr>
             <w:r>
               <w:rPr>
-                <w:sz w:val="19"/>
+                <w:sz w:val="18"/>
               </w:rPr>
-              <w:t>协调运行方向、速度、停车和门的操作；位置及速度传感器提供反馈。</w:t>
+              <w:t>关闭各楼层的井道入口。</w:t>
             </w:r>
           </w:p>
         </w:tc>
         <w:tc>
           <w:tcPr>
-            <w:tcW w:type="dxa" w:w="4706"/>
+            <w:tcW w:type="dxa" w:w="3969"/>
           </w:tcPr>
           <w:p>
             <w:pPr>
-              <w:spacing w:before="60" w:after="80" w:line="259" w:lineRule="auto"/>
+              <w:spacing w:before="40" w:after="60" w:line="252" w:lineRule="auto"/>
             </w:pPr>
             <w:r>
               <w:rPr>
-                <w:sz w:val="19"/>
+                <w:sz w:val="18"/>
               </w:rPr>
-              <w:t>The controller coordinates direction, speed, stopping and door operation. Position and speed transducers provide feedback.</w:t>
+              <w:t>Close the well entrance at each landing.</w:t>
             </w:r>
           </w:p>
         </w:tc>
@@ -682,52 +905,51 @@
         </w:trPr>
         <w:tc>
           <w:tcPr>
-            <w:tcW w:type="dxa" w:w="2098"/>
+            <w:tcW w:type="dxa" w:w="3685"/>
           </w:tcPr>
           <w:p>
             <w:pPr>
-              <w:spacing w:before="60" w:after="80" w:line="259" w:lineRule="auto"/>
+              <w:spacing w:before="40" w:after="60" w:line="252" w:lineRule="auto"/>
             </w:pPr>
             <w:r>
               <w:rPr>
-                <w:b/>
-                <w:sz w:val="19"/>
+                <w:sz w:val="18"/>
               </w:rPr>
-              <w:t>9 门及门安全装置</w:t>
+              <w:t>T14 层站按钮</w:t>
               <w:br/>
-              <w:t>Doors and door safety devices</w:t>
+              <w:t>Landing pushbutton</w:t>
             </w:r>
           </w:p>
         </w:tc>
         <w:tc>
           <w:tcPr>
-            <w:tcW w:type="dxa" w:w="3288"/>
+            <w:tcW w:type="dxa" w:w="2551"/>
           </w:tcPr>
           <w:p>
             <w:pPr>
-              <w:spacing w:before="60" w:after="80" w:line="259" w:lineRule="auto"/>
+              <w:spacing w:before="40" w:after="60" w:line="252" w:lineRule="auto"/>
             </w:pPr>
             <w:r>
               <w:rPr>
-                <w:sz w:val="19"/>
+                <w:sz w:val="18"/>
               </w:rPr>
-              <w:t>门机负责开关门。层门联锁确保门未正确关闭并锁紧时不能运行；关门期间若有人进入，接近传感器使门重开。</w:t>
+              <w:t>发出召梯指令。</w:t>
             </w:r>
           </w:p>
         </w:tc>
         <w:tc>
           <w:tcPr>
-            <w:tcW w:type="dxa" w:w="4706"/>
+            <w:tcW w:type="dxa" w:w="3969"/>
           </w:tcPr>
           <w:p>
             <w:pPr>
-              <w:spacing w:before="60" w:after="80" w:line="259" w:lineRule="auto"/>
+              <w:spacing w:before="40" w:after="60" w:line="252" w:lineRule="auto"/>
             </w:pPr>
             <w:r>
               <w:rPr>
-                <w:sz w:val="19"/>
+                <w:sz w:val="18"/>
               </w:rPr>
-              <w:t>The operator opens and closes the doors. Interlocks prevent travel unless landing doors are closed and locked. A proximity sensor reopens closing doors when someone enters.</w:t>
+              <w:t>Registers a landing call.</w:t>
             </w:r>
           </w:p>
         </w:tc>
@@ -738,52 +960,51 @@
         </w:trPr>
         <w:tc>
           <w:tcPr>
-            <w:tcW w:type="dxa" w:w="2098"/>
+            <w:tcW w:type="dxa" w:w="3685"/>
           </w:tcPr>
           <w:p>
             <w:pPr>
-              <w:spacing w:before="60" w:after="80" w:line="259" w:lineRule="auto"/>
+              <w:spacing w:before="40" w:after="60" w:line="252" w:lineRule="auto"/>
             </w:pPr>
             <w:r>
               <w:rPr>
-                <w:b/>
-                <w:sz w:val="19"/>
+                <w:sz w:val="18"/>
               </w:rPr>
-              <w:t>10 限速器、绳及张紧轮</w:t>
+              <w:t>T15 层站指示器</w:t>
               <w:br/>
-              <w:t>Governor, rope and tension sheave</w:t>
+              <w:t>Landing indicator</w:t>
             </w:r>
           </w:p>
         </w:tc>
         <w:tc>
           <w:tcPr>
-            <w:tcW w:type="dxa" w:w="3288"/>
+            <w:tcW w:type="dxa" w:w="2551"/>
           </w:tcPr>
           <w:p>
             <w:pPr>
-              <w:spacing w:before="60" w:after="80" w:line="259" w:lineRule="auto"/>
+              <w:spacing w:before="40" w:after="60" w:line="252" w:lineRule="auto"/>
             </w:pPr>
             <w:r>
               <w:rPr>
-                <w:sz w:val="19"/>
+                <w:sz w:val="18"/>
               </w:rPr>
-              <w:t>限速器在达到预定超速值时触发停止，并在需要时使安全钳或辅助制动器动作。绳及张紧轮构成相关机械布置。</w:t>
+              <w:t>显示升降机的运行信息。</w:t>
             </w:r>
           </w:p>
         </w:tc>
         <w:tc>
           <w:tcPr>
-            <w:tcW w:type="dxa" w:w="4706"/>
+            <w:tcW w:type="dxa" w:w="3969"/>
           </w:tcPr>
           <w:p>
             <w:pPr>
-              <w:spacing w:before="60" w:after="80" w:line="259" w:lineRule="auto"/>
+              <w:spacing w:before="40" w:after="60" w:line="252" w:lineRule="auto"/>
             </w:pPr>
             <w:r>
               <w:rPr>
-                <w:sz w:val="19"/>
+                <w:sz w:val="18"/>
               </w:rPr>
-              <w:t>At a predetermined overspeed, the governor initiates stopping and applies the safety gear or auxiliary brake when necessary. Its rope and tension sheave form the associated arrangement.</w:t>
+              <w:t>Displays lift operating information.</w:t>
             </w:r>
           </w:p>
         </w:tc>
@@ -794,52 +1015,51 @@
         </w:trPr>
         <w:tc>
           <w:tcPr>
-            <w:tcW w:type="dxa" w:w="2098"/>
+            <w:tcW w:type="dxa" w:w="3685"/>
           </w:tcPr>
           <w:p>
             <w:pPr>
-              <w:spacing w:before="60" w:after="80" w:line="259" w:lineRule="auto"/>
+              <w:spacing w:before="40" w:after="60" w:line="252" w:lineRule="auto"/>
             </w:pPr>
             <w:r>
               <w:rPr>
-                <w:b/>
-                <w:sz w:val="19"/>
+                <w:sz w:val="18"/>
               </w:rPr>
-              <w:t>11 安全钳</w:t>
+              <w:t>T16 护脚板</w:t>
               <w:br/>
-              <w:t>Safety gear</w:t>
+              <w:t>Apron</w:t>
             </w:r>
           </w:p>
         </w:tc>
         <w:tc>
           <w:tcPr>
-            <w:tcW w:type="dxa" w:w="3288"/>
+            <w:tcW w:type="dxa" w:w="2551"/>
           </w:tcPr>
           <w:p>
             <w:pPr>
-              <w:spacing w:before="60" w:after="80" w:line="259" w:lineRule="auto"/>
+              <w:spacing w:before="40" w:after="60" w:line="252" w:lineRule="auto"/>
             </w:pPr>
             <w:r>
               <w:rPr>
-                <w:sz w:val="19"/>
+                <w:sz w:val="18"/>
               </w:rPr>
-              <w:t>在向下超速或悬吊失效等情况下，作用于导轨，使轿厢停止并保持静止。</w:t>
+              <w:t>遮护轿厢入口下方的间隙。</w:t>
             </w:r>
           </w:p>
         </w:tc>
         <w:tc>
           <w:tcPr>
-            <w:tcW w:type="dxa" w:w="4706"/>
+            <w:tcW w:type="dxa" w:w="3969"/>
           </w:tcPr>
           <w:p>
             <w:pPr>
-              <w:spacing w:before="60" w:after="80" w:line="259" w:lineRule="auto"/>
+              <w:spacing w:before="40" w:after="60" w:line="252" w:lineRule="auto"/>
             </w:pPr>
             <w:r>
               <w:rPr>
-                <w:sz w:val="19"/>
+                <w:sz w:val="18"/>
               </w:rPr>
-              <w:t>The safety gear acts on the guide rails to stop and hold the car during downward overspeed or suspension failure.</w:t>
+              <w:t>Guards the gap below the car entrance.</w:t>
             </w:r>
           </w:p>
         </w:tc>
@@ -850,52 +1070,51 @@
         </w:trPr>
         <w:tc>
           <w:tcPr>
-            <w:tcW w:type="dxa" w:w="2098"/>
+            <w:tcW w:type="dxa" w:w="3685"/>
           </w:tcPr>
           <w:p>
             <w:pPr>
-              <w:spacing w:before="60" w:after="80" w:line="259" w:lineRule="auto"/>
+              <w:spacing w:before="40" w:after="60" w:line="252" w:lineRule="auto"/>
             </w:pPr>
             <w:r>
               <w:rPr>
-                <w:b/>
-                <w:sz w:val="19"/>
+                <w:sz w:val="18"/>
               </w:rPr>
-              <w:t>12 平层及限位装置</w:t>
+              <w:t>T17 井道</w:t>
               <w:br/>
-              <w:t>Levelling and limit devices</w:t>
+              <w:t>Lift well</w:t>
             </w:r>
           </w:p>
         </w:tc>
         <w:tc>
           <w:tcPr>
-            <w:tcW w:type="dxa" w:w="3288"/>
+            <w:tcW w:type="dxa" w:w="2551"/>
           </w:tcPr>
           <w:p>
             <w:pPr>
-              <w:spacing w:before="60" w:after="80" w:line="259" w:lineRule="auto"/>
+              <w:spacing w:before="40" w:after="60" w:line="252" w:lineRule="auto"/>
             </w:pPr>
             <w:r>
               <w:rPr>
-                <w:sz w:val="19"/>
+                <w:sz w:val="18"/>
               </w:rPr>
-              <w:t>平层装置提高停靠楼层的准确度；限位或终端停止开关防止轿厢越过允许行程。</w:t>
+              <w:t>容纳轿厢及对重的运行空间。</w:t>
             </w:r>
           </w:p>
         </w:tc>
         <w:tc>
           <w:tcPr>
-            <w:tcW w:type="dxa" w:w="4706"/>
+            <w:tcW w:type="dxa" w:w="3969"/>
           </w:tcPr>
           <w:p>
             <w:pPr>
-              <w:spacing w:before="60" w:after="80" w:line="259" w:lineRule="auto"/>
+              <w:spacing w:before="40" w:after="60" w:line="252" w:lineRule="auto"/>
             </w:pPr>
             <w:r>
               <w:rPr>
-                <w:sz w:val="19"/>
+                <w:sz w:val="18"/>
               </w:rPr>
-              <w:t>Levelling improves stopping accuracy at landings. Limit or terminal stopping switches prevent travel beyond the permitted limits.</w:t>
+              <w:t>Encloses the travel space of the car and counterweight.</w:t>
             </w:r>
           </w:p>
         </w:tc>
@@ -906,52 +1125,940 @@
         </w:trPr>
         <w:tc>
           <w:tcPr>
-            <w:tcW w:type="dxa" w:w="2098"/>
+            <w:tcW w:type="dxa" w:w="3685"/>
           </w:tcPr>
           <w:p>
             <w:pPr>
-              <w:spacing w:before="60" w:after="80" w:line="259" w:lineRule="auto"/>
+              <w:spacing w:before="40" w:after="60" w:line="252" w:lineRule="auto"/>
             </w:pPr>
             <w:r>
               <w:rPr>
-                <w:b/>
-                <w:sz w:val="19"/>
+                <w:sz w:val="18"/>
               </w:rPr>
-              <w:t>13 缓冲器</w:t>
+              <w:t>T18 随行电缆</w:t>
               <w:br/>
-              <w:t>Car and counterweight buffers</w:t>
+              <w:t>Travelling cables</w:t>
             </w:r>
           </w:p>
         </w:tc>
         <w:tc>
           <w:tcPr>
-            <w:tcW w:type="dxa" w:w="3288"/>
+            <w:tcW w:type="dxa" w:w="2551"/>
           </w:tcPr>
           <w:p>
             <w:pPr>
-              <w:spacing w:before="60" w:after="80" w:line="259" w:lineRule="auto"/>
+              <w:spacing w:before="40" w:after="60" w:line="252" w:lineRule="auto"/>
             </w:pPr>
             <w:r>
               <w:rPr>
-                <w:sz w:val="19"/>
+                <w:sz w:val="18"/>
               </w:rPr>
-              <w:t>在行程底部发生越程冲击时吸收能量。油压缓冲器通过流体阻尼产生制动作用。</w:t>
+              <w:t>连接移动轿厢的电源与信号。</w:t>
             </w:r>
           </w:p>
         </w:tc>
         <w:tc>
           <w:tcPr>
-            <w:tcW w:type="dxa" w:w="4706"/>
+            <w:tcW w:type="dxa" w:w="3969"/>
           </w:tcPr>
           <w:p>
             <w:pPr>
-              <w:spacing w:before="60" w:after="80" w:line="259" w:lineRule="auto"/>
+              <w:spacing w:before="40" w:after="60" w:line="252" w:lineRule="auto"/>
             </w:pPr>
             <w:r>
               <w:rPr>
-                <w:sz w:val="19"/>
+                <w:sz w:val="18"/>
               </w:rPr>
-              <w:t>Buffers absorb impact energy at the lower end of travel. Oil buffers provide braking through fluid resistance.</w:t>
+              <w:t>Carry power and signals to and from the moving car.</w:t>
+            </w:r>
+          </w:p>
+        </w:tc>
+      </w:tr>
+      <w:tr>
+        <w:trPr>
+          <w:cantSplit/>
+        </w:trPr>
+        <w:tc>
+          <w:tcPr>
+            <w:tcW w:type="dxa" w:w="3685"/>
+          </w:tcPr>
+          <w:p>
+            <w:pPr>
+              <w:spacing w:before="40" w:after="60" w:line="252" w:lineRule="auto"/>
+            </w:pPr>
+            <w:r>
+              <w:rPr>
+                <w:sz w:val="18"/>
+              </w:rPr>
+              <w:t>T19 限位开关</w:t>
+              <w:br/>
+              <w:t>Limit switches</w:t>
+            </w:r>
+          </w:p>
+        </w:tc>
+        <w:tc>
+          <w:tcPr>
+            <w:tcW w:type="dxa" w:w="2551"/>
+          </w:tcPr>
+          <w:p>
+            <w:pPr>
+              <w:spacing w:before="40" w:after="60" w:line="252" w:lineRule="auto"/>
+            </w:pPr>
+            <w:r>
+              <w:rPr>
+                <w:sz w:val="18"/>
+              </w:rPr>
+              <w:t>防止超过允许行程。</w:t>
+            </w:r>
+          </w:p>
+        </w:tc>
+        <w:tc>
+          <w:tcPr>
+            <w:tcW w:type="dxa" w:w="3969"/>
+          </w:tcPr>
+          <w:p>
+            <w:pPr>
+              <w:spacing w:before="40" w:after="60" w:line="252" w:lineRule="auto"/>
+            </w:pPr>
+            <w:r>
+              <w:rPr>
+                <w:sz w:val="18"/>
+              </w:rPr>
+              <w:t>Prevent travel beyond permitted limits.</w:t>
+            </w:r>
+          </w:p>
+        </w:tc>
+      </w:tr>
+      <w:tr>
+        <w:trPr>
+          <w:cantSplit/>
+        </w:trPr>
+        <w:tc>
+          <w:tcPr>
+            <w:tcW w:type="dxa" w:w="3685"/>
+          </w:tcPr>
+          <w:p>
+            <w:pPr>
+              <w:spacing w:before="40" w:after="60" w:line="252" w:lineRule="auto"/>
+            </w:pPr>
+            <w:r>
+              <w:rPr>
+                <w:sz w:val="18"/>
+              </w:rPr>
+              <w:t>T20 限速器</w:t>
+              <w:br/>
+              <w:t>Overspeed governor</w:t>
+            </w:r>
+          </w:p>
+        </w:tc>
+        <w:tc>
+          <w:tcPr>
+            <w:tcW w:type="dxa" w:w="2551"/>
+          </w:tcPr>
+          <w:p>
+            <w:pPr>
+              <w:spacing w:before="40" w:after="60" w:line="252" w:lineRule="auto"/>
+            </w:pPr>
+            <w:r>
+              <w:rPr>
+                <w:sz w:val="18"/>
+              </w:rPr>
+              <w:t>检测超速并触发安全停止。</w:t>
+            </w:r>
+          </w:p>
+        </w:tc>
+        <w:tc>
+          <w:tcPr>
+            <w:tcW w:type="dxa" w:w="3969"/>
+          </w:tcPr>
+          <w:p>
+            <w:pPr>
+              <w:spacing w:before="40" w:after="60" w:line="252" w:lineRule="auto"/>
+            </w:pPr>
+            <w:r>
+              <w:rPr>
+                <w:sz w:val="18"/>
+              </w:rPr>
+              <w:t>Detects overspeed and initiates safety stopping.</w:t>
+            </w:r>
+          </w:p>
+        </w:tc>
+      </w:tr>
+      <w:tr>
+        <w:trPr>
+          <w:cantSplit/>
+        </w:trPr>
+        <w:tc>
+          <w:tcPr>
+            <w:tcW w:type="dxa" w:w="3685"/>
+          </w:tcPr>
+          <w:p>
+            <w:pPr>
+              <w:spacing w:before="40" w:after="60" w:line="252" w:lineRule="auto"/>
+            </w:pPr>
+            <w:r>
+              <w:rPr>
+                <w:sz w:val="18"/>
+              </w:rPr>
+              <w:t>T21 安全钳</w:t>
+              <w:br/>
+              <w:t>Safety gear</w:t>
+            </w:r>
+          </w:p>
+        </w:tc>
+        <w:tc>
+          <w:tcPr>
+            <w:tcW w:type="dxa" w:w="2551"/>
+          </w:tcPr>
+          <w:p>
+            <w:pPr>
+              <w:spacing w:before="40" w:after="60" w:line="252" w:lineRule="auto"/>
+            </w:pPr>
+            <w:r>
+              <w:rPr>
+                <w:sz w:val="18"/>
+              </w:rPr>
+              <w:t>异常情况下作用于轿厢导轨，使轿厢停止。</w:t>
+            </w:r>
+          </w:p>
+        </w:tc>
+        <w:tc>
+          <w:tcPr>
+            <w:tcW w:type="dxa" w:w="3969"/>
+          </w:tcPr>
+          <w:p>
+            <w:pPr>
+              <w:spacing w:before="40" w:after="60" w:line="252" w:lineRule="auto"/>
+            </w:pPr>
+            <w:r>
+              <w:rPr>
+                <w:sz w:val="18"/>
+              </w:rPr>
+              <w:t>Acts on the car guide rail to stop the car in an emergency.</w:t>
+            </w:r>
+          </w:p>
+        </w:tc>
+      </w:tr>
+      <w:tr>
+        <w:trPr>
+          <w:cantSplit/>
+        </w:trPr>
+        <w:tc>
+          <w:tcPr>
+            <w:tcW w:type="dxa" w:w="3685"/>
+          </w:tcPr>
+          <w:p>
+            <w:pPr>
+              <w:spacing w:before="40" w:after="60" w:line="252" w:lineRule="auto"/>
+            </w:pPr>
+            <w:r>
+              <w:rPr>
+                <w:sz w:val="18"/>
+              </w:rPr>
+              <w:t>T22 限速器张紧轮</w:t>
+              <w:br/>
+              <w:t>Governor tension sheave</w:t>
+            </w:r>
+          </w:p>
+        </w:tc>
+        <w:tc>
+          <w:tcPr>
+            <w:tcW w:type="dxa" w:w="2551"/>
+          </w:tcPr>
+          <w:p>
+            <w:pPr>
+              <w:spacing w:before="40" w:after="60" w:line="252" w:lineRule="auto"/>
+            </w:pPr>
+            <w:r>
+              <w:rPr>
+                <w:sz w:val="18"/>
+              </w:rPr>
+              <w:t>保持限速器绳路张紧。</w:t>
+            </w:r>
+          </w:p>
+        </w:tc>
+        <w:tc>
+          <w:tcPr>
+            <w:tcW w:type="dxa" w:w="3969"/>
+          </w:tcPr>
+          <w:p>
+            <w:pPr>
+              <w:spacing w:before="40" w:after="60" w:line="252" w:lineRule="auto"/>
+            </w:pPr>
+            <w:r>
+              <w:rPr>
+                <w:sz w:val="18"/>
+              </w:rPr>
+              <w:t>Maintains tension in the governor rope loop.</w:t>
+            </w:r>
+          </w:p>
+        </w:tc>
+      </w:tr>
+      <w:tr>
+        <w:trPr>
+          <w:cantSplit/>
+        </w:trPr>
+        <w:tc>
+          <w:tcPr>
+            <w:tcW w:type="dxa" w:w="3685"/>
+          </w:tcPr>
+          <w:p>
+            <w:pPr>
+              <w:spacing w:before="40" w:after="60" w:line="252" w:lineRule="auto"/>
+            </w:pPr>
+            <w:r>
+              <w:rPr>
+                <w:sz w:val="18"/>
+              </w:rPr>
+              <w:t>T23 轿厢缓冲器</w:t>
+              <w:br/>
+              <w:t>Car buffer</w:t>
+            </w:r>
+          </w:p>
+        </w:tc>
+        <w:tc>
+          <w:tcPr>
+            <w:tcW w:type="dxa" w:w="2551"/>
+          </w:tcPr>
+          <w:p>
+            <w:pPr>
+              <w:spacing w:before="40" w:after="60" w:line="252" w:lineRule="auto"/>
+            </w:pPr>
+            <w:r>
+              <w:rPr>
+                <w:sz w:val="18"/>
+              </w:rPr>
+              <w:t>吸收轿厢底部越程冲击能量。</w:t>
+            </w:r>
+          </w:p>
+        </w:tc>
+        <w:tc>
+          <w:tcPr>
+            <w:tcW w:type="dxa" w:w="3969"/>
+          </w:tcPr>
+          <w:p>
+            <w:pPr>
+              <w:spacing w:before="40" w:after="60" w:line="252" w:lineRule="auto"/>
+            </w:pPr>
+            <w:r>
+              <w:rPr>
+                <w:sz w:val="18"/>
+              </w:rPr>
+              <w:t>Absorbs impact energy during bottom overtravel of the car.</w:t>
+            </w:r>
+          </w:p>
+        </w:tc>
+      </w:tr>
+      <w:tr>
+        <w:trPr>
+          <w:cantSplit/>
+        </w:trPr>
+        <w:tc>
+          <w:tcPr>
+            <w:tcW w:type="dxa" w:w="3685"/>
+          </w:tcPr>
+          <w:p>
+            <w:pPr>
+              <w:spacing w:before="40" w:after="60" w:line="252" w:lineRule="auto"/>
+            </w:pPr>
+            <w:r>
+              <w:rPr>
+                <w:sz w:val="18"/>
+              </w:rPr>
+              <w:t>T24 对重缓冲器</w:t>
+              <w:br/>
+              <w:t>Counterweight buffer</w:t>
+            </w:r>
+          </w:p>
+        </w:tc>
+        <w:tc>
+          <w:tcPr>
+            <w:tcW w:type="dxa" w:w="2551"/>
+          </w:tcPr>
+          <w:p>
+            <w:pPr>
+              <w:spacing w:before="40" w:after="60" w:line="252" w:lineRule="auto"/>
+            </w:pPr>
+            <w:r>
+              <w:rPr>
+                <w:sz w:val="18"/>
+              </w:rPr>
+              <w:t>吸收对重底部越程冲击能量。</w:t>
+            </w:r>
+          </w:p>
+        </w:tc>
+        <w:tc>
+          <w:tcPr>
+            <w:tcW w:type="dxa" w:w="3969"/>
+          </w:tcPr>
+          <w:p>
+            <w:pPr>
+              <w:spacing w:before="40" w:after="60" w:line="252" w:lineRule="auto"/>
+            </w:pPr>
+            <w:r>
+              <w:rPr>
+                <w:sz w:val="18"/>
+              </w:rPr>
+              <w:t>Absorbs impact energy during bottom overtravel of the counterweight.</w:t>
+            </w:r>
+          </w:p>
+        </w:tc>
+      </w:tr>
+    </w:tbl>
+    <w:p>
+      <w:r>
+        <w:br w:type="page"/>
+      </w:r>
+    </w:p>
+    <w:p>
+      <w:pPr>
+        <w:pStyle w:val="Heading1"/>
+      </w:pPr>
+      <w:r>
+        <w:t>1.1 部件及功能 / Components and functions (3/3)</w:t>
+      </w:r>
+    </w:p>
+    <w:tbl>
+      <w:tblPr>
+        <w:tblStyle w:val="TableGrid"/>
+        <w:tblW w:type="auto" w:w="0"/>
+        <w:tblLayout w:type="fixed"/>
+        <w:tblLook w:firstColumn="1" w:firstRow="1" w:lastColumn="0" w:lastRow="0" w:noHBand="0" w:noVBand="1" w:val="04A0"/>
+      </w:tblPr>
+      <w:tblGrid>
+        <w:gridCol w:w="3402"/>
+        <w:gridCol w:w="3402"/>
+        <w:gridCol w:w="3402"/>
+      </w:tblGrid>
+      <w:tr>
+        <w:trPr>
+          <w:tblHeader/>
+        </w:trPr>
+        <w:tc>
+          <w:tcPr>
+            <w:tcW w:type="dxa" w:w="3685"/>
+            <w:shd w:fill="E7EDF2"/>
+          </w:tcPr>
+          <w:p>
+            <w:r>
+              <w:t>编号及部件 / Component</w:t>
+            </w:r>
+          </w:p>
+        </w:tc>
+        <w:tc>
+          <w:tcPr>
+            <w:tcW w:type="dxa" w:w="2551"/>
+            <w:shd w:fill="E7EDF2"/>
+          </w:tcPr>
+          <w:p>
+            <w:r>
+              <w:t>功能</w:t>
+            </w:r>
+          </w:p>
+        </w:tc>
+        <w:tc>
+          <w:tcPr>
+            <w:tcW w:type="dxa" w:w="3969"/>
+            <w:shd w:fill="E7EDF2"/>
+          </w:tcPr>
+          <w:p>
+            <w:r>
+              <w:t>Operational function</w:t>
+            </w:r>
+          </w:p>
+        </w:tc>
+      </w:tr>
+      <w:tr>
+        <w:trPr>
+          <w:cantSplit/>
+        </w:trPr>
+        <w:tc>
+          <w:tcPr>
+            <w:tcW w:type="dxa" w:w="3685"/>
+          </w:tcPr>
+          <w:p>
+            <w:pPr>
+              <w:spacing w:before="40" w:after="60" w:line="252" w:lineRule="auto"/>
+            </w:pPr>
+            <w:r>
+              <w:rPr>
+                <w:sz w:val="18"/>
+              </w:rPr>
+              <w:t>T25 层门联锁</w:t>
+              <w:br/>
+              <w:t>Landing door interlock</w:t>
+            </w:r>
+          </w:p>
+        </w:tc>
+        <w:tc>
+          <w:tcPr>
+            <w:tcW w:type="dxa" w:w="2551"/>
+          </w:tcPr>
+          <w:p>
+            <w:pPr>
+              <w:spacing w:before="40" w:after="60" w:line="252" w:lineRule="auto"/>
+            </w:pPr>
+            <w:r>
+              <w:rPr>
+                <w:sz w:val="18"/>
+              </w:rPr>
+              <w:t>层门未关闭锁紧时阻止运行。</w:t>
+            </w:r>
+          </w:p>
+        </w:tc>
+        <w:tc>
+          <w:tcPr>
+            <w:tcW w:type="dxa" w:w="3969"/>
+          </w:tcPr>
+          <w:p>
+            <w:pPr>
+              <w:spacing w:before="40" w:after="60" w:line="252" w:lineRule="auto"/>
+            </w:pPr>
+            <w:r>
+              <w:rPr>
+                <w:sz w:val="18"/>
+              </w:rPr>
+              <w:t>Prevents travel unless the landing doors are closed and locked.</w:t>
+            </w:r>
+          </w:p>
+        </w:tc>
+      </w:tr>
+      <w:tr>
+        <w:trPr>
+          <w:cantSplit/>
+        </w:trPr>
+        <w:tc>
+          <w:tcPr>
+            <w:tcW w:type="dxa" w:w="3685"/>
+          </w:tcPr>
+          <w:p>
+            <w:pPr>
+              <w:spacing w:before="40" w:after="60" w:line="252" w:lineRule="auto"/>
+            </w:pPr>
+            <w:r>
+              <w:rPr>
+                <w:sz w:val="18"/>
+              </w:rPr>
+              <w:t>T26 层门接近传感器</w:t>
+              <w:br/>
+              <w:t>Landing door proximity sensor</w:t>
+            </w:r>
+          </w:p>
+        </w:tc>
+        <w:tc>
+          <w:tcPr>
+            <w:tcW w:type="dxa" w:w="2551"/>
+          </w:tcPr>
+          <w:p>
+            <w:pPr>
+              <w:spacing w:before="40" w:after="60" w:line="252" w:lineRule="auto"/>
+            </w:pPr>
+            <w:r>
+              <w:rPr>
+                <w:sz w:val="18"/>
+              </w:rPr>
+              <w:t>关门时检测到乘客进入便使门重开。</w:t>
+            </w:r>
+          </w:p>
+        </w:tc>
+        <w:tc>
+          <w:tcPr>
+            <w:tcW w:type="dxa" w:w="3969"/>
+          </w:tcPr>
+          <w:p>
+            <w:pPr>
+              <w:spacing w:before="40" w:after="60" w:line="252" w:lineRule="auto"/>
+            </w:pPr>
+            <w:r>
+              <w:rPr>
+                <w:sz w:val="18"/>
+              </w:rPr>
+              <w:t>Reopens closing doors when a person enters.</w:t>
+            </w:r>
+          </w:p>
+        </w:tc>
+      </w:tr>
+      <w:tr>
+        <w:trPr>
+          <w:cantSplit/>
+        </w:trPr>
+        <w:tc>
+          <w:tcPr>
+            <w:tcW w:type="dxa" w:w="3685"/>
+          </w:tcPr>
+          <w:p>
+            <w:pPr>
+              <w:spacing w:before="40" w:after="60" w:line="252" w:lineRule="auto"/>
+            </w:pPr>
+            <w:r>
+              <w:rPr>
+                <w:sz w:val="18"/>
+              </w:rPr>
+              <w:t>T27 补偿绳</w:t>
+              <w:br/>
+              <w:t>Compensation ropes</w:t>
+            </w:r>
+          </w:p>
+        </w:tc>
+        <w:tc>
+          <w:tcPr>
+            <w:tcW w:type="dxa" w:w="2551"/>
+          </w:tcPr>
+          <w:p>
+            <w:pPr>
+              <w:spacing w:before="40" w:after="60" w:line="252" w:lineRule="auto"/>
+            </w:pPr>
+            <w:r>
+              <w:rPr>
+                <w:sz w:val="18"/>
+              </w:rPr>
+              <w:t>补偿悬吊绳重量分布随轿厢位置的变化。</w:t>
+            </w:r>
+          </w:p>
+        </w:tc>
+        <w:tc>
+          <w:tcPr>
+            <w:tcW w:type="dxa" w:w="3969"/>
+          </w:tcPr>
+          <w:p>
+            <w:pPr>
+              <w:spacing w:before="40" w:after="60" w:line="252" w:lineRule="auto"/>
+            </w:pPr>
+            <w:r>
+              <w:rPr>
+                <w:sz w:val="18"/>
+              </w:rPr>
+              <w:t>Compensate for changes in suspension-rope weight distribution.</w:t>
+            </w:r>
+          </w:p>
+        </w:tc>
+      </w:tr>
+      <w:tr>
+        <w:trPr>
+          <w:cantSplit/>
+        </w:trPr>
+        <w:tc>
+          <w:tcPr>
+            <w:tcW w:type="dxa" w:w="3685"/>
+          </w:tcPr>
+          <w:p>
+            <w:pPr>
+              <w:spacing w:before="40" w:after="60" w:line="252" w:lineRule="auto"/>
+            </w:pPr>
+            <w:r>
+              <w:rPr>
+                <w:sz w:val="18"/>
+              </w:rPr>
+              <w:t>T28 补偿轮</w:t>
+              <w:br/>
+              <w:t>Compensation sheave</w:t>
+            </w:r>
+          </w:p>
+        </w:tc>
+        <w:tc>
+          <w:tcPr>
+            <w:tcW w:type="dxa" w:w="2551"/>
+          </w:tcPr>
+          <w:p>
+            <w:pPr>
+              <w:spacing w:before="40" w:after="60" w:line="252" w:lineRule="auto"/>
+            </w:pPr>
+            <w:r>
+              <w:rPr>
+                <w:sz w:val="18"/>
+              </w:rPr>
+              <w:t>引导补偿绳并维持其布置。</w:t>
+            </w:r>
+          </w:p>
+        </w:tc>
+        <w:tc>
+          <w:tcPr>
+            <w:tcW w:type="dxa" w:w="3969"/>
+          </w:tcPr>
+          <w:p>
+            <w:pPr>
+              <w:spacing w:before="40" w:after="60" w:line="252" w:lineRule="auto"/>
+            </w:pPr>
+            <w:r>
+              <w:rPr>
+                <w:sz w:val="18"/>
+              </w:rPr>
+              <w:t>Guides the compensation ropes.</w:t>
+            </w:r>
+          </w:p>
+        </w:tc>
+      </w:tr>
+      <w:tr>
+        <w:trPr>
+          <w:cantSplit/>
+        </w:trPr>
+        <w:tc>
+          <w:tcPr>
+            <w:tcW w:type="dxa" w:w="3685"/>
+          </w:tcPr>
+          <w:p>
+            <w:pPr>
+              <w:spacing w:before="40" w:after="60" w:line="252" w:lineRule="auto"/>
+            </w:pPr>
+            <w:r>
+              <w:rPr>
+                <w:sz w:val="18"/>
+              </w:rPr>
+              <w:t>T29 称重传感器</w:t>
+              <w:br/>
+              <w:t>Load-Weighing Transducers</w:t>
+            </w:r>
+          </w:p>
+        </w:tc>
+        <w:tc>
+          <w:tcPr>
+            <w:tcW w:type="dxa" w:w="2551"/>
+          </w:tcPr>
+          <w:p>
+            <w:pPr>
+              <w:spacing w:before="40" w:after="60" w:line="252" w:lineRule="auto"/>
+            </w:pPr>
+            <w:r>
+              <w:rPr>
+                <w:sz w:val="18"/>
+              </w:rPr>
+              <w:t>检测轿厢载荷。</w:t>
+            </w:r>
+          </w:p>
+        </w:tc>
+        <w:tc>
+          <w:tcPr>
+            <w:tcW w:type="dxa" w:w="3969"/>
+          </w:tcPr>
+          <w:p>
+            <w:pPr>
+              <w:spacing w:before="40" w:after="60" w:line="252" w:lineRule="auto"/>
+            </w:pPr>
+            <w:r>
+              <w:rPr>
+                <w:sz w:val="18"/>
+              </w:rPr>
+              <w:t>Measure the load in the car.</w:t>
+            </w:r>
+          </w:p>
+        </w:tc>
+      </w:tr>
+      <w:tr>
+        <w:trPr>
+          <w:cantSplit/>
+        </w:trPr>
+        <w:tc>
+          <w:tcPr>
+            <w:tcW w:type="dxa" w:w="3685"/>
+          </w:tcPr>
+          <w:p>
+            <w:pPr>
+              <w:spacing w:before="40" w:after="60" w:line="252" w:lineRule="auto"/>
+            </w:pPr>
+            <w:r>
+              <w:rPr>
+                <w:sz w:val="18"/>
+              </w:rPr>
+              <w:t>T30 主速度传感器</w:t>
+              <w:br/>
+              <w:t>Primary Velocity Transducer</w:t>
+            </w:r>
+          </w:p>
+        </w:tc>
+        <w:tc>
+          <w:tcPr>
+            <w:tcW w:type="dxa" w:w="2551"/>
+          </w:tcPr>
+          <w:p>
+            <w:pPr>
+              <w:spacing w:before="40" w:after="60" w:line="252" w:lineRule="auto"/>
+            </w:pPr>
+            <w:r>
+              <w:rPr>
+                <w:sz w:val="18"/>
+              </w:rPr>
+              <w:t>提供速度反馈。</w:t>
+            </w:r>
+          </w:p>
+        </w:tc>
+        <w:tc>
+          <w:tcPr>
+            <w:tcW w:type="dxa" w:w="3969"/>
+          </w:tcPr>
+          <w:p>
+            <w:pPr>
+              <w:spacing w:before="40" w:after="60" w:line="252" w:lineRule="auto"/>
+            </w:pPr>
+            <w:r>
+              <w:rPr>
+                <w:sz w:val="18"/>
+              </w:rPr>
+              <w:t>Provides speed feedback.</w:t>
+            </w:r>
+          </w:p>
+        </w:tc>
+      </w:tr>
+      <w:tr>
+        <w:trPr>
+          <w:cantSplit/>
+        </w:trPr>
+        <w:tc>
+          <w:tcPr>
+            <w:tcW w:type="dxa" w:w="3685"/>
+          </w:tcPr>
+          <w:p>
+            <w:pPr>
+              <w:spacing w:before="40" w:after="60" w:line="252" w:lineRule="auto"/>
+            </w:pPr>
+            <w:r>
+              <w:rPr>
+                <w:sz w:val="18"/>
+              </w:rPr>
+              <w:t>T31 智能主位置传感器</w:t>
+              <w:br/>
+              <w:t>Smart Primary Position Transducer</w:t>
+            </w:r>
+          </w:p>
+        </w:tc>
+        <w:tc>
+          <w:tcPr>
+            <w:tcW w:type="dxa" w:w="2551"/>
+          </w:tcPr>
+          <w:p>
+            <w:pPr>
+              <w:spacing w:before="40" w:after="60" w:line="252" w:lineRule="auto"/>
+            </w:pPr>
+            <w:r>
+              <w:rPr>
+                <w:sz w:val="18"/>
+              </w:rPr>
+              <w:t>提供位置反馈。</w:t>
+            </w:r>
+          </w:p>
+        </w:tc>
+        <w:tc>
+          <w:tcPr>
+            <w:tcW w:type="dxa" w:w="3969"/>
+          </w:tcPr>
+          <w:p>
+            <w:pPr>
+              <w:spacing w:before="40" w:after="60" w:line="252" w:lineRule="auto"/>
+            </w:pPr>
+            <w:r>
+              <w:rPr>
+                <w:sz w:val="18"/>
+              </w:rPr>
+              <w:t>Provides position feedback.</w:t>
+            </w:r>
+          </w:p>
+        </w:tc>
+      </w:tr>
+      <w:tr>
+        <w:trPr>
+          <w:cantSplit/>
+        </w:trPr>
+        <w:tc>
+          <w:tcPr>
+            <w:tcW w:type="dxa" w:w="3685"/>
+          </w:tcPr>
+          <w:p>
+            <w:pPr>
+              <w:spacing w:before="40" w:after="60" w:line="252" w:lineRule="auto"/>
+            </w:pPr>
+            <w:r>
+              <w:rPr>
+                <w:sz w:val="18"/>
+              </w:rPr>
+              <w:t>T32 辅助位置传感器</w:t>
+              <w:br/>
+              <w:t>Secondary Position Transducer</w:t>
+            </w:r>
+          </w:p>
+        </w:tc>
+        <w:tc>
+          <w:tcPr>
+            <w:tcW w:type="dxa" w:w="2551"/>
+          </w:tcPr>
+          <w:p>
+            <w:pPr>
+              <w:spacing w:before="40" w:after="60" w:line="252" w:lineRule="auto"/>
+            </w:pPr>
+            <w:r>
+              <w:rPr>
+                <w:sz w:val="18"/>
+              </w:rPr>
+              <w:t>提供辅助位置反馈。</w:t>
+            </w:r>
+          </w:p>
+        </w:tc>
+        <w:tc>
+          <w:tcPr>
+            <w:tcW w:type="dxa" w:w="3969"/>
+          </w:tcPr>
+          <w:p>
+            <w:pPr>
+              <w:spacing w:before="40" w:after="60" w:line="252" w:lineRule="auto"/>
+            </w:pPr>
+            <w:r>
+              <w:rPr>
+                <w:sz w:val="18"/>
+              </w:rPr>
+              <w:t>Provides additional position feedback.</w:t>
+            </w:r>
+          </w:p>
+        </w:tc>
+      </w:tr>
+      <w:tr>
+        <w:trPr>
+          <w:cantSplit/>
+        </w:trPr>
+        <w:tc>
+          <w:tcPr>
+            <w:tcW w:type="dxa" w:w="3685"/>
+          </w:tcPr>
+          <w:p>
+            <w:pPr>
+              <w:spacing w:before="40" w:after="60" w:line="252" w:lineRule="auto"/>
+            </w:pPr>
+            <w:r>
+              <w:rPr>
+                <w:sz w:val="18"/>
+              </w:rPr>
+              <w:t>T33 滚轮导靴</w:t>
+              <w:br/>
+              <w:t>Roller Guides</w:t>
+            </w:r>
+          </w:p>
+        </w:tc>
+        <w:tc>
+          <w:tcPr>
+            <w:tcW w:type="dxa" w:w="2551"/>
+          </w:tcPr>
+          <w:p>
+            <w:pPr>
+              <w:spacing w:before="40" w:after="60" w:line="252" w:lineRule="auto"/>
+            </w:pPr>
+            <w:r>
+              <w:rPr>
+                <w:sz w:val="18"/>
+              </w:rPr>
+              <w:t>配合轿厢导轨限制横向移动。</w:t>
+            </w:r>
+          </w:p>
+        </w:tc>
+        <w:tc>
+          <w:tcPr>
+            <w:tcW w:type="dxa" w:w="3969"/>
+          </w:tcPr>
+          <w:p>
+            <w:pPr>
+              <w:spacing w:before="40" w:after="60" w:line="252" w:lineRule="auto"/>
+            </w:pPr>
+            <w:r>
+              <w:rPr>
+                <w:sz w:val="18"/>
+              </w:rPr>
+              <w:t>Run along the car guide rail to restrain lateral movement.</w:t>
             </w:r>
           </w:p>
         </w:tc>
@@ -962,35 +2069,17 @@
         <w:pStyle w:val="Heading2"/>
       </w:pPr>
       <w:r>
-        <w:t>辅助部件 / Auxiliary components</w:t>
-      </w:r>
-    </w:p>
-    <w:p>
-      <w:r>
-        <w:t>随行电缆连接固定设备与移动轿厢，传送电源和控制信号。补偿绳及补偿轮用于补偿轿厢位置改变时的悬吊绳重量不平衡。</w:t>
-      </w:r>
-    </w:p>
-    <w:p>
-      <w:r>
-        <w:t>Travelling cables carry power and control signals between fixed equipment and the moving car. Compensation ropes and sheaves compensate for changes in suspension-rope weight balance as the car changes position.</w:t>
-      </w:r>
-    </w:p>
-    <w:p>
-      <w:pPr>
-        <w:pStyle w:val="Heading2"/>
-      </w:pPr>
-      <w:r>
         <w:t>1.2 运作过程 / Operation</w:t>
       </w:r>
     </w:p>
     <w:p>
       <w:r>
-        <w:t>门关闭且联锁条件满足后，控制器释放制动器并启动驱动系统，带动轿厢和对重反向移动。接近目标楼层时减速和平层，停车后由制动器保持静止，再开门。限速器与安全钳提供异常超速时的保护。</w:t>
+        <w:t>门关闭并锁紧后，控制器协调制动器释放和驱动电动机运行。驱动电动机经齿轮箱带动曳引轮，悬吊绳使轿厢与对重反向移动。接近目标楼层时减速并平层，停车后制动器保持静止，再打开轿门和层门。限速器检测到异常超速时，触发安全停止，并在需要时使安全钳作用于轿厢导轨。</w:t>
       </w:r>
     </w:p>
     <w:p>
       <w:r>
-        <w:t>Once the doors are closed and interlock conditions are satisfied, the controller releases the brake and operates the drive, moving the car and counterweight in opposite directions. The car slows and levels at the destination, the brake holds it stationary, and the doors open. The governor and safety gear provide protection during abnormal overspeed.</w:t>
+        <w:t>After the doors are closed and locked, the controller coordinates brake release and drive motor operation. The drive motor turns the drive sheave through the gear box. The suspension rope moves the car and counterweight in opposite directions. The car slows and levels at the destination, the brake holds it stationary, and the car doors and landing doors open. On abnormal overspeed, the overspeed governor initiates safety stopping and, when necessary, applies the safety gear to the car guide rail.</w:t>
       </w:r>
     </w:p>
     <w:p>
@@ -1007,24 +2096,13 @@
       </w:r>
     </w:p>
     <w:p>
-      <w:r>
-        <w:t>直顶式液压升降机利用油泵把液压油送入油缸，油压推动柱塞伸出，直接顶升轿厢。典型埋地式结构的油缸向地下延伸，以容纳所需的柱塞行程。</w:t>
-      </w:r>
-    </w:p>
-    <w:p>
-      <w:r>
-        <w:t>A direct-ram hydraulic lift pumps oil into a cylinder. Oil pressure extends the plunger, which directly raises the car. In a conventional in-ground arrangement, the cylinder extends below ground to accommodate the required plunger travel.</w:t>
-      </w:r>
-    </w:p>
-    <w:p>
       <w:pPr>
-        <w:spacing w:after="60"/>
         <w:jc w:val="center"/>
       </w:pPr>
       <w:r>
         <w:drawing>
           <wp:inline xmlns:a="http://schemas.openxmlformats.org/drawingml/2006/main" xmlns:pic="http://schemas.openxmlformats.org/drawingml/2006/picture">
-            <wp:extent cx="3561342" cy="5940000"/>
+            <wp:extent cx="5438045" cy="7596000"/>
             <wp:docPr id="2" name="Picture 2"/>
             <wp:cNvGraphicFramePr>
               <a:graphicFrameLocks noChangeAspect="1"/>
@@ -1033,7 +2111,7 @@
               <a:graphicData uri="http://schemas.openxmlformats.org/drawingml/2006/picture">
                 <pic:pic>
                   <pic:nvPicPr>
-                    <pic:cNvPr id="0" name="hydraulic_ppt.png"/>
+                    <pic:cNvPr id="0" name="PIA5704_Q1_Hydraulic_Handdraw.png"/>
                     <pic:cNvPicPr/>
                   </pic:nvPicPr>
                   <pic:blipFill>
@@ -1045,7 +2123,7 @@
                   <pic:spPr>
                     <a:xfrm>
                       <a:off x="0" y="0"/>
-                      <a:ext cx="3561342" cy="5940000"/>
+                      <a:ext cx="5438045" cy="7596000"/>
                     </a:xfrm>
                     <a:prstGeom prst="rect"/>
                   </pic:spPr>
@@ -1054,15 +2132,6 @@
             </a:graphic>
           </wp:inline>
         </w:drawing>
-      </w:r>
-    </w:p>
-    <w:p>
-      <w:pPr>
-        <w:pStyle w:val="Caption"/>
-        <w:jc w:val="center"/>
-      </w:pPr>
-      <w:r>
-        <w:t>图 2 直顶式液压升降机 / Figure 2 Direct-ram hydraulic lift</w:t>
       </w:r>
     </w:p>
     <w:p>
@@ -1075,7 +2144,7 @@
         <w:pStyle w:val="Heading1"/>
       </w:pPr>
       <w:r>
-        <w:t>2.1 主要部件及功能 / Major components (1/2)</w:t>
+        <w:t>2.1 部件及功能 / Components and functions (1/2)</w:t>
       </w:r>
     </w:p>
     <w:tbl>
@@ -1086,9 +2155,9 @@
         <w:tblLook w:firstColumn="1" w:firstRow="1" w:lastColumn="0" w:lastRow="0" w:noHBand="0" w:noVBand="1" w:val="04A0"/>
       </w:tblPr>
       <w:tblGrid>
-        <w:gridCol w:w="2098"/>
-        <w:gridCol w:w="3288"/>
-        <w:gridCol w:w="4706"/>
+        <w:gridCol w:w="3402"/>
+        <w:gridCol w:w="3402"/>
+        <w:gridCol w:w="3402"/>
       </w:tblGrid>
       <w:tr>
         <w:trPr>
@@ -1096,45 +2165,33 @@
         </w:trPr>
         <w:tc>
           <w:tcPr>
-            <w:tcW w:type="dxa" w:w="2098"/>
-            <w:shd w:fill="17364D"/>
+            <w:tcW w:type="dxa" w:w="3685"/>
+            <w:shd w:fill="E7EDF2"/>
           </w:tcPr>
           <w:p>
             <w:r>
-              <w:rPr>
-                <w:b/>
-                <w:color w:val="FFFFFF"/>
-              </w:rPr>
-              <w:t>部件 / Component</w:t>
+              <w:t>编号及部件 / Component</w:t>
             </w:r>
           </w:p>
         </w:tc>
         <w:tc>
           <w:tcPr>
-            <w:tcW w:type="dxa" w:w="3288"/>
-            <w:shd w:fill="17364D"/>
+            <w:tcW w:type="dxa" w:w="2551"/>
+            <w:shd w:fill="E7EDF2"/>
           </w:tcPr>
           <w:p>
             <w:r>
-              <w:rPr>
-                <w:b/>
-                <w:color w:val="FFFFFF"/>
-              </w:rPr>
               <w:t>功能</w:t>
             </w:r>
           </w:p>
         </w:tc>
         <w:tc>
           <w:tcPr>
-            <w:tcW w:type="dxa" w:w="4706"/>
-            <w:shd w:fill="17364D"/>
+            <w:tcW w:type="dxa" w:w="3969"/>
+            <w:shd w:fill="E7EDF2"/>
           </w:tcPr>
           <w:p>
             <w:r>
-              <w:rPr>
-                <w:b/>
-                <w:color w:val="FFFFFF"/>
-              </w:rPr>
               <w:t>Operational function</w:t>
             </w:r>
           </w:p>
@@ -1146,52 +2203,51 @@
         </w:trPr>
         <w:tc>
           <w:tcPr>
-            <w:tcW w:type="dxa" w:w="2098"/>
+            <w:tcW w:type="dxa" w:w="3685"/>
           </w:tcPr>
           <w:p>
             <w:pPr>
-              <w:spacing w:before="60" w:after="80" w:line="259" w:lineRule="auto"/>
+              <w:spacing w:before="40" w:after="60" w:line="252" w:lineRule="auto"/>
             </w:pPr>
             <w:r>
               <w:rPr>
-                <w:b/>
-                <w:sz w:val="19"/>
+                <w:sz w:val="18"/>
               </w:rPr>
-              <w:t>1 轿厢及承托结构</w:t>
+              <w:t>H1 轿厢</w:t>
               <w:br/>
-              <w:t>Car and support</w:t>
+              <w:t>Car</w:t>
             </w:r>
           </w:p>
         </w:tc>
         <w:tc>
           <w:tcPr>
-            <w:tcW w:type="dxa" w:w="3288"/>
+            <w:tcW w:type="dxa" w:w="2551"/>
           </w:tcPr>
           <w:p>
             <w:pPr>
-              <w:spacing w:before="60" w:after="80" w:line="259" w:lineRule="auto"/>
+              <w:spacing w:before="40" w:after="60" w:line="252" w:lineRule="auto"/>
             </w:pPr>
             <w:r>
               <w:rPr>
-                <w:sz w:val="19"/>
+                <w:sz w:val="18"/>
               </w:rPr>
-              <w:t>承载乘客或货物，底部由柱塞直接承托。</w:t>
+              <w:t>承载乘客或货物。</w:t>
             </w:r>
           </w:p>
         </w:tc>
         <w:tc>
           <w:tcPr>
-            <w:tcW w:type="dxa" w:w="4706"/>
+            <w:tcW w:type="dxa" w:w="3969"/>
           </w:tcPr>
           <w:p>
             <w:pPr>
-              <w:spacing w:before="60" w:after="80" w:line="259" w:lineRule="auto"/>
+              <w:spacing w:before="40" w:after="60" w:line="252" w:lineRule="auto"/>
             </w:pPr>
             <w:r>
               <w:rPr>
-                <w:sz w:val="19"/>
+                <w:sz w:val="18"/>
               </w:rPr>
-              <w:t>The car carries passengers or goods and is supported directly by the plunger beneath it.</w:t>
+              <w:t>Carries passengers or goods.</w:t>
             </w:r>
           </w:p>
         </w:tc>
@@ -1202,52 +2258,51 @@
         </w:trPr>
         <w:tc>
           <w:tcPr>
-            <w:tcW w:type="dxa" w:w="2098"/>
+            <w:tcW w:type="dxa" w:w="3685"/>
           </w:tcPr>
           <w:p>
             <w:pPr>
-              <w:spacing w:before="60" w:after="80" w:line="259" w:lineRule="auto"/>
+              <w:spacing w:before="40" w:after="60" w:line="252" w:lineRule="auto"/>
             </w:pPr>
             <w:r>
               <w:rPr>
-                <w:b/>
-                <w:sz w:val="19"/>
+                <w:sz w:val="18"/>
               </w:rPr>
-              <w:t>2 柱塞／顶杆</w:t>
+              <w:t>H2 柱塞</w:t>
               <w:br/>
-              <w:t>Plunger / ram</w:t>
+              <w:t>Plunger</w:t>
             </w:r>
           </w:p>
         </w:tc>
         <w:tc>
           <w:tcPr>
-            <w:tcW w:type="dxa" w:w="3288"/>
+            <w:tcW w:type="dxa" w:w="2551"/>
           </w:tcPr>
           <w:p>
             <w:pPr>
-              <w:spacing w:before="60" w:after="80" w:line="259" w:lineRule="auto"/>
+              <w:spacing w:before="40" w:after="60" w:line="252" w:lineRule="auto"/>
             </w:pPr>
             <w:r>
               <w:rPr>
-                <w:sz w:val="19"/>
+                <w:sz w:val="18"/>
               </w:rPr>
-              <w:t>把液压作用转化为垂直机械运动；伸出时顶升轿厢，缩回时轿厢下降。</w:t>
+              <w:t>直接承托并顶升轿厢。</w:t>
             </w:r>
           </w:p>
         </w:tc>
         <w:tc>
           <w:tcPr>
-            <w:tcW w:type="dxa" w:w="4706"/>
+            <w:tcW w:type="dxa" w:w="3969"/>
           </w:tcPr>
           <w:p>
             <w:pPr>
-              <w:spacing w:before="60" w:after="80" w:line="259" w:lineRule="auto"/>
+              <w:spacing w:before="40" w:after="60" w:line="252" w:lineRule="auto"/>
             </w:pPr>
             <w:r>
               <w:rPr>
-                <w:sz w:val="19"/>
+                <w:sz w:val="18"/>
               </w:rPr>
-              <w:t>The plunger converts hydraulic action into vertical movement. Its extension raises the car, and its retraction allows descent.</w:t>
+              <w:t>Directly supports and raises the car.</w:t>
             </w:r>
           </w:p>
         </w:tc>
@@ -1258,52 +2313,51 @@
         </w:trPr>
         <w:tc>
           <w:tcPr>
-            <w:tcW w:type="dxa" w:w="2098"/>
+            <w:tcW w:type="dxa" w:w="3685"/>
           </w:tcPr>
           <w:p>
             <w:pPr>
-              <w:spacing w:before="60" w:after="80" w:line="259" w:lineRule="auto"/>
+              <w:spacing w:before="40" w:after="60" w:line="252" w:lineRule="auto"/>
             </w:pPr>
             <w:r>
               <w:rPr>
-                <w:b/>
-                <w:sz w:val="19"/>
+                <w:sz w:val="18"/>
               </w:rPr>
-              <w:t>3 油缸</w:t>
+              <w:t>H3 油缸</w:t>
               <w:br/>
-              <w:t>Hydraulic cylinder</w:t>
+              <w:t>Cylinder</w:t>
             </w:r>
           </w:p>
         </w:tc>
         <w:tc>
           <w:tcPr>
-            <w:tcW w:type="dxa" w:w="3288"/>
+            <w:tcW w:type="dxa" w:w="2551"/>
           </w:tcPr>
           <w:p>
             <w:pPr>
-              <w:spacing w:before="60" w:after="80" w:line="259" w:lineRule="auto"/>
+              <w:spacing w:before="40" w:after="60" w:line="252" w:lineRule="auto"/>
             </w:pPr>
             <w:r>
               <w:rPr>
-                <w:sz w:val="19"/>
+                <w:sz w:val="18"/>
               </w:rPr>
-              <w:t>容纳受压液压油，与柱塞构成顶升机构。典型埋地式油缸向地下延伸，以容纳所需行程。</w:t>
+              <w:t>容纳压力油并与柱塞构成顶升机构。</w:t>
             </w:r>
           </w:p>
         </w:tc>
         <w:tc>
           <w:tcPr>
-            <w:tcW w:type="dxa" w:w="4706"/>
+            <w:tcW w:type="dxa" w:w="3969"/>
           </w:tcPr>
           <w:p>
             <w:pPr>
-              <w:spacing w:before="60" w:after="80" w:line="259" w:lineRule="auto"/>
+              <w:spacing w:before="40" w:after="60" w:line="252" w:lineRule="auto"/>
             </w:pPr>
             <w:r>
               <w:rPr>
-                <w:sz w:val="19"/>
+                <w:sz w:val="18"/>
               </w:rPr>
-              <w:t>The cylinder contains pressurised oil and forms the actuator with the plunger. In the in-ground arrangement, it extends below ground to accommodate travel.</w:t>
+              <w:t>Contains pressurised oil and forms the lifting actuator with the plunger.</w:t>
             </w:r>
           </w:p>
         </w:tc>
@@ -1314,52 +2368,51 @@
         </w:trPr>
         <w:tc>
           <w:tcPr>
-            <w:tcW w:type="dxa" w:w="2098"/>
+            <w:tcW w:type="dxa" w:w="3685"/>
           </w:tcPr>
           <w:p>
             <w:pPr>
-              <w:spacing w:before="60" w:after="80" w:line="259" w:lineRule="auto"/>
+              <w:spacing w:before="40" w:after="60" w:line="252" w:lineRule="auto"/>
             </w:pPr>
             <w:r>
               <w:rPr>
-                <w:b/>
-                <w:sz w:val="19"/>
+                <w:sz w:val="18"/>
               </w:rPr>
-              <w:t>4 液压油</w:t>
+              <w:t>H4 油箱</w:t>
               <w:br/>
-              <w:t>Hydraulic oil</w:t>
+              <w:t>Tank</w:t>
             </w:r>
           </w:p>
         </w:tc>
         <w:tc>
           <w:tcPr>
-            <w:tcW w:type="dxa" w:w="3288"/>
+            <w:tcW w:type="dxa" w:w="2551"/>
           </w:tcPr>
           <w:p>
             <w:pPr>
-              <w:spacing w:before="60" w:after="80" w:line="259" w:lineRule="auto"/>
+              <w:spacing w:before="40" w:after="60" w:line="252" w:lineRule="auto"/>
             </w:pPr>
             <w:r>
               <w:rPr>
-                <w:sz w:val="19"/>
+                <w:sz w:val="18"/>
               </w:rPr>
-              <w:t>作为工作介质，把油泵提供的压力传递至柱塞。</w:t>
+              <w:t>储油、向油泵供油并接收回油。</w:t>
             </w:r>
           </w:p>
         </w:tc>
         <w:tc>
           <w:tcPr>
-            <w:tcW w:type="dxa" w:w="4706"/>
+            <w:tcW w:type="dxa" w:w="3969"/>
           </w:tcPr>
           <w:p>
             <w:pPr>
-              <w:spacing w:before="60" w:after="80" w:line="259" w:lineRule="auto"/>
+              <w:spacing w:before="40" w:after="60" w:line="252" w:lineRule="auto"/>
             </w:pPr>
             <w:r>
               <w:rPr>
-                <w:sz w:val="19"/>
+                <w:sz w:val="18"/>
               </w:rPr>
-              <w:t>Hydraulic oil is the working fluid that transmits pump pressure to the plunger.</w:t>
+              <w:t>Stores oil, supplies the pump and receives returning oil.</w:t>
             </w:r>
           </w:p>
         </w:tc>
@@ -1370,52 +2423,51 @@
         </w:trPr>
         <w:tc>
           <w:tcPr>
-            <w:tcW w:type="dxa" w:w="2098"/>
+            <w:tcW w:type="dxa" w:w="3685"/>
           </w:tcPr>
           <w:p>
             <w:pPr>
-              <w:spacing w:before="60" w:after="80" w:line="259" w:lineRule="auto"/>
+              <w:spacing w:before="40" w:after="60" w:line="252" w:lineRule="auto"/>
             </w:pPr>
             <w:r>
               <w:rPr>
-                <w:b/>
-                <w:sz w:val="19"/>
+                <w:sz w:val="18"/>
               </w:rPr>
-              <w:t>5 油箱及油位计</w:t>
+              <w:t>H5 电动机</w:t>
               <w:br/>
-              <w:t>Tank and level gauge</w:t>
+              <w:t>Motor</w:t>
             </w:r>
           </w:p>
         </w:tc>
         <w:tc>
           <w:tcPr>
-            <w:tcW w:type="dxa" w:w="3288"/>
+            <w:tcW w:type="dxa" w:w="2551"/>
           </w:tcPr>
           <w:p>
             <w:pPr>
-              <w:spacing w:before="60" w:after="80" w:line="259" w:lineRule="auto"/>
+              <w:spacing w:before="40" w:after="60" w:line="252" w:lineRule="auto"/>
             </w:pPr>
             <w:r>
               <w:rPr>
-                <w:sz w:val="19"/>
+                <w:sz w:val="18"/>
               </w:rPr>
-              <w:t>油箱储油，向油泵供油并接收回油；油位计用于检查油量。</w:t>
+              <w:t>通过机械轴驱动油泵。</w:t>
             </w:r>
           </w:p>
         </w:tc>
         <w:tc>
           <w:tcPr>
-            <w:tcW w:type="dxa" w:w="4706"/>
+            <w:tcW w:type="dxa" w:w="3969"/>
           </w:tcPr>
           <w:p>
             <w:pPr>
-              <w:spacing w:before="60" w:after="80" w:line="259" w:lineRule="auto"/>
+              <w:spacing w:before="40" w:after="60" w:line="252" w:lineRule="auto"/>
             </w:pPr>
             <w:r>
               <w:rPr>
-                <w:sz w:val="19"/>
+                <w:sz w:val="18"/>
               </w:rPr>
-              <w:t>The tank stores oil, supplies the pump and receives returning oil. The gauge indicates the oil level.</w:t>
+              <w:t>Drives the pump through a mechanical shaft.</w:t>
             </w:r>
           </w:p>
         </w:tc>
@@ -1426,52 +2478,491 @@
         </w:trPr>
         <w:tc>
           <w:tcPr>
-            <w:tcW w:type="dxa" w:w="2098"/>
+            <w:tcW w:type="dxa" w:w="3685"/>
           </w:tcPr>
           <w:p>
             <w:pPr>
-              <w:spacing w:before="60" w:after="80" w:line="259" w:lineRule="auto"/>
+              <w:spacing w:before="40" w:after="60" w:line="252" w:lineRule="auto"/>
             </w:pPr>
             <w:r>
               <w:rPr>
-                <w:b/>
-                <w:sz w:val="19"/>
+                <w:sz w:val="18"/>
               </w:rPr>
-              <w:t>6 电动机及油泵</w:t>
+              <w:t>H6 油泵</w:t>
               <w:br/>
-              <w:t>Motor and pump</w:t>
+              <w:t>Pump</w:t>
             </w:r>
           </w:p>
         </w:tc>
         <w:tc>
           <w:tcPr>
-            <w:tcW w:type="dxa" w:w="3288"/>
+            <w:tcW w:type="dxa" w:w="2551"/>
           </w:tcPr>
           <w:p>
             <w:pPr>
-              <w:spacing w:before="60" w:after="80" w:line="259" w:lineRule="auto"/>
+              <w:spacing w:before="40" w:after="60" w:line="252" w:lineRule="auto"/>
             </w:pPr>
             <w:r>
               <w:rPr>
-                <w:sz w:val="19"/>
+                <w:sz w:val="18"/>
               </w:rPr>
-              <w:t>电动机驱动油泵，向系统输送液压油，提供顶升所需的压力及流量。</w:t>
+              <w:t>提供顶升所需油流。</w:t>
             </w:r>
           </w:p>
         </w:tc>
         <w:tc>
           <w:tcPr>
-            <w:tcW w:type="dxa" w:w="4706"/>
+            <w:tcW w:type="dxa" w:w="3969"/>
           </w:tcPr>
           <w:p>
             <w:pPr>
-              <w:spacing w:before="60" w:after="80" w:line="259" w:lineRule="auto"/>
+              <w:spacing w:before="40" w:after="60" w:line="252" w:lineRule="auto"/>
             </w:pPr>
             <w:r>
               <w:rPr>
-                <w:sz w:val="19"/>
+                <w:sz w:val="18"/>
               </w:rPr>
-              <w:t>The motor drives the pump, which supplies the oil pressure and flow needed to raise the car.</w:t>
+              <w:t>Supplies the oil flow needed to raise the car.</w:t>
+            </w:r>
+          </w:p>
+        </w:tc>
+      </w:tr>
+      <w:tr>
+        <w:trPr>
+          <w:cantSplit/>
+        </w:trPr>
+        <w:tc>
+          <w:tcPr>
+            <w:tcW w:type="dxa" w:w="3685"/>
+          </w:tcPr>
+          <w:p>
+            <w:pPr>
+              <w:spacing w:before="40" w:after="60" w:line="252" w:lineRule="auto"/>
+            </w:pPr>
+            <w:r>
+              <w:rPr>
+                <w:sz w:val="18"/>
+              </w:rPr>
+              <w:t>H7 阀组</w:t>
+              <w:br/>
+              <w:t>Valve block</w:t>
+            </w:r>
+          </w:p>
+        </w:tc>
+        <w:tc>
+          <w:tcPr>
+            <w:tcW w:type="dxa" w:w="2551"/>
+          </w:tcPr>
+          <w:p>
+            <w:pPr>
+              <w:spacing w:before="40" w:after="60" w:line="252" w:lineRule="auto"/>
+            </w:pPr>
+            <w:r>
+              <w:rPr>
+                <w:sz w:val="18"/>
+              </w:rPr>
+              <w:t>控制进油、保持和下降回油。</w:t>
+            </w:r>
+          </w:p>
+        </w:tc>
+        <w:tc>
+          <w:tcPr>
+            <w:tcW w:type="dxa" w:w="3969"/>
+          </w:tcPr>
+          <w:p>
+            <w:pPr>
+              <w:spacing w:before="40" w:after="60" w:line="252" w:lineRule="auto"/>
+            </w:pPr>
+            <w:r>
+              <w:rPr>
+                <w:sz w:val="18"/>
+              </w:rPr>
+              <w:t>Controls oil admission, holding and return during descent.</w:t>
+            </w:r>
+          </w:p>
+        </w:tc>
+      </w:tr>
+      <w:tr>
+        <w:trPr>
+          <w:cantSplit/>
+        </w:trPr>
+        <w:tc>
+          <w:tcPr>
+            <w:tcW w:type="dxa" w:w="3685"/>
+          </w:tcPr>
+          <w:p>
+            <w:pPr>
+              <w:spacing w:before="40" w:after="60" w:line="252" w:lineRule="auto"/>
+            </w:pPr>
+            <w:r>
+              <w:rPr>
+                <w:sz w:val="18"/>
+              </w:rPr>
+              <w:t>H8 闸阀</w:t>
+              <w:br/>
+              <w:t>Gate valve</w:t>
+            </w:r>
+          </w:p>
+        </w:tc>
+        <w:tc>
+          <w:tcPr>
+            <w:tcW w:type="dxa" w:w="2551"/>
+          </w:tcPr>
+          <w:p>
+            <w:pPr>
+              <w:spacing w:before="40" w:after="60" w:line="252" w:lineRule="auto"/>
+            </w:pPr>
+            <w:r>
+              <w:rPr>
+                <w:sz w:val="18"/>
+              </w:rPr>
+              <w:t>检修时隔离油缸油路。</w:t>
+            </w:r>
+          </w:p>
+        </w:tc>
+        <w:tc>
+          <w:tcPr>
+            <w:tcW w:type="dxa" w:w="3969"/>
+          </w:tcPr>
+          <w:p>
+            <w:pPr>
+              <w:spacing w:before="40" w:after="60" w:line="252" w:lineRule="auto"/>
+            </w:pPr>
+            <w:r>
+              <w:rPr>
+                <w:sz w:val="18"/>
+              </w:rPr>
+              <w:t>Isolates the cylinder oil line for maintenance.</w:t>
+            </w:r>
+          </w:p>
+        </w:tc>
+      </w:tr>
+      <w:tr>
+        <w:trPr>
+          <w:cantSplit/>
+        </w:trPr>
+        <w:tc>
+          <w:tcPr>
+            <w:tcW w:type="dxa" w:w="3685"/>
+          </w:tcPr>
+          <w:p>
+            <w:pPr>
+              <w:spacing w:before="40" w:after="60" w:line="252" w:lineRule="auto"/>
+            </w:pPr>
+            <w:r>
+              <w:rPr>
+                <w:sz w:val="18"/>
+              </w:rPr>
+              <w:t>H9 油位计</w:t>
+              <w:br/>
+              <w:t>Oil level gauge</w:t>
+            </w:r>
+          </w:p>
+        </w:tc>
+        <w:tc>
+          <w:tcPr>
+            <w:tcW w:type="dxa" w:w="2551"/>
+          </w:tcPr>
+          <w:p>
+            <w:pPr>
+              <w:spacing w:before="40" w:after="60" w:line="252" w:lineRule="auto"/>
+            </w:pPr>
+            <w:r>
+              <w:rPr>
+                <w:sz w:val="18"/>
+              </w:rPr>
+              <w:t>显示油箱油位。</w:t>
+            </w:r>
+          </w:p>
+        </w:tc>
+        <w:tc>
+          <w:tcPr>
+            <w:tcW w:type="dxa" w:w="3969"/>
+          </w:tcPr>
+          <w:p>
+            <w:pPr>
+              <w:spacing w:before="40" w:after="60" w:line="252" w:lineRule="auto"/>
+            </w:pPr>
+            <w:r>
+              <w:rPr>
+                <w:sz w:val="18"/>
+              </w:rPr>
+              <w:t>Indicates the tank oil level.</w:t>
+            </w:r>
+          </w:p>
+        </w:tc>
+      </w:tr>
+      <w:tr>
+        <w:trPr>
+          <w:cantSplit/>
+        </w:trPr>
+        <w:tc>
+          <w:tcPr>
+            <w:tcW w:type="dxa" w:w="3685"/>
+          </w:tcPr>
+          <w:p>
+            <w:pPr>
+              <w:spacing w:before="40" w:after="60" w:line="252" w:lineRule="auto"/>
+            </w:pPr>
+            <w:r>
+              <w:rPr>
+                <w:sz w:val="18"/>
+              </w:rPr>
+              <w:t>H10 控制器</w:t>
+              <w:br/>
+              <w:t>Controller</w:t>
+            </w:r>
+          </w:p>
+        </w:tc>
+        <w:tc>
+          <w:tcPr>
+            <w:tcW w:type="dxa" w:w="2551"/>
+          </w:tcPr>
+          <w:p>
+            <w:pPr>
+              <w:spacing w:before="40" w:after="60" w:line="252" w:lineRule="auto"/>
+            </w:pPr>
+            <w:r>
+              <w:rPr>
+                <w:sz w:val="18"/>
+              </w:rPr>
+              <w:t>协调电动机、阀组、停车及开关门。</w:t>
+            </w:r>
+          </w:p>
+        </w:tc>
+        <w:tc>
+          <w:tcPr>
+            <w:tcW w:type="dxa" w:w="3969"/>
+          </w:tcPr>
+          <w:p>
+            <w:pPr>
+              <w:spacing w:before="40" w:after="60" w:line="252" w:lineRule="auto"/>
+            </w:pPr>
+            <w:r>
+              <w:rPr>
+                <w:sz w:val="18"/>
+              </w:rPr>
+              <w:t>Coordinates the motor, valve block, stopping and door operation.</w:t>
+            </w:r>
+          </w:p>
+        </w:tc>
+      </w:tr>
+      <w:tr>
+        <w:trPr>
+          <w:cantSplit/>
+        </w:trPr>
+        <w:tc>
+          <w:tcPr>
+            <w:tcW w:type="dxa" w:w="3685"/>
+          </w:tcPr>
+          <w:p>
+            <w:pPr>
+              <w:spacing w:before="40" w:after="60" w:line="252" w:lineRule="auto"/>
+            </w:pPr>
+            <w:r>
+              <w:rPr>
+                <w:sz w:val="18"/>
+              </w:rPr>
+              <w:t>H11 轿厢导轨</w:t>
+              <w:br/>
+              <w:t>Car guide rail</w:t>
+            </w:r>
+          </w:p>
+        </w:tc>
+        <w:tc>
+          <w:tcPr>
+            <w:tcW w:type="dxa" w:w="2551"/>
+          </w:tcPr>
+          <w:p>
+            <w:pPr>
+              <w:spacing w:before="40" w:after="60" w:line="252" w:lineRule="auto"/>
+            </w:pPr>
+            <w:r>
+              <w:rPr>
+                <w:sz w:val="18"/>
+              </w:rPr>
+              <w:t>引导轿厢垂直运行。</w:t>
+            </w:r>
+          </w:p>
+        </w:tc>
+        <w:tc>
+          <w:tcPr>
+            <w:tcW w:type="dxa" w:w="3969"/>
+          </w:tcPr>
+          <w:p>
+            <w:pPr>
+              <w:spacing w:before="40" w:after="60" w:line="252" w:lineRule="auto"/>
+            </w:pPr>
+            <w:r>
+              <w:rPr>
+                <w:sz w:val="18"/>
+              </w:rPr>
+              <w:t>Guides the car vertically.</w:t>
+            </w:r>
+          </w:p>
+        </w:tc>
+      </w:tr>
+      <w:tr>
+        <w:trPr>
+          <w:cantSplit/>
+        </w:trPr>
+        <w:tc>
+          <w:tcPr>
+            <w:tcW w:type="dxa" w:w="3685"/>
+          </w:tcPr>
+          <w:p>
+            <w:pPr>
+              <w:spacing w:before="40" w:after="60" w:line="252" w:lineRule="auto"/>
+            </w:pPr>
+            <w:r>
+              <w:rPr>
+                <w:sz w:val="18"/>
+              </w:rPr>
+              <w:t>H12 导靴</w:t>
+              <w:br/>
+              <w:t>Guide shoe</w:t>
+            </w:r>
+          </w:p>
+        </w:tc>
+        <w:tc>
+          <w:tcPr>
+            <w:tcW w:type="dxa" w:w="2551"/>
+          </w:tcPr>
+          <w:p>
+            <w:pPr>
+              <w:spacing w:before="40" w:after="60" w:line="252" w:lineRule="auto"/>
+            </w:pPr>
+            <w:r>
+              <w:rPr>
+                <w:sz w:val="18"/>
+              </w:rPr>
+              <w:t>配合轿厢导轨限制横向移动。</w:t>
+            </w:r>
+          </w:p>
+        </w:tc>
+        <w:tc>
+          <w:tcPr>
+            <w:tcW w:type="dxa" w:w="3969"/>
+          </w:tcPr>
+          <w:p>
+            <w:pPr>
+              <w:spacing w:before="40" w:after="60" w:line="252" w:lineRule="auto"/>
+            </w:pPr>
+            <w:r>
+              <w:rPr>
+                <w:sz w:val="18"/>
+              </w:rPr>
+              <w:t>Runs along the car guide rail to restrain lateral movement.</w:t>
+            </w:r>
+          </w:p>
+        </w:tc>
+      </w:tr>
+      <w:tr>
+        <w:trPr>
+          <w:cantSplit/>
+        </w:trPr>
+        <w:tc>
+          <w:tcPr>
+            <w:tcW w:type="dxa" w:w="3685"/>
+          </w:tcPr>
+          <w:p>
+            <w:pPr>
+              <w:spacing w:before="40" w:after="60" w:line="252" w:lineRule="auto"/>
+            </w:pPr>
+            <w:r>
+              <w:rPr>
+                <w:sz w:val="18"/>
+              </w:rPr>
+              <w:t>H13 导轨支架</w:t>
+              <w:br/>
+              <w:t>Rail bracket</w:t>
+            </w:r>
+          </w:p>
+        </w:tc>
+        <w:tc>
+          <w:tcPr>
+            <w:tcW w:type="dxa" w:w="2551"/>
+          </w:tcPr>
+          <w:p>
+            <w:pPr>
+              <w:spacing w:before="40" w:after="60" w:line="252" w:lineRule="auto"/>
+            </w:pPr>
+            <w:r>
+              <w:rPr>
+                <w:sz w:val="18"/>
+              </w:rPr>
+              <w:t>固定轿厢导轨。</w:t>
+            </w:r>
+          </w:p>
+        </w:tc>
+        <w:tc>
+          <w:tcPr>
+            <w:tcW w:type="dxa" w:w="3969"/>
+          </w:tcPr>
+          <w:p>
+            <w:pPr>
+              <w:spacing w:before="40" w:after="60" w:line="252" w:lineRule="auto"/>
+            </w:pPr>
+            <w:r>
+              <w:rPr>
+                <w:sz w:val="18"/>
+              </w:rPr>
+              <w:t>Secures the car guide rail.</w:t>
+            </w:r>
+          </w:p>
+        </w:tc>
+      </w:tr>
+      <w:tr>
+        <w:trPr>
+          <w:cantSplit/>
+        </w:trPr>
+        <w:tc>
+          <w:tcPr>
+            <w:tcW w:type="dxa" w:w="3685"/>
+          </w:tcPr>
+          <w:p>
+            <w:pPr>
+              <w:spacing w:before="40" w:after="60" w:line="252" w:lineRule="auto"/>
+            </w:pPr>
+            <w:r>
+              <w:rPr>
+                <w:sz w:val="18"/>
+              </w:rPr>
+              <w:t>H14 门机</w:t>
+              <w:br/>
+              <w:t>Door operator</w:t>
+            </w:r>
+          </w:p>
+        </w:tc>
+        <w:tc>
+          <w:tcPr>
+            <w:tcW w:type="dxa" w:w="2551"/>
+          </w:tcPr>
+          <w:p>
+            <w:pPr>
+              <w:spacing w:before="40" w:after="60" w:line="252" w:lineRule="auto"/>
+            </w:pPr>
+            <w:r>
+              <w:rPr>
+                <w:sz w:val="18"/>
+              </w:rPr>
+              <w:t>驱动轿门开关。</w:t>
+            </w:r>
+          </w:p>
+        </w:tc>
+        <w:tc>
+          <w:tcPr>
+            <w:tcW w:type="dxa" w:w="3969"/>
+          </w:tcPr>
+          <w:p>
+            <w:pPr>
+              <w:spacing w:before="40" w:after="60" w:line="252" w:lineRule="auto"/>
+            </w:pPr>
+            <w:r>
+              <w:rPr>
+                <w:sz w:val="18"/>
+              </w:rPr>
+              <w:t>Operates the car doors.</w:t>
             </w:r>
           </w:p>
         </w:tc>
@@ -1487,7 +2978,7 @@
         <w:pStyle w:val="Heading1"/>
       </w:pPr>
       <w:r>
-        <w:t>2.1 主要部件及功能 / Major components (2/2)</w:t>
+        <w:t>2.1 部件及功能 / Components and functions (2/2)</w:t>
       </w:r>
     </w:p>
     <w:tbl>
@@ -1498,9 +2989,9 @@
         <w:tblLook w:firstColumn="1" w:firstRow="1" w:lastColumn="0" w:lastRow="0" w:noHBand="0" w:noVBand="1" w:val="04A0"/>
       </w:tblPr>
       <w:tblGrid>
-        <w:gridCol w:w="2098"/>
-        <w:gridCol w:w="3288"/>
-        <w:gridCol w:w="4706"/>
+        <w:gridCol w:w="3402"/>
+        <w:gridCol w:w="3402"/>
+        <w:gridCol w:w="3402"/>
       </w:tblGrid>
       <w:tr>
         <w:trPr>
@@ -1508,45 +2999,33 @@
         </w:trPr>
         <w:tc>
           <w:tcPr>
-            <w:tcW w:type="dxa" w:w="2098"/>
-            <w:shd w:fill="17364D"/>
+            <w:tcW w:type="dxa" w:w="3685"/>
+            <w:shd w:fill="E7EDF2"/>
           </w:tcPr>
           <w:p>
             <w:r>
-              <w:rPr>
-                <w:b/>
-                <w:color w:val="FFFFFF"/>
-              </w:rPr>
-              <w:t>部件 / Component</w:t>
+              <w:t>编号及部件 / Component</w:t>
             </w:r>
           </w:p>
         </w:tc>
         <w:tc>
           <w:tcPr>
-            <w:tcW w:type="dxa" w:w="3288"/>
-            <w:shd w:fill="17364D"/>
+            <w:tcW w:type="dxa" w:w="2551"/>
+            <w:shd w:fill="E7EDF2"/>
           </w:tcPr>
           <w:p>
             <w:r>
-              <w:rPr>
-                <w:b/>
-                <w:color w:val="FFFFFF"/>
-              </w:rPr>
               <w:t>功能</w:t>
             </w:r>
           </w:p>
         </w:tc>
         <w:tc>
           <w:tcPr>
-            <w:tcW w:type="dxa" w:w="4706"/>
-            <w:shd w:fill="17364D"/>
+            <w:tcW w:type="dxa" w:w="3969"/>
+            <w:shd w:fill="E7EDF2"/>
           </w:tcPr>
           <w:p>
             <w:r>
-              <w:rPr>
-                <w:b/>
-                <w:color w:val="FFFFFF"/>
-              </w:rPr>
               <w:t>Operational function</w:t>
             </w:r>
           </w:p>
@@ -1558,52 +3037,51 @@
         </w:trPr>
         <w:tc>
           <w:tcPr>
-            <w:tcW w:type="dxa" w:w="2098"/>
+            <w:tcW w:type="dxa" w:w="3685"/>
           </w:tcPr>
           <w:p>
             <w:pPr>
-              <w:spacing w:before="60" w:after="80" w:line="259" w:lineRule="auto"/>
+              <w:spacing w:before="40" w:after="60" w:line="252" w:lineRule="auto"/>
             </w:pPr>
             <w:r>
               <w:rPr>
-                <w:b/>
-                <w:sz w:val="19"/>
+                <w:sz w:val="18"/>
               </w:rPr>
-              <w:t>7 控制阀组及油管</w:t>
+              <w:t>H15 轿门</w:t>
               <w:br/>
-              <w:t>Valve block and pipework</w:t>
+              <w:t>Car doors</w:t>
             </w:r>
           </w:p>
         </w:tc>
         <w:tc>
           <w:tcPr>
-            <w:tcW w:type="dxa" w:w="3288"/>
+            <w:tcW w:type="dxa" w:w="2551"/>
           </w:tcPr>
           <w:p>
             <w:pPr>
-              <w:spacing w:before="60" w:after="80" w:line="259" w:lineRule="auto"/>
+              <w:spacing w:before="40" w:after="60" w:line="252" w:lineRule="auto"/>
             </w:pPr>
             <w:r>
               <w:rPr>
-                <w:sz w:val="19"/>
+                <w:sz w:val="18"/>
               </w:rPr>
-              <w:t>油管连接动力装置和油缸；阀组控制进油、保压及回油，从而控制上升、停止和下降。</w:t>
+              <w:t>控制轿厢入口。</w:t>
             </w:r>
           </w:p>
         </w:tc>
         <w:tc>
           <w:tcPr>
-            <w:tcW w:type="dxa" w:w="4706"/>
+            <w:tcW w:type="dxa" w:w="3969"/>
           </w:tcPr>
           <w:p>
             <w:pPr>
-              <w:spacing w:before="60" w:after="80" w:line="259" w:lineRule="auto"/>
+              <w:spacing w:before="40" w:after="60" w:line="252" w:lineRule="auto"/>
             </w:pPr>
             <w:r>
               <w:rPr>
-                <w:sz w:val="19"/>
+                <w:sz w:val="18"/>
               </w:rPr>
-              <w:t>Pipework connects the power unit to the cylinder. The valves control oil admission, holding and return for ascent, stopping and descent.</w:t>
+              <w:t>Control access to the car.</w:t>
             </w:r>
           </w:p>
         </w:tc>
@@ -1614,52 +3092,51 @@
         </w:trPr>
         <w:tc>
           <w:tcPr>
-            <w:tcW w:type="dxa" w:w="2098"/>
+            <w:tcW w:type="dxa" w:w="3685"/>
           </w:tcPr>
           <w:p>
             <w:pPr>
-              <w:spacing w:before="60" w:after="80" w:line="259" w:lineRule="auto"/>
+              <w:spacing w:before="40" w:after="60" w:line="252" w:lineRule="auto"/>
             </w:pPr>
             <w:r>
               <w:rPr>
-                <w:b/>
-                <w:sz w:val="19"/>
+                <w:sz w:val="18"/>
               </w:rPr>
-              <w:t>8 控制器</w:t>
+              <w:t>H16 层门</w:t>
               <w:br/>
-              <w:t>Controller</w:t>
+              <w:t>Landing doors</w:t>
             </w:r>
           </w:p>
         </w:tc>
         <w:tc>
           <w:tcPr>
-            <w:tcW w:type="dxa" w:w="3288"/>
+            <w:tcW w:type="dxa" w:w="2551"/>
           </w:tcPr>
           <w:p>
             <w:pPr>
-              <w:spacing w:before="60" w:after="80" w:line="259" w:lineRule="auto"/>
+              <w:spacing w:before="40" w:after="60" w:line="252" w:lineRule="auto"/>
             </w:pPr>
             <w:r>
               <w:rPr>
-                <w:sz w:val="19"/>
+                <w:sz w:val="18"/>
               </w:rPr>
-              <w:t>接收运行指令，协调油泵、阀组、停车及门的操作。</w:t>
+              <w:t>关闭各楼层的井道入口。</w:t>
             </w:r>
           </w:p>
         </w:tc>
         <w:tc>
           <w:tcPr>
-            <w:tcW w:type="dxa" w:w="4706"/>
+            <w:tcW w:type="dxa" w:w="3969"/>
           </w:tcPr>
           <w:p>
             <w:pPr>
-              <w:spacing w:before="60" w:after="80" w:line="259" w:lineRule="auto"/>
+              <w:spacing w:before="40" w:after="60" w:line="252" w:lineRule="auto"/>
             </w:pPr>
             <w:r>
               <w:rPr>
-                <w:sz w:val="19"/>
+                <w:sz w:val="18"/>
               </w:rPr>
-              <w:t>The controller receives travel commands and coordinates pump, valve, stopping and door operations.</w:t>
+              <w:t>Close the well entrance at each landing.</w:t>
             </w:r>
           </w:p>
         </w:tc>
@@ -1670,52 +3147,51 @@
         </w:trPr>
         <w:tc>
           <w:tcPr>
-            <w:tcW w:type="dxa" w:w="2098"/>
+            <w:tcW w:type="dxa" w:w="3685"/>
           </w:tcPr>
           <w:p>
             <w:pPr>
-              <w:spacing w:before="60" w:after="80" w:line="259" w:lineRule="auto"/>
+              <w:spacing w:before="40" w:after="60" w:line="252" w:lineRule="auto"/>
             </w:pPr>
             <w:r>
               <w:rPr>
-                <w:b/>
-                <w:sz w:val="19"/>
+                <w:sz w:val="18"/>
               </w:rPr>
-              <w:t>9 导轨、导靴及支架</w:t>
+              <w:t>H17 层站按钮</w:t>
               <w:br/>
-              <w:t>Rails, shoes and brackets</w:t>
+              <w:t>Landing pushbutton</w:t>
             </w:r>
           </w:p>
         </w:tc>
         <w:tc>
           <w:tcPr>
-            <w:tcW w:type="dxa" w:w="3288"/>
+            <w:tcW w:type="dxa" w:w="2551"/>
           </w:tcPr>
           <w:p>
             <w:pPr>
-              <w:spacing w:before="60" w:after="80" w:line="259" w:lineRule="auto"/>
+              <w:spacing w:before="40" w:after="60" w:line="252" w:lineRule="auto"/>
             </w:pPr>
             <w:r>
               <w:rPr>
-                <w:sz w:val="19"/>
+                <w:sz w:val="18"/>
               </w:rPr>
-              <w:t>引导轿厢垂直移动并限制横向偏移；支架固定导轨。</w:t>
+              <w:t>发出召梯指令。</w:t>
             </w:r>
           </w:p>
         </w:tc>
         <w:tc>
           <w:tcPr>
-            <w:tcW w:type="dxa" w:w="4706"/>
+            <w:tcW w:type="dxa" w:w="3969"/>
           </w:tcPr>
           <w:p>
             <w:pPr>
-              <w:spacing w:before="60" w:after="80" w:line="259" w:lineRule="auto"/>
+              <w:spacing w:before="40" w:after="60" w:line="252" w:lineRule="auto"/>
             </w:pPr>
             <w:r>
               <w:rPr>
-                <w:sz w:val="19"/>
+                <w:sz w:val="18"/>
               </w:rPr>
-              <w:t>Rails and shoes guide the car vertically and restrain lateral movement. Brackets secure the rails.</w:t>
+              <w:t>Registers a landing call.</w:t>
             </w:r>
           </w:p>
         </w:tc>
@@ -1726,52 +3202,51 @@
         </w:trPr>
         <w:tc>
           <w:tcPr>
-            <w:tcW w:type="dxa" w:w="2098"/>
+            <w:tcW w:type="dxa" w:w="3685"/>
           </w:tcPr>
           <w:p>
             <w:pPr>
-              <w:spacing w:before="60" w:after="80" w:line="259" w:lineRule="auto"/>
+              <w:spacing w:before="40" w:after="60" w:line="252" w:lineRule="auto"/>
             </w:pPr>
             <w:r>
               <w:rPr>
-                <w:b/>
-                <w:sz w:val="19"/>
+                <w:sz w:val="18"/>
               </w:rPr>
-              <w:t>10 门、门机及联锁</w:t>
+              <w:t>H18 层站指示器</w:t>
               <w:br/>
-              <w:t>Doors, operator and interlocks</w:t>
+              <w:t>Landing indicator</w:t>
             </w:r>
           </w:p>
         </w:tc>
         <w:tc>
           <w:tcPr>
-            <w:tcW w:type="dxa" w:w="3288"/>
+            <w:tcW w:type="dxa" w:w="2551"/>
           </w:tcPr>
           <w:p>
             <w:pPr>
-              <w:spacing w:before="60" w:after="80" w:line="259" w:lineRule="auto"/>
+              <w:spacing w:before="40" w:after="60" w:line="252" w:lineRule="auto"/>
             </w:pPr>
             <w:r>
               <w:rPr>
-                <w:sz w:val="19"/>
+                <w:sz w:val="18"/>
               </w:rPr>
-              <w:t>控制乘客出入。门未正确关闭并锁紧时，联锁阻止正常运行。</w:t>
+              <w:t>显示升降机的运行信息。</w:t>
             </w:r>
           </w:p>
         </w:tc>
         <w:tc>
           <w:tcPr>
-            <w:tcW w:type="dxa" w:w="4706"/>
+            <w:tcW w:type="dxa" w:w="3969"/>
           </w:tcPr>
           <w:p>
             <w:pPr>
-              <w:spacing w:before="60" w:after="80" w:line="259" w:lineRule="auto"/>
+              <w:spacing w:before="40" w:after="60" w:line="252" w:lineRule="auto"/>
             </w:pPr>
             <w:r>
               <w:rPr>
-                <w:sz w:val="19"/>
+                <w:sz w:val="18"/>
               </w:rPr>
-              <w:t>Doors control passenger access. Interlocks prevent normal travel unless the doors are properly closed and locked.</w:t>
+              <w:t>Displays lift operating information.</w:t>
             </w:r>
           </w:p>
         </w:tc>
@@ -1782,52 +3257,51 @@
         </w:trPr>
         <w:tc>
           <w:tcPr>
-            <w:tcW w:type="dxa" w:w="2098"/>
+            <w:tcW w:type="dxa" w:w="3685"/>
           </w:tcPr>
           <w:p>
             <w:pPr>
-              <w:spacing w:before="60" w:after="80" w:line="259" w:lineRule="auto"/>
+              <w:spacing w:before="40" w:after="60" w:line="252" w:lineRule="auto"/>
             </w:pPr>
             <w:r>
               <w:rPr>
-                <w:b/>
-                <w:sz w:val="19"/>
+                <w:sz w:val="18"/>
               </w:rPr>
-              <w:t>11 平层及限位装置</w:t>
+              <w:t>H19 随行电缆</w:t>
               <w:br/>
-              <w:t>Levelling and limit devices</w:t>
+              <w:t>Travelling cables</w:t>
             </w:r>
           </w:p>
         </w:tc>
         <w:tc>
           <w:tcPr>
-            <w:tcW w:type="dxa" w:w="3288"/>
+            <w:tcW w:type="dxa" w:w="2551"/>
           </w:tcPr>
           <w:p>
             <w:pPr>
-              <w:spacing w:before="60" w:after="80" w:line="259" w:lineRule="auto"/>
+              <w:spacing w:before="40" w:after="60" w:line="252" w:lineRule="auto"/>
             </w:pPr>
             <w:r>
               <w:rPr>
-                <w:sz w:val="19"/>
+                <w:sz w:val="18"/>
               </w:rPr>
-              <w:t>平层装置使轿厢准确停靠楼层；限位装置防止超出规定行程。</w:t>
+              <w:t>连接移动轿厢的电源与信号。</w:t>
             </w:r>
           </w:p>
         </w:tc>
         <w:tc>
           <w:tcPr>
-            <w:tcW w:type="dxa" w:w="4706"/>
+            <w:tcW w:type="dxa" w:w="3969"/>
           </w:tcPr>
           <w:p>
             <w:pPr>
-              <w:spacing w:before="60" w:after="80" w:line="259" w:lineRule="auto"/>
+              <w:spacing w:before="40" w:after="60" w:line="252" w:lineRule="auto"/>
             </w:pPr>
             <w:r>
               <w:rPr>
-                <w:sz w:val="19"/>
+                <w:sz w:val="18"/>
               </w:rPr>
-              <w:t>Levelling devices provide accurate landing alignment. Limit devices prevent travel beyond the permitted range.</w:t>
+              <w:t>Carry power and signals to and from the moving car.</w:t>
             </w:r>
           </w:p>
         </w:tc>
@@ -1838,52 +3312,436 @@
         </w:trPr>
         <w:tc>
           <w:tcPr>
-            <w:tcW w:type="dxa" w:w="2098"/>
+            <w:tcW w:type="dxa" w:w="3685"/>
           </w:tcPr>
           <w:p>
             <w:pPr>
-              <w:spacing w:before="60" w:after="80" w:line="259" w:lineRule="auto"/>
+              <w:spacing w:before="40" w:after="60" w:line="252" w:lineRule="auto"/>
             </w:pPr>
             <w:r>
               <w:rPr>
-                <w:b/>
-                <w:sz w:val="19"/>
+                <w:sz w:val="18"/>
               </w:rPr>
-              <w:t>12 底坑缓冲器</w:t>
+              <w:t>H20 楼层停止及限位开关</w:t>
               <w:br/>
-              <w:t>Pit buffers</w:t>
+              <w:t>Floor stop and limit switch</w:t>
             </w:r>
           </w:p>
         </w:tc>
         <w:tc>
           <w:tcPr>
-            <w:tcW w:type="dxa" w:w="3288"/>
+            <w:tcW w:type="dxa" w:w="2551"/>
           </w:tcPr>
           <w:p>
             <w:pPr>
-              <w:spacing w:before="60" w:after="80" w:line="259" w:lineRule="auto"/>
+              <w:spacing w:before="40" w:after="60" w:line="252" w:lineRule="auto"/>
             </w:pPr>
             <w:r>
               <w:rPr>
-                <w:sz w:val="19"/>
+                <w:sz w:val="18"/>
               </w:rPr>
-              <w:t>在轿厢底部发生越程冲击时吸收能量。</w:t>
+              <w:t>控制楼层停车并限制行程。</w:t>
             </w:r>
           </w:p>
         </w:tc>
         <w:tc>
           <w:tcPr>
-            <w:tcW w:type="dxa" w:w="4706"/>
+            <w:tcW w:type="dxa" w:w="3969"/>
           </w:tcPr>
           <w:p>
             <w:pPr>
-              <w:spacing w:before="60" w:after="80" w:line="259" w:lineRule="auto"/>
+              <w:spacing w:before="40" w:after="60" w:line="252" w:lineRule="auto"/>
             </w:pPr>
             <w:r>
               <w:rPr>
-                <w:sz w:val="19"/>
+                <w:sz w:val="18"/>
               </w:rPr>
-              <w:t>Pit buffers absorb impact energy if the car overruns at the bottom of travel.</w:t>
+              <w:t>Controls landing stops and limits travel.</w:t>
+            </w:r>
+          </w:p>
+        </w:tc>
+      </w:tr>
+      <w:tr>
+        <w:trPr>
+          <w:cantSplit/>
+        </w:trPr>
+        <w:tc>
+          <w:tcPr>
+            <w:tcW w:type="dxa" w:w="3685"/>
+          </w:tcPr>
+          <w:p>
+            <w:pPr>
+              <w:spacing w:before="40" w:after="60" w:line="252" w:lineRule="auto"/>
+            </w:pPr>
+            <w:r>
+              <w:rPr>
+                <w:sz w:val="18"/>
+              </w:rPr>
+              <w:t>H21 低速平层开关凸轮</w:t>
+              <w:br/>
+              <w:t>Creepage and leveling switch cam</w:t>
+            </w:r>
+          </w:p>
+        </w:tc>
+        <w:tc>
+          <w:tcPr>
+            <w:tcW w:type="dxa" w:w="2551"/>
+          </w:tcPr>
+          <w:p>
+            <w:pPr>
+              <w:spacing w:before="40" w:after="60" w:line="252" w:lineRule="auto"/>
+            </w:pPr>
+            <w:r>
+              <w:rPr>
+                <w:sz w:val="18"/>
+              </w:rPr>
+              <w:t>触发低速平层相关开关。</w:t>
+            </w:r>
+          </w:p>
+        </w:tc>
+        <w:tc>
+          <w:tcPr>
+            <w:tcW w:type="dxa" w:w="3969"/>
+          </w:tcPr>
+          <w:p>
+            <w:pPr>
+              <w:spacing w:before="40" w:after="60" w:line="252" w:lineRule="auto"/>
+            </w:pPr>
+            <w:r>
+              <w:rPr>
+                <w:sz w:val="18"/>
+              </w:rPr>
+              <w:t>Actuates switches used for low-speed levelling.</w:t>
+            </w:r>
+          </w:p>
+        </w:tc>
+      </w:tr>
+      <w:tr>
+        <w:trPr>
+          <w:cantSplit/>
+        </w:trPr>
+        <w:tc>
+          <w:tcPr>
+            <w:tcW w:type="dxa" w:w="3685"/>
+          </w:tcPr>
+          <w:p>
+            <w:pPr>
+              <w:spacing w:before="40" w:after="60" w:line="252" w:lineRule="auto"/>
+            </w:pPr>
+            <w:r>
+              <w:rPr>
+                <w:sz w:val="18"/>
+              </w:rPr>
+              <w:t>H22 弹簧缓冲器</w:t>
+              <w:br/>
+              <w:t>Buffer spring</w:t>
+            </w:r>
+          </w:p>
+        </w:tc>
+        <w:tc>
+          <w:tcPr>
+            <w:tcW w:type="dxa" w:w="2551"/>
+          </w:tcPr>
+          <w:p>
+            <w:pPr>
+              <w:spacing w:before="40" w:after="60" w:line="252" w:lineRule="auto"/>
+            </w:pPr>
+            <w:r>
+              <w:rPr>
+                <w:sz w:val="18"/>
+              </w:rPr>
+              <w:t>吸收轿厢底部越程冲击能量。</w:t>
+            </w:r>
+          </w:p>
+        </w:tc>
+        <w:tc>
+          <w:tcPr>
+            <w:tcW w:type="dxa" w:w="3969"/>
+          </w:tcPr>
+          <w:p>
+            <w:pPr>
+              <w:spacing w:before="40" w:after="60" w:line="252" w:lineRule="auto"/>
+            </w:pPr>
+            <w:r>
+              <w:rPr>
+                <w:sz w:val="18"/>
+              </w:rPr>
+              <w:t>Absorbs impact energy during bottom overtravel.</w:t>
+            </w:r>
+          </w:p>
+        </w:tc>
+      </w:tr>
+      <w:tr>
+        <w:trPr>
+          <w:cantSplit/>
+        </w:trPr>
+        <w:tc>
+          <w:tcPr>
+            <w:tcW w:type="dxa" w:w="3685"/>
+          </w:tcPr>
+          <w:p>
+            <w:pPr>
+              <w:spacing w:before="40" w:after="60" w:line="252" w:lineRule="auto"/>
+            </w:pPr>
+            <w:r>
+              <w:rPr>
+                <w:sz w:val="18"/>
+              </w:rPr>
+              <w:t>H23 柱塞止动环</w:t>
+              <w:br/>
+              <w:t>Plunger stop ring</w:t>
+            </w:r>
+          </w:p>
+        </w:tc>
+        <w:tc>
+          <w:tcPr>
+            <w:tcW w:type="dxa" w:w="2551"/>
+          </w:tcPr>
+          <w:p>
+            <w:pPr>
+              <w:spacing w:before="40" w:after="60" w:line="252" w:lineRule="auto"/>
+            </w:pPr>
+            <w:r>
+              <w:rPr>
+                <w:sz w:val="18"/>
+              </w:rPr>
+              <w:t>限制柱塞过度伸出。</w:t>
+            </w:r>
+          </w:p>
+        </w:tc>
+        <w:tc>
+          <w:tcPr>
+            <w:tcW w:type="dxa" w:w="3969"/>
+          </w:tcPr>
+          <w:p>
+            <w:pPr>
+              <w:spacing w:before="40" w:after="60" w:line="252" w:lineRule="auto"/>
+            </w:pPr>
+            <w:r>
+              <w:rPr>
+                <w:sz w:val="18"/>
+              </w:rPr>
+              <w:t>Limits excessive extension of the plunger.</w:t>
+            </w:r>
+          </w:p>
+        </w:tc>
+      </w:tr>
+      <w:tr>
+        <w:trPr>
+          <w:cantSplit/>
+        </w:trPr>
+        <w:tc>
+          <w:tcPr>
+            <w:tcW w:type="dxa" w:w="3685"/>
+          </w:tcPr>
+          <w:p>
+            <w:pPr>
+              <w:spacing w:before="40" w:after="60" w:line="252" w:lineRule="auto"/>
+            </w:pPr>
+            <w:r>
+              <w:rPr>
+                <w:sz w:val="18"/>
+              </w:rPr>
+              <w:t>H24 井道</w:t>
+              <w:br/>
+              <w:t>Lift well</w:t>
+            </w:r>
+          </w:p>
+        </w:tc>
+        <w:tc>
+          <w:tcPr>
+            <w:tcW w:type="dxa" w:w="2551"/>
+          </w:tcPr>
+          <w:p>
+            <w:pPr>
+              <w:spacing w:before="40" w:after="60" w:line="252" w:lineRule="auto"/>
+            </w:pPr>
+            <w:r>
+              <w:rPr>
+                <w:sz w:val="18"/>
+              </w:rPr>
+              <w:t>容纳轿厢运行空间。</w:t>
+            </w:r>
+          </w:p>
+        </w:tc>
+        <w:tc>
+          <w:tcPr>
+            <w:tcW w:type="dxa" w:w="3969"/>
+          </w:tcPr>
+          <w:p>
+            <w:pPr>
+              <w:spacing w:before="40" w:after="60" w:line="252" w:lineRule="auto"/>
+            </w:pPr>
+            <w:r>
+              <w:rPr>
+                <w:sz w:val="18"/>
+              </w:rPr>
+              <w:t>Encloses the car travel space.</w:t>
+            </w:r>
+          </w:p>
+        </w:tc>
+      </w:tr>
+      <w:tr>
+        <w:trPr>
+          <w:cantSplit/>
+        </w:trPr>
+        <w:tc>
+          <w:tcPr>
+            <w:tcW w:type="dxa" w:w="3685"/>
+          </w:tcPr>
+          <w:p>
+            <w:pPr>
+              <w:spacing w:before="40" w:after="60" w:line="252" w:lineRule="auto"/>
+            </w:pPr>
+            <w:r>
+              <w:rPr>
+                <w:sz w:val="18"/>
+              </w:rPr>
+              <w:t>H25 套管</w:t>
+              <w:br/>
+              <w:t>Casing</w:t>
+            </w:r>
+          </w:p>
+        </w:tc>
+        <w:tc>
+          <w:tcPr>
+            <w:tcW w:type="dxa" w:w="2551"/>
+          </w:tcPr>
+          <w:p>
+            <w:pPr>
+              <w:spacing w:before="40" w:after="60" w:line="252" w:lineRule="auto"/>
+            </w:pPr>
+            <w:r>
+              <w:rPr>
+                <w:sz w:val="18"/>
+              </w:rPr>
+              <w:t>围护埋地油缸。</w:t>
+            </w:r>
+          </w:p>
+        </w:tc>
+        <w:tc>
+          <w:tcPr>
+            <w:tcW w:type="dxa" w:w="3969"/>
+          </w:tcPr>
+          <w:p>
+            <w:pPr>
+              <w:spacing w:before="40" w:after="60" w:line="252" w:lineRule="auto"/>
+            </w:pPr>
+            <w:r>
+              <w:rPr>
+                <w:sz w:val="18"/>
+              </w:rPr>
+              <w:t>Surrounds the buried cylinder.</w:t>
+            </w:r>
+          </w:p>
+        </w:tc>
+      </w:tr>
+      <w:tr>
+        <w:trPr>
+          <w:cantSplit/>
+        </w:trPr>
+        <w:tc>
+          <w:tcPr>
+            <w:tcW w:type="dxa" w:w="3685"/>
+          </w:tcPr>
+          <w:p>
+            <w:pPr>
+              <w:spacing w:before="40" w:after="60" w:line="252" w:lineRule="auto"/>
+            </w:pPr>
+            <w:r>
+              <w:rPr>
+                <w:sz w:val="18"/>
+              </w:rPr>
+              <w:t>H26 层门联锁</w:t>
+              <w:br/>
+              <w:t>Landing door interlock</w:t>
+            </w:r>
+          </w:p>
+        </w:tc>
+        <w:tc>
+          <w:tcPr>
+            <w:tcW w:type="dxa" w:w="2551"/>
+          </w:tcPr>
+          <w:p>
+            <w:pPr>
+              <w:spacing w:before="40" w:after="60" w:line="252" w:lineRule="auto"/>
+            </w:pPr>
+            <w:r>
+              <w:rPr>
+                <w:sz w:val="18"/>
+              </w:rPr>
+              <w:t>层门未关闭锁紧时阻止运行。</w:t>
+            </w:r>
+          </w:p>
+        </w:tc>
+        <w:tc>
+          <w:tcPr>
+            <w:tcW w:type="dxa" w:w="3969"/>
+          </w:tcPr>
+          <w:p>
+            <w:pPr>
+              <w:spacing w:before="40" w:after="60" w:line="252" w:lineRule="auto"/>
+            </w:pPr>
+            <w:r>
+              <w:rPr>
+                <w:sz w:val="18"/>
+              </w:rPr>
+              <w:t>Prevents travel unless the landing doors are closed and locked.</w:t>
+            </w:r>
+          </w:p>
+        </w:tc>
+      </w:tr>
+      <w:tr>
+        <w:trPr>
+          <w:cantSplit/>
+        </w:trPr>
+        <w:tc>
+          <w:tcPr>
+            <w:tcW w:type="dxa" w:w="3685"/>
+          </w:tcPr>
+          <w:p>
+            <w:pPr>
+              <w:spacing w:before="40" w:after="60" w:line="252" w:lineRule="auto"/>
+            </w:pPr>
+            <w:r>
+              <w:rPr>
+                <w:sz w:val="18"/>
+              </w:rPr>
+              <w:t>H27 层门接近传感器</w:t>
+              <w:br/>
+              <w:t>Landing door proximity sensor</w:t>
+            </w:r>
+          </w:p>
+        </w:tc>
+        <w:tc>
+          <w:tcPr>
+            <w:tcW w:type="dxa" w:w="2551"/>
+          </w:tcPr>
+          <w:p>
+            <w:pPr>
+              <w:spacing w:before="40" w:after="60" w:line="252" w:lineRule="auto"/>
+            </w:pPr>
+            <w:r>
+              <w:rPr>
+                <w:sz w:val="18"/>
+              </w:rPr>
+              <w:t>关门时检测到乘客进入便使门重开。</w:t>
+            </w:r>
+          </w:p>
+        </w:tc>
+        <w:tc>
+          <w:tcPr>
+            <w:tcW w:type="dxa" w:w="3969"/>
+          </w:tcPr>
+          <w:p>
+            <w:pPr>
+              <w:spacing w:before="40" w:after="60" w:line="252" w:lineRule="auto"/>
+            </w:pPr>
+            <w:r>
+              <w:rPr>
+                <w:sz w:val="18"/>
+              </w:rPr>
+              <w:t>Reopens closing doors when a person enters.</w:t>
             </w:r>
           </w:p>
         </w:tc>
@@ -1899,19 +3757,19 @@
     </w:p>
     <w:p>
       <w:r>
-        <w:t>上升时，电动机驱动油泵向油缸供油，使柱塞伸出并顶升轿厢。停止时，阀组保持油缸内的油液，使轿厢停留在所需位置。下降时，阀组允许油液受控流回油箱，轿厢重量使柱塞缩回，轿厢随之下降。</w:t>
+        <w:t>上升时，电动机驱动油泵，油由油箱经油泵、阀组和闸阀进入油缸，使柱塞伸出并直接顶升轿厢。停止时，阀组保持油缸内的油。下降时，阀组让油受控流回油箱，轿厢重量使柱塞缩回。闸阀在正常运行时保持开启。</w:t>
       </w:r>
     </w:p>
     <w:p>
       <w:r>
-        <w:t>During ascent, the motor drives the pump to supply oil to the cylinder, extending the plunger and raising the car. During holding, the valve arrangement retains oil in the cylinder to keep the car at the required position. During descent, the valves allow controlled oil return to the tank, and the weight of the car retracts the plunger.</w:t>
+        <w:t>During ascent, the motor drives the pump. Oil flows from the tank through the pump, valve block and gate valve into the cylinder, extending the plunger and directly raising the car. During holding, the valve block retains oil in the cylinder. During descent, it permits controlled return to the tank, and the car weight retracts the plunger. The gate valve remains open during normal operation.</w:t>
       </w:r>
     </w:p>
     <w:sectPr>
       <w:headerReference w:type="default" r:id="rId9"/>
       <w:footerReference w:type="default" r:id="rId10"/>
       <w:pgSz w:w="11906" w:h="16838"/>
-      <w:pgMar w:top="879" w:right="907" w:bottom="850" w:left="907" w:header="369" w:footer="369" w:gutter="0"/>
+      <w:pgMar w:top="794" w:right="850" w:bottom="794" w:left="850" w:header="720" w:footer="720" w:gutter="0"/>
       <w:cols w:space="720"/>
       <w:docGrid w:linePitch="360"/>
     </w:sectPr>
@@ -1935,10 +3793,10 @@
 <w:hdr xmlns:m="http://schemas.openxmlformats.org/officeDocument/2006/math" xmlns:mc="http://schemas.openxmlformats.org/markup-compatibility/2006" xmlns:mo="http://schemas.microsoft.com/office/mac/office/2008/main" xmlns:mv="urn:schemas-microsoft-com:mac:vml" xmlns:o="urn:schemas-microsoft-com:office:office" xmlns:r="http://schemas.openxmlformats.org/officeDocument/2006/relationships" xmlns:v="urn:schemas-microsoft-com:vml" xmlns:w10="urn:schemas-microsoft-com:office:word" xmlns:w14="http://schemas.microsoft.com/office/word/2010/wordml" xmlns:w="http://schemas.openxmlformats.org/wordprocessingml/2006/main" xmlns:wne="http://schemas.microsoft.com/office/word/2006/wordml" xmlns:wp14="http://schemas.microsoft.com/office/word/2010/wordprocessingDrawing" xmlns:wp="http://schemas.openxmlformats.org/drawingml/2006/wordprocessingDrawing" xmlns:wpc="http://schemas.microsoft.com/office/word/2010/wordprocessingCanvas" xmlns:wpg="http://schemas.microsoft.com/office/word/2010/wordprocessingGroup" xmlns:wpi="http://schemas.microsoft.com/office/word/2010/wordprocessingInk" xmlns:wps="http://schemas.microsoft.com/office/word/2010/wordprocessingShape" mc:Ignorable="w14 wp14">
   <w:p>
     <w:pPr>
-      <w:pStyle w:val="Caption"/>
+      <w:pStyle w:val="Header"/>
     </w:pPr>
     <w:r>
-      <w:t>PIA5704  |  Q1</w:t>
+      <w:t>PIA5704 | Q1</w:t>
     </w:r>
   </w:p>
 </w:hdr>
@@ -2308,7 +4166,7 @@
     <w:qFormat/>
     <w:rsid w:val="00FC693F"/>
     <w:pPr>
-      <w:spacing w:after="100" w:line="264" w:lineRule="auto"/>
+      <w:spacing w:after="100"/>
     </w:pPr>
     <w:rPr>
       <w:rFonts w:ascii="Calibri" w:hAnsi="Calibri" w:eastAsia="Noto Sans CJK SC"/>
@@ -2370,15 +4228,15 @@
     <w:pPr>
       <w:keepNext/>
       <w:keepLines/>
-      <w:spacing w:before="480" w:after="140"/>
+      <w:spacing w:before="480" w:after="0"/>
       <w:outlineLvl w:val="0"/>
     </w:pPr>
     <w:rPr>
       <w:rFonts w:asciiTheme="majorHAnsi" w:eastAsiaTheme="majorEastAsia" w:hAnsiTheme="majorHAnsi" w:cstheme="majorBidi" w:ascii="Calibri" w:hAnsi="Calibri" w:eastAsia="Noto Sans CJK SC"/>
       <w:b/>
       <w:bCs/>
-      <w:color w:val="17364D"/>
-      <w:sz w:val="32"/>
+      <w:color w:val="365F91" w:themeColor="accent1" w:themeShade="BF"/>
+      <w:sz w:val="30"/>
       <w:szCs w:val="28"/>
     </w:rPr>
   </w:style>
@@ -2394,14 +4252,14 @@
     <w:pPr>
       <w:keepNext/>
       <w:keepLines/>
-      <w:spacing w:before="200" w:after="140"/>
+      <w:spacing w:before="200" w:after="0"/>
       <w:outlineLvl w:val="1"/>
     </w:pPr>
     <w:rPr>
       <w:rFonts w:asciiTheme="majorHAnsi" w:eastAsiaTheme="majorEastAsia" w:hAnsiTheme="majorHAnsi" w:cstheme="majorBidi" w:ascii="Calibri" w:hAnsi="Calibri" w:eastAsia="Noto Sans CJK SC"/>
       <w:b/>
       <w:bCs/>
-      <w:color w:val="17364D"/>
+      <w:color w:val="4F81BD" w:themeColor="accent1"/>
       <w:sz w:val="24"/>
       <w:szCs w:val="26"/>
     </w:rPr>
@@ -2659,15 +4517,15 @@
       <w:pBdr>
         <w:bottom w:val="single" w:sz="8" w:space="4" w:color="4F81BD" w:themeColor="accent1"/>
       </w:pBdr>
-      <w:spacing w:after="140" w:line="240" w:lineRule="auto"/>
+      <w:spacing w:after="300" w:line="240" w:lineRule="auto"/>
       <w:contextualSpacing/>
     </w:pPr>
     <w:rPr>
       <w:rFonts w:asciiTheme="majorHAnsi" w:eastAsiaTheme="majorEastAsia" w:hAnsiTheme="majorHAnsi" w:cstheme="majorBidi" w:ascii="Calibri" w:hAnsi="Calibri" w:eastAsia="Noto Sans CJK SC"/>
-      <w:color w:val="17364D"/>
+      <w:color w:val="17365D" w:themeColor="text2" w:themeShade="BF"/>
       <w:spacing w:val="5"/>
       <w:kern w:val="28"/>
-      <w:sz w:val="40"/>
+      <w:sz w:val="38"/>
       <w:szCs w:val="52"/>
     </w:rPr>
   </w:style>
@@ -2746,10 +4604,6 @@
     <w:pPr>
       <w:spacing w:after="120"/>
     </w:pPr>
-    <w:rPr>
-      <w:rFonts w:ascii="Calibri" w:hAnsi="Calibri" w:eastAsia="Noto Sans CJK SC"/>
-      <w:sz w:val="20"/>
-    </w:rPr>
   </w:style>
   <w:style w:type="character" w:customStyle="1" w:styleId="BodyTextChar">
     <w:name w:val="Body Text Char"/>

</xml_diff>

<commit_message>
Align Q1 answer with major-component requirements and add clear directly labelled vector diagrams
</commit_message>
<xml_diff>
--- a/downloads/PIA5704/PIA5704_Q1_Bilingual.docx
+++ b/downloads/PIA5704/PIA5704_Q1_Bilingual.docx
@@ -7,7 +7,7 @@
         <w:pStyle w:val="Title"/>
       </w:pPr>
       <w:r>
-        <w:t>Q1 升降机系统 / Lift Systems</w:t>
+        <w:t>Q1</w:t>
       </w:r>
     </w:p>
     <w:p>
@@ -19,55 +19,13 @@
       </w:r>
     </w:p>
     <w:p>
-      <w:pPr>
-        <w:jc w:val="center"/>
-      </w:pPr>
       <w:r>
-        <w:drawing>
-          <wp:inline xmlns:a="http://schemas.openxmlformats.org/drawingml/2006/main" xmlns:pic="http://schemas.openxmlformats.org/drawingml/2006/picture">
-            <wp:extent cx="5438045" cy="7596000"/>
-            <wp:docPr id="1" name="Picture 1"/>
-            <wp:cNvGraphicFramePr>
-              <a:graphicFrameLocks noChangeAspect="1"/>
-            </wp:cNvGraphicFramePr>
-            <a:graphic>
-              <a:graphicData uri="http://schemas.openxmlformats.org/drawingml/2006/picture">
-                <pic:pic>
-                  <pic:nvPicPr>
-                    <pic:cNvPr id="0" name="PIA5704_Q1_Traction_Handdraw.png"/>
-                    <pic:cNvPicPr/>
-                  </pic:nvPicPr>
-                  <pic:blipFill>
-                    <a:blip r:embed="rId11"/>
-                    <a:stretch>
-                      <a:fillRect/>
-                    </a:stretch>
-                  </pic:blipFill>
-                  <pic:spPr>
-                    <a:xfrm>
-                      <a:off x="0" y="0"/>
-                      <a:ext cx="5438045" cy="7596000"/>
-                    </a:xfrm>
-                    <a:prstGeom prst="rect"/>
-                  </pic:spPr>
-                </pic:pic>
-              </a:graphicData>
-            </a:graphic>
-          </wp:inline>
-        </w:drawing>
+        <w:t>典型电力曳引式升降机由驱动电动机带动曳引轮，通过曳引轮与悬吊绳之间的摩擦传递驱动力，使轿厢与对重反向移动。对重平衡轿厢及部分载荷重量，因此驱动电动机主要克服不平衡负载和摩擦。以下以有齿轮式布置说明。</w:t>
       </w:r>
     </w:p>
     <w:p>
       <w:r>
-        <w:br w:type="page"/>
-      </w:r>
-    </w:p>
-    <w:p>
-      <w:pPr>
-        <w:pStyle w:val="Heading1"/>
-      </w:pPr>
-      <w:r>
-        <w:t>1.1 部件及功能 / Components and functions (1/3)</w:t>
+        <w:t>A typical electric traction lift uses a drive motor to turn a drive sheave. Friction between the drive sheave and suspension rope moves the car and counterweight in opposite directions. The counterweight balances the car and part of its load, so the drive motor mainly overcomes the unbalanced load and friction. The arrangement described here is geared.</w:t>
       </w:r>
     </w:p>
     <w:tbl>
@@ -78,9 +36,9 @@
         <w:tblLook w:firstColumn="1" w:firstRow="1" w:lastColumn="0" w:lastRow="0" w:noHBand="0" w:noVBand="1" w:val="04A0"/>
       </w:tblPr>
       <w:tblGrid>
-        <w:gridCol w:w="3402"/>
-        <w:gridCol w:w="3402"/>
-        <w:gridCol w:w="3402"/>
+        <w:gridCol w:w="3175"/>
+        <w:gridCol w:w="2835"/>
+        <w:gridCol w:w="4309"/>
       </w:tblGrid>
       <w:tr>
         <w:trPr>
@@ -88,19 +46,19 @@
         </w:trPr>
         <w:tc>
           <w:tcPr>
-            <w:tcW w:type="dxa" w:w="3685"/>
-            <w:shd w:fill="E7EDF2"/>
+            <w:tcW w:type="dxa" w:w="3175"/>
+            <w:shd w:fill="E5EDF3"/>
           </w:tcPr>
           <w:p>
             <w:r>
-              <w:t>编号及部件 / Component</w:t>
+              <w:t>主要部件 / Major component</w:t>
             </w:r>
           </w:p>
         </w:tc>
         <w:tc>
           <w:tcPr>
-            <w:tcW w:type="dxa" w:w="2551"/>
-            <w:shd w:fill="E7EDF2"/>
+            <w:tcW w:type="dxa" w:w="2835"/>
+            <w:shd w:fill="E5EDF3"/>
           </w:tcPr>
           <w:p>
             <w:r>
@@ -110,8 +68,8 @@
         </w:tc>
         <w:tc>
           <w:tcPr>
-            <w:tcW w:type="dxa" w:w="3969"/>
-            <w:shd w:fill="E7EDF2"/>
+            <w:tcW w:type="dxa" w:w="4309"/>
+            <w:shd w:fill="E5EDF3"/>
           </w:tcPr>
           <w:p>
             <w:r>
@@ -126,7 +84,7 @@
         </w:trPr>
         <w:tc>
           <w:tcPr>
-            <w:tcW w:type="dxa" w:w="3685"/>
+            <w:tcW w:type="dxa" w:w="3175"/>
           </w:tcPr>
           <w:p>
             <w:pPr>
@@ -134,17 +92,17 @@
             </w:pPr>
             <w:r>
               <w:rPr>
-                <w:sz w:val="18"/>
+                <w:sz w:val="19"/>
               </w:rPr>
-              <w:t>T1 控制器</w:t>
+              <w:t>驱动电动机</w:t>
               <w:br/>
-              <w:t>Controller</w:t>
+              <w:t>Drive motor</w:t>
             </w:r>
           </w:p>
         </w:tc>
         <w:tc>
           <w:tcPr>
-            <w:tcW w:type="dxa" w:w="2551"/>
+            <w:tcW w:type="dxa" w:w="2835"/>
           </w:tcPr>
           <w:p>
             <w:pPr>
@@ -152,15 +110,15 @@
             </w:pPr>
             <w:r>
               <w:rPr>
-                <w:sz w:val="18"/>
+                <w:sz w:val="19"/>
               </w:rPr>
-              <w:t>协调驱动、停车及开关门。</w:t>
+              <w:t>提供升降机运行的动力。</w:t>
             </w:r>
           </w:p>
         </w:tc>
         <w:tc>
           <w:tcPr>
-            <w:tcW w:type="dxa" w:w="3969"/>
+            <w:tcW w:type="dxa" w:w="4309"/>
           </w:tcPr>
           <w:p>
             <w:pPr>
@@ -168,9 +126,9 @@
             </w:pPr>
             <w:r>
               <w:rPr>
-                <w:sz w:val="18"/>
+                <w:sz w:val="19"/>
               </w:rPr>
-              <w:t>Coordinates drive, stopping and door operation.</w:t>
+              <w:t>Supplies power to operate the lift.</w:t>
             </w:r>
           </w:p>
         </w:tc>
@@ -181,7 +139,7 @@
         </w:trPr>
         <w:tc>
           <w:tcPr>
-            <w:tcW w:type="dxa" w:w="3685"/>
+            <w:tcW w:type="dxa" w:w="3175"/>
           </w:tcPr>
           <w:p>
             <w:pPr>
@@ -189,17 +147,17 @@
             </w:pPr>
             <w:r>
               <w:rPr>
-                <w:sz w:val="18"/>
+                <w:sz w:val="19"/>
               </w:rPr>
-              <w:t>T2 驱动电动机</w:t>
+              <w:t>齿轮箱</w:t>
               <w:br/>
-              <w:t>Drive motor</w:t>
+              <w:t>Gear box</w:t>
             </w:r>
           </w:p>
         </w:tc>
         <w:tc>
           <w:tcPr>
-            <w:tcW w:type="dxa" w:w="2551"/>
+            <w:tcW w:type="dxa" w:w="2835"/>
           </w:tcPr>
           <w:p>
             <w:pPr>
@@ -207,15 +165,15 @@
             </w:pPr>
             <w:r>
               <w:rPr>
-                <w:sz w:val="18"/>
+                <w:sz w:val="19"/>
               </w:rPr>
-              <w:t>提供驱动力。</w:t>
+              <w:t>降低驱动电动机转速，并把转矩传递至曳引轮。</w:t>
             </w:r>
           </w:p>
         </w:tc>
         <w:tc>
           <w:tcPr>
-            <w:tcW w:type="dxa" w:w="3969"/>
+            <w:tcW w:type="dxa" w:w="4309"/>
           </w:tcPr>
           <w:p>
             <w:pPr>
@@ -223,9 +181,9 @@
             </w:pPr>
             <w:r>
               <w:rPr>
-                <w:sz w:val="18"/>
+                <w:sz w:val="19"/>
               </w:rPr>
-              <w:t>Supplies driving power.</w:t>
+              <w:t>Reduces drive motor speed and transmits torque to the drive sheave.</w:t>
             </w:r>
           </w:p>
         </w:tc>
@@ -236,7 +194,7 @@
         </w:trPr>
         <w:tc>
           <w:tcPr>
-            <w:tcW w:type="dxa" w:w="3685"/>
+            <w:tcW w:type="dxa" w:w="3175"/>
           </w:tcPr>
           <w:p>
             <w:pPr>
@@ -244,17 +202,17 @@
             </w:pPr>
             <w:r>
               <w:rPr>
-                <w:sz w:val="18"/>
+                <w:sz w:val="19"/>
               </w:rPr>
-              <w:t>T3 制动器</w:t>
+              <w:t>曳引轮</w:t>
               <w:br/>
-              <w:t>Brake</w:t>
+              <w:t>Drive sheave</w:t>
             </w:r>
           </w:p>
         </w:tc>
         <w:tc>
           <w:tcPr>
-            <w:tcW w:type="dxa" w:w="2551"/>
+            <w:tcW w:type="dxa" w:w="2835"/>
           </w:tcPr>
           <w:p>
             <w:pPr>
@@ -262,15 +220,15 @@
             </w:pPr>
             <w:r>
               <w:rPr>
-                <w:sz w:val="18"/>
+                <w:sz w:val="19"/>
               </w:rPr>
-              <w:t>停止并保持驱动系统；弹簧施闸、电力释放。</w:t>
+              <w:t>通过与悬吊绳之间的摩擦传递驱动力。</w:t>
             </w:r>
           </w:p>
         </w:tc>
         <w:tc>
           <w:tcPr>
-            <w:tcW w:type="dxa" w:w="3969"/>
+            <w:tcW w:type="dxa" w:w="4309"/>
           </w:tcPr>
           <w:p>
             <w:pPr>
@@ -278,9 +236,9 @@
             </w:pPr>
             <w:r>
               <w:rPr>
-                <w:sz w:val="18"/>
+                <w:sz w:val="19"/>
               </w:rPr>
-              <w:t>Stops and holds the drive; spring-applied and electrically released.</w:t>
+              <w:t>Transmits driving force through friction with the suspension rope.</w:t>
             </w:r>
           </w:p>
         </w:tc>
@@ -291,7 +249,7 @@
         </w:trPr>
         <w:tc>
           <w:tcPr>
-            <w:tcW w:type="dxa" w:w="3685"/>
+            <w:tcW w:type="dxa" w:w="3175"/>
           </w:tcPr>
           <w:p>
             <w:pPr>
@@ -299,17 +257,17 @@
             </w:pPr>
             <w:r>
               <w:rPr>
-                <w:sz w:val="18"/>
+                <w:sz w:val="19"/>
               </w:rPr>
-              <w:t>T4 齿轮箱</w:t>
+              <w:t>悬吊绳</w:t>
               <w:br/>
-              <w:t>Gear box</w:t>
+              <w:t>Suspension rope</w:t>
             </w:r>
           </w:p>
         </w:tc>
         <w:tc>
           <w:tcPr>
-            <w:tcW w:type="dxa" w:w="2551"/>
+            <w:tcW w:type="dxa" w:w="2835"/>
           </w:tcPr>
           <w:p>
             <w:pPr>
@@ -317,15 +275,15 @@
             </w:pPr>
             <w:r>
               <w:rPr>
-                <w:sz w:val="18"/>
+                <w:sz w:val="19"/>
               </w:rPr>
-              <w:t>降低转速并传递转矩至曳引轮。</w:t>
+              <w:t>连接并悬吊轿厢和对重，使两者反向移动。</w:t>
             </w:r>
           </w:p>
         </w:tc>
         <w:tc>
           <w:tcPr>
-            <w:tcW w:type="dxa" w:w="3969"/>
+            <w:tcW w:type="dxa" w:w="4309"/>
           </w:tcPr>
           <w:p>
             <w:pPr>
@@ -333,9 +291,9 @@
             </w:pPr>
             <w:r>
               <w:rPr>
-                <w:sz w:val="18"/>
+                <w:sz w:val="19"/>
               </w:rPr>
-              <w:t>Reduces speed and transmits torque to the drive sheave.</w:t>
+              <w:t>Connects and suspends the car and counterweight so that they move in opposite directions.</w:t>
             </w:r>
           </w:p>
         </w:tc>
@@ -346,7 +304,7 @@
         </w:trPr>
         <w:tc>
           <w:tcPr>
-            <w:tcW w:type="dxa" w:w="3685"/>
+            <w:tcW w:type="dxa" w:w="3175"/>
           </w:tcPr>
           <w:p>
             <w:pPr>
@@ -354,17 +312,17 @@
             </w:pPr>
             <w:r>
               <w:rPr>
-                <w:sz w:val="18"/>
+                <w:sz w:val="19"/>
               </w:rPr>
-              <w:t>T5 曳引轮</w:t>
+              <w:t>轿厢</w:t>
               <w:br/>
-              <w:t>Drive sheave</w:t>
+              <w:t>Car</w:t>
             </w:r>
           </w:p>
         </w:tc>
         <w:tc>
           <w:tcPr>
-            <w:tcW w:type="dxa" w:w="2551"/>
+            <w:tcW w:type="dxa" w:w="2835"/>
           </w:tcPr>
           <w:p>
             <w:pPr>
@@ -372,15 +330,15 @@
             </w:pPr>
             <w:r>
               <w:rPr>
-                <w:sz w:val="18"/>
+                <w:sz w:val="19"/>
               </w:rPr>
-              <w:t>通过与悬吊绳的摩擦传递驱动力。</w:t>
+              <w:t>承载乘客或货物。</w:t>
             </w:r>
           </w:p>
         </w:tc>
         <w:tc>
           <w:tcPr>
-            <w:tcW w:type="dxa" w:w="3969"/>
+            <w:tcW w:type="dxa" w:w="4309"/>
           </w:tcPr>
           <w:p>
             <w:pPr>
@@ -388,117 +346,7 @@
             </w:pPr>
             <w:r>
               <w:rPr>
-                <w:sz w:val="18"/>
-              </w:rPr>
-              <w:t>Transmits driving force by friction with the suspension rope.</w:t>
-            </w:r>
-          </w:p>
-        </w:tc>
-      </w:tr>
-      <w:tr>
-        <w:trPr>
-          <w:cantSplit/>
-        </w:trPr>
-        <w:tc>
-          <w:tcPr>
-            <w:tcW w:type="dxa" w:w="3685"/>
-          </w:tcPr>
-          <w:p>
-            <w:pPr>
-              <w:spacing w:before="40" w:after="60" w:line="252" w:lineRule="auto"/>
-            </w:pPr>
-            <w:r>
-              <w:rPr>
-                <w:sz w:val="18"/>
-              </w:rPr>
-              <w:t>T6 悬吊绳</w:t>
-              <w:br/>
-              <w:t>Suspension rope</w:t>
-            </w:r>
-          </w:p>
-        </w:tc>
-        <w:tc>
-          <w:tcPr>
-            <w:tcW w:type="dxa" w:w="2551"/>
-          </w:tcPr>
-          <w:p>
-            <w:pPr>
-              <w:spacing w:before="40" w:after="60" w:line="252" w:lineRule="auto"/>
-            </w:pPr>
-            <w:r>
-              <w:rPr>
-                <w:sz w:val="18"/>
-              </w:rPr>
-              <w:t>悬吊轿厢和对重。</w:t>
-            </w:r>
-          </w:p>
-        </w:tc>
-        <w:tc>
-          <w:tcPr>
-            <w:tcW w:type="dxa" w:w="3969"/>
-          </w:tcPr>
-          <w:p>
-            <w:pPr>
-              <w:spacing w:before="40" w:after="60" w:line="252" w:lineRule="auto"/>
-            </w:pPr>
-            <w:r>
-              <w:rPr>
-                <w:sz w:val="18"/>
-              </w:rPr>
-              <w:t>Suspends the car and counterweight.</w:t>
-            </w:r>
-          </w:p>
-        </w:tc>
-      </w:tr>
-      <w:tr>
-        <w:trPr>
-          <w:cantSplit/>
-        </w:trPr>
-        <w:tc>
-          <w:tcPr>
-            <w:tcW w:type="dxa" w:w="3685"/>
-          </w:tcPr>
-          <w:p>
-            <w:pPr>
-              <w:spacing w:before="40" w:after="60" w:line="252" w:lineRule="auto"/>
-            </w:pPr>
-            <w:r>
-              <w:rPr>
-                <w:sz w:val="18"/>
-              </w:rPr>
-              <w:t>T7 轿厢</w:t>
-              <w:br/>
-              <w:t>Car</w:t>
-            </w:r>
-          </w:p>
-        </w:tc>
-        <w:tc>
-          <w:tcPr>
-            <w:tcW w:type="dxa" w:w="2551"/>
-          </w:tcPr>
-          <w:p>
-            <w:pPr>
-              <w:spacing w:before="40" w:after="60" w:line="252" w:lineRule="auto"/>
-            </w:pPr>
-            <w:r>
-              <w:rPr>
-                <w:sz w:val="18"/>
-              </w:rPr>
-              <w:t>承载乘客或货物。</w:t>
-            </w:r>
-          </w:p>
-        </w:tc>
-        <w:tc>
-          <w:tcPr>
-            <w:tcW w:type="dxa" w:w="3969"/>
-          </w:tcPr>
-          <w:p>
-            <w:pPr>
-              <w:spacing w:before="40" w:after="60" w:line="252" w:lineRule="auto"/>
-            </w:pPr>
-            <w:r>
-              <w:rPr>
-                <w:sz w:val="18"/>
+                <w:sz w:val="19"/>
               </w:rPr>
               <w:t>Carries passengers or goods.</w:t>
             </w:r>
@@ -511,7 +359,7 @@
         </w:trPr>
         <w:tc>
           <w:tcPr>
-            <w:tcW w:type="dxa" w:w="3685"/>
+            <w:tcW w:type="dxa" w:w="3175"/>
           </w:tcPr>
           <w:p>
             <w:pPr>
@@ -519,9 +367,9 @@
             </w:pPr>
             <w:r>
               <w:rPr>
-                <w:sz w:val="18"/>
+                <w:sz w:val="19"/>
               </w:rPr>
-              <w:t>T8 对重</w:t>
+              <w:t>对重</w:t>
               <w:br/>
               <w:t>Counterweight</w:t>
             </w:r>
@@ -529,7 +377,7 @@
         </w:tc>
         <w:tc>
           <w:tcPr>
-            <w:tcW w:type="dxa" w:w="2551"/>
+            <w:tcW w:type="dxa" w:w="2835"/>
           </w:tcPr>
           <w:p>
             <w:pPr>
@@ -537,15 +385,15 @@
             </w:pPr>
             <w:r>
               <w:rPr>
-                <w:sz w:val="18"/>
+                <w:sz w:val="19"/>
               </w:rPr>
-              <w:t>平衡部分重量，减少不平衡负载。</w:t>
+              <w:t>平衡轿厢及部分载荷重量，减少驱动电动机需要克服的不平衡负载。</w:t>
             </w:r>
           </w:p>
         </w:tc>
         <w:tc>
           <w:tcPr>
-            <w:tcW w:type="dxa" w:w="3969"/>
+            <w:tcW w:type="dxa" w:w="4309"/>
           </w:tcPr>
           <w:p>
             <w:pPr>
@@ -553,9 +401,9 @@
             </w:pPr>
             <w:r>
               <w:rPr>
-                <w:sz w:val="18"/>
+                <w:sz w:val="19"/>
               </w:rPr>
-              <w:t>Balances part of the load to reduce the unbalanced load.</w:t>
+              <w:t>Balances the car and part of its load, reducing the unbalanced load that the drive motor must overcome.</w:t>
             </w:r>
           </w:p>
         </w:tc>
@@ -566,7 +414,7 @@
         </w:trPr>
         <w:tc>
           <w:tcPr>
-            <w:tcW w:type="dxa" w:w="3685"/>
+            <w:tcW w:type="dxa" w:w="3175"/>
           </w:tcPr>
           <w:p>
             <w:pPr>
@@ -574,9 +422,9 @@
             </w:pPr>
             <w:r>
               <w:rPr>
-                <w:sz w:val="18"/>
+                <w:sz w:val="19"/>
               </w:rPr>
-              <w:t>T9 轿厢导轨</w:t>
+              <w:t>轿厢导轨</w:t>
               <w:br/>
               <w:t>Car guide rail</w:t>
             </w:r>
@@ -584,7 +432,7 @@
         </w:tc>
         <w:tc>
           <w:tcPr>
-            <w:tcW w:type="dxa" w:w="2551"/>
+            <w:tcW w:type="dxa" w:w="2835"/>
           </w:tcPr>
           <w:p>
             <w:pPr>
@@ -592,15 +440,15 @@
             </w:pPr>
             <w:r>
               <w:rPr>
-                <w:sz w:val="18"/>
+                <w:sz w:val="19"/>
               </w:rPr>
-              <w:t>引导轿厢垂直运行。</w:t>
+              <w:t>引导轿厢沿垂直路径运行，并供安全钳作用。</w:t>
             </w:r>
           </w:p>
         </w:tc>
         <w:tc>
           <w:tcPr>
-            <w:tcW w:type="dxa" w:w="3969"/>
+            <w:tcW w:type="dxa" w:w="4309"/>
           </w:tcPr>
           <w:p>
             <w:pPr>
@@ -608,9 +456,9 @@
             </w:pPr>
             <w:r>
               <w:rPr>
-                <w:sz w:val="18"/>
+                <w:sz w:val="19"/>
               </w:rPr>
-              <w:t>Guides the car vertically.</w:t>
+              <w:t>Guides the car vertically and provides the surface on which the safety gear acts.</w:t>
             </w:r>
           </w:p>
         </w:tc>
@@ -621,7 +469,7 @@
         </w:trPr>
         <w:tc>
           <w:tcPr>
-            <w:tcW w:type="dxa" w:w="3685"/>
+            <w:tcW w:type="dxa" w:w="3175"/>
           </w:tcPr>
           <w:p>
             <w:pPr>
@@ -629,9 +477,9 @@
             </w:pPr>
             <w:r>
               <w:rPr>
-                <w:sz w:val="18"/>
+                <w:sz w:val="19"/>
               </w:rPr>
-              <w:t>T10 对重导轨</w:t>
+              <w:t>对重导轨</w:t>
               <w:br/>
               <w:t>Counterweight guide rail</w:t>
             </w:r>
@@ -639,7 +487,7 @@
         </w:tc>
         <w:tc>
           <w:tcPr>
-            <w:tcW w:type="dxa" w:w="2551"/>
+            <w:tcW w:type="dxa" w:w="2835"/>
           </w:tcPr>
           <w:p>
             <w:pPr>
@@ -647,15 +495,15 @@
             </w:pPr>
             <w:r>
               <w:rPr>
-                <w:sz w:val="18"/>
+                <w:sz w:val="19"/>
               </w:rPr>
-              <w:t>引导对重垂直运行。</w:t>
+              <w:t>引导对重沿垂直路径运行。</w:t>
             </w:r>
           </w:p>
         </w:tc>
         <w:tc>
           <w:tcPr>
-            <w:tcW w:type="dxa" w:w="3969"/>
+            <w:tcW w:type="dxa" w:w="4309"/>
           </w:tcPr>
           <w:p>
             <w:pPr>
@@ -663,7 +511,7 @@
             </w:pPr>
             <w:r>
               <w:rPr>
-                <w:sz w:val="18"/>
+                <w:sz w:val="19"/>
               </w:rPr>
               <w:t>Guides the counterweight vertically.</w:t>
             </w:r>
@@ -676,7 +524,7 @@
         </w:trPr>
         <w:tc>
           <w:tcPr>
-            <w:tcW w:type="dxa" w:w="3685"/>
+            <w:tcW w:type="dxa" w:w="3175"/>
           </w:tcPr>
           <w:p>
             <w:pPr>
@@ -684,17 +532,17 @@
             </w:pPr>
             <w:r>
               <w:rPr>
-                <w:sz w:val="18"/>
+                <w:sz w:val="19"/>
               </w:rPr>
-              <w:t>T11 门机</w:t>
+              <w:t>制动器</w:t>
               <w:br/>
-              <w:t>Door operator</w:t>
+              <w:t>Brake</w:t>
             </w:r>
           </w:p>
         </w:tc>
         <w:tc>
           <w:tcPr>
-            <w:tcW w:type="dxa" w:w="2551"/>
+            <w:tcW w:type="dxa" w:w="2835"/>
           </w:tcPr>
           <w:p>
             <w:pPr>
@@ -702,15 +550,15 @@
             </w:pPr>
             <w:r>
               <w:rPr>
-                <w:sz w:val="18"/>
+                <w:sz w:val="19"/>
               </w:rPr>
-              <w:t>驱动轿门开关。</w:t>
+              <w:t>停止并保持驱动系统。采用弹簧施闸、电力释放的安排。</w:t>
             </w:r>
           </w:p>
         </w:tc>
         <w:tc>
           <w:tcPr>
-            <w:tcW w:type="dxa" w:w="3969"/>
+            <w:tcW w:type="dxa" w:w="4309"/>
           </w:tcPr>
           <w:p>
             <w:pPr>
@@ -718,9 +566,9 @@
             </w:pPr>
             <w:r>
               <w:rPr>
-                <w:sz w:val="18"/>
+                <w:sz w:val="19"/>
               </w:rPr>
-              <w:t>Operates the car doors.</w:t>
+              <w:t>Stops and holds the drive system. It is spring-applied and electrically released.</w:t>
             </w:r>
           </w:p>
         </w:tc>
@@ -731,7 +579,7 @@
         </w:trPr>
         <w:tc>
           <w:tcPr>
-            <w:tcW w:type="dxa" w:w="3685"/>
+            <w:tcW w:type="dxa" w:w="3175"/>
           </w:tcPr>
           <w:p>
             <w:pPr>
@@ -739,17 +587,17 @@
             </w:pPr>
             <w:r>
               <w:rPr>
-                <w:sz w:val="18"/>
+                <w:sz w:val="19"/>
               </w:rPr>
-              <w:t>T12 轿门</w:t>
+              <w:t>控制器</w:t>
               <w:br/>
-              <w:t>Car doors</w:t>
+              <w:t>Controller</w:t>
             </w:r>
           </w:p>
         </w:tc>
         <w:tc>
           <w:tcPr>
-            <w:tcW w:type="dxa" w:w="2551"/>
+            <w:tcW w:type="dxa" w:w="2835"/>
           </w:tcPr>
           <w:p>
             <w:pPr>
@@ -757,15 +605,15 @@
             </w:pPr>
             <w:r>
               <w:rPr>
-                <w:sz w:val="18"/>
+                <w:sz w:val="19"/>
               </w:rPr>
-              <w:t>控制轿厢入口。</w:t>
+              <w:t>协调运行方向、速度、减速、平层、停车及开关门。</w:t>
             </w:r>
           </w:p>
         </w:tc>
         <w:tc>
           <w:tcPr>
-            <w:tcW w:type="dxa" w:w="3969"/>
+            <w:tcW w:type="dxa" w:w="4309"/>
           </w:tcPr>
           <w:p>
             <w:pPr>
@@ -773,9 +621,64 @@
             </w:pPr>
             <w:r>
               <w:rPr>
-                <w:sz w:val="18"/>
+                <w:sz w:val="19"/>
               </w:rPr>
-              <w:t>Control access to the car.</w:t>
+              <w:t>Coordinates direction, speed, deceleration, levelling, stopping and door operation.</w:t>
+            </w:r>
+          </w:p>
+        </w:tc>
+      </w:tr>
+      <w:tr>
+        <w:trPr>
+          <w:cantSplit/>
+        </w:trPr>
+        <w:tc>
+          <w:tcPr>
+            <w:tcW w:type="dxa" w:w="3175"/>
+          </w:tcPr>
+          <w:p>
+            <w:pPr>
+              <w:spacing w:before="40" w:after="60" w:line="252" w:lineRule="auto"/>
+            </w:pPr>
+            <w:r>
+              <w:rPr>
+                <w:sz w:val="19"/>
+              </w:rPr>
+              <w:t>门机</w:t>
+              <w:br/>
+              <w:t>Door operator</w:t>
+            </w:r>
+          </w:p>
+        </w:tc>
+        <w:tc>
+          <w:tcPr>
+            <w:tcW w:type="dxa" w:w="2835"/>
+          </w:tcPr>
+          <w:p>
+            <w:pPr>
+              <w:spacing w:before="40" w:after="60" w:line="252" w:lineRule="auto"/>
+            </w:pPr>
+            <w:r>
+              <w:rPr>
+                <w:sz w:val="19"/>
+              </w:rPr>
+              <w:t>驱动轿门开启和关闭。</w:t>
+            </w:r>
+          </w:p>
+        </w:tc>
+        <w:tc>
+          <w:tcPr>
+            <w:tcW w:type="dxa" w:w="4309"/>
+          </w:tcPr>
+          <w:p>
+            <w:pPr>
+              <w:spacing w:before="40" w:after="60" w:line="252" w:lineRule="auto"/>
+            </w:pPr>
+            <w:r>
+              <w:rPr>
+                <w:sz w:val="19"/>
+              </w:rPr>
+              <w:t>Opens and closes the car doors.</w:t>
             </w:r>
           </w:p>
         </w:tc>
@@ -791,7 +694,7 @@
         <w:pStyle w:val="Heading1"/>
       </w:pPr>
       <w:r>
-        <w:t>1.1 部件及功能 / Components and functions (2/3)</w:t>
+        <w:t>1.1 主要部件及功能（续） / Major components (continued)</w:t>
       </w:r>
     </w:p>
     <w:tbl>
@@ -802,9 +705,9 @@
         <w:tblLook w:firstColumn="1" w:firstRow="1" w:lastColumn="0" w:lastRow="0" w:noHBand="0" w:noVBand="1" w:val="04A0"/>
       </w:tblPr>
       <w:tblGrid>
-        <w:gridCol w:w="3402"/>
-        <w:gridCol w:w="3402"/>
-        <w:gridCol w:w="3402"/>
+        <w:gridCol w:w="3175"/>
+        <w:gridCol w:w="2835"/>
+        <w:gridCol w:w="4309"/>
       </w:tblGrid>
       <w:tr>
         <w:trPr>
@@ -812,19 +715,19 @@
         </w:trPr>
         <w:tc>
           <w:tcPr>
-            <w:tcW w:type="dxa" w:w="3685"/>
-            <w:shd w:fill="E7EDF2"/>
+            <w:tcW w:type="dxa" w:w="3175"/>
+            <w:shd w:fill="E5EDF3"/>
           </w:tcPr>
           <w:p>
             <w:r>
-              <w:t>编号及部件 / Component</w:t>
+              <w:t>主要部件 / Major component</w:t>
             </w:r>
           </w:p>
         </w:tc>
         <w:tc>
           <w:tcPr>
-            <w:tcW w:type="dxa" w:w="2551"/>
-            <w:shd w:fill="E7EDF2"/>
+            <w:tcW w:type="dxa" w:w="2835"/>
+            <w:shd w:fill="E5EDF3"/>
           </w:tcPr>
           <w:p>
             <w:r>
@@ -834,8 +737,8 @@
         </w:tc>
         <w:tc>
           <w:tcPr>
-            <w:tcW w:type="dxa" w:w="3969"/>
-            <w:shd w:fill="E7EDF2"/>
+            <w:tcW w:type="dxa" w:w="4309"/>
+            <w:shd w:fill="E5EDF3"/>
           </w:tcPr>
           <w:p>
             <w:r>
@@ -850,7 +753,7 @@
         </w:trPr>
         <w:tc>
           <w:tcPr>
-            <w:tcW w:type="dxa" w:w="3685"/>
+            <w:tcW w:type="dxa" w:w="3175"/>
           </w:tcPr>
           <w:p>
             <w:pPr>
@@ -858,9 +761,64 @@
             </w:pPr>
             <w:r>
               <w:rPr>
-                <w:sz w:val="18"/>
+                <w:sz w:val="19"/>
               </w:rPr>
-              <w:t>T13 层门</w:t>
+              <w:t>轿门</w:t>
+              <w:br/>
+              <w:t>Car doors</w:t>
+            </w:r>
+          </w:p>
+        </w:tc>
+        <w:tc>
+          <w:tcPr>
+            <w:tcW w:type="dxa" w:w="2835"/>
+          </w:tcPr>
+          <w:p>
+            <w:pPr>
+              <w:spacing w:before="40" w:after="60" w:line="252" w:lineRule="auto"/>
+            </w:pPr>
+            <w:r>
+              <w:rPr>
+                <w:sz w:val="19"/>
+              </w:rPr>
+              <w:t>关闭轿厢入口，保障运行期间的乘客安全。</w:t>
+            </w:r>
+          </w:p>
+        </w:tc>
+        <w:tc>
+          <w:tcPr>
+            <w:tcW w:type="dxa" w:w="4309"/>
+          </w:tcPr>
+          <w:p>
+            <w:pPr>
+              <w:spacing w:before="40" w:after="60" w:line="252" w:lineRule="auto"/>
+            </w:pPr>
+            <w:r>
+              <w:rPr>
+                <w:sz w:val="19"/>
+              </w:rPr>
+              <w:t>Close the car entrance to protect passengers during travel.</w:t>
+            </w:r>
+          </w:p>
+        </w:tc>
+      </w:tr>
+      <w:tr>
+        <w:trPr>
+          <w:cantSplit/>
+        </w:trPr>
+        <w:tc>
+          <w:tcPr>
+            <w:tcW w:type="dxa" w:w="3175"/>
+          </w:tcPr>
+          <w:p>
+            <w:pPr>
+              <w:spacing w:before="40" w:after="60" w:line="252" w:lineRule="auto"/>
+            </w:pPr>
+            <w:r>
+              <w:rPr>
+                <w:sz w:val="19"/>
+              </w:rPr>
+              <w:t>层门</w:t>
               <w:br/>
               <w:t>Landing doors</w:t>
             </w:r>
@@ -868,7 +826,7 @@
         </w:tc>
         <w:tc>
           <w:tcPr>
-            <w:tcW w:type="dxa" w:w="2551"/>
+            <w:tcW w:type="dxa" w:w="2835"/>
           </w:tcPr>
           <w:p>
             <w:pPr>
@@ -876,15 +834,15 @@
             </w:pPr>
             <w:r>
               <w:rPr>
-                <w:sz w:val="18"/>
+                <w:sz w:val="19"/>
               </w:rPr>
-              <w:t>关闭各楼层的井道入口。</w:t>
+              <w:t>关闭各楼层通向井道的入口。</w:t>
             </w:r>
           </w:p>
         </w:tc>
         <w:tc>
           <w:tcPr>
-            <w:tcW w:type="dxa" w:w="3969"/>
+            <w:tcW w:type="dxa" w:w="4309"/>
           </w:tcPr>
           <w:p>
             <w:pPr>
@@ -892,7 +850,7 @@
             </w:pPr>
             <w:r>
               <w:rPr>
-                <w:sz w:val="18"/>
+                <w:sz w:val="19"/>
               </w:rPr>
               <w:t>Close the well entrance at each landing.</w:t>
             </w:r>
@@ -905,7 +863,7 @@
         </w:trPr>
         <w:tc>
           <w:tcPr>
-            <w:tcW w:type="dxa" w:w="3685"/>
+            <w:tcW w:type="dxa" w:w="3175"/>
           </w:tcPr>
           <w:p>
             <w:pPr>
@@ -913,17 +871,17 @@
             </w:pPr>
             <w:r>
               <w:rPr>
-                <w:sz w:val="18"/>
+                <w:sz w:val="19"/>
               </w:rPr>
-              <w:t>T14 层站按钮</w:t>
+              <w:t>层门联锁</w:t>
               <w:br/>
-              <w:t>Landing pushbutton</w:t>
+              <w:t>Landing door interlock</w:t>
             </w:r>
           </w:p>
         </w:tc>
         <w:tc>
           <w:tcPr>
-            <w:tcW w:type="dxa" w:w="2551"/>
+            <w:tcW w:type="dxa" w:w="2835"/>
           </w:tcPr>
           <w:p>
             <w:pPr>
@@ -931,15 +889,15 @@
             </w:pPr>
             <w:r>
               <w:rPr>
-                <w:sz w:val="18"/>
+                <w:sz w:val="19"/>
               </w:rPr>
-              <w:t>发出召梯指令。</w:t>
+              <w:t>层门未正确关闭并锁紧时，阻止升降机正常运行。</w:t>
             </w:r>
           </w:p>
         </w:tc>
         <w:tc>
           <w:tcPr>
-            <w:tcW w:type="dxa" w:w="3969"/>
+            <w:tcW w:type="dxa" w:w="4309"/>
           </w:tcPr>
           <w:p>
             <w:pPr>
@@ -947,9 +905,9 @@
             </w:pPr>
             <w:r>
               <w:rPr>
-                <w:sz w:val="18"/>
+                <w:sz w:val="19"/>
               </w:rPr>
-              <w:t>Registers a landing call.</w:t>
+              <w:t>Prevents normal travel unless the landing doors are properly closed and locked.</w:t>
             </w:r>
           </w:p>
         </w:tc>
@@ -960,7 +918,7 @@
         </w:trPr>
         <w:tc>
           <w:tcPr>
-            <w:tcW w:type="dxa" w:w="3685"/>
+            <w:tcW w:type="dxa" w:w="3175"/>
           </w:tcPr>
           <w:p>
             <w:pPr>
@@ -968,17 +926,17 @@
             </w:pPr>
             <w:r>
               <w:rPr>
-                <w:sz w:val="18"/>
+                <w:sz w:val="19"/>
               </w:rPr>
-              <w:t>T15 层站指示器</w:t>
+              <w:t>层门接近传感器</w:t>
               <w:br/>
-              <w:t>Landing indicator</w:t>
+              <w:t>Landing door proximity sensor</w:t>
             </w:r>
           </w:p>
         </w:tc>
         <w:tc>
           <w:tcPr>
-            <w:tcW w:type="dxa" w:w="2551"/>
+            <w:tcW w:type="dxa" w:w="2835"/>
           </w:tcPr>
           <w:p>
             <w:pPr>
@@ -986,15 +944,15 @@
             </w:pPr>
             <w:r>
               <w:rPr>
-                <w:sz w:val="18"/>
+                <w:sz w:val="19"/>
               </w:rPr>
-              <w:t>显示升降机的运行信息。</w:t>
+              <w:t>关门期间检测到乘客进入时，使门重新打开。</w:t>
             </w:r>
           </w:p>
         </w:tc>
         <w:tc>
           <w:tcPr>
-            <w:tcW w:type="dxa" w:w="3969"/>
+            <w:tcW w:type="dxa" w:w="4309"/>
           </w:tcPr>
           <w:p>
             <w:pPr>
@@ -1002,9 +960,9 @@
             </w:pPr>
             <w:r>
               <w:rPr>
-                <w:sz w:val="18"/>
+                <w:sz w:val="19"/>
               </w:rPr>
-              <w:t>Displays lift operating information.</w:t>
+              <w:t>Causes closing doors to reopen when a person enters.</w:t>
             </w:r>
           </w:p>
         </w:tc>
@@ -1015,7 +973,7 @@
         </w:trPr>
         <w:tc>
           <w:tcPr>
-            <w:tcW w:type="dxa" w:w="3685"/>
+            <w:tcW w:type="dxa" w:w="3175"/>
           </w:tcPr>
           <w:p>
             <w:pPr>
@@ -1023,17 +981,17 @@
             </w:pPr>
             <w:r>
               <w:rPr>
-                <w:sz w:val="18"/>
+                <w:sz w:val="19"/>
               </w:rPr>
-              <w:t>T16 护脚板</w:t>
+              <w:t>限速器</w:t>
               <w:br/>
-              <w:t>Apron</w:t>
+              <w:t>Overspeed governor</w:t>
             </w:r>
           </w:p>
         </w:tc>
         <w:tc>
           <w:tcPr>
-            <w:tcW w:type="dxa" w:w="2551"/>
+            <w:tcW w:type="dxa" w:w="2835"/>
           </w:tcPr>
           <w:p>
             <w:pPr>
@@ -1041,15 +999,15 @@
             </w:pPr>
             <w:r>
               <w:rPr>
-                <w:sz w:val="18"/>
+                <w:sz w:val="19"/>
               </w:rPr>
-              <w:t>遮护轿厢入口下方的间隙。</w:t>
+              <w:t>达到预定超速值时触发安全停止，并在需要时使安全钳动作。</w:t>
             </w:r>
           </w:p>
         </w:tc>
         <w:tc>
           <w:tcPr>
-            <w:tcW w:type="dxa" w:w="3969"/>
+            <w:tcW w:type="dxa" w:w="4309"/>
           </w:tcPr>
           <w:p>
             <w:pPr>
@@ -1057,9 +1015,9 @@
             </w:pPr>
             <w:r>
               <w:rPr>
-                <w:sz w:val="18"/>
+                <w:sz w:val="19"/>
               </w:rPr>
-              <w:t>Guards the gap below the car entrance.</w:t>
+              <w:t>Initiates safety stopping at a predetermined overspeed and applies the safety gear when necessary.</w:t>
             </w:r>
           </w:p>
         </w:tc>
@@ -1070,7 +1028,7 @@
         </w:trPr>
         <w:tc>
           <w:tcPr>
-            <w:tcW w:type="dxa" w:w="3685"/>
+            <w:tcW w:type="dxa" w:w="3175"/>
           </w:tcPr>
           <w:p>
             <w:pPr>
@@ -1078,17 +1036,17 @@
             </w:pPr>
             <w:r>
               <w:rPr>
-                <w:sz w:val="18"/>
+                <w:sz w:val="19"/>
               </w:rPr>
-              <w:t>T17 井道</w:t>
+              <w:t>安全钳</w:t>
               <w:br/>
-              <w:t>Lift well</w:t>
+              <w:t>Safety gear</w:t>
             </w:r>
           </w:p>
         </w:tc>
         <w:tc>
           <w:tcPr>
-            <w:tcW w:type="dxa" w:w="2551"/>
+            <w:tcW w:type="dxa" w:w="2835"/>
           </w:tcPr>
           <w:p>
             <w:pPr>
@@ -1096,15 +1054,15 @@
             </w:pPr>
             <w:r>
               <w:rPr>
-                <w:sz w:val="18"/>
+                <w:sz w:val="19"/>
               </w:rPr>
-              <w:t>容纳轿厢及对重的运行空间。</w:t>
+              <w:t>向下超速或悬吊失效等情况下，作用于轿厢导轨，停止并保持轿厢。</w:t>
             </w:r>
           </w:p>
         </w:tc>
         <w:tc>
           <w:tcPr>
-            <w:tcW w:type="dxa" w:w="3969"/>
+            <w:tcW w:type="dxa" w:w="4309"/>
           </w:tcPr>
           <w:p>
             <w:pPr>
@@ -1112,9 +1070,9 @@
             </w:pPr>
             <w:r>
               <w:rPr>
-                <w:sz w:val="18"/>
+                <w:sz w:val="19"/>
               </w:rPr>
-              <w:t>Encloses the travel space of the car and counterweight.</w:t>
+              <w:t>Acts on the car guide rail to stop and hold the car during downward overspeed or suspension failure.</w:t>
             </w:r>
           </w:p>
         </w:tc>
@@ -1125,7 +1083,7 @@
         </w:trPr>
         <w:tc>
           <w:tcPr>
-            <w:tcW w:type="dxa" w:w="3685"/>
+            <w:tcW w:type="dxa" w:w="3175"/>
           </w:tcPr>
           <w:p>
             <w:pPr>
@@ -1133,17 +1091,17 @@
             </w:pPr>
             <w:r>
               <w:rPr>
-                <w:sz w:val="18"/>
+                <w:sz w:val="19"/>
               </w:rPr>
-              <w:t>T18 随行电缆</w:t>
+              <w:t>限速器张紧轮</w:t>
               <w:br/>
-              <w:t>Travelling cables</w:t>
+              <w:t>Governor tension sheave</w:t>
             </w:r>
           </w:p>
         </w:tc>
         <w:tc>
           <w:tcPr>
-            <w:tcW w:type="dxa" w:w="2551"/>
+            <w:tcW w:type="dxa" w:w="2835"/>
           </w:tcPr>
           <w:p>
             <w:pPr>
@@ -1151,15 +1109,15 @@
             </w:pPr>
             <w:r>
               <w:rPr>
-                <w:sz w:val="18"/>
+                <w:sz w:val="19"/>
               </w:rPr>
-              <w:t>连接移动轿厢的电源与信号。</w:t>
+              <w:t>使限速器的绳路保持张紧。</w:t>
             </w:r>
           </w:p>
         </w:tc>
         <w:tc>
           <w:tcPr>
-            <w:tcW w:type="dxa" w:w="3969"/>
+            <w:tcW w:type="dxa" w:w="4309"/>
           </w:tcPr>
           <w:p>
             <w:pPr>
@@ -1167,9 +1125,9 @@
             </w:pPr>
             <w:r>
               <w:rPr>
-                <w:sz w:val="18"/>
+                <w:sz w:val="19"/>
               </w:rPr>
-              <w:t>Carry power and signals to and from the moving car.</w:t>
+              <w:t>Maintains tension in the overspeed governor rope loop.</w:t>
             </w:r>
           </w:p>
         </w:tc>
@@ -1180,7 +1138,7 @@
         </w:trPr>
         <w:tc>
           <w:tcPr>
-            <w:tcW w:type="dxa" w:w="3685"/>
+            <w:tcW w:type="dxa" w:w="3175"/>
           </w:tcPr>
           <w:p>
             <w:pPr>
@@ -1188,9 +1146,9 @@
             </w:pPr>
             <w:r>
               <w:rPr>
-                <w:sz w:val="18"/>
+                <w:sz w:val="19"/>
               </w:rPr>
-              <w:t>T19 限位开关</w:t>
+              <w:t>限位开关</w:t>
               <w:br/>
               <w:t>Limit switches</w:t>
             </w:r>
@@ -1198,7 +1156,7 @@
         </w:tc>
         <w:tc>
           <w:tcPr>
-            <w:tcW w:type="dxa" w:w="2551"/>
+            <w:tcW w:type="dxa" w:w="2835"/>
           </w:tcPr>
           <w:p>
             <w:pPr>
@@ -1206,15 +1164,15 @@
             </w:pPr>
             <w:r>
               <w:rPr>
-                <w:sz w:val="18"/>
+                <w:sz w:val="19"/>
               </w:rPr>
-              <w:t>防止超过允许行程。</w:t>
+              <w:t>在行程端部提供停止保护，防止超过允许行程。</w:t>
             </w:r>
           </w:p>
         </w:tc>
         <w:tc>
           <w:tcPr>
-            <w:tcW w:type="dxa" w:w="3969"/>
+            <w:tcW w:type="dxa" w:w="4309"/>
           </w:tcPr>
           <w:p>
             <w:pPr>
@@ -1222,9 +1180,9 @@
             </w:pPr>
             <w:r>
               <w:rPr>
-                <w:sz w:val="18"/>
+                <w:sz w:val="19"/>
               </w:rPr>
-              <w:t>Prevent travel beyond permitted limits.</w:t>
+              <w:t>Provide stopping protection at the ends of travel to prevent overtravel.</w:t>
             </w:r>
           </w:p>
         </w:tc>
@@ -1235,7 +1193,7 @@
         </w:trPr>
         <w:tc>
           <w:tcPr>
-            <w:tcW w:type="dxa" w:w="3685"/>
+            <w:tcW w:type="dxa" w:w="3175"/>
           </w:tcPr>
           <w:p>
             <w:pPr>
@@ -1243,17 +1201,17 @@
             </w:pPr>
             <w:r>
               <w:rPr>
-                <w:sz w:val="18"/>
+                <w:sz w:val="19"/>
               </w:rPr>
-              <w:t>T20 限速器</w:t>
+              <w:t>轿厢缓冲器</w:t>
               <w:br/>
-              <w:t>Overspeed governor</w:t>
+              <w:t>Car buffer</w:t>
             </w:r>
           </w:p>
         </w:tc>
         <w:tc>
           <w:tcPr>
-            <w:tcW w:type="dxa" w:w="2551"/>
+            <w:tcW w:type="dxa" w:w="2835"/>
           </w:tcPr>
           <w:p>
             <w:pPr>
@@ -1261,15 +1219,15 @@
             </w:pPr>
             <w:r>
               <w:rPr>
-                <w:sz w:val="18"/>
+                <w:sz w:val="19"/>
               </w:rPr>
-              <w:t>检测超速并触发安全停止。</w:t>
+              <w:t>在轿厢底部越程时吸收冲击能量。</w:t>
             </w:r>
           </w:p>
         </w:tc>
         <w:tc>
           <w:tcPr>
-            <w:tcW w:type="dxa" w:w="3969"/>
+            <w:tcW w:type="dxa" w:w="4309"/>
           </w:tcPr>
           <w:p>
             <w:pPr>
@@ -1277,172 +1235,7 @@
             </w:pPr>
             <w:r>
               <w:rPr>
-                <w:sz w:val="18"/>
-              </w:rPr>
-              <w:t>Detects overspeed and initiates safety stopping.</w:t>
-            </w:r>
-          </w:p>
-        </w:tc>
-      </w:tr>
-      <w:tr>
-        <w:trPr>
-          <w:cantSplit/>
-        </w:trPr>
-        <w:tc>
-          <w:tcPr>
-            <w:tcW w:type="dxa" w:w="3685"/>
-          </w:tcPr>
-          <w:p>
-            <w:pPr>
-              <w:spacing w:before="40" w:after="60" w:line="252" w:lineRule="auto"/>
-            </w:pPr>
-            <w:r>
-              <w:rPr>
-                <w:sz w:val="18"/>
-              </w:rPr>
-              <w:t>T21 安全钳</w:t>
-              <w:br/>
-              <w:t>Safety gear</w:t>
-            </w:r>
-          </w:p>
-        </w:tc>
-        <w:tc>
-          <w:tcPr>
-            <w:tcW w:type="dxa" w:w="2551"/>
-          </w:tcPr>
-          <w:p>
-            <w:pPr>
-              <w:spacing w:before="40" w:after="60" w:line="252" w:lineRule="auto"/>
-            </w:pPr>
-            <w:r>
-              <w:rPr>
-                <w:sz w:val="18"/>
-              </w:rPr>
-              <w:t>异常情况下作用于轿厢导轨，使轿厢停止。</w:t>
-            </w:r>
-          </w:p>
-        </w:tc>
-        <w:tc>
-          <w:tcPr>
-            <w:tcW w:type="dxa" w:w="3969"/>
-          </w:tcPr>
-          <w:p>
-            <w:pPr>
-              <w:spacing w:before="40" w:after="60" w:line="252" w:lineRule="auto"/>
-            </w:pPr>
-            <w:r>
-              <w:rPr>
-                <w:sz w:val="18"/>
-              </w:rPr>
-              <w:t>Acts on the car guide rail to stop the car in an emergency.</w:t>
-            </w:r>
-          </w:p>
-        </w:tc>
-      </w:tr>
-      <w:tr>
-        <w:trPr>
-          <w:cantSplit/>
-        </w:trPr>
-        <w:tc>
-          <w:tcPr>
-            <w:tcW w:type="dxa" w:w="3685"/>
-          </w:tcPr>
-          <w:p>
-            <w:pPr>
-              <w:spacing w:before="40" w:after="60" w:line="252" w:lineRule="auto"/>
-            </w:pPr>
-            <w:r>
-              <w:rPr>
-                <w:sz w:val="18"/>
-              </w:rPr>
-              <w:t>T22 限速器张紧轮</w:t>
-              <w:br/>
-              <w:t>Governor tension sheave</w:t>
-            </w:r>
-          </w:p>
-        </w:tc>
-        <w:tc>
-          <w:tcPr>
-            <w:tcW w:type="dxa" w:w="2551"/>
-          </w:tcPr>
-          <w:p>
-            <w:pPr>
-              <w:spacing w:before="40" w:after="60" w:line="252" w:lineRule="auto"/>
-            </w:pPr>
-            <w:r>
-              <w:rPr>
-                <w:sz w:val="18"/>
-              </w:rPr>
-              <w:t>保持限速器绳路张紧。</w:t>
-            </w:r>
-          </w:p>
-        </w:tc>
-        <w:tc>
-          <w:tcPr>
-            <w:tcW w:type="dxa" w:w="3969"/>
-          </w:tcPr>
-          <w:p>
-            <w:pPr>
-              <w:spacing w:before="40" w:after="60" w:line="252" w:lineRule="auto"/>
-            </w:pPr>
-            <w:r>
-              <w:rPr>
-                <w:sz w:val="18"/>
-              </w:rPr>
-              <w:t>Maintains tension in the governor rope loop.</w:t>
-            </w:r>
-          </w:p>
-        </w:tc>
-      </w:tr>
-      <w:tr>
-        <w:trPr>
-          <w:cantSplit/>
-        </w:trPr>
-        <w:tc>
-          <w:tcPr>
-            <w:tcW w:type="dxa" w:w="3685"/>
-          </w:tcPr>
-          <w:p>
-            <w:pPr>
-              <w:spacing w:before="40" w:after="60" w:line="252" w:lineRule="auto"/>
-            </w:pPr>
-            <w:r>
-              <w:rPr>
-                <w:sz w:val="18"/>
-              </w:rPr>
-              <w:t>T23 轿厢缓冲器</w:t>
-              <w:br/>
-              <w:t>Car buffer</w:t>
-            </w:r>
-          </w:p>
-        </w:tc>
-        <w:tc>
-          <w:tcPr>
-            <w:tcW w:type="dxa" w:w="2551"/>
-          </w:tcPr>
-          <w:p>
-            <w:pPr>
-              <w:spacing w:before="40" w:after="60" w:line="252" w:lineRule="auto"/>
-            </w:pPr>
-            <w:r>
-              <w:rPr>
-                <w:sz w:val="18"/>
-              </w:rPr>
-              <w:t>吸收轿厢底部越程冲击能量。</w:t>
-            </w:r>
-          </w:p>
-        </w:tc>
-        <w:tc>
-          <w:tcPr>
-            <w:tcW w:type="dxa" w:w="3969"/>
-          </w:tcPr>
-          <w:p>
-            <w:pPr>
-              <w:spacing w:before="40" w:after="60" w:line="252" w:lineRule="auto"/>
-            </w:pPr>
-            <w:r>
-              <w:rPr>
-                <w:sz w:val="18"/>
+                <w:sz w:val="19"/>
               </w:rPr>
               <w:t>Absorbs impact energy during bottom overtravel of the car.</w:t>
             </w:r>
@@ -1455,7 +1248,7 @@
         </w:trPr>
         <w:tc>
           <w:tcPr>
-            <w:tcW w:type="dxa" w:w="3685"/>
+            <w:tcW w:type="dxa" w:w="3175"/>
           </w:tcPr>
           <w:p>
             <w:pPr>
@@ -1463,9 +1256,9 @@
             </w:pPr>
             <w:r>
               <w:rPr>
-                <w:sz w:val="18"/>
+                <w:sz w:val="19"/>
               </w:rPr>
-              <w:t>T24 对重缓冲器</w:t>
+              <w:t>对重缓冲器</w:t>
               <w:br/>
               <w:t>Counterweight buffer</w:t>
             </w:r>
@@ -1473,7 +1266,7 @@
         </w:tc>
         <w:tc>
           <w:tcPr>
-            <w:tcW w:type="dxa" w:w="2551"/>
+            <w:tcW w:type="dxa" w:w="2835"/>
           </w:tcPr>
           <w:p>
             <w:pPr>
@@ -1481,15 +1274,15 @@
             </w:pPr>
             <w:r>
               <w:rPr>
-                <w:sz w:val="18"/>
+                <w:sz w:val="19"/>
               </w:rPr>
-              <w:t>吸收对重底部越程冲击能量。</w:t>
+              <w:t>在对重底部越程时吸收冲击能量。</w:t>
             </w:r>
           </w:p>
         </w:tc>
         <w:tc>
           <w:tcPr>
-            <w:tcW w:type="dxa" w:w="3969"/>
+            <w:tcW w:type="dxa" w:w="4309"/>
           </w:tcPr>
           <w:p>
             <w:pPr>
@@ -1497,9 +1290,818 @@
             </w:pPr>
             <w:r>
               <w:rPr>
-                <w:sz w:val="18"/>
+                <w:sz w:val="19"/>
               </w:rPr>
               <w:t>Absorbs impact energy during bottom overtravel of the counterweight.</w:t>
+            </w:r>
+          </w:p>
+        </w:tc>
+      </w:tr>
+      <w:tr>
+        <w:trPr>
+          <w:cantSplit/>
+        </w:trPr>
+        <w:tc>
+          <w:tcPr>
+            <w:tcW w:type="dxa" w:w="3175"/>
+          </w:tcPr>
+          <w:p>
+            <w:pPr>
+              <w:spacing w:before="40" w:after="60" w:line="252" w:lineRule="auto"/>
+            </w:pPr>
+            <w:r>
+              <w:rPr>
+                <w:sz w:val="19"/>
+              </w:rPr>
+              <w:t>随行电缆</w:t>
+              <w:br/>
+              <w:t>Travelling cables</w:t>
+            </w:r>
+          </w:p>
+        </w:tc>
+        <w:tc>
+          <w:tcPr>
+            <w:tcW w:type="dxa" w:w="2835"/>
+          </w:tcPr>
+          <w:p>
+            <w:pPr>
+              <w:spacing w:before="40" w:after="60" w:line="252" w:lineRule="auto"/>
+            </w:pPr>
+            <w:r>
+              <w:rPr>
+                <w:sz w:val="19"/>
+              </w:rPr>
+              <w:t>在固定设备与移动轿厢之间传送电源及控制信号。</w:t>
+            </w:r>
+          </w:p>
+        </w:tc>
+        <w:tc>
+          <w:tcPr>
+            <w:tcW w:type="dxa" w:w="4309"/>
+          </w:tcPr>
+          <w:p>
+            <w:pPr>
+              <w:spacing w:before="40" w:after="60" w:line="252" w:lineRule="auto"/>
+            </w:pPr>
+            <w:r>
+              <w:rPr>
+                <w:sz w:val="19"/>
+              </w:rPr>
+              <w:t>Carry power and control signals between fixed equipment and the moving car.</w:t>
+            </w:r>
+          </w:p>
+        </w:tc>
+      </w:tr>
+    </w:tbl>
+    <w:p>
+      <w:pPr>
+        <w:pStyle w:val="Heading2"/>
+      </w:pPr>
+      <w:r>
+        <w:t>1.2 运作过程 / Operation</w:t>
+      </w:r>
+    </w:p>
+    <w:p>
+      <w:r>
+        <w:t>层门关闭并锁紧后，控制器协调制动器释放和驱动电动机运行。驱动电动机经齿轮箱带动曳引轮，悬吊绳使轿厢与对重反向移动。接近目标楼层时减速和平层，停车后由制动器保持静止，再开门。限速器和安全钳共同提供超速及悬吊失效情况下的安全保护。</w:t>
+      </w:r>
+    </w:p>
+    <w:p>
+      <w:r>
+        <w:t>Once the landing doors are closed and locked, the controller coordinates brake release and drive motor operation. The drive motor turns the drive sheave through the gear box, and the suspension rope moves the car and counterweight in opposite directions. The car slows and levels at the destination, the brake holds it stationary, and the doors open. The overspeed governor and safety gear provide protection during overspeed or suspension failure.</w:t>
+      </w:r>
+    </w:p>
+    <w:p>
+      <w:pPr>
+        <w:sectPr>
+          <w:headerReference w:type="default" r:id="rId9"/>
+          <w:footerReference w:type="default" r:id="rId10"/>
+          <w:pgSz w:w="11906" w:h="16838"/>
+          <w:pgMar w:top="794" w:right="794" w:bottom="794" w:left="794" w:header="340" w:footer="340" w:gutter="0"/>
+          <w:cols w:space="720"/>
+          <w:docGrid w:linePitch="360"/>
+        </w:sectPr>
+      </w:pPr>
+    </w:p>
+    <w:p>
+      <w:pPr>
+        <w:spacing w:after="0"/>
+        <w:jc w:val="center"/>
+      </w:pPr>
+      <w:r>
+        <w:drawing>
+          <wp:inline xmlns:a="http://schemas.openxmlformats.org/drawingml/2006/main" xmlns:pic="http://schemas.openxmlformats.org/drawingml/2006/picture">
+            <wp:extent cx="9540000" cy="6748658"/>
+            <wp:docPr id="1" name="Picture 1"/>
+            <wp:cNvGraphicFramePr>
+              <a:graphicFrameLocks noChangeAspect="1"/>
+            </wp:cNvGraphicFramePr>
+            <a:graphic>
+              <a:graphicData uri="http://schemas.openxmlformats.org/drawingml/2006/picture">
+                <pic:pic>
+                  <pic:nvPicPr>
+                    <pic:cNvPr id="0" name="PIA5704_Q1_Traction_Clear.png"/>
+                    <pic:cNvPicPr/>
+                  </pic:nvPicPr>
+                  <pic:blipFill>
+                    <a:blip r:embed="rId11"/>
+                    <a:stretch>
+                      <a:fillRect/>
+                    </a:stretch>
+                  </pic:blipFill>
+                  <pic:spPr>
+                    <a:xfrm>
+                      <a:off x="0" y="0"/>
+                      <a:ext cx="9540000" cy="6748658"/>
+                    </a:xfrm>
+                    <a:prstGeom prst="rect"/>
+                  </pic:spPr>
+                </pic:pic>
+              </a:graphicData>
+            </a:graphic>
+          </wp:inline>
+        </w:drawing>
+      </w:r>
+    </w:p>
+    <w:p>
+      <w:pPr>
+        <w:sectPr>
+          <w:pgSz w:w="16838" w:h="11906" w:orient="landscape"/>
+          <w:pgMar w:top="794" w:right="794" w:bottom="794" w:left="794" w:header="340" w:footer="340" w:gutter="0"/>
+          <w:cols w:space="720"/>
+          <w:docGrid w:linePitch="360"/>
+        </w:sectPr>
+      </w:pPr>
+    </w:p>
+    <w:p>
+      <w:pPr>
+        <w:pStyle w:val="Heading1"/>
+      </w:pPr>
+      <w:r>
+        <w:t>2 直顶式液压升降机 / Direct-driven cylinder hydraulic lift</w:t>
+      </w:r>
+    </w:p>
+    <w:p>
+      <w:r>
+        <w:t>直顶式液压升降机利用电动机驱动油泵，把液压油由油箱送入油缸。油压使柱塞伸出，直接顶升轿厢。下降时，阀组让油受控流回油箱，轿厢重量使柱塞缩回。此结构的柱塞直接承托轿厢。</w:t>
+      </w:r>
+    </w:p>
+    <w:p>
+      <w:r>
+        <w:t>A direct-driven cylinder hydraulic lift uses a motor-driven pump to deliver oil from the tank into the cylinder. Oil pressure extends the plunger, directly raising the car. During descent, the valve block permits controlled oil return to the tank, and the weight of the car retracts the plunger. The plunger directly supports the car in this arrangement.</w:t>
+      </w:r>
+    </w:p>
+    <w:tbl>
+      <w:tblPr>
+        <w:tblStyle w:val="TableGrid"/>
+        <w:tblW w:type="auto" w:w="0"/>
+        <w:tblLayout w:type="fixed"/>
+        <w:tblLook w:firstColumn="1" w:firstRow="1" w:lastColumn="0" w:lastRow="0" w:noHBand="0" w:noVBand="1" w:val="04A0"/>
+      </w:tblPr>
+      <w:tblGrid>
+        <w:gridCol w:w="3175"/>
+        <w:gridCol w:w="2835"/>
+        <w:gridCol w:w="4309"/>
+      </w:tblGrid>
+      <w:tr>
+        <w:trPr>
+          <w:tblHeader/>
+        </w:trPr>
+        <w:tc>
+          <w:tcPr>
+            <w:tcW w:type="dxa" w:w="3175"/>
+            <w:shd w:fill="E5EDF3"/>
+          </w:tcPr>
+          <w:p>
+            <w:r>
+              <w:t>主要部件 / Major component</w:t>
+            </w:r>
+          </w:p>
+        </w:tc>
+        <w:tc>
+          <w:tcPr>
+            <w:tcW w:type="dxa" w:w="2835"/>
+            <w:shd w:fill="E5EDF3"/>
+          </w:tcPr>
+          <w:p>
+            <w:r>
+              <w:t>功能</w:t>
+            </w:r>
+          </w:p>
+        </w:tc>
+        <w:tc>
+          <w:tcPr>
+            <w:tcW w:type="dxa" w:w="4309"/>
+            <w:shd w:fill="E5EDF3"/>
+          </w:tcPr>
+          <w:p>
+            <w:r>
+              <w:t>Operational function</w:t>
+            </w:r>
+          </w:p>
+        </w:tc>
+      </w:tr>
+      <w:tr>
+        <w:trPr>
+          <w:cantSplit/>
+        </w:trPr>
+        <w:tc>
+          <w:tcPr>
+            <w:tcW w:type="dxa" w:w="3175"/>
+          </w:tcPr>
+          <w:p>
+            <w:pPr>
+              <w:spacing w:before="40" w:after="60" w:line="252" w:lineRule="auto"/>
+            </w:pPr>
+            <w:r>
+              <w:rPr>
+                <w:sz w:val="19"/>
+              </w:rPr>
+              <w:t>轿厢</w:t>
+              <w:br/>
+              <w:t>Car</w:t>
+            </w:r>
+          </w:p>
+        </w:tc>
+        <w:tc>
+          <w:tcPr>
+            <w:tcW w:type="dxa" w:w="2835"/>
+          </w:tcPr>
+          <w:p>
+            <w:pPr>
+              <w:spacing w:before="40" w:after="60" w:line="252" w:lineRule="auto"/>
+            </w:pPr>
+            <w:r>
+              <w:rPr>
+                <w:sz w:val="19"/>
+              </w:rPr>
+              <w:t>承载乘客或货物，并由柱塞直接承托。</w:t>
+            </w:r>
+          </w:p>
+        </w:tc>
+        <w:tc>
+          <w:tcPr>
+            <w:tcW w:type="dxa" w:w="4309"/>
+          </w:tcPr>
+          <w:p>
+            <w:pPr>
+              <w:spacing w:before="40" w:after="60" w:line="252" w:lineRule="auto"/>
+            </w:pPr>
+            <w:r>
+              <w:rPr>
+                <w:sz w:val="19"/>
+              </w:rPr>
+              <w:t>Carries passengers or goods and is directly supported by the plunger.</w:t>
+            </w:r>
+          </w:p>
+        </w:tc>
+      </w:tr>
+      <w:tr>
+        <w:trPr>
+          <w:cantSplit/>
+        </w:trPr>
+        <w:tc>
+          <w:tcPr>
+            <w:tcW w:type="dxa" w:w="3175"/>
+          </w:tcPr>
+          <w:p>
+            <w:pPr>
+              <w:spacing w:before="40" w:after="60" w:line="252" w:lineRule="auto"/>
+            </w:pPr>
+            <w:r>
+              <w:rPr>
+                <w:sz w:val="19"/>
+              </w:rPr>
+              <w:t>柱塞</w:t>
+              <w:br/>
+              <w:t>Plunger</w:t>
+            </w:r>
+          </w:p>
+        </w:tc>
+        <w:tc>
+          <w:tcPr>
+            <w:tcW w:type="dxa" w:w="2835"/>
+          </w:tcPr>
+          <w:p>
+            <w:pPr>
+              <w:spacing w:before="40" w:after="60" w:line="252" w:lineRule="auto"/>
+            </w:pPr>
+            <w:r>
+              <w:rPr>
+                <w:sz w:val="19"/>
+              </w:rPr>
+              <w:t>在油压作用下伸出，直接顶升轿厢；回缩时轿厢下降。</w:t>
+            </w:r>
+          </w:p>
+        </w:tc>
+        <w:tc>
+          <w:tcPr>
+            <w:tcW w:type="dxa" w:w="4309"/>
+          </w:tcPr>
+          <w:p>
+            <w:pPr>
+              <w:spacing w:before="40" w:after="60" w:line="252" w:lineRule="auto"/>
+            </w:pPr>
+            <w:r>
+              <w:rPr>
+                <w:sz w:val="19"/>
+              </w:rPr>
+              <w:t>Extends under oil pressure to raise the car directly; its retraction allows descent.</w:t>
+            </w:r>
+          </w:p>
+        </w:tc>
+      </w:tr>
+      <w:tr>
+        <w:trPr>
+          <w:cantSplit/>
+        </w:trPr>
+        <w:tc>
+          <w:tcPr>
+            <w:tcW w:type="dxa" w:w="3175"/>
+          </w:tcPr>
+          <w:p>
+            <w:pPr>
+              <w:spacing w:before="40" w:after="60" w:line="252" w:lineRule="auto"/>
+            </w:pPr>
+            <w:r>
+              <w:rPr>
+                <w:sz w:val="19"/>
+              </w:rPr>
+              <w:t>油缸</w:t>
+              <w:br/>
+              <w:t>Cylinder</w:t>
+            </w:r>
+          </w:p>
+        </w:tc>
+        <w:tc>
+          <w:tcPr>
+            <w:tcW w:type="dxa" w:w="2835"/>
+          </w:tcPr>
+          <w:p>
+            <w:pPr>
+              <w:spacing w:before="40" w:after="60" w:line="252" w:lineRule="auto"/>
+            </w:pPr>
+            <w:r>
+              <w:rPr>
+                <w:sz w:val="19"/>
+              </w:rPr>
+              <w:t>容纳受压液压油，与柱塞共同形成顶升机构。</w:t>
+            </w:r>
+          </w:p>
+        </w:tc>
+        <w:tc>
+          <w:tcPr>
+            <w:tcW w:type="dxa" w:w="4309"/>
+          </w:tcPr>
+          <w:p>
+            <w:pPr>
+              <w:spacing w:before="40" w:after="60" w:line="252" w:lineRule="auto"/>
+            </w:pPr>
+            <w:r>
+              <w:rPr>
+                <w:sz w:val="19"/>
+              </w:rPr>
+              <w:t>Contains pressurised oil and forms the lifting actuator with the plunger.</w:t>
+            </w:r>
+          </w:p>
+        </w:tc>
+      </w:tr>
+      <w:tr>
+        <w:trPr>
+          <w:cantSplit/>
+        </w:trPr>
+        <w:tc>
+          <w:tcPr>
+            <w:tcW w:type="dxa" w:w="3175"/>
+          </w:tcPr>
+          <w:p>
+            <w:pPr>
+              <w:spacing w:before="40" w:after="60" w:line="252" w:lineRule="auto"/>
+            </w:pPr>
+            <w:r>
+              <w:rPr>
+                <w:sz w:val="19"/>
+              </w:rPr>
+              <w:t>油箱</w:t>
+              <w:br/>
+              <w:t>Tank</w:t>
+            </w:r>
+          </w:p>
+        </w:tc>
+        <w:tc>
+          <w:tcPr>
+            <w:tcW w:type="dxa" w:w="2835"/>
+          </w:tcPr>
+          <w:p>
+            <w:pPr>
+              <w:spacing w:before="40" w:after="60" w:line="252" w:lineRule="auto"/>
+            </w:pPr>
+            <w:r>
+              <w:rPr>
+                <w:sz w:val="19"/>
+              </w:rPr>
+              <w:t>储存液压油，向油泵供油并接收下降回油。</w:t>
+            </w:r>
+          </w:p>
+        </w:tc>
+        <w:tc>
+          <w:tcPr>
+            <w:tcW w:type="dxa" w:w="4309"/>
+          </w:tcPr>
+          <w:p>
+            <w:pPr>
+              <w:spacing w:before="40" w:after="60" w:line="252" w:lineRule="auto"/>
+            </w:pPr>
+            <w:r>
+              <w:rPr>
+                <w:sz w:val="19"/>
+              </w:rPr>
+              <w:t>Stores oil, supplies the pump and receives returning oil during descent.</w:t>
+            </w:r>
+          </w:p>
+        </w:tc>
+      </w:tr>
+      <w:tr>
+        <w:trPr>
+          <w:cantSplit/>
+        </w:trPr>
+        <w:tc>
+          <w:tcPr>
+            <w:tcW w:type="dxa" w:w="3175"/>
+          </w:tcPr>
+          <w:p>
+            <w:pPr>
+              <w:spacing w:before="40" w:after="60" w:line="252" w:lineRule="auto"/>
+            </w:pPr>
+            <w:r>
+              <w:rPr>
+                <w:sz w:val="19"/>
+              </w:rPr>
+              <w:t>油位计</w:t>
+              <w:br/>
+              <w:t>Oil level gauge</w:t>
+            </w:r>
+          </w:p>
+        </w:tc>
+        <w:tc>
+          <w:tcPr>
+            <w:tcW w:type="dxa" w:w="2835"/>
+          </w:tcPr>
+          <w:p>
+            <w:pPr>
+              <w:spacing w:before="40" w:after="60" w:line="252" w:lineRule="auto"/>
+            </w:pPr>
+            <w:r>
+              <w:rPr>
+                <w:sz w:val="19"/>
+              </w:rPr>
+              <w:t>显示油箱中的油位。</w:t>
+            </w:r>
+          </w:p>
+        </w:tc>
+        <w:tc>
+          <w:tcPr>
+            <w:tcW w:type="dxa" w:w="4309"/>
+          </w:tcPr>
+          <w:p>
+            <w:pPr>
+              <w:spacing w:before="40" w:after="60" w:line="252" w:lineRule="auto"/>
+            </w:pPr>
+            <w:r>
+              <w:rPr>
+                <w:sz w:val="19"/>
+              </w:rPr>
+              <w:t>Indicates the oil level in the tank.</w:t>
+            </w:r>
+          </w:p>
+        </w:tc>
+      </w:tr>
+      <w:tr>
+        <w:trPr>
+          <w:cantSplit/>
+        </w:trPr>
+        <w:tc>
+          <w:tcPr>
+            <w:tcW w:type="dxa" w:w="3175"/>
+          </w:tcPr>
+          <w:p>
+            <w:pPr>
+              <w:spacing w:before="40" w:after="60" w:line="252" w:lineRule="auto"/>
+            </w:pPr>
+            <w:r>
+              <w:rPr>
+                <w:sz w:val="19"/>
+              </w:rPr>
+              <w:t>电动机</w:t>
+              <w:br/>
+              <w:t>Motor</w:t>
+            </w:r>
+          </w:p>
+        </w:tc>
+        <w:tc>
+          <w:tcPr>
+            <w:tcW w:type="dxa" w:w="2835"/>
+          </w:tcPr>
+          <w:p>
+            <w:pPr>
+              <w:spacing w:before="40" w:after="60" w:line="252" w:lineRule="auto"/>
+            </w:pPr>
+            <w:r>
+              <w:rPr>
+                <w:sz w:val="19"/>
+              </w:rPr>
+              <w:t>通过机械轴驱动油泵。</w:t>
+            </w:r>
+          </w:p>
+        </w:tc>
+        <w:tc>
+          <w:tcPr>
+            <w:tcW w:type="dxa" w:w="4309"/>
+          </w:tcPr>
+          <w:p>
+            <w:pPr>
+              <w:spacing w:before="40" w:after="60" w:line="252" w:lineRule="auto"/>
+            </w:pPr>
+            <w:r>
+              <w:rPr>
+                <w:sz w:val="19"/>
+              </w:rPr>
+              <w:t>Drives the pump through a mechanical shaft.</w:t>
+            </w:r>
+          </w:p>
+        </w:tc>
+      </w:tr>
+      <w:tr>
+        <w:trPr>
+          <w:cantSplit/>
+        </w:trPr>
+        <w:tc>
+          <w:tcPr>
+            <w:tcW w:type="dxa" w:w="3175"/>
+          </w:tcPr>
+          <w:p>
+            <w:pPr>
+              <w:spacing w:before="40" w:after="60" w:line="252" w:lineRule="auto"/>
+            </w:pPr>
+            <w:r>
+              <w:rPr>
+                <w:sz w:val="19"/>
+              </w:rPr>
+              <w:t>油泵</w:t>
+              <w:br/>
+              <w:t>Pump</w:t>
+            </w:r>
+          </w:p>
+        </w:tc>
+        <w:tc>
+          <w:tcPr>
+            <w:tcW w:type="dxa" w:w="2835"/>
+          </w:tcPr>
+          <w:p>
+            <w:pPr>
+              <w:spacing w:before="40" w:after="60" w:line="252" w:lineRule="auto"/>
+            </w:pPr>
+            <w:r>
+              <w:rPr>
+                <w:sz w:val="19"/>
+              </w:rPr>
+              <w:t>将油箱内的油送往油缸，提供顶升所需油流。</w:t>
+            </w:r>
+          </w:p>
+        </w:tc>
+        <w:tc>
+          <w:tcPr>
+            <w:tcW w:type="dxa" w:w="4309"/>
+          </w:tcPr>
+          <w:p>
+            <w:pPr>
+              <w:spacing w:before="40" w:after="60" w:line="252" w:lineRule="auto"/>
+            </w:pPr>
+            <w:r>
+              <w:rPr>
+                <w:sz w:val="19"/>
+              </w:rPr>
+              <w:t>Delivers oil from the tank towards the cylinder to raise the car.</w:t>
+            </w:r>
+          </w:p>
+        </w:tc>
+      </w:tr>
+      <w:tr>
+        <w:trPr>
+          <w:cantSplit/>
+        </w:trPr>
+        <w:tc>
+          <w:tcPr>
+            <w:tcW w:type="dxa" w:w="3175"/>
+          </w:tcPr>
+          <w:p>
+            <w:pPr>
+              <w:spacing w:before="40" w:after="60" w:line="252" w:lineRule="auto"/>
+            </w:pPr>
+            <w:r>
+              <w:rPr>
+                <w:sz w:val="19"/>
+              </w:rPr>
+              <w:t>阀组</w:t>
+              <w:br/>
+              <w:t>Valve block</w:t>
+            </w:r>
+          </w:p>
+        </w:tc>
+        <w:tc>
+          <w:tcPr>
+            <w:tcW w:type="dxa" w:w="2835"/>
+          </w:tcPr>
+          <w:p>
+            <w:pPr>
+              <w:spacing w:before="40" w:after="60" w:line="252" w:lineRule="auto"/>
+            </w:pPr>
+            <w:r>
+              <w:rPr>
+                <w:sz w:val="19"/>
+              </w:rPr>
+              <w:t>控制进油、保压及受控回油，从而实现上升、停止和下降。</w:t>
+            </w:r>
+          </w:p>
+        </w:tc>
+        <w:tc>
+          <w:tcPr>
+            <w:tcW w:type="dxa" w:w="4309"/>
+          </w:tcPr>
+          <w:p>
+            <w:pPr>
+              <w:spacing w:before="40" w:after="60" w:line="252" w:lineRule="auto"/>
+            </w:pPr>
+            <w:r>
+              <w:rPr>
+                <w:sz w:val="19"/>
+              </w:rPr>
+              <w:t>Controls oil admission, holding and controlled return for ascent, stopping and descent.</w:t>
+            </w:r>
+          </w:p>
+        </w:tc>
+      </w:tr>
+      <w:tr>
+        <w:trPr>
+          <w:cantSplit/>
+        </w:trPr>
+        <w:tc>
+          <w:tcPr>
+            <w:tcW w:type="dxa" w:w="3175"/>
+          </w:tcPr>
+          <w:p>
+            <w:pPr>
+              <w:spacing w:before="40" w:after="60" w:line="252" w:lineRule="auto"/>
+            </w:pPr>
+            <w:r>
+              <w:rPr>
+                <w:sz w:val="19"/>
+              </w:rPr>
+              <w:t>闸阀</w:t>
+              <w:br/>
+              <w:t>Gate valve</w:t>
+            </w:r>
+          </w:p>
+        </w:tc>
+        <w:tc>
+          <w:tcPr>
+            <w:tcW w:type="dxa" w:w="2835"/>
+          </w:tcPr>
+          <w:p>
+            <w:pPr>
+              <w:spacing w:before="40" w:after="60" w:line="252" w:lineRule="auto"/>
+            </w:pPr>
+            <w:r>
+              <w:rPr>
+                <w:sz w:val="19"/>
+              </w:rPr>
+              <w:t>隔离油缸油路，供检修使用；正常运行时保持开启。</w:t>
+            </w:r>
+          </w:p>
+        </w:tc>
+        <w:tc>
+          <w:tcPr>
+            <w:tcW w:type="dxa" w:w="4309"/>
+          </w:tcPr>
+          <w:p>
+            <w:pPr>
+              <w:spacing w:before="40" w:after="60" w:line="252" w:lineRule="auto"/>
+            </w:pPr>
+            <w:r>
+              <w:rPr>
+                <w:sz w:val="19"/>
+              </w:rPr>
+              <w:t>Isolates the cylinder oil line for maintenance and remains open during normal operation.</w:t>
+            </w:r>
+          </w:p>
+        </w:tc>
+      </w:tr>
+      <w:tr>
+        <w:trPr>
+          <w:cantSplit/>
+        </w:trPr>
+        <w:tc>
+          <w:tcPr>
+            <w:tcW w:type="dxa" w:w="3175"/>
+          </w:tcPr>
+          <w:p>
+            <w:pPr>
+              <w:spacing w:before="40" w:after="60" w:line="252" w:lineRule="auto"/>
+            </w:pPr>
+            <w:r>
+              <w:rPr>
+                <w:sz w:val="19"/>
+              </w:rPr>
+              <w:t>控制器</w:t>
+              <w:br/>
+              <w:t>Controller</w:t>
+            </w:r>
+          </w:p>
+        </w:tc>
+        <w:tc>
+          <w:tcPr>
+            <w:tcW w:type="dxa" w:w="2835"/>
+          </w:tcPr>
+          <w:p>
+            <w:pPr>
+              <w:spacing w:before="40" w:after="60" w:line="252" w:lineRule="auto"/>
+            </w:pPr>
+            <w:r>
+              <w:rPr>
+                <w:sz w:val="19"/>
+              </w:rPr>
+              <w:t>协调电动机、阀组、停车、平层和开关门。</w:t>
+            </w:r>
+          </w:p>
+        </w:tc>
+        <w:tc>
+          <w:tcPr>
+            <w:tcW w:type="dxa" w:w="4309"/>
+          </w:tcPr>
+          <w:p>
+            <w:pPr>
+              <w:spacing w:before="40" w:after="60" w:line="252" w:lineRule="auto"/>
+            </w:pPr>
+            <w:r>
+              <w:rPr>
+                <w:sz w:val="19"/>
+              </w:rPr>
+              <w:t>Coordinates the motor, valve block, stopping, levelling and door operation.</w:t>
+            </w:r>
+          </w:p>
+        </w:tc>
+      </w:tr>
+      <w:tr>
+        <w:trPr>
+          <w:cantSplit/>
+        </w:trPr>
+        <w:tc>
+          <w:tcPr>
+            <w:tcW w:type="dxa" w:w="3175"/>
+          </w:tcPr>
+          <w:p>
+            <w:pPr>
+              <w:spacing w:before="40" w:after="60" w:line="252" w:lineRule="auto"/>
+            </w:pPr>
+            <w:r>
+              <w:rPr>
+                <w:sz w:val="19"/>
+              </w:rPr>
+              <w:t>轿厢导轨</w:t>
+              <w:br/>
+              <w:t>Car guide rail</w:t>
+            </w:r>
+          </w:p>
+        </w:tc>
+        <w:tc>
+          <w:tcPr>
+            <w:tcW w:type="dxa" w:w="2835"/>
+          </w:tcPr>
+          <w:p>
+            <w:pPr>
+              <w:spacing w:before="40" w:after="60" w:line="252" w:lineRule="auto"/>
+            </w:pPr>
+            <w:r>
+              <w:rPr>
+                <w:sz w:val="19"/>
+              </w:rPr>
+              <w:t>引导轿厢沿垂直路径运行。</w:t>
+            </w:r>
+          </w:p>
+        </w:tc>
+        <w:tc>
+          <w:tcPr>
+            <w:tcW w:type="dxa" w:w="4309"/>
+          </w:tcPr>
+          <w:p>
+            <w:pPr>
+              <w:spacing w:before="40" w:after="60" w:line="252" w:lineRule="auto"/>
+            </w:pPr>
+            <w:r>
+              <w:rPr>
+                <w:sz w:val="19"/>
+              </w:rPr>
+              <w:t>Guides the car vertically.</w:t>
             </w:r>
           </w:p>
         </w:tc>
@@ -1515,7 +2117,7 @@
         <w:pStyle w:val="Heading1"/>
       </w:pPr>
       <w:r>
-        <w:t>1.1 部件及功能 / Components and functions (3/3)</w:t>
+        <w:t>2.1 主要部件及功能（续） / Major components (continued)</w:t>
       </w:r>
     </w:p>
     <w:tbl>
@@ -1526,9 +2128,9 @@
         <w:tblLook w:firstColumn="1" w:firstRow="1" w:lastColumn="0" w:lastRow="0" w:noHBand="0" w:noVBand="1" w:val="04A0"/>
       </w:tblPr>
       <w:tblGrid>
-        <w:gridCol w:w="3402"/>
-        <w:gridCol w:w="3402"/>
-        <w:gridCol w:w="3402"/>
+        <w:gridCol w:w="3175"/>
+        <w:gridCol w:w="2835"/>
+        <w:gridCol w:w="4309"/>
       </w:tblGrid>
       <w:tr>
         <w:trPr>
@@ -1536,19 +2138,19 @@
         </w:trPr>
         <w:tc>
           <w:tcPr>
-            <w:tcW w:type="dxa" w:w="3685"/>
-            <w:shd w:fill="E7EDF2"/>
+            <w:tcW w:type="dxa" w:w="3175"/>
+            <w:shd w:fill="E5EDF3"/>
           </w:tcPr>
           <w:p>
             <w:r>
-              <w:t>编号及部件 / Component</w:t>
+              <w:t>主要部件 / Major component</w:t>
             </w:r>
           </w:p>
         </w:tc>
         <w:tc>
           <w:tcPr>
-            <w:tcW w:type="dxa" w:w="2551"/>
-            <w:shd w:fill="E7EDF2"/>
+            <w:tcW w:type="dxa" w:w="2835"/>
+            <w:shd w:fill="E5EDF3"/>
           </w:tcPr>
           <w:p>
             <w:r>
@@ -1558,8 +2160,8 @@
         </w:tc>
         <w:tc>
           <w:tcPr>
-            <w:tcW w:type="dxa" w:w="3969"/>
-            <w:shd w:fill="E7EDF2"/>
+            <w:tcW w:type="dxa" w:w="4309"/>
+            <w:shd w:fill="E5EDF3"/>
           </w:tcPr>
           <w:p>
             <w:r>
@@ -1574,7 +2176,7 @@
         </w:trPr>
         <w:tc>
           <w:tcPr>
-            <w:tcW w:type="dxa" w:w="3685"/>
+            <w:tcW w:type="dxa" w:w="3175"/>
           </w:tcPr>
           <w:p>
             <w:pPr>
@@ -1582,17 +2184,17 @@
             </w:pPr>
             <w:r>
               <w:rPr>
-                <w:sz w:val="18"/>
+                <w:sz w:val="19"/>
               </w:rPr>
-              <w:t>T25 层门联锁</w:t>
+              <w:t>导靴</w:t>
               <w:br/>
-              <w:t>Landing door interlock</w:t>
+              <w:t>Guide shoe</w:t>
             </w:r>
           </w:p>
         </w:tc>
         <w:tc>
           <w:tcPr>
-            <w:tcW w:type="dxa" w:w="2551"/>
+            <w:tcW w:type="dxa" w:w="2835"/>
           </w:tcPr>
           <w:p>
             <w:pPr>
@@ -1600,15 +2202,15 @@
             </w:pPr>
             <w:r>
               <w:rPr>
-                <w:sz w:val="18"/>
+                <w:sz w:val="19"/>
               </w:rPr>
-              <w:t>层门未关闭锁紧时阻止运行。</w:t>
+              <w:t>配合轿厢导轨引导轿厢，并限制横向移动。</w:t>
             </w:r>
           </w:p>
         </w:tc>
         <w:tc>
           <w:tcPr>
-            <w:tcW w:type="dxa" w:w="3969"/>
+            <w:tcW w:type="dxa" w:w="4309"/>
           </w:tcPr>
           <w:p>
             <w:pPr>
@@ -1616,9 +2218,9 @@
             </w:pPr>
             <w:r>
               <w:rPr>
-                <w:sz w:val="18"/>
+                <w:sz w:val="19"/>
               </w:rPr>
-              <w:t>Prevents travel unless the landing doors are closed and locked.</w:t>
+              <w:t>Runs along the car guide rail to guide the car and restrain lateral movement.</w:t>
             </w:r>
           </w:p>
         </w:tc>
@@ -1629,7 +2231,7 @@
         </w:trPr>
         <w:tc>
           <w:tcPr>
-            <w:tcW w:type="dxa" w:w="3685"/>
+            <w:tcW w:type="dxa" w:w="3175"/>
           </w:tcPr>
           <w:p>
             <w:pPr>
@@ -1637,17 +2239,17 @@
             </w:pPr>
             <w:r>
               <w:rPr>
-                <w:sz w:val="18"/>
+                <w:sz w:val="19"/>
               </w:rPr>
-              <w:t>T26 层门接近传感器</w:t>
+              <w:t>门机</w:t>
               <w:br/>
-              <w:t>Landing door proximity sensor</w:t>
+              <w:t>Door operator</w:t>
             </w:r>
           </w:p>
         </w:tc>
         <w:tc>
           <w:tcPr>
-            <w:tcW w:type="dxa" w:w="2551"/>
+            <w:tcW w:type="dxa" w:w="2835"/>
           </w:tcPr>
           <w:p>
             <w:pPr>
@@ -1655,15 +2257,15 @@
             </w:pPr>
             <w:r>
               <w:rPr>
-                <w:sz w:val="18"/>
+                <w:sz w:val="19"/>
               </w:rPr>
-              <w:t>关门时检测到乘客进入便使门重开。</w:t>
+              <w:t>驱动轿门开启和关闭。</w:t>
             </w:r>
           </w:p>
         </w:tc>
         <w:tc>
           <w:tcPr>
-            <w:tcW w:type="dxa" w:w="3969"/>
+            <w:tcW w:type="dxa" w:w="4309"/>
           </w:tcPr>
           <w:p>
             <w:pPr>
@@ -1671,9 +2273,9 @@
             </w:pPr>
             <w:r>
               <w:rPr>
-                <w:sz w:val="18"/>
+                <w:sz w:val="19"/>
               </w:rPr>
-              <w:t>Reopens closing doors when a person enters.</w:t>
+              <w:t>Opens and closes the car doors.</w:t>
             </w:r>
           </w:p>
         </w:tc>
@@ -1684,7 +2286,7 @@
         </w:trPr>
         <w:tc>
           <w:tcPr>
-            <w:tcW w:type="dxa" w:w="3685"/>
+            <w:tcW w:type="dxa" w:w="3175"/>
           </w:tcPr>
           <w:p>
             <w:pPr>
@@ -1692,17 +2294,17 @@
             </w:pPr>
             <w:r>
               <w:rPr>
-                <w:sz w:val="18"/>
+                <w:sz w:val="19"/>
               </w:rPr>
-              <w:t>T27 补偿绳</w:t>
+              <w:t>轿门</w:t>
               <w:br/>
-              <w:t>Compensation ropes</w:t>
+              <w:t>Car doors</w:t>
             </w:r>
           </w:p>
         </w:tc>
         <w:tc>
           <w:tcPr>
-            <w:tcW w:type="dxa" w:w="2551"/>
+            <w:tcW w:type="dxa" w:w="2835"/>
           </w:tcPr>
           <w:p>
             <w:pPr>
@@ -1710,15 +2312,15 @@
             </w:pPr>
             <w:r>
               <w:rPr>
-                <w:sz w:val="18"/>
+                <w:sz w:val="19"/>
               </w:rPr>
-              <w:t>补偿悬吊绳重量分布随轿厢位置的变化。</w:t>
+              <w:t>关闭轿厢入口。</w:t>
             </w:r>
           </w:p>
         </w:tc>
         <w:tc>
           <w:tcPr>
-            <w:tcW w:type="dxa" w:w="3969"/>
+            <w:tcW w:type="dxa" w:w="4309"/>
           </w:tcPr>
           <w:p>
             <w:pPr>
@@ -1726,9 +2328,9 @@
             </w:pPr>
             <w:r>
               <w:rPr>
-                <w:sz w:val="18"/>
+                <w:sz w:val="19"/>
               </w:rPr>
-              <w:t>Compensate for changes in suspension-rope weight distribution.</w:t>
+              <w:t>Close the car entrance.</w:t>
             </w:r>
           </w:p>
         </w:tc>
@@ -1739,7 +2341,7 @@
         </w:trPr>
         <w:tc>
           <w:tcPr>
-            <w:tcW w:type="dxa" w:w="3685"/>
+            <w:tcW w:type="dxa" w:w="3175"/>
           </w:tcPr>
           <w:p>
             <w:pPr>
@@ -1747,17 +2349,17 @@
             </w:pPr>
             <w:r>
               <w:rPr>
-                <w:sz w:val="18"/>
+                <w:sz w:val="19"/>
               </w:rPr>
-              <w:t>T28 补偿轮</w:t>
+              <w:t>层门</w:t>
               <w:br/>
-              <w:t>Compensation sheave</w:t>
+              <w:t>Landing doors</w:t>
             </w:r>
           </w:p>
         </w:tc>
         <w:tc>
           <w:tcPr>
-            <w:tcW w:type="dxa" w:w="2551"/>
+            <w:tcW w:type="dxa" w:w="2835"/>
           </w:tcPr>
           <w:p>
             <w:pPr>
@@ -1765,15 +2367,15 @@
             </w:pPr>
             <w:r>
               <w:rPr>
-                <w:sz w:val="18"/>
+                <w:sz w:val="19"/>
               </w:rPr>
-              <w:t>引导补偿绳并维持其布置。</w:t>
+              <w:t>关闭各楼层通向井道的入口。</w:t>
             </w:r>
           </w:p>
         </w:tc>
         <w:tc>
           <w:tcPr>
-            <w:tcW w:type="dxa" w:w="3969"/>
+            <w:tcW w:type="dxa" w:w="4309"/>
           </w:tcPr>
           <w:p>
             <w:pPr>
@@ -1781,1360 +2383,7 @@
             </w:pPr>
             <w:r>
               <w:rPr>
-                <w:sz w:val="18"/>
-              </w:rPr>
-              <w:t>Guides the compensation ropes.</w:t>
-            </w:r>
-          </w:p>
-        </w:tc>
-      </w:tr>
-      <w:tr>
-        <w:trPr>
-          <w:cantSplit/>
-        </w:trPr>
-        <w:tc>
-          <w:tcPr>
-            <w:tcW w:type="dxa" w:w="3685"/>
-          </w:tcPr>
-          <w:p>
-            <w:pPr>
-              <w:spacing w:before="40" w:after="60" w:line="252" w:lineRule="auto"/>
-            </w:pPr>
-            <w:r>
-              <w:rPr>
-                <w:sz w:val="18"/>
-              </w:rPr>
-              <w:t>T29 称重传感器</w:t>
-              <w:br/>
-              <w:t>Load-Weighing Transducers</w:t>
-            </w:r>
-          </w:p>
-        </w:tc>
-        <w:tc>
-          <w:tcPr>
-            <w:tcW w:type="dxa" w:w="2551"/>
-          </w:tcPr>
-          <w:p>
-            <w:pPr>
-              <w:spacing w:before="40" w:after="60" w:line="252" w:lineRule="auto"/>
-            </w:pPr>
-            <w:r>
-              <w:rPr>
-                <w:sz w:val="18"/>
-              </w:rPr>
-              <w:t>检测轿厢载荷。</w:t>
-            </w:r>
-          </w:p>
-        </w:tc>
-        <w:tc>
-          <w:tcPr>
-            <w:tcW w:type="dxa" w:w="3969"/>
-          </w:tcPr>
-          <w:p>
-            <w:pPr>
-              <w:spacing w:before="40" w:after="60" w:line="252" w:lineRule="auto"/>
-            </w:pPr>
-            <w:r>
-              <w:rPr>
-                <w:sz w:val="18"/>
-              </w:rPr>
-              <w:t>Measure the load in the car.</w:t>
-            </w:r>
-          </w:p>
-        </w:tc>
-      </w:tr>
-      <w:tr>
-        <w:trPr>
-          <w:cantSplit/>
-        </w:trPr>
-        <w:tc>
-          <w:tcPr>
-            <w:tcW w:type="dxa" w:w="3685"/>
-          </w:tcPr>
-          <w:p>
-            <w:pPr>
-              <w:spacing w:before="40" w:after="60" w:line="252" w:lineRule="auto"/>
-            </w:pPr>
-            <w:r>
-              <w:rPr>
-                <w:sz w:val="18"/>
-              </w:rPr>
-              <w:t>T30 主速度传感器</w:t>
-              <w:br/>
-              <w:t>Primary Velocity Transducer</w:t>
-            </w:r>
-          </w:p>
-        </w:tc>
-        <w:tc>
-          <w:tcPr>
-            <w:tcW w:type="dxa" w:w="2551"/>
-          </w:tcPr>
-          <w:p>
-            <w:pPr>
-              <w:spacing w:before="40" w:after="60" w:line="252" w:lineRule="auto"/>
-            </w:pPr>
-            <w:r>
-              <w:rPr>
-                <w:sz w:val="18"/>
-              </w:rPr>
-              <w:t>提供速度反馈。</w:t>
-            </w:r>
-          </w:p>
-        </w:tc>
-        <w:tc>
-          <w:tcPr>
-            <w:tcW w:type="dxa" w:w="3969"/>
-          </w:tcPr>
-          <w:p>
-            <w:pPr>
-              <w:spacing w:before="40" w:after="60" w:line="252" w:lineRule="auto"/>
-            </w:pPr>
-            <w:r>
-              <w:rPr>
-                <w:sz w:val="18"/>
-              </w:rPr>
-              <w:t>Provides speed feedback.</w:t>
-            </w:r>
-          </w:p>
-        </w:tc>
-      </w:tr>
-      <w:tr>
-        <w:trPr>
-          <w:cantSplit/>
-        </w:trPr>
-        <w:tc>
-          <w:tcPr>
-            <w:tcW w:type="dxa" w:w="3685"/>
-          </w:tcPr>
-          <w:p>
-            <w:pPr>
-              <w:spacing w:before="40" w:after="60" w:line="252" w:lineRule="auto"/>
-            </w:pPr>
-            <w:r>
-              <w:rPr>
-                <w:sz w:val="18"/>
-              </w:rPr>
-              <w:t>T31 智能主位置传感器</w:t>
-              <w:br/>
-              <w:t>Smart Primary Position Transducer</w:t>
-            </w:r>
-          </w:p>
-        </w:tc>
-        <w:tc>
-          <w:tcPr>
-            <w:tcW w:type="dxa" w:w="2551"/>
-          </w:tcPr>
-          <w:p>
-            <w:pPr>
-              <w:spacing w:before="40" w:after="60" w:line="252" w:lineRule="auto"/>
-            </w:pPr>
-            <w:r>
-              <w:rPr>
-                <w:sz w:val="18"/>
-              </w:rPr>
-              <w:t>提供位置反馈。</w:t>
-            </w:r>
-          </w:p>
-        </w:tc>
-        <w:tc>
-          <w:tcPr>
-            <w:tcW w:type="dxa" w:w="3969"/>
-          </w:tcPr>
-          <w:p>
-            <w:pPr>
-              <w:spacing w:before="40" w:after="60" w:line="252" w:lineRule="auto"/>
-            </w:pPr>
-            <w:r>
-              <w:rPr>
-                <w:sz w:val="18"/>
-              </w:rPr>
-              <w:t>Provides position feedback.</w:t>
-            </w:r>
-          </w:p>
-        </w:tc>
-      </w:tr>
-      <w:tr>
-        <w:trPr>
-          <w:cantSplit/>
-        </w:trPr>
-        <w:tc>
-          <w:tcPr>
-            <w:tcW w:type="dxa" w:w="3685"/>
-          </w:tcPr>
-          <w:p>
-            <w:pPr>
-              <w:spacing w:before="40" w:after="60" w:line="252" w:lineRule="auto"/>
-            </w:pPr>
-            <w:r>
-              <w:rPr>
-                <w:sz w:val="18"/>
-              </w:rPr>
-              <w:t>T32 辅助位置传感器</w:t>
-              <w:br/>
-              <w:t>Secondary Position Transducer</w:t>
-            </w:r>
-          </w:p>
-        </w:tc>
-        <w:tc>
-          <w:tcPr>
-            <w:tcW w:type="dxa" w:w="2551"/>
-          </w:tcPr>
-          <w:p>
-            <w:pPr>
-              <w:spacing w:before="40" w:after="60" w:line="252" w:lineRule="auto"/>
-            </w:pPr>
-            <w:r>
-              <w:rPr>
-                <w:sz w:val="18"/>
-              </w:rPr>
-              <w:t>提供辅助位置反馈。</w:t>
-            </w:r>
-          </w:p>
-        </w:tc>
-        <w:tc>
-          <w:tcPr>
-            <w:tcW w:type="dxa" w:w="3969"/>
-          </w:tcPr>
-          <w:p>
-            <w:pPr>
-              <w:spacing w:before="40" w:after="60" w:line="252" w:lineRule="auto"/>
-            </w:pPr>
-            <w:r>
-              <w:rPr>
-                <w:sz w:val="18"/>
-              </w:rPr>
-              <w:t>Provides additional position feedback.</w:t>
-            </w:r>
-          </w:p>
-        </w:tc>
-      </w:tr>
-      <w:tr>
-        <w:trPr>
-          <w:cantSplit/>
-        </w:trPr>
-        <w:tc>
-          <w:tcPr>
-            <w:tcW w:type="dxa" w:w="3685"/>
-          </w:tcPr>
-          <w:p>
-            <w:pPr>
-              <w:spacing w:before="40" w:after="60" w:line="252" w:lineRule="auto"/>
-            </w:pPr>
-            <w:r>
-              <w:rPr>
-                <w:sz w:val="18"/>
-              </w:rPr>
-              <w:t>T33 滚轮导靴</w:t>
-              <w:br/>
-              <w:t>Roller Guides</w:t>
-            </w:r>
-          </w:p>
-        </w:tc>
-        <w:tc>
-          <w:tcPr>
-            <w:tcW w:type="dxa" w:w="2551"/>
-          </w:tcPr>
-          <w:p>
-            <w:pPr>
-              <w:spacing w:before="40" w:after="60" w:line="252" w:lineRule="auto"/>
-            </w:pPr>
-            <w:r>
-              <w:rPr>
-                <w:sz w:val="18"/>
-              </w:rPr>
-              <w:t>配合轿厢导轨限制横向移动。</w:t>
-            </w:r>
-          </w:p>
-        </w:tc>
-        <w:tc>
-          <w:tcPr>
-            <w:tcW w:type="dxa" w:w="3969"/>
-          </w:tcPr>
-          <w:p>
-            <w:pPr>
-              <w:spacing w:before="40" w:after="60" w:line="252" w:lineRule="auto"/>
-            </w:pPr>
-            <w:r>
-              <w:rPr>
-                <w:sz w:val="18"/>
-              </w:rPr>
-              <w:t>Run along the car guide rail to restrain lateral movement.</w:t>
-            </w:r>
-          </w:p>
-        </w:tc>
-      </w:tr>
-    </w:tbl>
-    <w:p>
-      <w:pPr>
-        <w:pStyle w:val="Heading2"/>
-      </w:pPr>
-      <w:r>
-        <w:t>1.2 运作过程 / Operation</w:t>
-      </w:r>
-    </w:p>
-    <w:p>
-      <w:r>
-        <w:t>门关闭并锁紧后，控制器协调制动器释放和驱动电动机运行。驱动电动机经齿轮箱带动曳引轮，悬吊绳使轿厢与对重反向移动。接近目标楼层时减速并平层，停车后制动器保持静止，再打开轿门和层门。限速器检测到异常超速时，触发安全停止，并在需要时使安全钳作用于轿厢导轨。</w:t>
-      </w:r>
-    </w:p>
-    <w:p>
-      <w:r>
-        <w:t>After the doors are closed and locked, the controller coordinates brake release and drive motor operation. The drive motor turns the drive sheave through the gear box. The suspension rope moves the car and counterweight in opposite directions. The car slows and levels at the destination, the brake holds it stationary, and the car doors and landing doors open. On abnormal overspeed, the overspeed governor initiates safety stopping and, when necessary, applies the safety gear to the car guide rail.</w:t>
-      </w:r>
-    </w:p>
-    <w:p>
-      <w:r>
-        <w:br w:type="page"/>
-      </w:r>
-    </w:p>
-    <w:p>
-      <w:pPr>
-        <w:pStyle w:val="Heading1"/>
-      </w:pPr>
-      <w:r>
-        <w:t>2 直顶式液压升降机 / Direct-ram hydraulic lift</w:t>
-      </w:r>
-    </w:p>
-    <w:p>
-      <w:pPr>
-        <w:jc w:val="center"/>
-      </w:pPr>
-      <w:r>
-        <w:drawing>
-          <wp:inline xmlns:a="http://schemas.openxmlformats.org/drawingml/2006/main" xmlns:pic="http://schemas.openxmlformats.org/drawingml/2006/picture">
-            <wp:extent cx="5438045" cy="7596000"/>
-            <wp:docPr id="2" name="Picture 2"/>
-            <wp:cNvGraphicFramePr>
-              <a:graphicFrameLocks noChangeAspect="1"/>
-            </wp:cNvGraphicFramePr>
-            <a:graphic>
-              <a:graphicData uri="http://schemas.openxmlformats.org/drawingml/2006/picture">
-                <pic:pic>
-                  <pic:nvPicPr>
-                    <pic:cNvPr id="0" name="PIA5704_Q1_Hydraulic_Handdraw.png"/>
-                    <pic:cNvPicPr/>
-                  </pic:nvPicPr>
-                  <pic:blipFill>
-                    <a:blip r:embed="rId12"/>
-                    <a:stretch>
-                      <a:fillRect/>
-                    </a:stretch>
-                  </pic:blipFill>
-                  <pic:spPr>
-                    <a:xfrm>
-                      <a:off x="0" y="0"/>
-                      <a:ext cx="5438045" cy="7596000"/>
-                    </a:xfrm>
-                    <a:prstGeom prst="rect"/>
-                  </pic:spPr>
-                </pic:pic>
-              </a:graphicData>
-            </a:graphic>
-          </wp:inline>
-        </w:drawing>
-      </w:r>
-    </w:p>
-    <w:p>
-      <w:r>
-        <w:br w:type="page"/>
-      </w:r>
-    </w:p>
-    <w:p>
-      <w:pPr>
-        <w:pStyle w:val="Heading1"/>
-      </w:pPr>
-      <w:r>
-        <w:t>2.1 部件及功能 / Components and functions (1/2)</w:t>
-      </w:r>
-    </w:p>
-    <w:tbl>
-      <w:tblPr>
-        <w:tblStyle w:val="TableGrid"/>
-        <w:tblW w:type="auto" w:w="0"/>
-        <w:tblLayout w:type="fixed"/>
-        <w:tblLook w:firstColumn="1" w:firstRow="1" w:lastColumn="0" w:lastRow="0" w:noHBand="0" w:noVBand="1" w:val="04A0"/>
-      </w:tblPr>
-      <w:tblGrid>
-        <w:gridCol w:w="3402"/>
-        <w:gridCol w:w="3402"/>
-        <w:gridCol w:w="3402"/>
-      </w:tblGrid>
-      <w:tr>
-        <w:trPr>
-          <w:tblHeader/>
-        </w:trPr>
-        <w:tc>
-          <w:tcPr>
-            <w:tcW w:type="dxa" w:w="3685"/>
-            <w:shd w:fill="E7EDF2"/>
-          </w:tcPr>
-          <w:p>
-            <w:r>
-              <w:t>编号及部件 / Component</w:t>
-            </w:r>
-          </w:p>
-        </w:tc>
-        <w:tc>
-          <w:tcPr>
-            <w:tcW w:type="dxa" w:w="2551"/>
-            <w:shd w:fill="E7EDF2"/>
-          </w:tcPr>
-          <w:p>
-            <w:r>
-              <w:t>功能</w:t>
-            </w:r>
-          </w:p>
-        </w:tc>
-        <w:tc>
-          <w:tcPr>
-            <w:tcW w:type="dxa" w:w="3969"/>
-            <w:shd w:fill="E7EDF2"/>
-          </w:tcPr>
-          <w:p>
-            <w:r>
-              <w:t>Operational function</w:t>
-            </w:r>
-          </w:p>
-        </w:tc>
-      </w:tr>
-      <w:tr>
-        <w:trPr>
-          <w:cantSplit/>
-        </w:trPr>
-        <w:tc>
-          <w:tcPr>
-            <w:tcW w:type="dxa" w:w="3685"/>
-          </w:tcPr>
-          <w:p>
-            <w:pPr>
-              <w:spacing w:before="40" w:after="60" w:line="252" w:lineRule="auto"/>
-            </w:pPr>
-            <w:r>
-              <w:rPr>
-                <w:sz w:val="18"/>
-              </w:rPr>
-              <w:t>H1 轿厢</w:t>
-              <w:br/>
-              <w:t>Car</w:t>
-            </w:r>
-          </w:p>
-        </w:tc>
-        <w:tc>
-          <w:tcPr>
-            <w:tcW w:type="dxa" w:w="2551"/>
-          </w:tcPr>
-          <w:p>
-            <w:pPr>
-              <w:spacing w:before="40" w:after="60" w:line="252" w:lineRule="auto"/>
-            </w:pPr>
-            <w:r>
-              <w:rPr>
-                <w:sz w:val="18"/>
-              </w:rPr>
-              <w:t>承载乘客或货物。</w:t>
-            </w:r>
-          </w:p>
-        </w:tc>
-        <w:tc>
-          <w:tcPr>
-            <w:tcW w:type="dxa" w:w="3969"/>
-          </w:tcPr>
-          <w:p>
-            <w:pPr>
-              <w:spacing w:before="40" w:after="60" w:line="252" w:lineRule="auto"/>
-            </w:pPr>
-            <w:r>
-              <w:rPr>
-                <w:sz w:val="18"/>
-              </w:rPr>
-              <w:t>Carries passengers or goods.</w:t>
-            </w:r>
-          </w:p>
-        </w:tc>
-      </w:tr>
-      <w:tr>
-        <w:trPr>
-          <w:cantSplit/>
-        </w:trPr>
-        <w:tc>
-          <w:tcPr>
-            <w:tcW w:type="dxa" w:w="3685"/>
-          </w:tcPr>
-          <w:p>
-            <w:pPr>
-              <w:spacing w:before="40" w:after="60" w:line="252" w:lineRule="auto"/>
-            </w:pPr>
-            <w:r>
-              <w:rPr>
-                <w:sz w:val="18"/>
-              </w:rPr>
-              <w:t>H2 柱塞</w:t>
-              <w:br/>
-              <w:t>Plunger</w:t>
-            </w:r>
-          </w:p>
-        </w:tc>
-        <w:tc>
-          <w:tcPr>
-            <w:tcW w:type="dxa" w:w="2551"/>
-          </w:tcPr>
-          <w:p>
-            <w:pPr>
-              <w:spacing w:before="40" w:after="60" w:line="252" w:lineRule="auto"/>
-            </w:pPr>
-            <w:r>
-              <w:rPr>
-                <w:sz w:val="18"/>
-              </w:rPr>
-              <w:t>直接承托并顶升轿厢。</w:t>
-            </w:r>
-          </w:p>
-        </w:tc>
-        <w:tc>
-          <w:tcPr>
-            <w:tcW w:type="dxa" w:w="3969"/>
-          </w:tcPr>
-          <w:p>
-            <w:pPr>
-              <w:spacing w:before="40" w:after="60" w:line="252" w:lineRule="auto"/>
-            </w:pPr>
-            <w:r>
-              <w:rPr>
-                <w:sz w:val="18"/>
-              </w:rPr>
-              <w:t>Directly supports and raises the car.</w:t>
-            </w:r>
-          </w:p>
-        </w:tc>
-      </w:tr>
-      <w:tr>
-        <w:trPr>
-          <w:cantSplit/>
-        </w:trPr>
-        <w:tc>
-          <w:tcPr>
-            <w:tcW w:type="dxa" w:w="3685"/>
-          </w:tcPr>
-          <w:p>
-            <w:pPr>
-              <w:spacing w:before="40" w:after="60" w:line="252" w:lineRule="auto"/>
-            </w:pPr>
-            <w:r>
-              <w:rPr>
-                <w:sz w:val="18"/>
-              </w:rPr>
-              <w:t>H3 油缸</w:t>
-              <w:br/>
-              <w:t>Cylinder</w:t>
-            </w:r>
-          </w:p>
-        </w:tc>
-        <w:tc>
-          <w:tcPr>
-            <w:tcW w:type="dxa" w:w="2551"/>
-          </w:tcPr>
-          <w:p>
-            <w:pPr>
-              <w:spacing w:before="40" w:after="60" w:line="252" w:lineRule="auto"/>
-            </w:pPr>
-            <w:r>
-              <w:rPr>
-                <w:sz w:val="18"/>
-              </w:rPr>
-              <w:t>容纳压力油并与柱塞构成顶升机构。</w:t>
-            </w:r>
-          </w:p>
-        </w:tc>
-        <w:tc>
-          <w:tcPr>
-            <w:tcW w:type="dxa" w:w="3969"/>
-          </w:tcPr>
-          <w:p>
-            <w:pPr>
-              <w:spacing w:before="40" w:after="60" w:line="252" w:lineRule="auto"/>
-            </w:pPr>
-            <w:r>
-              <w:rPr>
-                <w:sz w:val="18"/>
-              </w:rPr>
-              <w:t>Contains pressurised oil and forms the lifting actuator with the plunger.</w:t>
-            </w:r>
-          </w:p>
-        </w:tc>
-      </w:tr>
-      <w:tr>
-        <w:trPr>
-          <w:cantSplit/>
-        </w:trPr>
-        <w:tc>
-          <w:tcPr>
-            <w:tcW w:type="dxa" w:w="3685"/>
-          </w:tcPr>
-          <w:p>
-            <w:pPr>
-              <w:spacing w:before="40" w:after="60" w:line="252" w:lineRule="auto"/>
-            </w:pPr>
-            <w:r>
-              <w:rPr>
-                <w:sz w:val="18"/>
-              </w:rPr>
-              <w:t>H4 油箱</w:t>
-              <w:br/>
-              <w:t>Tank</w:t>
-            </w:r>
-          </w:p>
-        </w:tc>
-        <w:tc>
-          <w:tcPr>
-            <w:tcW w:type="dxa" w:w="2551"/>
-          </w:tcPr>
-          <w:p>
-            <w:pPr>
-              <w:spacing w:before="40" w:after="60" w:line="252" w:lineRule="auto"/>
-            </w:pPr>
-            <w:r>
-              <w:rPr>
-                <w:sz w:val="18"/>
-              </w:rPr>
-              <w:t>储油、向油泵供油并接收回油。</w:t>
-            </w:r>
-          </w:p>
-        </w:tc>
-        <w:tc>
-          <w:tcPr>
-            <w:tcW w:type="dxa" w:w="3969"/>
-          </w:tcPr>
-          <w:p>
-            <w:pPr>
-              <w:spacing w:before="40" w:after="60" w:line="252" w:lineRule="auto"/>
-            </w:pPr>
-            <w:r>
-              <w:rPr>
-                <w:sz w:val="18"/>
-              </w:rPr>
-              <w:t>Stores oil, supplies the pump and receives returning oil.</w:t>
-            </w:r>
-          </w:p>
-        </w:tc>
-      </w:tr>
-      <w:tr>
-        <w:trPr>
-          <w:cantSplit/>
-        </w:trPr>
-        <w:tc>
-          <w:tcPr>
-            <w:tcW w:type="dxa" w:w="3685"/>
-          </w:tcPr>
-          <w:p>
-            <w:pPr>
-              <w:spacing w:before="40" w:after="60" w:line="252" w:lineRule="auto"/>
-            </w:pPr>
-            <w:r>
-              <w:rPr>
-                <w:sz w:val="18"/>
-              </w:rPr>
-              <w:t>H5 电动机</w:t>
-              <w:br/>
-              <w:t>Motor</w:t>
-            </w:r>
-          </w:p>
-        </w:tc>
-        <w:tc>
-          <w:tcPr>
-            <w:tcW w:type="dxa" w:w="2551"/>
-          </w:tcPr>
-          <w:p>
-            <w:pPr>
-              <w:spacing w:before="40" w:after="60" w:line="252" w:lineRule="auto"/>
-            </w:pPr>
-            <w:r>
-              <w:rPr>
-                <w:sz w:val="18"/>
-              </w:rPr>
-              <w:t>通过机械轴驱动油泵。</w:t>
-            </w:r>
-          </w:p>
-        </w:tc>
-        <w:tc>
-          <w:tcPr>
-            <w:tcW w:type="dxa" w:w="3969"/>
-          </w:tcPr>
-          <w:p>
-            <w:pPr>
-              <w:spacing w:before="40" w:after="60" w:line="252" w:lineRule="auto"/>
-            </w:pPr>
-            <w:r>
-              <w:rPr>
-                <w:sz w:val="18"/>
-              </w:rPr>
-              <w:t>Drives the pump through a mechanical shaft.</w:t>
-            </w:r>
-          </w:p>
-        </w:tc>
-      </w:tr>
-      <w:tr>
-        <w:trPr>
-          <w:cantSplit/>
-        </w:trPr>
-        <w:tc>
-          <w:tcPr>
-            <w:tcW w:type="dxa" w:w="3685"/>
-          </w:tcPr>
-          <w:p>
-            <w:pPr>
-              <w:spacing w:before="40" w:after="60" w:line="252" w:lineRule="auto"/>
-            </w:pPr>
-            <w:r>
-              <w:rPr>
-                <w:sz w:val="18"/>
-              </w:rPr>
-              <w:t>H6 油泵</w:t>
-              <w:br/>
-              <w:t>Pump</w:t>
-            </w:r>
-          </w:p>
-        </w:tc>
-        <w:tc>
-          <w:tcPr>
-            <w:tcW w:type="dxa" w:w="2551"/>
-          </w:tcPr>
-          <w:p>
-            <w:pPr>
-              <w:spacing w:before="40" w:after="60" w:line="252" w:lineRule="auto"/>
-            </w:pPr>
-            <w:r>
-              <w:rPr>
-                <w:sz w:val="18"/>
-              </w:rPr>
-              <w:t>提供顶升所需油流。</w:t>
-            </w:r>
-          </w:p>
-        </w:tc>
-        <w:tc>
-          <w:tcPr>
-            <w:tcW w:type="dxa" w:w="3969"/>
-          </w:tcPr>
-          <w:p>
-            <w:pPr>
-              <w:spacing w:before="40" w:after="60" w:line="252" w:lineRule="auto"/>
-            </w:pPr>
-            <w:r>
-              <w:rPr>
-                <w:sz w:val="18"/>
-              </w:rPr>
-              <w:t>Supplies the oil flow needed to raise the car.</w:t>
-            </w:r>
-          </w:p>
-        </w:tc>
-      </w:tr>
-      <w:tr>
-        <w:trPr>
-          <w:cantSplit/>
-        </w:trPr>
-        <w:tc>
-          <w:tcPr>
-            <w:tcW w:type="dxa" w:w="3685"/>
-          </w:tcPr>
-          <w:p>
-            <w:pPr>
-              <w:spacing w:before="40" w:after="60" w:line="252" w:lineRule="auto"/>
-            </w:pPr>
-            <w:r>
-              <w:rPr>
-                <w:sz w:val="18"/>
-              </w:rPr>
-              <w:t>H7 阀组</w:t>
-              <w:br/>
-              <w:t>Valve block</w:t>
-            </w:r>
-          </w:p>
-        </w:tc>
-        <w:tc>
-          <w:tcPr>
-            <w:tcW w:type="dxa" w:w="2551"/>
-          </w:tcPr>
-          <w:p>
-            <w:pPr>
-              <w:spacing w:before="40" w:after="60" w:line="252" w:lineRule="auto"/>
-            </w:pPr>
-            <w:r>
-              <w:rPr>
-                <w:sz w:val="18"/>
-              </w:rPr>
-              <w:t>控制进油、保持和下降回油。</w:t>
-            </w:r>
-          </w:p>
-        </w:tc>
-        <w:tc>
-          <w:tcPr>
-            <w:tcW w:type="dxa" w:w="3969"/>
-          </w:tcPr>
-          <w:p>
-            <w:pPr>
-              <w:spacing w:before="40" w:after="60" w:line="252" w:lineRule="auto"/>
-            </w:pPr>
-            <w:r>
-              <w:rPr>
-                <w:sz w:val="18"/>
-              </w:rPr>
-              <w:t>Controls oil admission, holding and return during descent.</w:t>
-            </w:r>
-          </w:p>
-        </w:tc>
-      </w:tr>
-      <w:tr>
-        <w:trPr>
-          <w:cantSplit/>
-        </w:trPr>
-        <w:tc>
-          <w:tcPr>
-            <w:tcW w:type="dxa" w:w="3685"/>
-          </w:tcPr>
-          <w:p>
-            <w:pPr>
-              <w:spacing w:before="40" w:after="60" w:line="252" w:lineRule="auto"/>
-            </w:pPr>
-            <w:r>
-              <w:rPr>
-                <w:sz w:val="18"/>
-              </w:rPr>
-              <w:t>H8 闸阀</w:t>
-              <w:br/>
-              <w:t>Gate valve</w:t>
-            </w:r>
-          </w:p>
-        </w:tc>
-        <w:tc>
-          <w:tcPr>
-            <w:tcW w:type="dxa" w:w="2551"/>
-          </w:tcPr>
-          <w:p>
-            <w:pPr>
-              <w:spacing w:before="40" w:after="60" w:line="252" w:lineRule="auto"/>
-            </w:pPr>
-            <w:r>
-              <w:rPr>
-                <w:sz w:val="18"/>
-              </w:rPr>
-              <w:t>检修时隔离油缸油路。</w:t>
-            </w:r>
-          </w:p>
-        </w:tc>
-        <w:tc>
-          <w:tcPr>
-            <w:tcW w:type="dxa" w:w="3969"/>
-          </w:tcPr>
-          <w:p>
-            <w:pPr>
-              <w:spacing w:before="40" w:after="60" w:line="252" w:lineRule="auto"/>
-            </w:pPr>
-            <w:r>
-              <w:rPr>
-                <w:sz w:val="18"/>
-              </w:rPr>
-              <w:t>Isolates the cylinder oil line for maintenance.</w:t>
-            </w:r>
-          </w:p>
-        </w:tc>
-      </w:tr>
-      <w:tr>
-        <w:trPr>
-          <w:cantSplit/>
-        </w:trPr>
-        <w:tc>
-          <w:tcPr>
-            <w:tcW w:type="dxa" w:w="3685"/>
-          </w:tcPr>
-          <w:p>
-            <w:pPr>
-              <w:spacing w:before="40" w:after="60" w:line="252" w:lineRule="auto"/>
-            </w:pPr>
-            <w:r>
-              <w:rPr>
-                <w:sz w:val="18"/>
-              </w:rPr>
-              <w:t>H9 油位计</w:t>
-              <w:br/>
-              <w:t>Oil level gauge</w:t>
-            </w:r>
-          </w:p>
-        </w:tc>
-        <w:tc>
-          <w:tcPr>
-            <w:tcW w:type="dxa" w:w="2551"/>
-          </w:tcPr>
-          <w:p>
-            <w:pPr>
-              <w:spacing w:before="40" w:after="60" w:line="252" w:lineRule="auto"/>
-            </w:pPr>
-            <w:r>
-              <w:rPr>
-                <w:sz w:val="18"/>
-              </w:rPr>
-              <w:t>显示油箱油位。</w:t>
-            </w:r>
-          </w:p>
-        </w:tc>
-        <w:tc>
-          <w:tcPr>
-            <w:tcW w:type="dxa" w:w="3969"/>
-          </w:tcPr>
-          <w:p>
-            <w:pPr>
-              <w:spacing w:before="40" w:after="60" w:line="252" w:lineRule="auto"/>
-            </w:pPr>
-            <w:r>
-              <w:rPr>
-                <w:sz w:val="18"/>
-              </w:rPr>
-              <w:t>Indicates the tank oil level.</w:t>
-            </w:r>
-          </w:p>
-        </w:tc>
-      </w:tr>
-      <w:tr>
-        <w:trPr>
-          <w:cantSplit/>
-        </w:trPr>
-        <w:tc>
-          <w:tcPr>
-            <w:tcW w:type="dxa" w:w="3685"/>
-          </w:tcPr>
-          <w:p>
-            <w:pPr>
-              <w:spacing w:before="40" w:after="60" w:line="252" w:lineRule="auto"/>
-            </w:pPr>
-            <w:r>
-              <w:rPr>
-                <w:sz w:val="18"/>
-              </w:rPr>
-              <w:t>H10 控制器</w:t>
-              <w:br/>
-              <w:t>Controller</w:t>
-            </w:r>
-          </w:p>
-        </w:tc>
-        <w:tc>
-          <w:tcPr>
-            <w:tcW w:type="dxa" w:w="2551"/>
-          </w:tcPr>
-          <w:p>
-            <w:pPr>
-              <w:spacing w:before="40" w:after="60" w:line="252" w:lineRule="auto"/>
-            </w:pPr>
-            <w:r>
-              <w:rPr>
-                <w:sz w:val="18"/>
-              </w:rPr>
-              <w:t>协调电动机、阀组、停车及开关门。</w:t>
-            </w:r>
-          </w:p>
-        </w:tc>
-        <w:tc>
-          <w:tcPr>
-            <w:tcW w:type="dxa" w:w="3969"/>
-          </w:tcPr>
-          <w:p>
-            <w:pPr>
-              <w:spacing w:before="40" w:after="60" w:line="252" w:lineRule="auto"/>
-            </w:pPr>
-            <w:r>
-              <w:rPr>
-                <w:sz w:val="18"/>
-              </w:rPr>
-              <w:t>Coordinates the motor, valve block, stopping and door operation.</w:t>
-            </w:r>
-          </w:p>
-        </w:tc>
-      </w:tr>
-      <w:tr>
-        <w:trPr>
-          <w:cantSplit/>
-        </w:trPr>
-        <w:tc>
-          <w:tcPr>
-            <w:tcW w:type="dxa" w:w="3685"/>
-          </w:tcPr>
-          <w:p>
-            <w:pPr>
-              <w:spacing w:before="40" w:after="60" w:line="252" w:lineRule="auto"/>
-            </w:pPr>
-            <w:r>
-              <w:rPr>
-                <w:sz w:val="18"/>
-              </w:rPr>
-              <w:t>H11 轿厢导轨</w:t>
-              <w:br/>
-              <w:t>Car guide rail</w:t>
-            </w:r>
-          </w:p>
-        </w:tc>
-        <w:tc>
-          <w:tcPr>
-            <w:tcW w:type="dxa" w:w="2551"/>
-          </w:tcPr>
-          <w:p>
-            <w:pPr>
-              <w:spacing w:before="40" w:after="60" w:line="252" w:lineRule="auto"/>
-            </w:pPr>
-            <w:r>
-              <w:rPr>
-                <w:sz w:val="18"/>
-              </w:rPr>
-              <w:t>引导轿厢垂直运行。</w:t>
-            </w:r>
-          </w:p>
-        </w:tc>
-        <w:tc>
-          <w:tcPr>
-            <w:tcW w:type="dxa" w:w="3969"/>
-          </w:tcPr>
-          <w:p>
-            <w:pPr>
-              <w:spacing w:before="40" w:after="60" w:line="252" w:lineRule="auto"/>
-            </w:pPr>
-            <w:r>
-              <w:rPr>
-                <w:sz w:val="18"/>
-              </w:rPr>
-              <w:t>Guides the car vertically.</w:t>
-            </w:r>
-          </w:p>
-        </w:tc>
-      </w:tr>
-      <w:tr>
-        <w:trPr>
-          <w:cantSplit/>
-        </w:trPr>
-        <w:tc>
-          <w:tcPr>
-            <w:tcW w:type="dxa" w:w="3685"/>
-          </w:tcPr>
-          <w:p>
-            <w:pPr>
-              <w:spacing w:before="40" w:after="60" w:line="252" w:lineRule="auto"/>
-            </w:pPr>
-            <w:r>
-              <w:rPr>
-                <w:sz w:val="18"/>
-              </w:rPr>
-              <w:t>H12 导靴</w:t>
-              <w:br/>
-              <w:t>Guide shoe</w:t>
-            </w:r>
-          </w:p>
-        </w:tc>
-        <w:tc>
-          <w:tcPr>
-            <w:tcW w:type="dxa" w:w="2551"/>
-          </w:tcPr>
-          <w:p>
-            <w:pPr>
-              <w:spacing w:before="40" w:after="60" w:line="252" w:lineRule="auto"/>
-            </w:pPr>
-            <w:r>
-              <w:rPr>
-                <w:sz w:val="18"/>
-              </w:rPr>
-              <w:t>配合轿厢导轨限制横向移动。</w:t>
-            </w:r>
-          </w:p>
-        </w:tc>
-        <w:tc>
-          <w:tcPr>
-            <w:tcW w:type="dxa" w:w="3969"/>
-          </w:tcPr>
-          <w:p>
-            <w:pPr>
-              <w:spacing w:before="40" w:after="60" w:line="252" w:lineRule="auto"/>
-            </w:pPr>
-            <w:r>
-              <w:rPr>
-                <w:sz w:val="18"/>
-              </w:rPr>
-              <w:t>Runs along the car guide rail to restrain lateral movement.</w:t>
-            </w:r>
-          </w:p>
-        </w:tc>
-      </w:tr>
-      <w:tr>
-        <w:trPr>
-          <w:cantSplit/>
-        </w:trPr>
-        <w:tc>
-          <w:tcPr>
-            <w:tcW w:type="dxa" w:w="3685"/>
-          </w:tcPr>
-          <w:p>
-            <w:pPr>
-              <w:spacing w:before="40" w:after="60" w:line="252" w:lineRule="auto"/>
-            </w:pPr>
-            <w:r>
-              <w:rPr>
-                <w:sz w:val="18"/>
-              </w:rPr>
-              <w:t>H13 导轨支架</w:t>
-              <w:br/>
-              <w:t>Rail bracket</w:t>
-            </w:r>
-          </w:p>
-        </w:tc>
-        <w:tc>
-          <w:tcPr>
-            <w:tcW w:type="dxa" w:w="2551"/>
-          </w:tcPr>
-          <w:p>
-            <w:pPr>
-              <w:spacing w:before="40" w:after="60" w:line="252" w:lineRule="auto"/>
-            </w:pPr>
-            <w:r>
-              <w:rPr>
-                <w:sz w:val="18"/>
-              </w:rPr>
-              <w:t>固定轿厢导轨。</w:t>
-            </w:r>
-          </w:p>
-        </w:tc>
-        <w:tc>
-          <w:tcPr>
-            <w:tcW w:type="dxa" w:w="3969"/>
-          </w:tcPr>
-          <w:p>
-            <w:pPr>
-              <w:spacing w:before="40" w:after="60" w:line="252" w:lineRule="auto"/>
-            </w:pPr>
-            <w:r>
-              <w:rPr>
-                <w:sz w:val="18"/>
-              </w:rPr>
-              <w:t>Secures the car guide rail.</w:t>
-            </w:r>
-          </w:p>
-        </w:tc>
-      </w:tr>
-      <w:tr>
-        <w:trPr>
-          <w:cantSplit/>
-        </w:trPr>
-        <w:tc>
-          <w:tcPr>
-            <w:tcW w:type="dxa" w:w="3685"/>
-          </w:tcPr>
-          <w:p>
-            <w:pPr>
-              <w:spacing w:before="40" w:after="60" w:line="252" w:lineRule="auto"/>
-            </w:pPr>
-            <w:r>
-              <w:rPr>
-                <w:sz w:val="18"/>
-              </w:rPr>
-              <w:t>H14 门机</w:t>
-              <w:br/>
-              <w:t>Door operator</w:t>
-            </w:r>
-          </w:p>
-        </w:tc>
-        <w:tc>
-          <w:tcPr>
-            <w:tcW w:type="dxa" w:w="2551"/>
-          </w:tcPr>
-          <w:p>
-            <w:pPr>
-              <w:spacing w:before="40" w:after="60" w:line="252" w:lineRule="auto"/>
-            </w:pPr>
-            <w:r>
-              <w:rPr>
-                <w:sz w:val="18"/>
-              </w:rPr>
-              <w:t>驱动轿门开关。</w:t>
-            </w:r>
-          </w:p>
-        </w:tc>
-        <w:tc>
-          <w:tcPr>
-            <w:tcW w:type="dxa" w:w="3969"/>
-          </w:tcPr>
-          <w:p>
-            <w:pPr>
-              <w:spacing w:before="40" w:after="60" w:line="252" w:lineRule="auto"/>
-            </w:pPr>
-            <w:r>
-              <w:rPr>
-                <w:sz w:val="18"/>
-              </w:rPr>
-              <w:t>Operates the car doors.</w:t>
-            </w:r>
-          </w:p>
-        </w:tc>
-      </w:tr>
-    </w:tbl>
-    <w:p>
-      <w:r>
-        <w:br w:type="page"/>
-      </w:r>
-    </w:p>
-    <w:p>
-      <w:pPr>
-        <w:pStyle w:val="Heading1"/>
-      </w:pPr>
-      <w:r>
-        <w:t>2.1 部件及功能 / Components and functions (2/2)</w:t>
-      </w:r>
-    </w:p>
-    <w:tbl>
-      <w:tblPr>
-        <w:tblStyle w:val="TableGrid"/>
-        <w:tblW w:type="auto" w:w="0"/>
-        <w:tblLayout w:type="fixed"/>
-        <w:tblLook w:firstColumn="1" w:firstRow="1" w:lastColumn="0" w:lastRow="0" w:noHBand="0" w:noVBand="1" w:val="04A0"/>
-      </w:tblPr>
-      <w:tblGrid>
-        <w:gridCol w:w="3402"/>
-        <w:gridCol w:w="3402"/>
-        <w:gridCol w:w="3402"/>
-      </w:tblGrid>
-      <w:tr>
-        <w:trPr>
-          <w:tblHeader/>
-        </w:trPr>
-        <w:tc>
-          <w:tcPr>
-            <w:tcW w:type="dxa" w:w="3685"/>
-            <w:shd w:fill="E7EDF2"/>
-          </w:tcPr>
-          <w:p>
-            <w:r>
-              <w:t>编号及部件 / Component</w:t>
-            </w:r>
-          </w:p>
-        </w:tc>
-        <w:tc>
-          <w:tcPr>
-            <w:tcW w:type="dxa" w:w="2551"/>
-            <w:shd w:fill="E7EDF2"/>
-          </w:tcPr>
-          <w:p>
-            <w:r>
-              <w:t>功能</w:t>
-            </w:r>
-          </w:p>
-        </w:tc>
-        <w:tc>
-          <w:tcPr>
-            <w:tcW w:type="dxa" w:w="3969"/>
-            <w:shd w:fill="E7EDF2"/>
-          </w:tcPr>
-          <w:p>
-            <w:r>
-              <w:t>Operational function</w:t>
-            </w:r>
-          </w:p>
-        </w:tc>
-      </w:tr>
-      <w:tr>
-        <w:trPr>
-          <w:cantSplit/>
-        </w:trPr>
-        <w:tc>
-          <w:tcPr>
-            <w:tcW w:type="dxa" w:w="3685"/>
-          </w:tcPr>
-          <w:p>
-            <w:pPr>
-              <w:spacing w:before="40" w:after="60" w:line="252" w:lineRule="auto"/>
-            </w:pPr>
-            <w:r>
-              <w:rPr>
-                <w:sz w:val="18"/>
-              </w:rPr>
-              <w:t>H15 轿门</w:t>
-              <w:br/>
-              <w:t>Car doors</w:t>
-            </w:r>
-          </w:p>
-        </w:tc>
-        <w:tc>
-          <w:tcPr>
-            <w:tcW w:type="dxa" w:w="2551"/>
-          </w:tcPr>
-          <w:p>
-            <w:pPr>
-              <w:spacing w:before="40" w:after="60" w:line="252" w:lineRule="auto"/>
-            </w:pPr>
-            <w:r>
-              <w:rPr>
-                <w:sz w:val="18"/>
-              </w:rPr>
-              <w:t>控制轿厢入口。</w:t>
-            </w:r>
-          </w:p>
-        </w:tc>
-        <w:tc>
-          <w:tcPr>
-            <w:tcW w:type="dxa" w:w="3969"/>
-          </w:tcPr>
-          <w:p>
-            <w:pPr>
-              <w:spacing w:before="40" w:after="60" w:line="252" w:lineRule="auto"/>
-            </w:pPr>
-            <w:r>
-              <w:rPr>
-                <w:sz w:val="18"/>
-              </w:rPr>
-              <w:t>Control access to the car.</w:t>
-            </w:r>
-          </w:p>
-        </w:tc>
-      </w:tr>
-      <w:tr>
-        <w:trPr>
-          <w:cantSplit/>
-        </w:trPr>
-        <w:tc>
-          <w:tcPr>
-            <w:tcW w:type="dxa" w:w="3685"/>
-          </w:tcPr>
-          <w:p>
-            <w:pPr>
-              <w:spacing w:before="40" w:after="60" w:line="252" w:lineRule="auto"/>
-            </w:pPr>
-            <w:r>
-              <w:rPr>
-                <w:sz w:val="18"/>
-              </w:rPr>
-              <w:t>H16 层门</w:t>
-              <w:br/>
-              <w:t>Landing doors</w:t>
-            </w:r>
-          </w:p>
-        </w:tc>
-        <w:tc>
-          <w:tcPr>
-            <w:tcW w:type="dxa" w:w="2551"/>
-          </w:tcPr>
-          <w:p>
-            <w:pPr>
-              <w:spacing w:before="40" w:after="60" w:line="252" w:lineRule="auto"/>
-            </w:pPr>
-            <w:r>
-              <w:rPr>
-                <w:sz w:val="18"/>
-              </w:rPr>
-              <w:t>关闭各楼层的井道入口。</w:t>
-            </w:r>
-          </w:p>
-        </w:tc>
-        <w:tc>
-          <w:tcPr>
-            <w:tcW w:type="dxa" w:w="3969"/>
-          </w:tcPr>
-          <w:p>
-            <w:pPr>
-              <w:spacing w:before="40" w:after="60" w:line="252" w:lineRule="auto"/>
-            </w:pPr>
-            <w:r>
-              <w:rPr>
-                <w:sz w:val="18"/>
+                <w:sz w:val="19"/>
               </w:rPr>
               <w:t>Close the well entrance at each landing.</w:t>
             </w:r>
@@ -3147,7 +2396,7 @@
         </w:trPr>
         <w:tc>
           <w:tcPr>
-            <w:tcW w:type="dxa" w:w="3685"/>
+            <w:tcW w:type="dxa" w:w="3175"/>
           </w:tcPr>
           <w:p>
             <w:pPr>
@@ -3155,17 +2404,17 @@
             </w:pPr>
             <w:r>
               <w:rPr>
-                <w:sz w:val="18"/>
+                <w:sz w:val="19"/>
               </w:rPr>
-              <w:t>H17 层站按钮</w:t>
+              <w:t>层门联锁</w:t>
               <w:br/>
-              <w:t>Landing pushbutton</w:t>
+              <w:t>Landing door interlock</w:t>
             </w:r>
           </w:p>
         </w:tc>
         <w:tc>
           <w:tcPr>
-            <w:tcW w:type="dxa" w:w="2551"/>
+            <w:tcW w:type="dxa" w:w="2835"/>
           </w:tcPr>
           <w:p>
             <w:pPr>
@@ -3173,15 +2422,15 @@
             </w:pPr>
             <w:r>
               <w:rPr>
-                <w:sz w:val="18"/>
+                <w:sz w:val="19"/>
               </w:rPr>
-              <w:t>发出召梯指令。</w:t>
+              <w:t>层门未正确关闭并锁紧时，阻止正常运行。</w:t>
             </w:r>
           </w:p>
         </w:tc>
         <w:tc>
           <w:tcPr>
-            <w:tcW w:type="dxa" w:w="3969"/>
+            <w:tcW w:type="dxa" w:w="4309"/>
           </w:tcPr>
           <w:p>
             <w:pPr>
@@ -3189,9 +2438,9 @@
             </w:pPr>
             <w:r>
               <w:rPr>
-                <w:sz w:val="18"/>
+                <w:sz w:val="19"/>
               </w:rPr>
-              <w:t>Registers a landing call.</w:t>
+              <w:t>Prevents normal travel unless the landing doors are properly closed and locked.</w:t>
             </w:r>
           </w:p>
         </w:tc>
@@ -3202,7 +2451,7 @@
         </w:trPr>
         <w:tc>
           <w:tcPr>
-            <w:tcW w:type="dxa" w:w="3685"/>
+            <w:tcW w:type="dxa" w:w="3175"/>
           </w:tcPr>
           <w:p>
             <w:pPr>
@@ -3210,17 +2459,17 @@
             </w:pPr>
             <w:r>
               <w:rPr>
-                <w:sz w:val="18"/>
+                <w:sz w:val="19"/>
               </w:rPr>
-              <w:t>H18 层站指示器</w:t>
+              <w:t>层门接近传感器</w:t>
               <w:br/>
-              <w:t>Landing indicator</w:t>
+              <w:t>Landing door proximity sensor</w:t>
             </w:r>
           </w:p>
         </w:tc>
         <w:tc>
           <w:tcPr>
-            <w:tcW w:type="dxa" w:w="2551"/>
+            <w:tcW w:type="dxa" w:w="2835"/>
           </w:tcPr>
           <w:p>
             <w:pPr>
@@ -3228,15 +2477,15 @@
             </w:pPr>
             <w:r>
               <w:rPr>
-                <w:sz w:val="18"/>
+                <w:sz w:val="19"/>
               </w:rPr>
-              <w:t>显示升降机的运行信息。</w:t>
+              <w:t>关门期间检测到乘客进入时，使门重新打开。</w:t>
             </w:r>
           </w:p>
         </w:tc>
         <w:tc>
           <w:tcPr>
-            <w:tcW w:type="dxa" w:w="3969"/>
+            <w:tcW w:type="dxa" w:w="4309"/>
           </w:tcPr>
           <w:p>
             <w:pPr>
@@ -3244,9 +2493,9 @@
             </w:pPr>
             <w:r>
               <w:rPr>
-                <w:sz w:val="18"/>
+                <w:sz w:val="19"/>
               </w:rPr>
-              <w:t>Displays lift operating information.</w:t>
+              <w:t>Causes closing doors to reopen when a person enters.</w:t>
             </w:r>
           </w:p>
         </w:tc>
@@ -3257,7 +2506,7 @@
         </w:trPr>
         <w:tc>
           <w:tcPr>
-            <w:tcW w:type="dxa" w:w="3685"/>
+            <w:tcW w:type="dxa" w:w="3175"/>
           </w:tcPr>
           <w:p>
             <w:pPr>
@@ -3265,17 +2514,17 @@
             </w:pPr>
             <w:r>
               <w:rPr>
-                <w:sz w:val="18"/>
+                <w:sz w:val="19"/>
               </w:rPr>
-              <w:t>H19 随行电缆</w:t>
+              <w:t>楼层停止及限位开关</w:t>
               <w:br/>
-              <w:t>Travelling cables</w:t>
+              <w:t>Floor stop and limit switch</w:t>
             </w:r>
           </w:p>
         </w:tc>
         <w:tc>
           <w:tcPr>
-            <w:tcW w:type="dxa" w:w="2551"/>
+            <w:tcW w:type="dxa" w:w="2835"/>
           </w:tcPr>
           <w:p>
             <w:pPr>
@@ -3283,15 +2532,15 @@
             </w:pPr>
             <w:r>
               <w:rPr>
-                <w:sz w:val="18"/>
+                <w:sz w:val="19"/>
               </w:rPr>
-              <w:t>连接移动轿厢的电源与信号。</w:t>
+              <w:t>控制楼层停车并限制轿厢行程。</w:t>
             </w:r>
           </w:p>
         </w:tc>
         <w:tc>
           <w:tcPr>
-            <w:tcW w:type="dxa" w:w="3969"/>
+            <w:tcW w:type="dxa" w:w="4309"/>
           </w:tcPr>
           <w:p>
             <w:pPr>
@@ -3299,9 +2548,9 @@
             </w:pPr>
             <w:r>
               <w:rPr>
-                <w:sz w:val="18"/>
+                <w:sz w:val="19"/>
               </w:rPr>
-              <w:t>Carry power and signals to and from the moving car.</w:t>
+              <w:t>Controls landing stops and limits car travel.</w:t>
             </w:r>
           </w:p>
         </w:tc>
@@ -3312,7 +2561,7 @@
         </w:trPr>
         <w:tc>
           <w:tcPr>
-            <w:tcW w:type="dxa" w:w="3685"/>
+            <w:tcW w:type="dxa" w:w="3175"/>
           </w:tcPr>
           <w:p>
             <w:pPr>
@@ -3320,17 +2569,17 @@
             </w:pPr>
             <w:r>
               <w:rPr>
-                <w:sz w:val="18"/>
+                <w:sz w:val="19"/>
               </w:rPr>
-              <w:t>H20 楼层停止及限位开关</w:t>
+              <w:t>低速平层开关凸轮</w:t>
               <w:br/>
-              <w:t>Floor stop and limit switch</w:t>
+              <w:t>Creepage and leveling switch cam</w:t>
             </w:r>
           </w:p>
         </w:tc>
         <w:tc>
           <w:tcPr>
-            <w:tcW w:type="dxa" w:w="2551"/>
+            <w:tcW w:type="dxa" w:w="2835"/>
           </w:tcPr>
           <w:p>
             <w:pPr>
@@ -3338,15 +2587,15 @@
             </w:pPr>
             <w:r>
               <w:rPr>
-                <w:sz w:val="18"/>
+                <w:sz w:val="19"/>
               </w:rPr>
-              <w:t>控制楼层停车并限制行程。</w:t>
+              <w:t>触发相关开关，使系统进行低速平层。</w:t>
             </w:r>
           </w:p>
         </w:tc>
         <w:tc>
           <w:tcPr>
-            <w:tcW w:type="dxa" w:w="3969"/>
+            <w:tcW w:type="dxa" w:w="4309"/>
           </w:tcPr>
           <w:p>
             <w:pPr>
@@ -3354,9 +2603,9 @@
             </w:pPr>
             <w:r>
               <w:rPr>
-                <w:sz w:val="18"/>
+                <w:sz w:val="19"/>
               </w:rPr>
-              <w:t>Controls landing stops and limits travel.</w:t>
+              <w:t>Actuates the associated switches for low-speed levelling.</w:t>
             </w:r>
           </w:p>
         </w:tc>
@@ -3367,7 +2616,7 @@
         </w:trPr>
         <w:tc>
           <w:tcPr>
-            <w:tcW w:type="dxa" w:w="3685"/>
+            <w:tcW w:type="dxa" w:w="3175"/>
           </w:tcPr>
           <w:p>
             <w:pPr>
@@ -3375,17 +2624,17 @@
             </w:pPr>
             <w:r>
               <w:rPr>
-                <w:sz w:val="18"/>
+                <w:sz w:val="19"/>
               </w:rPr>
-              <w:t>H21 低速平层开关凸轮</w:t>
+              <w:t>弹簧缓冲器</w:t>
               <w:br/>
-              <w:t>Creepage and leveling switch cam</w:t>
+              <w:t>Buffer spring</w:t>
             </w:r>
           </w:p>
         </w:tc>
         <w:tc>
           <w:tcPr>
-            <w:tcW w:type="dxa" w:w="2551"/>
+            <w:tcW w:type="dxa" w:w="2835"/>
           </w:tcPr>
           <w:p>
             <w:pPr>
@@ -3393,15 +2642,15 @@
             </w:pPr>
             <w:r>
               <w:rPr>
-                <w:sz w:val="18"/>
+                <w:sz w:val="19"/>
               </w:rPr>
-              <w:t>触发低速平层相关开关。</w:t>
+              <w:t>在轿厢底部越程时吸收冲击能量。</w:t>
             </w:r>
           </w:p>
         </w:tc>
         <w:tc>
           <w:tcPr>
-            <w:tcW w:type="dxa" w:w="3969"/>
+            <w:tcW w:type="dxa" w:w="4309"/>
           </w:tcPr>
           <w:p>
             <w:pPr>
@@ -3409,9 +2658,9 @@
             </w:pPr>
             <w:r>
               <w:rPr>
-                <w:sz w:val="18"/>
+                <w:sz w:val="19"/>
               </w:rPr>
-              <w:t>Actuates switches used for low-speed levelling.</w:t>
+              <w:t>Absorbs impact energy during bottom overtravel of the car.</w:t>
             </w:r>
           </w:p>
         </w:tc>
@@ -3422,7 +2671,7 @@
         </w:trPr>
         <w:tc>
           <w:tcPr>
-            <w:tcW w:type="dxa" w:w="3685"/>
+            <w:tcW w:type="dxa" w:w="3175"/>
           </w:tcPr>
           <w:p>
             <w:pPr>
@@ -3430,17 +2679,17 @@
             </w:pPr>
             <w:r>
               <w:rPr>
-                <w:sz w:val="18"/>
+                <w:sz w:val="19"/>
               </w:rPr>
-              <w:t>H22 弹簧缓冲器</w:t>
+              <w:t>随行电缆</w:t>
               <w:br/>
-              <w:t>Buffer spring</w:t>
+              <w:t>Travelling cables</w:t>
             </w:r>
           </w:p>
         </w:tc>
         <w:tc>
           <w:tcPr>
-            <w:tcW w:type="dxa" w:w="2551"/>
+            <w:tcW w:type="dxa" w:w="2835"/>
           </w:tcPr>
           <w:p>
             <w:pPr>
@@ -3448,15 +2697,15 @@
             </w:pPr>
             <w:r>
               <w:rPr>
-                <w:sz w:val="18"/>
+                <w:sz w:val="19"/>
               </w:rPr>
-              <w:t>吸收轿厢底部越程冲击能量。</w:t>
+              <w:t>在固定设备与移动轿厢之间传送电源及控制信号。</w:t>
             </w:r>
           </w:p>
         </w:tc>
         <w:tc>
           <w:tcPr>
-            <w:tcW w:type="dxa" w:w="3969"/>
+            <w:tcW w:type="dxa" w:w="4309"/>
           </w:tcPr>
           <w:p>
             <w:pPr>
@@ -3464,284 +2713,9 @@
             </w:pPr>
             <w:r>
               <w:rPr>
-                <w:sz w:val="18"/>
+                <w:sz w:val="19"/>
               </w:rPr>
-              <w:t>Absorbs impact energy during bottom overtravel.</w:t>
-            </w:r>
-          </w:p>
-        </w:tc>
-      </w:tr>
-      <w:tr>
-        <w:trPr>
-          <w:cantSplit/>
-        </w:trPr>
-        <w:tc>
-          <w:tcPr>
-            <w:tcW w:type="dxa" w:w="3685"/>
-          </w:tcPr>
-          <w:p>
-            <w:pPr>
-              <w:spacing w:before="40" w:after="60" w:line="252" w:lineRule="auto"/>
-            </w:pPr>
-            <w:r>
-              <w:rPr>
-                <w:sz w:val="18"/>
-              </w:rPr>
-              <w:t>H23 柱塞止动环</w:t>
-              <w:br/>
-              <w:t>Plunger stop ring</w:t>
-            </w:r>
-          </w:p>
-        </w:tc>
-        <w:tc>
-          <w:tcPr>
-            <w:tcW w:type="dxa" w:w="2551"/>
-          </w:tcPr>
-          <w:p>
-            <w:pPr>
-              <w:spacing w:before="40" w:after="60" w:line="252" w:lineRule="auto"/>
-            </w:pPr>
-            <w:r>
-              <w:rPr>
-                <w:sz w:val="18"/>
-              </w:rPr>
-              <w:t>限制柱塞过度伸出。</w:t>
-            </w:r>
-          </w:p>
-        </w:tc>
-        <w:tc>
-          <w:tcPr>
-            <w:tcW w:type="dxa" w:w="3969"/>
-          </w:tcPr>
-          <w:p>
-            <w:pPr>
-              <w:spacing w:before="40" w:after="60" w:line="252" w:lineRule="auto"/>
-            </w:pPr>
-            <w:r>
-              <w:rPr>
-                <w:sz w:val="18"/>
-              </w:rPr>
-              <w:t>Limits excessive extension of the plunger.</w:t>
-            </w:r>
-          </w:p>
-        </w:tc>
-      </w:tr>
-      <w:tr>
-        <w:trPr>
-          <w:cantSplit/>
-        </w:trPr>
-        <w:tc>
-          <w:tcPr>
-            <w:tcW w:type="dxa" w:w="3685"/>
-          </w:tcPr>
-          <w:p>
-            <w:pPr>
-              <w:spacing w:before="40" w:after="60" w:line="252" w:lineRule="auto"/>
-            </w:pPr>
-            <w:r>
-              <w:rPr>
-                <w:sz w:val="18"/>
-              </w:rPr>
-              <w:t>H24 井道</w:t>
-              <w:br/>
-              <w:t>Lift well</w:t>
-            </w:r>
-          </w:p>
-        </w:tc>
-        <w:tc>
-          <w:tcPr>
-            <w:tcW w:type="dxa" w:w="2551"/>
-          </w:tcPr>
-          <w:p>
-            <w:pPr>
-              <w:spacing w:before="40" w:after="60" w:line="252" w:lineRule="auto"/>
-            </w:pPr>
-            <w:r>
-              <w:rPr>
-                <w:sz w:val="18"/>
-              </w:rPr>
-              <w:t>容纳轿厢运行空间。</w:t>
-            </w:r>
-          </w:p>
-        </w:tc>
-        <w:tc>
-          <w:tcPr>
-            <w:tcW w:type="dxa" w:w="3969"/>
-          </w:tcPr>
-          <w:p>
-            <w:pPr>
-              <w:spacing w:before="40" w:after="60" w:line="252" w:lineRule="auto"/>
-            </w:pPr>
-            <w:r>
-              <w:rPr>
-                <w:sz w:val="18"/>
-              </w:rPr>
-              <w:t>Encloses the car travel space.</w:t>
-            </w:r>
-          </w:p>
-        </w:tc>
-      </w:tr>
-      <w:tr>
-        <w:trPr>
-          <w:cantSplit/>
-        </w:trPr>
-        <w:tc>
-          <w:tcPr>
-            <w:tcW w:type="dxa" w:w="3685"/>
-          </w:tcPr>
-          <w:p>
-            <w:pPr>
-              <w:spacing w:before="40" w:after="60" w:line="252" w:lineRule="auto"/>
-            </w:pPr>
-            <w:r>
-              <w:rPr>
-                <w:sz w:val="18"/>
-              </w:rPr>
-              <w:t>H25 套管</w:t>
-              <w:br/>
-              <w:t>Casing</w:t>
-            </w:r>
-          </w:p>
-        </w:tc>
-        <w:tc>
-          <w:tcPr>
-            <w:tcW w:type="dxa" w:w="2551"/>
-          </w:tcPr>
-          <w:p>
-            <w:pPr>
-              <w:spacing w:before="40" w:after="60" w:line="252" w:lineRule="auto"/>
-            </w:pPr>
-            <w:r>
-              <w:rPr>
-                <w:sz w:val="18"/>
-              </w:rPr>
-              <w:t>围护埋地油缸。</w:t>
-            </w:r>
-          </w:p>
-        </w:tc>
-        <w:tc>
-          <w:tcPr>
-            <w:tcW w:type="dxa" w:w="3969"/>
-          </w:tcPr>
-          <w:p>
-            <w:pPr>
-              <w:spacing w:before="40" w:after="60" w:line="252" w:lineRule="auto"/>
-            </w:pPr>
-            <w:r>
-              <w:rPr>
-                <w:sz w:val="18"/>
-              </w:rPr>
-              <w:t>Surrounds the buried cylinder.</w:t>
-            </w:r>
-          </w:p>
-        </w:tc>
-      </w:tr>
-      <w:tr>
-        <w:trPr>
-          <w:cantSplit/>
-        </w:trPr>
-        <w:tc>
-          <w:tcPr>
-            <w:tcW w:type="dxa" w:w="3685"/>
-          </w:tcPr>
-          <w:p>
-            <w:pPr>
-              <w:spacing w:before="40" w:after="60" w:line="252" w:lineRule="auto"/>
-            </w:pPr>
-            <w:r>
-              <w:rPr>
-                <w:sz w:val="18"/>
-              </w:rPr>
-              <w:t>H26 层门联锁</w:t>
-              <w:br/>
-              <w:t>Landing door interlock</w:t>
-            </w:r>
-          </w:p>
-        </w:tc>
-        <w:tc>
-          <w:tcPr>
-            <w:tcW w:type="dxa" w:w="2551"/>
-          </w:tcPr>
-          <w:p>
-            <w:pPr>
-              <w:spacing w:before="40" w:after="60" w:line="252" w:lineRule="auto"/>
-            </w:pPr>
-            <w:r>
-              <w:rPr>
-                <w:sz w:val="18"/>
-              </w:rPr>
-              <w:t>层门未关闭锁紧时阻止运行。</w:t>
-            </w:r>
-          </w:p>
-        </w:tc>
-        <w:tc>
-          <w:tcPr>
-            <w:tcW w:type="dxa" w:w="3969"/>
-          </w:tcPr>
-          <w:p>
-            <w:pPr>
-              <w:spacing w:before="40" w:after="60" w:line="252" w:lineRule="auto"/>
-            </w:pPr>
-            <w:r>
-              <w:rPr>
-                <w:sz w:val="18"/>
-              </w:rPr>
-              <w:t>Prevents travel unless the landing doors are closed and locked.</w:t>
-            </w:r>
-          </w:p>
-        </w:tc>
-      </w:tr>
-      <w:tr>
-        <w:trPr>
-          <w:cantSplit/>
-        </w:trPr>
-        <w:tc>
-          <w:tcPr>
-            <w:tcW w:type="dxa" w:w="3685"/>
-          </w:tcPr>
-          <w:p>
-            <w:pPr>
-              <w:spacing w:before="40" w:after="60" w:line="252" w:lineRule="auto"/>
-            </w:pPr>
-            <w:r>
-              <w:rPr>
-                <w:sz w:val="18"/>
-              </w:rPr>
-              <w:t>H27 层门接近传感器</w:t>
-              <w:br/>
-              <w:t>Landing door proximity sensor</w:t>
-            </w:r>
-          </w:p>
-        </w:tc>
-        <w:tc>
-          <w:tcPr>
-            <w:tcW w:type="dxa" w:w="2551"/>
-          </w:tcPr>
-          <w:p>
-            <w:pPr>
-              <w:spacing w:before="40" w:after="60" w:line="252" w:lineRule="auto"/>
-            </w:pPr>
-            <w:r>
-              <w:rPr>
-                <w:sz w:val="18"/>
-              </w:rPr>
-              <w:t>关门时检测到乘客进入便使门重开。</w:t>
-            </w:r>
-          </w:p>
-        </w:tc>
-        <w:tc>
-          <w:tcPr>
-            <w:tcW w:type="dxa" w:w="3969"/>
-          </w:tcPr>
-          <w:p>
-            <w:pPr>
-              <w:spacing w:before="40" w:after="60" w:line="252" w:lineRule="auto"/>
-            </w:pPr>
-            <w:r>
-              <w:rPr>
-                <w:sz w:val="18"/>
-              </w:rPr>
-              <w:t>Reopens closing doors when a person enters.</w:t>
+              <w:t>Carry power and control signals between fixed equipment and the moving car.</w:t>
             </w:r>
           </w:p>
         </w:tc>
@@ -3757,19 +2731,67 @@
     </w:p>
     <w:p>
       <w:r>
-        <w:t>上升时，电动机驱动油泵，油由油箱经油泵、阀组和闸阀进入油缸，使柱塞伸出并直接顶升轿厢。停止时，阀组保持油缸内的油。下降时，阀组让油受控流回油箱，轿厢重量使柱塞缩回。闸阀在正常运行时保持开启。</w:t>
+        <w:t>上升时，电动机驱动油泵，液压油经阀组和闸阀进入油缸，使柱塞伸出并直接顶升轿厢。停止时，阀组保持油缸内的油液。下降时，阀组控制油液回流油箱的速度，使柱塞及轿厢受控下降。正常运行时闸阀保持开启。</w:t>
       </w:r>
     </w:p>
     <w:p>
       <w:r>
-        <w:t>During ascent, the motor drives the pump. Oil flows from the tank through the pump, valve block and gate valve into the cylinder, extending the plunger and directly raising the car. During holding, the valve block retains oil in the cylinder. During descent, it permits controlled return to the tank, and the car weight retracts the plunger. The gate valve remains open during normal operation.</w:t>
+        <w:t>During ascent, the motor drives the pump, and oil enters the cylinder through the valve block and gate valve, extending the plunger and directly raising the car. During holding, the valve block retains oil in the cylinder. During descent, it controls the rate of return to the tank so that the plunger and car descend in a controlled manner. The gate valve remains open during normal operation.</w:t>
+      </w:r>
+    </w:p>
+    <w:p>
+      <w:pPr>
+        <w:sectPr>
+          <w:pgSz w:w="11906" w:h="16838"/>
+          <w:pgMar w:top="794" w:right="794" w:bottom="794" w:left="794" w:header="340" w:footer="340" w:gutter="0"/>
+          <w:cols w:space="720"/>
+          <w:docGrid w:linePitch="360"/>
+        </w:sectPr>
+      </w:pPr>
+    </w:p>
+    <w:p>
+      <w:pPr>
+        <w:spacing w:after="0"/>
+        <w:jc w:val="center"/>
+      </w:pPr>
+      <w:r>
+        <w:drawing>
+          <wp:inline xmlns:a="http://schemas.openxmlformats.org/drawingml/2006/main" xmlns:pic="http://schemas.openxmlformats.org/drawingml/2006/picture">
+            <wp:extent cx="9540000" cy="6748658"/>
+            <wp:docPr id="2" name="Picture 2"/>
+            <wp:cNvGraphicFramePr>
+              <a:graphicFrameLocks noChangeAspect="1"/>
+            </wp:cNvGraphicFramePr>
+            <a:graphic>
+              <a:graphicData uri="http://schemas.openxmlformats.org/drawingml/2006/picture">
+                <pic:pic>
+                  <pic:nvPicPr>
+                    <pic:cNvPr id="0" name="PIA5704_Q1_Hydraulic_Clear.png"/>
+                    <pic:cNvPicPr/>
+                  </pic:nvPicPr>
+                  <pic:blipFill>
+                    <a:blip r:embed="rId12"/>
+                    <a:stretch>
+                      <a:fillRect/>
+                    </a:stretch>
+                  </pic:blipFill>
+                  <pic:spPr>
+                    <a:xfrm>
+                      <a:off x="0" y="0"/>
+                      <a:ext cx="9540000" cy="6748658"/>
+                    </a:xfrm>
+                    <a:prstGeom prst="rect"/>
+                  </pic:spPr>
+                </pic:pic>
+              </a:graphicData>
+            </a:graphic>
+          </wp:inline>
+        </w:drawing>
       </w:r>
     </w:p>
     <w:sectPr>
-      <w:headerReference w:type="default" r:id="rId9"/>
-      <w:footerReference w:type="default" r:id="rId10"/>
-      <w:pgSz w:w="11906" w:h="16838"/>
-      <w:pgMar w:top="794" w:right="850" w:bottom="794" w:left="850" w:header="720" w:footer="720" w:gutter="0"/>
+      <w:pgSz w:w="16838" w:h="11906" w:orient="landscape"/>
+      <w:pgMar w:top="794" w:right="794" w:bottom="794" w:left="794" w:header="340" w:footer="340" w:gutter="0"/>
       <w:cols w:space="720"/>
       <w:docGrid w:linePitch="360"/>
     </w:sectPr>
@@ -4170,7 +3192,7 @@
     </w:pPr>
     <w:rPr>
       <w:rFonts w:ascii="Calibri" w:hAnsi="Calibri" w:eastAsia="Noto Sans CJK SC"/>
-      <w:sz w:val="20"/>
+      <w:sz w:val="21"/>
     </w:rPr>
   </w:style>
   <w:style w:type="paragraph" w:styleId="Header">
@@ -4228,15 +3250,15 @@
     <w:pPr>
       <w:keepNext/>
       <w:keepLines/>
-      <w:spacing w:before="480" w:after="0"/>
+      <w:spacing w:before="480" w:after="140"/>
       <w:outlineLvl w:val="0"/>
     </w:pPr>
     <w:rPr>
       <w:rFonts w:asciiTheme="majorHAnsi" w:eastAsiaTheme="majorEastAsia" w:hAnsiTheme="majorHAnsi" w:cstheme="majorBidi" w:ascii="Calibri" w:hAnsi="Calibri" w:eastAsia="Noto Sans CJK SC"/>
       <w:b/>
       <w:bCs/>
-      <w:color w:val="365F91" w:themeColor="accent1" w:themeShade="BF"/>
-      <w:sz w:val="30"/>
+      <w:color w:val="17364D"/>
+      <w:sz w:val="32"/>
       <w:szCs w:val="28"/>
     </w:rPr>
   </w:style>
@@ -4252,14 +3274,14 @@
     <w:pPr>
       <w:keepNext/>
       <w:keepLines/>
-      <w:spacing w:before="200" w:after="0"/>
+      <w:spacing w:before="200" w:after="140"/>
       <w:outlineLvl w:val="1"/>
     </w:pPr>
     <w:rPr>
       <w:rFonts w:asciiTheme="majorHAnsi" w:eastAsiaTheme="majorEastAsia" w:hAnsiTheme="majorHAnsi" w:cstheme="majorBidi" w:ascii="Calibri" w:hAnsi="Calibri" w:eastAsia="Noto Sans CJK SC"/>
       <w:b/>
       <w:bCs/>
-      <w:color w:val="4F81BD" w:themeColor="accent1"/>
+      <w:color w:val="17364D"/>
       <w:sz w:val="24"/>
       <w:szCs w:val="26"/>
     </w:rPr>
@@ -4517,15 +3539,15 @@
       <w:pBdr>
         <w:bottom w:val="single" w:sz="8" w:space="4" w:color="4F81BD" w:themeColor="accent1"/>
       </w:pBdr>
-      <w:spacing w:after="300" w:line="240" w:lineRule="auto"/>
+      <w:spacing w:after="140" w:line="240" w:lineRule="auto"/>
       <w:contextualSpacing/>
     </w:pPr>
     <w:rPr>
       <w:rFonts w:asciiTheme="majorHAnsi" w:eastAsiaTheme="majorEastAsia" w:hAnsiTheme="majorHAnsi" w:cstheme="majorBidi" w:ascii="Calibri" w:hAnsi="Calibri" w:eastAsia="Noto Sans CJK SC"/>
-      <w:color w:val="17365D" w:themeColor="text2" w:themeShade="BF"/>
+      <w:color w:val="17364D"/>
       <w:spacing w:val="5"/>
       <w:kern w:val="28"/>
-      <w:sz w:val="38"/>
+      <w:sz w:val="40"/>
       <w:szCs w:val="52"/>
     </w:rPr>
   </w:style>
@@ -4967,7 +3989,7 @@
       <w:b/>
       <w:bCs/>
       <w:color w:val="4F81BD" w:themeColor="accent1"/>
-      <w:sz w:val="20"/>
+      <w:sz w:val="21"/>
       <w:szCs w:val="18"/>
     </w:rPr>
   </w:style>
@@ -5119,7 +4141,7 @@
     </w:pPr>
     <w:rPr>
       <w:rFonts w:ascii="Calibri" w:hAnsi="Calibri" w:eastAsia="Noto Sans CJK SC"/>
-      <w:sz w:val="20"/>
+      <w:sz w:val="21"/>
     </w:rPr>
     <w:tblPr>
       <w:tblInd w:w="0" w:type="dxa"/>

</xml_diff>